<commit_message>
feat(register): v5-Kopfstücke je Register + Konzept-Unterüberschriften
Je Register vier Kopfstücke aus der erweiterten Ausgabe v5 (ein langer
Kopfstein zuerst, dann drei weitere) vor die 14 Korpus-Stimmen gesetzt;
VII bekommt 3 (v5 hat kaum Schweige-Material). Ersatz C 1936→LP 243 in V.
Unterüberschriften auf die ausführlichen Konzept-/PoC-Fassungen umgestellt,
Namenszeilen um die Sprechaktklasse ergänzt. 125 Stücke. Kopfstücke werden
beim Build faithful aus der v5-docx gezogen.

Co-Authored-By: Claude Opus 4.8 <noreply@anthropic.com>
Claude-Session: https://claude.ai/code/session_01WJ6p9HdvKuJ9ea1tbSE1cy
</commit_message>
<xml_diff>
--- a/safaitic-research/Poetics/register/wer_dies_liest_register.docx
+++ b/safaitic-research/Poetics/register/wer_dies_liest_register.docx
@@ -108,7 +108,7 @@
           <w:sz w:val="22"/>
           <w:szCs w:val="22"/>
         </w:rPr>
-        <w:t xml:space="preserve">Dieser Band ordnet darum nicht nach Thema, sondern nach Sprechhaltung. Jedes der sieben Register ist eine andere Art, mit dem Stein zu sprechen — vom bloßen Dasein über die Bitte und die Klage bis zum Fluch, zum Zeugnis und zuletzt zum Verstummen.</w:t>
+        <w:t xml:space="preserve">Dieser Band ordnet darum nicht nach Thema, sondern nach Sprechhaltung. Jedes der sieben Register ist eine andere Art, mit dem Stein zu sprechen — vom bloßen Dasein über die Bitte und die Klage bis zum Fluch, zum Zeugnis und zuletzt zum Verstummen. Jedes Register eröffnen einige lange Inschriften aus der erweiterten Ausgabe; danach folgen die knappen Stimmen des Vollkorpus.</w:t>
       </w:r>
     </w:p>
     <w:p>
@@ -155,7 +155,7 @@
           <w:sz w:val="30"/>
           <w:szCs w:val="30"/>
         </w:rPr>
-        <w:t xml:space="preserve">Er war hier</w:t>
+        <w:t xml:space="preserve">Er war hier · Präsentativ</w:t>
       </w:r>
     </w:p>
     <w:p>
@@ -169,7 +169,167 @@
           <w:sz w:val="20"/>
           <w:szCs w:val="20"/>
         </w:rPr>
-        <w:t xml:space="preserve">Präsentativ — Dasein als Akt: der bloße Name und der Stein.</w:t>
+        <w:t xml:space="preserve">Dasein als Akt — Deixis, kein Verb des Fühlens. Die reinste Form: „dies ist”.</w:t>
+      </w:r>
+    </w:p>
+    <w:p>
+      <w:pPr>
+        <w:spacing w:after="40"/>
+      </w:pPr>
+      <w:r>
+        <w:rPr>
+          <w:rFonts w:ascii="Georgia" w:cs="Georgia" w:eastAsia="Georgia" w:hAnsi="Georgia"/>
+          <w:sz w:val="22"/>
+          <w:szCs w:val="22"/>
+        </w:rPr>
+        <w:t xml:space="preserve">Hier.</w:t>
+      </w:r>
+    </w:p>
+    <w:p>
+      <w:pPr>
+        <w:spacing w:after="40"/>
+      </w:pPr>
+      <w:r>
+        <w:rPr>
+          <w:rFonts w:ascii="Georgia" w:cs="Georgia" w:eastAsia="Georgia" w:hAnsi="Georgia"/>
+          <w:sz w:val="22"/>
+          <w:szCs w:val="22"/>
+        </w:rPr>
+        <w:t xml:space="preserve">Und der Himmel regnete,</w:t>
+      </w:r>
+    </w:p>
+    <w:p>
+      <w:pPr>
+        <w:spacing w:after="40"/>
+      </w:pPr>
+      <w:r>
+        <w:rPr>
+          <w:rFonts w:ascii="Georgia" w:cs="Georgia" w:eastAsia="Georgia" w:hAnsi="Georgia"/>
+          <w:sz w:val="22"/>
+          <w:szCs w:val="22"/>
+        </w:rPr>
+        <w:t xml:space="preserve">nach langer Zeit ohne Regen.</w:t>
+      </w:r>
+    </w:p>
+    <w:p>
+      <w:pPr>
+        <w:spacing w:after="280" w:before="60"/>
+      </w:pPr>
+      <w:r>
+        <w:rPr>
+          <w:rFonts w:ascii="Georgia" w:cs="Georgia" w:eastAsia="Georgia" w:hAnsi="Georgia"/>
+          <w:color w:val="7A5C3E"/>
+          <w:sz w:val="16"/>
+          <w:szCs w:val="16"/>
+        </w:rPr>
+        <w:t xml:space="preserve">Sigle RWQ 342</w:t>
+      </w:r>
+    </w:p>
+    <w:p>
+      <w:pPr>
+        <w:spacing w:after="40"/>
+      </w:pPr>
+      <w:r>
+        <w:rPr>
+          <w:rFonts w:ascii="Georgia" w:cs="Georgia" w:eastAsia="Georgia" w:hAnsi="Georgia"/>
+          <w:sz w:val="22"/>
+          <w:szCs w:val="22"/>
+        </w:rPr>
+        <w:t xml:space="preserve">Er war hier</w:t>
+      </w:r>
+    </w:p>
+    <w:p>
+      <w:pPr>
+        <w:spacing w:after="40"/>
+      </w:pPr>
+      <w:r>
+        <w:rPr>
+          <w:rFonts w:ascii="Georgia" w:cs="Georgia" w:eastAsia="Georgia" w:hAnsi="Georgia"/>
+          <w:sz w:val="22"/>
+          <w:szCs w:val="22"/>
+        </w:rPr>
+        <w:t xml:space="preserve">und sah den Löwen</w:t>
+      </w:r>
+    </w:p>
+    <w:p>
+      <w:pPr>
+        <w:spacing w:after="40"/>
+      </w:pPr>
+      <w:r>
+        <w:rPr>
+          <w:rFonts w:ascii="Georgia" w:cs="Georgia" w:eastAsia="Georgia" w:hAnsi="Georgia"/>
+          <w:sz w:val="22"/>
+          <w:szCs w:val="22"/>
+        </w:rPr>
+        <w:t xml:space="preserve">an der Nordseite.</w:t>
+      </w:r>
+    </w:p>
+    <w:p>
+      <w:pPr>
+        <w:spacing w:after="280" w:before="60"/>
+      </w:pPr>
+      <w:r>
+        <w:rPr>
+          <w:rFonts w:ascii="Georgia" w:cs="Georgia" w:eastAsia="Georgia" w:hAnsi="Georgia"/>
+          <w:color w:val="7A5C3E"/>
+          <w:sz w:val="16"/>
+          <w:szCs w:val="16"/>
+        </w:rPr>
+        <w:t xml:space="preserve">Sigle RWQ 187</w:t>
+      </w:r>
+    </w:p>
+    <w:p>
+      <w:pPr>
+        <w:spacing w:after="40"/>
+      </w:pPr>
+      <w:r>
+        <w:rPr>
+          <w:rFonts w:ascii="Georgia" w:cs="Georgia" w:eastAsia="Georgia" w:hAnsi="Georgia"/>
+          <w:sz w:val="22"/>
+          <w:szCs w:val="22"/>
+        </w:rPr>
+        <w:t xml:space="preserve">Der Löwe.</w:t>
+      </w:r>
+    </w:p>
+    <w:p>
+      <w:pPr>
+        <w:spacing w:after="280" w:before="60"/>
+      </w:pPr>
+      <w:r>
+        <w:rPr>
+          <w:rFonts w:ascii="Georgia" w:cs="Georgia" w:eastAsia="Georgia" w:hAnsi="Georgia"/>
+          <w:color w:val="7A5C3E"/>
+          <w:sz w:val="16"/>
+          <w:szCs w:val="16"/>
+        </w:rPr>
+        <w:t xml:space="preserve">Sigle HYGQ 24</w:t>
+      </w:r>
+    </w:p>
+    <w:p>
+      <w:pPr>
+        <w:spacing w:after="40"/>
+      </w:pPr>
+      <w:r>
+        <w:rPr>
+          <w:rFonts w:ascii="Georgia" w:cs="Georgia" w:eastAsia="Georgia" w:hAnsi="Georgia"/>
+          <w:sz w:val="22"/>
+          <w:szCs w:val="22"/>
+        </w:rPr>
+        <w:t xml:space="preserve">Die Zeichnung des Löwen.</w:t>
+      </w:r>
+    </w:p>
+    <w:p>
+      <w:pPr>
+        <w:spacing w:after="280" w:before="60"/>
+      </w:pPr>
+      <w:r>
+        <w:rPr>
+          <w:rFonts w:ascii="Georgia" w:cs="Georgia" w:eastAsia="Georgia" w:hAnsi="Georgia"/>
+          <w:color w:val="7A5C3E"/>
+          <w:sz w:val="16"/>
+          <w:szCs w:val="16"/>
+        </w:rPr>
+        <w:t xml:space="preserve">Sigle KRS 1341</w:t>
       </w:r>
     </w:p>
     <w:p>
@@ -763,7 +923,7 @@
           <w:sz w:val="30"/>
           <w:szCs w:val="30"/>
         </w:rPr>
-        <w:t xml:space="preserve">Er wartet</w:t>
+        <w:t xml:space="preserve">Er wartet · Expressiv-Deferred</w:t>
       </w:r>
     </w:p>
     <w:p>
@@ -777,7 +937,323 @@
           <w:sz w:val="20"/>
           <w:szCs w:val="20"/>
         </w:rPr>
-        <w:t xml:space="preserve">Expressiv — Ausschau und Sehnsucht, im Stein konserviert.</w:t>
+        <w:t xml:space="preserve">Sehnsucht, die bleibt — Warten auf Regen, auf Familie, auf Rückkehr; im Stein für einen Späteren konserviert.</w:t>
+      </w:r>
+    </w:p>
+    <w:p>
+      <w:pPr>
+        <w:spacing w:after="40"/>
+      </w:pPr>
+      <w:r>
+        <w:rPr>
+          <w:rFonts w:ascii="Georgia" w:cs="Georgia" w:eastAsia="Georgia" w:hAnsi="Georgia"/>
+          <w:sz w:val="22"/>
+          <w:szCs w:val="22"/>
+        </w:rPr>
+        <w:t xml:space="preserve">Von Rbʾl, Sohn des Ḥnn, Sohn des Ẓ˥n,</w:t>
+      </w:r>
+    </w:p>
+    <w:p>
+      <w:pPr>
+        <w:spacing w:after="40"/>
+      </w:pPr>
+      <w:r>
+        <w:rPr>
+          <w:rFonts w:ascii="Georgia" w:cs="Georgia" w:eastAsia="Georgia" w:hAnsi="Georgia"/>
+          <w:sz w:val="22"/>
+          <w:szCs w:val="22"/>
+        </w:rPr>
+        <w:t xml:space="preserve">Sohn des Ḫyḏ, Sohn des ˥ḏr.</w:t>
+      </w:r>
+    </w:p>
+    <w:p>
+      <w:pPr>
+        <w:spacing w:after="40"/>
+      </w:pPr>
+      <w:r>
+        <w:rPr>
+          <w:rFonts w:ascii="Georgia" w:cs="Georgia" w:eastAsia="Georgia" w:hAnsi="Georgia"/>
+          <w:sz w:val="22"/>
+          <w:szCs w:val="22"/>
+        </w:rPr>
+        <w:t xml:space="preserve">Und er zog zum Wasser, der Dürre gewärtig —</w:t>
+      </w:r>
+    </w:p>
+    <w:p>
+      <w:pPr>
+        <w:spacing w:after="40"/>
+      </w:pPr>
+      <w:r>
+        <w:rPr>
+          <w:rFonts w:ascii="Georgia" w:cs="Georgia" w:eastAsia="Georgia" w:hAnsi="Georgia"/>
+          <w:sz w:val="22"/>
+          <w:szCs w:val="22"/>
+        </w:rPr>
+        <w:t xml:space="preserve">dann wieder im Wassermann, dann im Widder,</w:t>
+      </w:r>
+    </w:p>
+    <w:p>
+      <w:pPr>
+        <w:spacing w:after="40"/>
+      </w:pPr>
+      <w:r>
+        <w:rPr>
+          <w:rFonts w:ascii="Georgia" w:cs="Georgia" w:eastAsia="Georgia" w:hAnsi="Georgia"/>
+          <w:sz w:val="22"/>
+          <w:szCs w:val="22"/>
+        </w:rPr>
+        <w:t xml:space="preserve">dann in der Waage, dann abermals in der Waage,</w:t>
+      </w:r>
+    </w:p>
+    <w:p>
+      <w:pPr>
+        <w:spacing w:after="40"/>
+      </w:pPr>
+      <w:r>
+        <w:rPr>
+          <w:rFonts w:ascii="Georgia" w:cs="Georgia" w:eastAsia="Georgia" w:hAnsi="Georgia"/>
+          <w:sz w:val="22"/>
+          <w:szCs w:val="22"/>
+        </w:rPr>
+        <w:t xml:space="preserve">zwei Jahre in Folge —,</w:t>
+      </w:r>
+    </w:p>
+    <w:p>
+      <w:pPr>
+        <w:spacing w:after="40"/>
+      </w:pPr>
+      <w:r>
+        <w:rPr>
+          <w:rFonts w:ascii="Georgia" w:cs="Georgia" w:eastAsia="Georgia" w:hAnsi="Georgia"/>
+          <w:sz w:val="22"/>
+          <w:szCs w:val="22"/>
+        </w:rPr>
+        <w:t xml:space="preserve">und in dieser Zeit trauerte er vor Schmerz</w:t>
+      </w:r>
+    </w:p>
+    <w:p>
+      <w:pPr>
+        <w:spacing w:after="40"/>
+      </w:pPr>
+      <w:r>
+        <w:rPr>
+          <w:rFonts w:ascii="Georgia" w:cs="Georgia" w:eastAsia="Georgia" w:hAnsi="Georgia"/>
+          <w:sz w:val="22"/>
+          <w:szCs w:val="22"/>
+        </w:rPr>
+        <w:t xml:space="preserve">um einen, den er liebte,</w:t>
+      </w:r>
+    </w:p>
+    <w:p>
+      <w:pPr>
+        <w:spacing w:after="40"/>
+      </w:pPr>
+      <w:r>
+        <w:rPr>
+          <w:rFonts w:ascii="Georgia" w:cs="Georgia" w:eastAsia="Georgia" w:hAnsi="Georgia"/>
+          <w:sz w:val="22"/>
+          <w:szCs w:val="22"/>
+        </w:rPr>
+        <w:t xml:space="preserve">und um die Kamele, die er weidete,</w:t>
+      </w:r>
+    </w:p>
+    <w:p>
+      <w:pPr>
+        <w:spacing w:after="40"/>
+      </w:pPr>
+      <w:r>
+        <w:rPr>
+          <w:rFonts w:ascii="Georgia" w:cs="Georgia" w:eastAsia="Georgia" w:hAnsi="Georgia"/>
+          <w:sz w:val="22"/>
+          <w:szCs w:val="22"/>
+        </w:rPr>
+        <w:t xml:space="preserve">hinausgezogen aus der inneren Wüste,</w:t>
+      </w:r>
+    </w:p>
+    <w:p>
+      <w:pPr>
+        <w:spacing w:after="40"/>
+      </w:pPr>
+      <w:r>
+        <w:rPr>
+          <w:rFonts w:ascii="Georgia" w:cs="Georgia" w:eastAsia="Georgia" w:hAnsi="Georgia"/>
+          <w:sz w:val="22"/>
+          <w:szCs w:val="22"/>
+        </w:rPr>
+        <w:t xml:space="preserve">im Jahr, als Bnt starb.</w:t>
+      </w:r>
+    </w:p>
+    <w:p>
+      <w:pPr>
+        <w:spacing w:after="280" w:before="60"/>
+      </w:pPr>
+      <w:r>
+        <w:rPr>
+          <w:rFonts w:ascii="Georgia" w:cs="Georgia" w:eastAsia="Georgia" w:hAnsi="Georgia"/>
+          <w:color w:val="7A5C3E"/>
+          <w:sz w:val="16"/>
+          <w:szCs w:val="16"/>
+        </w:rPr>
+        <w:t xml:space="preserve">Sigle ASWS 73</w:t>
+      </w:r>
+    </w:p>
+    <w:p>
+      <w:pPr>
+        <w:spacing w:after="40"/>
+      </w:pPr>
+      <w:r>
+        <w:rPr>
+          <w:rFonts w:ascii="Georgia" w:cs="Georgia" w:eastAsia="Georgia" w:hAnsi="Georgia"/>
+          <w:sz w:val="22"/>
+          <w:szCs w:val="22"/>
+        </w:rPr>
+        <w:t xml:space="preserve">Er war an diesem Ort</w:t>
+      </w:r>
+    </w:p>
+    <w:p>
+      <w:pPr>
+        <w:spacing w:after="40"/>
+      </w:pPr>
+      <w:r>
+        <w:rPr>
+          <w:rFonts w:ascii="Georgia" w:cs="Georgia" w:eastAsia="Georgia" w:hAnsi="Georgia"/>
+          <w:sz w:val="22"/>
+          <w:szCs w:val="22"/>
+        </w:rPr>
+        <w:t xml:space="preserve">und hielt Ausschau nach den Brüdern.</w:t>
+      </w:r>
+    </w:p>
+    <w:p>
+      <w:pPr>
+        <w:spacing w:after="40"/>
+      </w:pPr>
+      <w:r>
+        <w:rPr>
+          <w:rFonts w:ascii="Georgia" w:cs="Georgia" w:eastAsia="Georgia" w:hAnsi="Georgia"/>
+          <w:sz w:val="22"/>
+          <w:szCs w:val="22"/>
+        </w:rPr>
+        <w:t xml:space="preserve">Sie fehlten ihm.</w:t>
+      </w:r>
+    </w:p>
+    <w:p>
+      <w:pPr>
+        <w:spacing w:after="280" w:before="60"/>
+      </w:pPr>
+      <w:r>
+        <w:rPr>
+          <w:rFonts w:ascii="Georgia" w:cs="Georgia" w:eastAsia="Georgia" w:hAnsi="Georgia"/>
+          <w:color w:val="7A5C3E"/>
+          <w:sz w:val="16"/>
+          <w:szCs w:val="16"/>
+        </w:rPr>
+        <w:t xml:space="preserve">Sigle RSIS 110</w:t>
+      </w:r>
+    </w:p>
+    <w:p>
+      <w:pPr>
+        <w:spacing w:after="40"/>
+      </w:pPr>
+      <w:r>
+        <w:rPr>
+          <w:rFonts w:ascii="Georgia" w:cs="Georgia" w:eastAsia="Georgia" w:hAnsi="Georgia"/>
+          <w:sz w:val="22"/>
+          <w:szCs w:val="22"/>
+        </w:rPr>
+        <w:t xml:space="preserve">Er hielt Ausschau</w:t>
+      </w:r>
+    </w:p>
+    <w:p>
+      <w:pPr>
+        <w:spacing w:after="40"/>
+      </w:pPr>
+      <w:r>
+        <w:rPr>
+          <w:rFonts w:ascii="Georgia" w:cs="Georgia" w:eastAsia="Georgia" w:hAnsi="Georgia"/>
+          <w:sz w:val="22"/>
+          <w:szCs w:val="22"/>
+        </w:rPr>
+        <w:t xml:space="preserve">nach der Geliebten.</w:t>
+      </w:r>
+    </w:p>
+    <w:p>
+      <w:pPr>
+        <w:spacing w:after="40"/>
+      </w:pPr>
+      <w:r>
+        <w:rPr>
+          <w:rFonts w:ascii="Georgia" w:cs="Georgia" w:eastAsia="Georgia" w:hAnsi="Georgia"/>
+          <w:sz w:val="22"/>
+          <w:szCs w:val="22"/>
+        </w:rPr>
+        <w:t xml:space="preserve">Jaʾlat — gib Sicherheit.</w:t>
+      </w:r>
+    </w:p>
+    <w:p>
+      <w:pPr>
+        <w:spacing w:after="280" w:before="60"/>
+      </w:pPr>
+      <w:r>
+        <w:rPr>
+          <w:rFonts w:ascii="Georgia" w:cs="Georgia" w:eastAsia="Georgia" w:hAnsi="Georgia"/>
+          <w:color w:val="7A5C3E"/>
+          <w:sz w:val="16"/>
+          <w:szCs w:val="16"/>
+        </w:rPr>
+        <w:t xml:space="preserve">Sigle Is.Mu 255</w:t>
+      </w:r>
+    </w:p>
+    <w:p>
+      <w:pPr>
+        <w:spacing w:after="40"/>
+      </w:pPr>
+      <w:r>
+        <w:rPr>
+          <w:rFonts w:ascii="Georgia" w:cs="Georgia" w:eastAsia="Georgia" w:hAnsi="Georgia"/>
+          <w:sz w:val="22"/>
+          <w:szCs w:val="22"/>
+        </w:rPr>
+        <w:t xml:space="preserve">Er wartete</w:t>
+      </w:r>
+    </w:p>
+    <w:p>
+      <w:pPr>
+        <w:spacing w:after="40"/>
+      </w:pPr>
+      <w:r>
+        <w:rPr>
+          <w:rFonts w:ascii="Georgia" w:cs="Georgia" w:eastAsia="Georgia" w:hAnsi="Georgia"/>
+          <w:sz w:val="22"/>
+          <w:szCs w:val="22"/>
+        </w:rPr>
+        <w:t xml:space="preserve">auf den Schnee</w:t>
+      </w:r>
+    </w:p>
+    <w:p>
+      <w:pPr>
+        <w:spacing w:after="40"/>
+      </w:pPr>
+      <w:r>
+        <w:rPr>
+          <w:rFonts w:ascii="Georgia" w:cs="Georgia" w:eastAsia="Georgia" w:hAnsi="Georgia"/>
+          <w:sz w:val="22"/>
+          <w:szCs w:val="22"/>
+        </w:rPr>
+        <w:t xml:space="preserve">über dem Hauran.</w:t>
+      </w:r>
+    </w:p>
+    <w:p>
+      <w:pPr>
+        <w:spacing w:after="280" w:before="60"/>
+      </w:pPr>
+      <w:r>
+        <w:rPr>
+          <w:rFonts w:ascii="Georgia" w:cs="Georgia" w:eastAsia="Georgia" w:hAnsi="Georgia"/>
+          <w:color w:val="7A5C3E"/>
+          <w:sz w:val="16"/>
+          <w:szCs w:val="16"/>
+        </w:rPr>
+        <w:t xml:space="preserve">Sigle SIJ 30</w:t>
       </w:r>
     </w:p>
     <w:p>
@@ -1449,7 +1925,7 @@
           <w:sz w:val="30"/>
           <w:szCs w:val="30"/>
         </w:rPr>
-        <w:t xml:space="preserve">Er bittet</w:t>
+        <w:t xml:space="preserve">Er bittet · Intermediär-Direktiv</w:t>
       </w:r>
     </w:p>
     <w:p>
@@ -1463,7 +1939,219 @@
           <w:sz w:val="20"/>
           <w:szCs w:val="20"/>
         </w:rPr>
-        <w:t xml:space="preserve">Direktiv — das Gebet, das im Stein steht.</w:t>
+        <w:t xml:space="preserve">Das Gebet, das im Stein steht — an die Gottheit gerichtet, doch der Stein ist das Medium; es verhallt nicht, es bleibt adressiert.</w:t>
+      </w:r>
+    </w:p>
+    <w:p>
+      <w:pPr>
+        <w:spacing w:after="40"/>
+      </w:pPr>
+      <w:r>
+        <w:rPr>
+          <w:rFonts w:ascii="Georgia" w:cs="Georgia" w:eastAsia="Georgia" w:hAnsi="Georgia"/>
+          <w:sz w:val="22"/>
+          <w:szCs w:val="22"/>
+        </w:rPr>
+        <w:t xml:space="preserve">Allat, Baalschamin, Schaihaqaum —</w:t>
+      </w:r>
+    </w:p>
+    <w:p>
+      <w:pPr>
+        <w:spacing w:after="40"/>
+      </w:pPr>
+      <w:r>
+        <w:rPr>
+          <w:rFonts w:ascii="Georgia" w:cs="Georgia" w:eastAsia="Georgia" w:hAnsi="Georgia"/>
+          <w:sz w:val="22"/>
+          <w:szCs w:val="22"/>
+        </w:rPr>
+        <w:t xml:space="preserve">bringt ihm den Geliebten zurück.</w:t>
+      </w:r>
+    </w:p>
+    <w:p>
+      <w:pPr>
+        <w:spacing w:after="280" w:before="60"/>
+      </w:pPr>
+      <w:r>
+        <w:rPr>
+          <w:rFonts w:ascii="Georgia" w:cs="Georgia" w:eastAsia="Georgia" w:hAnsi="Georgia"/>
+          <w:color w:val="7A5C3E"/>
+          <w:sz w:val="16"/>
+          <w:szCs w:val="16"/>
+        </w:rPr>
+        <w:t xml:space="preserve">Sigle BS 209</w:t>
+      </w:r>
+    </w:p>
+    <w:p>
+      <w:pPr>
+        <w:spacing w:after="40"/>
+      </w:pPr>
+      <w:r>
+        <w:rPr>
+          <w:rFonts w:ascii="Georgia" w:cs="Georgia" w:eastAsia="Georgia" w:hAnsi="Georgia"/>
+          <w:sz w:val="22"/>
+          <w:szCs w:val="22"/>
+        </w:rPr>
+        <w:t xml:space="preserve">Nasr —</w:t>
+      </w:r>
+    </w:p>
+    <w:p>
+      <w:pPr>
+        <w:spacing w:after="40"/>
+      </w:pPr>
+      <w:r>
+        <w:rPr>
+          <w:rFonts w:ascii="Georgia" w:cs="Georgia" w:eastAsia="Georgia" w:hAnsi="Georgia"/>
+          <w:sz w:val="22"/>
+          <w:szCs w:val="22"/>
+        </w:rPr>
+        <w:t xml:space="preserve">hilf dem, der liebt,</w:t>
+      </w:r>
+    </w:p>
+    <w:p>
+      <w:pPr>
+        <w:spacing w:after="40"/>
+      </w:pPr>
+      <w:r>
+        <w:rPr>
+          <w:rFonts w:ascii="Georgia" w:cs="Georgia" w:eastAsia="Georgia" w:hAnsi="Georgia"/>
+          <w:sz w:val="22"/>
+          <w:szCs w:val="22"/>
+        </w:rPr>
+        <w:t xml:space="preserve">und nimm die Not.</w:t>
+      </w:r>
+    </w:p>
+    <w:p>
+      <w:pPr>
+        <w:spacing w:after="280" w:before="60"/>
+      </w:pPr>
+      <w:r>
+        <w:rPr>
+          <w:rFonts w:ascii="Georgia" w:cs="Georgia" w:eastAsia="Georgia" w:hAnsi="Georgia"/>
+          <w:color w:val="7A5C3E"/>
+          <w:sz w:val="16"/>
+          <w:szCs w:val="16"/>
+        </w:rPr>
+        <w:t xml:space="preserve">Sigle MKJS 80</w:t>
+      </w:r>
+    </w:p>
+    <w:p>
+      <w:pPr>
+        <w:spacing w:after="40"/>
+      </w:pPr>
+      <w:r>
+        <w:rPr>
+          <w:rFonts w:ascii="Georgia" w:cs="Georgia" w:eastAsia="Georgia" w:hAnsi="Georgia"/>
+          <w:sz w:val="22"/>
+          <w:szCs w:val="22"/>
+        </w:rPr>
+        <w:t xml:space="preserve">Allat —</w:t>
+      </w:r>
+    </w:p>
+    <w:p>
+      <w:pPr>
+        <w:spacing w:after="40"/>
+      </w:pPr>
+      <w:r>
+        <w:rPr>
+          <w:rFonts w:ascii="Georgia" w:cs="Georgia" w:eastAsia="Georgia" w:hAnsi="Georgia"/>
+          <w:sz w:val="22"/>
+          <w:szCs w:val="22"/>
+        </w:rPr>
+        <w:t xml:space="preserve">schenk langes Leben</w:t>
+      </w:r>
+    </w:p>
+    <w:p>
+      <w:pPr>
+        <w:spacing w:after="40"/>
+      </w:pPr>
+      <w:r>
+        <w:rPr>
+          <w:rFonts w:ascii="Georgia" w:cs="Georgia" w:eastAsia="Georgia" w:hAnsi="Georgia"/>
+          <w:sz w:val="22"/>
+          <w:szCs w:val="22"/>
+        </w:rPr>
+        <w:t xml:space="preserve">dem Bruder Kʿmh.</w:t>
+      </w:r>
+    </w:p>
+    <w:p>
+      <w:pPr>
+        <w:spacing w:after="280" w:before="60"/>
+      </w:pPr>
+      <w:r>
+        <w:rPr>
+          <w:rFonts w:ascii="Georgia" w:cs="Georgia" w:eastAsia="Georgia" w:hAnsi="Georgia"/>
+          <w:color w:val="7A5C3E"/>
+          <w:sz w:val="16"/>
+          <w:szCs w:val="16"/>
+        </w:rPr>
+        <w:t xml:space="preserve">Sigle LP 1267</w:t>
+      </w:r>
+    </w:p>
+    <w:p>
+      <w:pPr>
+        <w:spacing w:after="40"/>
+      </w:pPr>
+      <w:r>
+        <w:rPr>
+          <w:rFonts w:ascii="Georgia" w:cs="Georgia" w:eastAsia="Georgia" w:hAnsi="Georgia"/>
+          <w:sz w:val="22"/>
+          <w:szCs w:val="22"/>
+        </w:rPr>
+        <w:t xml:space="preserve">Der Winter brachte keinen Regen</w:t>
+      </w:r>
+    </w:p>
+    <w:p>
+      <w:pPr>
+        <w:spacing w:after="40"/>
+      </w:pPr>
+      <w:r>
+        <w:rPr>
+          <w:rFonts w:ascii="Georgia" w:cs="Georgia" w:eastAsia="Georgia" w:hAnsi="Georgia"/>
+          <w:sz w:val="22"/>
+          <w:szCs w:val="22"/>
+        </w:rPr>
+        <w:t xml:space="preserve">in dem Jahr, als Wdn floh.</w:t>
+      </w:r>
+    </w:p>
+    <w:p>
+      <w:pPr>
+        <w:spacing w:after="40"/>
+      </w:pPr>
+      <w:r>
+        <w:rPr>
+          <w:rFonts w:ascii="Georgia" w:cs="Georgia" w:eastAsia="Georgia" w:hAnsi="Georgia"/>
+          <w:sz w:val="22"/>
+          <w:szCs w:val="22"/>
+        </w:rPr>
+        <w:t xml:space="preserve">Baalschamin —</w:t>
+      </w:r>
+    </w:p>
+    <w:p>
+      <w:pPr>
+        <w:spacing w:after="40"/>
+      </w:pPr>
+      <w:r>
+        <w:rPr>
+          <w:rFonts w:ascii="Georgia" w:cs="Georgia" w:eastAsia="Georgia" w:hAnsi="Georgia"/>
+          <w:sz w:val="22"/>
+          <w:szCs w:val="22"/>
+        </w:rPr>
+        <w:t xml:space="preserve">nimm ihm die Angst und das Nichtwissen.</w:t>
+      </w:r>
+    </w:p>
+    <w:p>
+      <w:pPr>
+        <w:spacing w:after="280" w:before="60"/>
+      </w:pPr>
+      <w:r>
+        <w:rPr>
+          <w:rFonts w:ascii="Georgia" w:cs="Georgia" w:eastAsia="Georgia" w:hAnsi="Georgia"/>
+          <w:color w:val="7A5C3E"/>
+          <w:sz w:val="16"/>
+          <w:szCs w:val="16"/>
+        </w:rPr>
+        <w:t xml:space="preserve">Sigle Is.Mu 88</w:t>
       </w:r>
     </w:p>
     <w:p>
@@ -2096,7 +2784,7 @@
           <w:sz w:val="30"/>
           <w:szCs w:val="30"/>
         </w:rPr>
-        <w:t xml:space="preserve">Er klagt</w:t>
+        <w:t xml:space="preserve">Er klagt · Memorativ-Expressiv</w:t>
       </w:r>
     </w:p>
     <w:p>
@@ -2110,7 +2798,271 @@
           <w:sz w:val="20"/>
           <w:szCs w:val="20"/>
         </w:rPr>
-        <w:t xml:space="preserve">Memorativ — die Trauer als Denkmal; ein Chor aus vielen Händen.</w:t>
+        <w:t xml:space="preserve">Die Trauer als Denkmal — die Klage, dem Moment entzogen; die Namensliste ist die Form des Schmerzes.</w:t>
+      </w:r>
+    </w:p>
+    <w:p>
+      <w:pPr>
+        <w:spacing w:after="40"/>
+      </w:pPr>
+      <w:r>
+        <w:rPr>
+          <w:rFonts w:ascii="Georgia" w:cs="Georgia" w:eastAsia="Georgia" w:hAnsi="Georgia"/>
+          <w:sz w:val="22"/>
+          <w:szCs w:val="22"/>
+        </w:rPr>
+        <w:t xml:space="preserve">Er trauerte um die Schwester</w:t>
+      </w:r>
+    </w:p>
+    <w:p>
+      <w:pPr>
+        <w:spacing w:after="40"/>
+      </w:pPr>
+      <w:r>
+        <w:rPr>
+          <w:rFonts w:ascii="Georgia" w:cs="Georgia" w:eastAsia="Georgia" w:hAnsi="Georgia"/>
+          <w:sz w:val="22"/>
+          <w:szCs w:val="22"/>
+        </w:rPr>
+        <w:t xml:space="preserve">und weinte um sie</w:t>
+      </w:r>
+    </w:p>
+    <w:p>
+      <w:pPr>
+        <w:spacing w:after="40"/>
+      </w:pPr>
+      <w:r>
+        <w:rPr>
+          <w:rFonts w:ascii="Georgia" w:cs="Georgia" w:eastAsia="Georgia" w:hAnsi="Georgia"/>
+          <w:sz w:val="22"/>
+          <w:szCs w:val="22"/>
+        </w:rPr>
+        <w:t xml:space="preserve">und baute ihr dieses Grab,</w:t>
+      </w:r>
+    </w:p>
+    <w:p>
+      <w:pPr>
+        <w:spacing w:after="40"/>
+      </w:pPr>
+      <w:r>
+        <w:rPr>
+          <w:rFonts w:ascii="Georgia" w:cs="Georgia" w:eastAsia="Georgia" w:hAnsi="Georgia"/>
+          <w:sz w:val="22"/>
+          <w:szCs w:val="22"/>
+        </w:rPr>
+        <w:t xml:space="preserve">im Jahr, als er floh</w:t>
+      </w:r>
+    </w:p>
+    <w:p>
+      <w:pPr>
+        <w:spacing w:after="40"/>
+      </w:pPr>
+      <w:r>
+        <w:rPr>
+          <w:rFonts w:ascii="Georgia" w:cs="Georgia" w:eastAsia="Georgia" w:hAnsi="Georgia"/>
+          <w:sz w:val="22"/>
+          <w:szCs w:val="22"/>
+        </w:rPr>
+        <w:t xml:space="preserve">vor Nmrt, dem Mann der Regierung,</w:t>
+      </w:r>
+    </w:p>
+    <w:p>
+      <w:pPr>
+        <w:spacing w:after="40"/>
+      </w:pPr>
+      <w:r>
+        <w:rPr>
+          <w:rFonts w:ascii="Georgia" w:cs="Georgia" w:eastAsia="Georgia" w:hAnsi="Georgia"/>
+          <w:sz w:val="22"/>
+          <w:szCs w:val="22"/>
+        </w:rPr>
+        <w:t xml:space="preserve">zum Stamm ˥wḏ.</w:t>
+      </w:r>
+    </w:p>
+    <w:p>
+      <w:pPr>
+        <w:spacing w:after="280" w:before="60"/>
+      </w:pPr>
+      <w:r>
+        <w:rPr>
+          <w:rFonts w:ascii="Georgia" w:cs="Georgia" w:eastAsia="Georgia" w:hAnsi="Georgia"/>
+          <w:color w:val="7A5C3E"/>
+          <w:sz w:val="16"/>
+          <w:szCs w:val="16"/>
+        </w:rPr>
+        <w:t xml:space="preserve">Sigle LP 540</w:t>
+      </w:r>
+    </w:p>
+    <w:p>
+      <w:pPr>
+        <w:spacing w:after="40"/>
+      </w:pPr>
+      <w:r>
+        <w:rPr>
+          <w:rFonts w:ascii="Georgia" w:cs="Georgia" w:eastAsia="Georgia" w:hAnsi="Georgia"/>
+          <w:sz w:val="22"/>
+          <w:szCs w:val="22"/>
+        </w:rPr>
+        <w:t xml:space="preserve">Er fand die Schrift des Ms¹k</w:t>
+      </w:r>
+    </w:p>
+    <w:p>
+      <w:pPr>
+        <w:spacing w:after="40"/>
+      </w:pPr>
+      <w:r>
+        <w:rPr>
+          <w:rFonts w:ascii="Georgia" w:cs="Georgia" w:eastAsia="Georgia" w:hAnsi="Georgia"/>
+          <w:sz w:val="22"/>
+          <w:szCs w:val="22"/>
+        </w:rPr>
+        <w:t xml:space="preserve">und weinte,</w:t>
+      </w:r>
+    </w:p>
+    <w:p>
+      <w:pPr>
+        <w:spacing w:after="40"/>
+      </w:pPr>
+      <w:r>
+        <w:rPr>
+          <w:rFonts w:ascii="Georgia" w:cs="Georgia" w:eastAsia="Georgia" w:hAnsi="Georgia"/>
+          <w:sz w:val="22"/>
+          <w:szCs w:val="22"/>
+        </w:rPr>
+        <w:t xml:space="preserve">und die Trauer legte sich über ihn.</w:t>
+      </w:r>
+    </w:p>
+    <w:p>
+      <w:pPr>
+        <w:spacing w:after="40"/>
+      </w:pPr>
+      <w:r>
+        <w:rPr>
+          <w:rFonts w:ascii="Georgia" w:cs="Georgia" w:eastAsia="Georgia" w:hAnsi="Georgia"/>
+          <w:sz w:val="22"/>
+          <w:szCs w:val="22"/>
+        </w:rPr>
+        <w:t xml:space="preserve">Er dachte an den Bruder, den sie fortführten,</w:t>
+      </w:r>
+    </w:p>
+    <w:p>
+      <w:pPr>
+        <w:spacing w:after="40"/>
+      </w:pPr>
+      <w:r>
+        <w:rPr>
+          <w:rFonts w:ascii="Georgia" w:cs="Georgia" w:eastAsia="Georgia" w:hAnsi="Georgia"/>
+          <w:sz w:val="22"/>
+          <w:szCs w:val="22"/>
+        </w:rPr>
+        <w:t xml:space="preserve">und wurde schwer.</w:t>
+      </w:r>
+    </w:p>
+    <w:p>
+      <w:pPr>
+        <w:spacing w:after="280" w:before="60"/>
+      </w:pPr>
+      <w:r>
+        <w:rPr>
+          <w:rFonts w:ascii="Georgia" w:cs="Georgia" w:eastAsia="Georgia" w:hAnsi="Georgia"/>
+          <w:color w:val="7A5C3E"/>
+          <w:sz w:val="16"/>
+          <w:szCs w:val="16"/>
+        </w:rPr>
+        <w:t xml:space="preserve">Sigle KRS 17</w:t>
+      </w:r>
+    </w:p>
+    <w:p>
+      <w:pPr>
+        <w:spacing w:after="40"/>
+      </w:pPr>
+      <w:r>
+        <w:rPr>
+          <w:rFonts w:ascii="Georgia" w:cs="Georgia" w:eastAsia="Georgia" w:hAnsi="Georgia"/>
+          <w:sz w:val="22"/>
+          <w:szCs w:val="22"/>
+        </w:rPr>
+        <w:t xml:space="preserve">Er weinte vor Kummer</w:t>
+      </w:r>
+    </w:p>
+    <w:p>
+      <w:pPr>
+        <w:spacing w:after="40"/>
+      </w:pPr>
+      <w:r>
+        <w:rPr>
+          <w:rFonts w:ascii="Georgia" w:cs="Georgia" w:eastAsia="Georgia" w:hAnsi="Georgia"/>
+          <w:sz w:val="22"/>
+          <w:szCs w:val="22"/>
+        </w:rPr>
+        <w:t xml:space="preserve">um einen, den er liebte.</w:t>
+      </w:r>
+    </w:p>
+    <w:p>
+      <w:pPr>
+        <w:spacing w:after="280" w:before="60"/>
+      </w:pPr>
+      <w:r>
+        <w:rPr>
+          <w:rFonts w:ascii="Georgia" w:cs="Georgia" w:eastAsia="Georgia" w:hAnsi="Georgia"/>
+          <w:color w:val="7A5C3E"/>
+          <w:sz w:val="16"/>
+          <w:szCs w:val="16"/>
+        </w:rPr>
+        <w:t xml:space="preserve">Sigle AbaNS 361</w:t>
+      </w:r>
+    </w:p>
+    <w:p>
+      <w:pPr>
+        <w:spacing w:after="40"/>
+      </w:pPr>
+      <w:r>
+        <w:rPr>
+          <w:rFonts w:ascii="Georgia" w:cs="Georgia" w:eastAsia="Georgia" w:hAnsi="Georgia"/>
+          <w:sz w:val="22"/>
+          <w:szCs w:val="22"/>
+        </w:rPr>
+        <w:t xml:space="preserve">Er trauerte um den Vater</w:t>
+      </w:r>
+    </w:p>
+    <w:p>
+      <w:pPr>
+        <w:spacing w:after="40"/>
+      </w:pPr>
+      <w:r>
+        <w:rPr>
+          <w:rFonts w:ascii="Georgia" w:cs="Georgia" w:eastAsia="Georgia" w:hAnsi="Georgia"/>
+          <w:sz w:val="22"/>
+          <w:szCs w:val="22"/>
+        </w:rPr>
+        <w:t xml:space="preserve">und um den Bruder, zu früh dahin,</w:t>
+      </w:r>
+    </w:p>
+    <w:p>
+      <w:pPr>
+        <w:spacing w:after="40"/>
+      </w:pPr>
+      <w:r>
+        <w:rPr>
+          <w:rFonts w:ascii="Georgia" w:cs="Georgia" w:eastAsia="Georgia" w:hAnsi="Georgia"/>
+          <w:sz w:val="22"/>
+          <w:szCs w:val="22"/>
+        </w:rPr>
+        <w:t xml:space="preserve">und um Ḫlṣ und um ʾtm.</w:t>
+      </w:r>
+    </w:p>
+    <w:p>
+      <w:pPr>
+        <w:spacing w:after="280" w:before="60"/>
+      </w:pPr>
+      <w:r>
+        <w:rPr>
+          <w:rFonts w:ascii="Georgia" w:cs="Georgia" w:eastAsia="Georgia" w:hAnsi="Georgia"/>
+          <w:color w:val="7A5C3E"/>
+          <w:sz w:val="16"/>
+          <w:szCs w:val="16"/>
+        </w:rPr>
+        <w:t xml:space="preserve">Sigle C 4273</w:t>
       </w:r>
     </w:p>
     <w:p>
@@ -2561,7 +3513,7 @@
           <w:sz w:val="30"/>
           <w:szCs w:val="30"/>
         </w:rPr>
-        <w:t xml:space="preserve">Er verflucht</w:t>
+        <w:t xml:space="preserve">Er verflucht · Magisch-Deklarativ</w:t>
       </w:r>
     </w:p>
     <w:p>
@@ -2575,7 +3527,388 @@
           <w:sz w:val="20"/>
           <w:szCs w:val="20"/>
         </w:rPr>
-        <w:t xml:space="preserve">Deklarativ — der Fluch, der nie endet.</w:t>
+        <w:t xml:space="preserve">Der Fluch, der nie endet — der performativste Akt: ein gesprochener Fluch verhallt, ein gemeißelter gilt ewig.</w:t>
+      </w:r>
+    </w:p>
+    <w:p>
+      <w:pPr>
+        <w:spacing w:after="40"/>
+      </w:pPr>
+      <w:r>
+        <w:rPr>
+          <w:rFonts w:ascii="Georgia" w:cs="Georgia" w:eastAsia="Georgia" w:hAnsi="Georgia"/>
+          <w:sz w:val="22"/>
+          <w:szCs w:val="22"/>
+        </w:rPr>
+        <w:t xml:space="preserve">Von ʾlwhb, Sohn des Zmr, Sohn des Ḍkr.</w:t>
+      </w:r>
+    </w:p>
+    <w:p>
+      <w:pPr>
+        <w:spacing w:after="40"/>
+      </w:pPr>
+      <w:r>
+        <w:rPr>
+          <w:rFonts w:ascii="Georgia" w:cs="Georgia" w:eastAsia="Georgia" w:hAnsi="Georgia"/>
+          <w:sz w:val="22"/>
+          <w:szCs w:val="22"/>
+        </w:rPr>
+        <w:t xml:space="preserve">Und er dachte an sein Lamm,</w:t>
+      </w:r>
+    </w:p>
+    <w:p>
+      <w:pPr>
+        <w:spacing w:after="40"/>
+      </w:pPr>
+      <w:r>
+        <w:rPr>
+          <w:rFonts w:ascii="Georgia" w:cs="Georgia" w:eastAsia="Georgia" w:hAnsi="Georgia"/>
+          <w:sz w:val="22"/>
+          <w:szCs w:val="22"/>
+        </w:rPr>
+        <w:t xml:space="preserve">das der Wolf geschlagen hatte.</w:t>
+      </w:r>
+    </w:p>
+    <w:p>
+      <w:pPr>
+        <w:spacing w:after="40"/>
+      </w:pPr>
+      <w:r>
+        <w:rPr>
+          <w:rFonts w:ascii="Georgia" w:cs="Georgia" w:eastAsia="Georgia" w:hAnsi="Georgia"/>
+          <w:sz w:val="22"/>
+          <w:szCs w:val="22"/>
+        </w:rPr>
+        <w:t xml:space="preserve">B˥ls¹mn — gib Sicherheit,</w:t>
+      </w:r>
+    </w:p>
+    <w:p>
+      <w:pPr>
+        <w:spacing w:after="40"/>
+      </w:pPr>
+      <w:r>
+        <w:rPr>
+          <w:rFonts w:ascii="Georgia" w:cs="Georgia" w:eastAsia="Georgia" w:hAnsi="Georgia"/>
+          <w:sz w:val="22"/>
+          <w:szCs w:val="22"/>
+        </w:rPr>
+        <w:t xml:space="preserve">dass das Lagern leicht werde.</w:t>
+      </w:r>
+    </w:p>
+    <w:p>
+      <w:pPr>
+        <w:spacing w:after="40"/>
+      </w:pPr>
+      <w:r>
+        <w:rPr>
+          <w:rFonts w:ascii="Georgia" w:cs="Georgia" w:eastAsia="Georgia" w:hAnsi="Georgia"/>
+          <w:sz w:val="22"/>
+          <w:szCs w:val="22"/>
+        </w:rPr>
+        <w:t xml:space="preserve">Und wer diese Schrift austilgt: erblinde.</w:t>
+      </w:r>
+    </w:p>
+    <w:p>
+      <w:pPr>
+        <w:spacing w:after="40"/>
+      </w:pPr>
+      <w:r>
+        <w:rPr>
+          <w:rFonts w:ascii="Georgia" w:cs="Georgia" w:eastAsia="Georgia" w:hAnsi="Georgia"/>
+          <w:sz w:val="22"/>
+          <w:szCs w:val="22"/>
+        </w:rPr>
+        <w:t xml:space="preserve">Wer diese Schrift liest: lebe lang.</w:t>
+      </w:r>
+    </w:p>
+    <w:p>
+      <w:pPr>
+        <w:spacing w:after="280" w:before="60"/>
+      </w:pPr>
+      <w:r>
+        <w:rPr>
+          <w:rFonts w:ascii="Georgia" w:cs="Georgia" w:eastAsia="Georgia" w:hAnsi="Georgia"/>
+          <w:color w:val="7A5C3E"/>
+          <w:sz w:val="16"/>
+          <w:szCs w:val="16"/>
+        </w:rPr>
+        <w:t xml:space="preserve">Sigle C 4803</w:t>
+      </w:r>
+    </w:p>
+    <w:p>
+      <w:pPr>
+        <w:spacing w:after="40"/>
+      </w:pPr>
+      <w:r>
+        <w:rPr>
+          <w:rFonts w:ascii="Georgia" w:cs="Georgia" w:eastAsia="Georgia" w:hAnsi="Georgia"/>
+          <w:sz w:val="22"/>
+          <w:szCs w:val="22"/>
+        </w:rPr>
+        <w:t xml:space="preserve">Er gedachte des Ḍr</w:t>
+      </w:r>
+    </w:p>
+    <w:p>
+      <w:pPr>
+        <w:spacing w:after="40"/>
+      </w:pPr>
+      <w:r>
+        <w:rPr>
+          <w:rFonts w:ascii="Georgia" w:cs="Georgia" w:eastAsia="Georgia" w:hAnsi="Georgia"/>
+          <w:sz w:val="22"/>
+          <w:szCs w:val="22"/>
+        </w:rPr>
+        <w:t xml:space="preserve">und weinte um den Vater, um ˥bd, um den Oheim,</w:t>
+      </w:r>
+    </w:p>
+    <w:p>
+      <w:pPr>
+        <w:spacing w:after="40"/>
+      </w:pPr>
+      <w:r>
+        <w:rPr>
+          <w:rFonts w:ascii="Georgia" w:cs="Georgia" w:eastAsia="Georgia" w:hAnsi="Georgia"/>
+          <w:sz w:val="22"/>
+          <w:szCs w:val="22"/>
+        </w:rPr>
+        <w:t xml:space="preserve">und verstörte sich über die,</w:t>
+      </w:r>
+    </w:p>
+    <w:p>
+      <w:pPr>
+        <w:spacing w:after="40"/>
+      </w:pPr>
+      <w:r>
+        <w:rPr>
+          <w:rFonts w:ascii="Georgia" w:cs="Georgia" w:eastAsia="Georgia" w:hAnsi="Georgia"/>
+          <w:sz w:val="22"/>
+          <w:szCs w:val="22"/>
+        </w:rPr>
+        <w:t xml:space="preserve">die zu Schaden kamen und verloren gingen.</w:t>
+      </w:r>
+    </w:p>
+    <w:p>
+      <w:pPr>
+        <w:spacing w:after="40"/>
+      </w:pPr>
+      <w:r>
+        <w:rPr>
+          <w:rFonts w:ascii="Georgia" w:cs="Georgia" w:eastAsia="Georgia" w:hAnsi="Georgia"/>
+          <w:sz w:val="22"/>
+          <w:szCs w:val="22"/>
+        </w:rPr>
+        <w:t xml:space="preserve">Und er überwinterte abermals in der Ḥarrah</w:t>
+      </w:r>
+    </w:p>
+    <w:p>
+      <w:pPr>
+        <w:spacing w:after="40"/>
+      </w:pPr>
+      <w:r>
+        <w:rPr>
+          <w:rFonts w:ascii="Georgia" w:cs="Georgia" w:eastAsia="Georgia" w:hAnsi="Georgia"/>
+          <w:sz w:val="22"/>
+          <w:szCs w:val="22"/>
+        </w:rPr>
+        <w:t xml:space="preserve">und lagerte an diesem Ort.</w:t>
+      </w:r>
+    </w:p>
+    <w:p>
+      <w:pPr>
+        <w:spacing w:after="40"/>
+      </w:pPr>
+      <w:r>
+        <w:rPr>
+          <w:rFonts w:ascii="Georgia" w:cs="Georgia" w:eastAsia="Georgia" w:hAnsi="Georgia"/>
+          <w:sz w:val="22"/>
+          <w:szCs w:val="22"/>
+        </w:rPr>
+        <w:t xml:space="preserve">Wer diese Schrift austilgt:</w:t>
+      </w:r>
+    </w:p>
+    <w:p>
+      <w:pPr>
+        <w:spacing w:after="40"/>
+      </w:pPr>
+      <w:r>
+        <w:rPr>
+          <w:rFonts w:ascii="Georgia" w:cs="Georgia" w:eastAsia="Georgia" w:hAnsi="Georgia"/>
+          <w:sz w:val="22"/>
+          <w:szCs w:val="22"/>
+        </w:rPr>
+        <w:t xml:space="preserve">den befalle die Krätze,</w:t>
+      </w:r>
+    </w:p>
+    <w:p>
+      <w:pPr>
+        <w:spacing w:after="40"/>
+      </w:pPr>
+      <w:r>
+        <w:rPr>
+          <w:rFonts w:ascii="Georgia" w:cs="Georgia" w:eastAsia="Georgia" w:hAnsi="Georgia"/>
+          <w:sz w:val="22"/>
+          <w:szCs w:val="22"/>
+        </w:rPr>
+        <w:t xml:space="preserve">und man werfe ihn aus dem Grab.</w:t>
+      </w:r>
+    </w:p>
+    <w:p>
+      <w:pPr>
+        <w:spacing w:after="280" w:before="60"/>
+      </w:pPr>
+      <w:r>
+        <w:rPr>
+          <w:rFonts w:ascii="Georgia" w:cs="Georgia" w:eastAsia="Georgia" w:hAnsi="Georgia"/>
+          <w:color w:val="7A5C3E"/>
+          <w:sz w:val="16"/>
+          <w:szCs w:val="16"/>
+        </w:rPr>
+        <w:t xml:space="preserve">Sigle RSIS 351</w:t>
+      </w:r>
+    </w:p>
+    <w:p>
+      <w:pPr>
+        <w:spacing w:after="40"/>
+      </w:pPr>
+      <w:r>
+        <w:rPr>
+          <w:rFonts w:ascii="Georgia" w:cs="Georgia" w:eastAsia="Georgia" w:hAnsi="Georgia"/>
+          <w:sz w:val="22"/>
+          <w:szCs w:val="22"/>
+        </w:rPr>
+        <w:t xml:space="preserve">Er weinte, er trauerte</w:t>
+      </w:r>
+    </w:p>
+    <w:p>
+      <w:pPr>
+        <w:spacing w:after="40"/>
+      </w:pPr>
+      <w:r>
+        <w:rPr>
+          <w:rFonts w:ascii="Georgia" w:cs="Georgia" w:eastAsia="Georgia" w:hAnsi="Georgia"/>
+          <w:sz w:val="22"/>
+          <w:szCs w:val="22"/>
+        </w:rPr>
+        <w:t xml:space="preserve">um den Vater, den sie ermordeten.</w:t>
+      </w:r>
+    </w:p>
+    <w:p>
+      <w:pPr>
+        <w:spacing w:after="40"/>
+      </w:pPr>
+      <w:r>
+        <w:rPr>
+          <w:rFonts w:ascii="Georgia" w:cs="Georgia" w:eastAsia="Georgia" w:hAnsi="Georgia"/>
+          <w:sz w:val="22"/>
+          <w:szCs w:val="22"/>
+        </w:rPr>
+        <w:t xml:space="preserve">Er sehnte sich nach dem Oheim</w:t>
+      </w:r>
+    </w:p>
+    <w:p>
+      <w:pPr>
+        <w:spacing w:after="40"/>
+      </w:pPr>
+      <w:r>
+        <w:rPr>
+          <w:rFonts w:ascii="Georgia" w:cs="Georgia" w:eastAsia="Georgia" w:hAnsi="Georgia"/>
+          <w:sz w:val="22"/>
+          <w:szCs w:val="22"/>
+        </w:rPr>
+        <w:t xml:space="preserve">und allen Gefährten.</w:t>
+      </w:r>
+    </w:p>
+    <w:p>
+      <w:pPr>
+        <w:spacing w:after="40"/>
+      </w:pPr>
+      <w:r>
+        <w:rPr>
+          <w:rFonts w:ascii="Georgia" w:cs="Georgia" w:eastAsia="Georgia" w:hAnsi="Georgia"/>
+          <w:sz w:val="22"/>
+          <w:szCs w:val="22"/>
+        </w:rPr>
+        <w:t xml:space="preserve">Wer dies austilgt: erblinde.</w:t>
+      </w:r>
+    </w:p>
+    <w:p>
+      <w:pPr>
+        <w:spacing w:after="280" w:before="60"/>
+      </w:pPr>
+      <w:r>
+        <w:rPr>
+          <w:rFonts w:ascii="Georgia" w:cs="Georgia" w:eastAsia="Georgia" w:hAnsi="Georgia"/>
+          <w:color w:val="7A5C3E"/>
+          <w:sz w:val="16"/>
+          <w:szCs w:val="16"/>
+        </w:rPr>
+        <w:t xml:space="preserve">Sigle LP 243</w:t>
+      </w:r>
+    </w:p>
+    <w:p>
+      <w:pPr>
+        <w:spacing w:after="40"/>
+      </w:pPr>
+      <w:r>
+        <w:rPr>
+          <w:rFonts w:ascii="Georgia" w:cs="Georgia" w:eastAsia="Georgia" w:hAnsi="Georgia"/>
+          <w:sz w:val="22"/>
+          <w:szCs w:val="22"/>
+        </w:rPr>
+        <w:t xml:space="preserve">Er trauerte vor Schmerz</w:t>
+      </w:r>
+    </w:p>
+    <w:p>
+      <w:pPr>
+        <w:spacing w:after="40"/>
+      </w:pPr>
+      <w:r>
+        <w:rPr>
+          <w:rFonts w:ascii="Georgia" w:cs="Georgia" w:eastAsia="Georgia" w:hAnsi="Georgia"/>
+          <w:sz w:val="22"/>
+          <w:szCs w:val="22"/>
+        </w:rPr>
+        <w:t xml:space="preserve">um Nr, um Ṣfwn, um Ks¹ṭ,</w:t>
+      </w:r>
+    </w:p>
+    <w:p>
+      <w:pPr>
+        <w:spacing w:after="40"/>
+      </w:pPr>
+      <w:r>
+        <w:rPr>
+          <w:rFonts w:ascii="Georgia" w:cs="Georgia" w:eastAsia="Georgia" w:hAnsi="Georgia"/>
+          <w:sz w:val="22"/>
+          <w:szCs w:val="22"/>
+        </w:rPr>
+        <w:t xml:space="preserve">und war verstört um die Gefährten.</w:t>
+      </w:r>
+    </w:p>
+    <w:p>
+      <w:pPr>
+        <w:spacing w:after="40"/>
+      </w:pPr>
+      <w:r>
+        <w:rPr>
+          <w:rFonts w:ascii="Georgia" w:cs="Georgia" w:eastAsia="Georgia" w:hAnsi="Georgia"/>
+          <w:sz w:val="22"/>
+          <w:szCs w:val="22"/>
+        </w:rPr>
+        <w:t xml:space="preserve">Wer dies auskratzt: erblinde.</w:t>
+      </w:r>
+    </w:p>
+    <w:p>
+      <w:pPr>
+        <w:spacing w:after="280" w:before="60"/>
+      </w:pPr>
+      <w:r>
+        <w:rPr>
+          <w:rFonts w:ascii="Georgia" w:cs="Georgia" w:eastAsia="Georgia" w:hAnsi="Georgia"/>
+          <w:color w:val="7A5C3E"/>
+          <w:sz w:val="16"/>
+          <w:szCs w:val="16"/>
+        </w:rPr>
+        <w:t xml:space="preserve">Sigle C 2775</w:t>
       </w:r>
     </w:p>
     <w:p>
@@ -3468,7 +4801,7 @@
           <w:sz w:val="30"/>
           <w:szCs w:val="30"/>
         </w:rPr>
-        <w:t xml:space="preserve">Er bezeugt</w:t>
+        <w:t xml:space="preserve">Er bezeugt · Assertiv-Deferred</w:t>
       </w:r>
     </w:p>
     <w:p>
@@ -3482,7 +4815,440 @@
           <w:sz w:val="20"/>
           <w:szCs w:val="20"/>
         </w:rPr>
-        <w:t xml:space="preserve">Assertiv — Zeugnis für Unbekannte, die später kommen.</w:t>
+        <w:t xml:space="preserve">Zeugnis für Unbekannte — die Datierung als Akt: er war dabei, es war dieses Jahr; geschrieben für Fremde, die später kommen.</w:t>
+      </w:r>
+    </w:p>
+    <w:p>
+      <w:pPr>
+        <w:spacing w:after="40"/>
+      </w:pPr>
+      <w:r>
+        <w:rPr>
+          <w:rFonts w:ascii="Georgia" w:cs="Georgia" w:eastAsia="Georgia" w:hAnsi="Georgia"/>
+          <w:sz w:val="22"/>
+          <w:szCs w:val="22"/>
+        </w:rPr>
+        <w:t xml:space="preserve">Von Lbʾt, Sohn des Ḫṭs¹t, Sohn des Flṭt,</w:t>
+      </w:r>
+    </w:p>
+    <w:p>
+      <w:pPr>
+        <w:spacing w:after="40"/>
+      </w:pPr>
+      <w:r>
+        <w:rPr>
+          <w:rFonts w:ascii="Georgia" w:cs="Georgia" w:eastAsia="Georgia" w:hAnsi="Georgia"/>
+          <w:sz w:val="22"/>
+          <w:szCs w:val="22"/>
+        </w:rPr>
+        <w:t xml:space="preserve">Sohn des Bhs², Sohn des ʾḏnt, Sohn des ʾs¹lm,</w:t>
+      </w:r>
+    </w:p>
+    <w:p>
+      <w:pPr>
+        <w:spacing w:after="40"/>
+      </w:pPr>
+      <w:r>
+        <w:rPr>
+          <w:rFonts w:ascii="Georgia" w:cs="Georgia" w:eastAsia="Georgia" w:hAnsi="Georgia"/>
+          <w:sz w:val="22"/>
+          <w:szCs w:val="22"/>
+        </w:rPr>
+        <w:t xml:space="preserve">Sohn des Zkr, Sohn des Rfʾt, Sohn des Ws²yt,</w:t>
+      </w:r>
+    </w:p>
+    <w:p>
+      <w:pPr>
+        <w:spacing w:after="40"/>
+      </w:pPr>
+      <w:r>
+        <w:rPr>
+          <w:rFonts w:ascii="Georgia" w:cs="Georgia" w:eastAsia="Georgia" w:hAnsi="Georgia"/>
+          <w:sz w:val="22"/>
+          <w:szCs w:val="22"/>
+        </w:rPr>
+        <w:t xml:space="preserve">Sohn des Ḍf, Sohn des ˥gd, Sohn des T˥wḏ.</w:t>
+      </w:r>
+    </w:p>
+    <w:p>
+      <w:pPr>
+        <w:spacing w:after="40"/>
+      </w:pPr>
+      <w:r>
+        <w:rPr>
+          <w:rFonts w:ascii="Georgia" w:cs="Georgia" w:eastAsia="Georgia" w:hAnsi="Georgia"/>
+          <w:sz w:val="22"/>
+          <w:szCs w:val="22"/>
+        </w:rPr>
+        <w:t xml:space="preserve">Und er war an diesem Ort</w:t>
+      </w:r>
+    </w:p>
+    <w:p>
+      <w:pPr>
+        <w:spacing w:after="40"/>
+      </w:pPr>
+      <w:r>
+        <w:rPr>
+          <w:rFonts w:ascii="Georgia" w:cs="Georgia" w:eastAsia="Georgia" w:hAnsi="Georgia"/>
+          <w:sz w:val="22"/>
+          <w:szCs w:val="22"/>
+        </w:rPr>
+        <w:t xml:space="preserve">im Jahr, als Agrippa König war, der Sohn des Herodes,</w:t>
+      </w:r>
+    </w:p>
+    <w:p>
+      <w:pPr>
+        <w:spacing w:after="40"/>
+      </w:pPr>
+      <w:r>
+        <w:rPr>
+          <w:rFonts w:ascii="Georgia" w:cs="Georgia" w:eastAsia="Georgia" w:hAnsi="Georgia"/>
+          <w:sz w:val="22"/>
+          <w:szCs w:val="22"/>
+        </w:rPr>
+        <w:t xml:space="preserve">und er fand die Spuren seiner Mutterbrüder</w:t>
+      </w:r>
+    </w:p>
+    <w:p>
+      <w:pPr>
+        <w:spacing w:after="40"/>
+      </w:pPr>
+      <w:r>
+        <w:rPr>
+          <w:rFonts w:ascii="Georgia" w:cs="Georgia" w:eastAsia="Georgia" w:hAnsi="Georgia"/>
+          <w:sz w:val="22"/>
+          <w:szCs w:val="22"/>
+        </w:rPr>
+        <w:t xml:space="preserve">vom Stamm ʾs²ll —</w:t>
+      </w:r>
+    </w:p>
+    <w:p>
+      <w:pPr>
+        <w:spacing w:after="40"/>
+      </w:pPr>
+      <w:r>
+        <w:rPr>
+          <w:rFonts w:ascii="Georgia" w:cs="Georgia" w:eastAsia="Georgia" w:hAnsi="Georgia"/>
+          <w:sz w:val="22"/>
+          <w:szCs w:val="22"/>
+        </w:rPr>
+        <w:t xml:space="preserve">Tm und Grmʾ und ʾḥwḍ und Zbd —</w:t>
+      </w:r>
+    </w:p>
+    <w:p>
+      <w:pPr>
+        <w:spacing w:after="40"/>
+      </w:pPr>
+      <w:r>
+        <w:rPr>
+          <w:rFonts w:ascii="Georgia" w:cs="Georgia" w:eastAsia="Georgia" w:hAnsi="Georgia"/>
+          <w:sz w:val="22"/>
+          <w:szCs w:val="22"/>
+        </w:rPr>
+        <w:t xml:space="preserve">und trauerte vor Schmerz.</w:t>
+      </w:r>
+    </w:p>
+    <w:p>
+      <w:pPr>
+        <w:spacing w:after="40"/>
+      </w:pPr>
+      <w:r>
+        <w:rPr>
+          <w:rFonts w:ascii="Georgia" w:cs="Georgia" w:eastAsia="Georgia" w:hAnsi="Georgia"/>
+          <w:sz w:val="22"/>
+          <w:szCs w:val="22"/>
+        </w:rPr>
+        <w:t xml:space="preserve">Ds²ry und Lt:</w:t>
+      </w:r>
+    </w:p>
+    <w:p>
+      <w:pPr>
+        <w:spacing w:after="40"/>
+      </w:pPr>
+      <w:r>
+        <w:rPr>
+          <w:rFonts w:ascii="Georgia" w:cs="Georgia" w:eastAsia="Georgia" w:hAnsi="Georgia"/>
+          <w:sz w:val="22"/>
+          <w:szCs w:val="22"/>
+        </w:rPr>
+        <w:t xml:space="preserve">Beute dem, der die Schrift unversehrt lässt,</w:t>
+      </w:r>
+    </w:p>
+    <w:p>
+      <w:pPr>
+        <w:spacing w:after="40"/>
+      </w:pPr>
+      <w:r>
+        <w:rPr>
+          <w:rFonts w:ascii="Georgia" w:cs="Georgia" w:eastAsia="Georgia" w:hAnsi="Georgia"/>
+          <w:sz w:val="22"/>
+          <w:szCs w:val="22"/>
+        </w:rPr>
+        <w:t xml:space="preserve">Leid dem, der sie zerstört.</w:t>
+      </w:r>
+    </w:p>
+    <w:p>
+      <w:pPr>
+        <w:spacing w:after="280" w:before="60"/>
+      </w:pPr>
+      <w:r>
+        <w:rPr>
+          <w:rFonts w:ascii="Georgia" w:cs="Georgia" w:eastAsia="Georgia" w:hAnsi="Georgia"/>
+          <w:color w:val="7A5C3E"/>
+          <w:sz w:val="16"/>
+          <w:szCs w:val="16"/>
+        </w:rPr>
+        <w:t xml:space="preserve">Sigle HSNS 5</w:t>
+      </w:r>
+    </w:p>
+    <w:p>
+      <w:pPr>
+        <w:spacing w:after="40"/>
+      </w:pPr>
+      <w:r>
+        <w:rPr>
+          <w:rFonts w:ascii="Georgia" w:cs="Georgia" w:eastAsia="Georgia" w:hAnsi="Georgia"/>
+          <w:sz w:val="22"/>
+          <w:szCs w:val="22"/>
+        </w:rPr>
+        <w:t xml:space="preserve">Er lagerte am beständigen Wasser</w:t>
+      </w:r>
+    </w:p>
+    <w:p>
+      <w:pPr>
+        <w:spacing w:after="40"/>
+      </w:pPr>
+      <w:r>
+        <w:rPr>
+          <w:rFonts w:ascii="Georgia" w:cs="Georgia" w:eastAsia="Georgia" w:hAnsi="Georgia"/>
+          <w:sz w:val="22"/>
+          <w:szCs w:val="22"/>
+        </w:rPr>
+        <w:t xml:space="preserve">im Jahr, als die Legionen des Grmnqṣ bei Nqʾt standen.</w:t>
+      </w:r>
+    </w:p>
+    <w:p>
+      <w:pPr>
+        <w:spacing w:after="40"/>
+      </w:pPr>
+      <w:r>
+        <w:rPr>
+          <w:rFonts w:ascii="Georgia" w:cs="Georgia" w:eastAsia="Georgia" w:hAnsi="Georgia"/>
+          <w:sz w:val="22"/>
+          <w:szCs w:val="22"/>
+        </w:rPr>
+        <w:t xml:space="preserve">Und er trauerte:</w:t>
+      </w:r>
+    </w:p>
+    <w:p>
+      <w:pPr>
+        <w:spacing w:after="40"/>
+      </w:pPr>
+      <w:r>
+        <w:rPr>
+          <w:rFonts w:ascii="Georgia" w:cs="Georgia" w:eastAsia="Georgia" w:hAnsi="Georgia"/>
+          <w:sz w:val="22"/>
+          <w:szCs w:val="22"/>
+        </w:rPr>
+        <w:t xml:space="preserve">um Glḥn, erschlagen,</w:t>
+      </w:r>
+    </w:p>
+    <w:p>
+      <w:pPr>
+        <w:spacing w:after="40"/>
+      </w:pPr>
+      <w:r>
+        <w:rPr>
+          <w:rFonts w:ascii="Georgia" w:cs="Georgia" w:eastAsia="Georgia" w:hAnsi="Georgia"/>
+          <w:sz w:val="22"/>
+          <w:szCs w:val="22"/>
+        </w:rPr>
+        <w:t xml:space="preserve">um ʾbn, erschlagen,</w:t>
+      </w:r>
+    </w:p>
+    <w:p>
+      <w:pPr>
+        <w:spacing w:after="40"/>
+      </w:pPr>
+      <w:r>
+        <w:rPr>
+          <w:rFonts w:ascii="Georgia" w:cs="Georgia" w:eastAsia="Georgia" w:hAnsi="Georgia"/>
+          <w:sz w:val="22"/>
+          <w:szCs w:val="22"/>
+        </w:rPr>
+        <w:t xml:space="preserve">um M˥z, erschlagen,</w:t>
+      </w:r>
+    </w:p>
+    <w:p>
+      <w:pPr>
+        <w:spacing w:after="40"/>
+      </w:pPr>
+      <w:r>
+        <w:rPr>
+          <w:rFonts w:ascii="Georgia" w:cs="Georgia" w:eastAsia="Georgia" w:hAnsi="Georgia"/>
+          <w:sz w:val="22"/>
+          <w:szCs w:val="22"/>
+        </w:rPr>
+        <w:t xml:space="preserve">um Mlk, erschlagen,</w:t>
+      </w:r>
+    </w:p>
+    <w:p>
+      <w:pPr>
+        <w:spacing w:after="40"/>
+      </w:pPr>
+      <w:r>
+        <w:rPr>
+          <w:rFonts w:ascii="Georgia" w:cs="Georgia" w:eastAsia="Georgia" w:hAnsi="Georgia"/>
+          <w:sz w:val="22"/>
+          <w:szCs w:val="22"/>
+        </w:rPr>
+        <w:t xml:space="preserve">um Ns¹m,</w:t>
+      </w:r>
+    </w:p>
+    <w:p>
+      <w:pPr>
+        <w:spacing w:after="40"/>
+      </w:pPr>
+      <w:r>
+        <w:rPr>
+          <w:rFonts w:ascii="Georgia" w:cs="Georgia" w:eastAsia="Georgia" w:hAnsi="Georgia"/>
+          <w:sz w:val="22"/>
+          <w:szCs w:val="22"/>
+        </w:rPr>
+        <w:t xml:space="preserve">und um Ṭr aus dem Stamm S¹mw.</w:t>
+      </w:r>
+    </w:p>
+    <w:p>
+      <w:pPr>
+        <w:spacing w:after="280" w:before="60"/>
+      </w:pPr>
+      <w:r>
+        <w:rPr>
+          <w:rFonts w:ascii="Georgia" w:cs="Georgia" w:eastAsia="Georgia" w:hAnsi="Georgia"/>
+          <w:color w:val="7A5C3E"/>
+          <w:sz w:val="16"/>
+          <w:szCs w:val="16"/>
+        </w:rPr>
+        <w:t xml:space="preserve">Sigle LP 653</w:t>
+      </w:r>
+    </w:p>
+    <w:p>
+      <w:pPr>
+        <w:spacing w:after="40"/>
+      </w:pPr>
+      <w:r>
+        <w:rPr>
+          <w:rFonts w:ascii="Georgia" w:cs="Georgia" w:eastAsia="Georgia" w:hAnsi="Georgia"/>
+          <w:sz w:val="22"/>
+          <w:szCs w:val="22"/>
+        </w:rPr>
+        <w:t xml:space="preserve">Er weidete die Kamele</w:t>
+      </w:r>
+    </w:p>
+    <w:p>
+      <w:pPr>
+        <w:spacing w:after="40"/>
+      </w:pPr>
+      <w:r>
+        <w:rPr>
+          <w:rFonts w:ascii="Georgia" w:cs="Georgia" w:eastAsia="Georgia" w:hAnsi="Georgia"/>
+          <w:sz w:val="22"/>
+          <w:szCs w:val="22"/>
+        </w:rPr>
+        <w:t xml:space="preserve">auf dem Frühjahrsgras,</w:t>
+      </w:r>
+    </w:p>
+    <w:p>
+      <w:pPr>
+        <w:spacing w:after="40"/>
+      </w:pPr>
+      <w:r>
+        <w:rPr>
+          <w:rFonts w:ascii="Georgia" w:cs="Georgia" w:eastAsia="Georgia" w:hAnsi="Georgia"/>
+          <w:sz w:val="22"/>
+          <w:szCs w:val="22"/>
+        </w:rPr>
+        <w:t xml:space="preserve">im Jahr, als Rhy gegen die Nabatäer stritt,</w:t>
+      </w:r>
+    </w:p>
+    <w:p>
+      <w:pPr>
+        <w:spacing w:after="40"/>
+      </w:pPr>
+      <w:r>
+        <w:rPr>
+          <w:rFonts w:ascii="Georgia" w:cs="Georgia" w:eastAsia="Georgia" w:hAnsi="Georgia"/>
+          <w:sz w:val="22"/>
+          <w:szCs w:val="22"/>
+        </w:rPr>
+        <w:t xml:space="preserve">und hielt Ausschau nach den Hwlt.</w:t>
+      </w:r>
+    </w:p>
+    <w:p>
+      <w:pPr>
+        <w:spacing w:after="280" w:before="60"/>
+      </w:pPr>
+      <w:r>
+        <w:rPr>
+          <w:rFonts w:ascii="Georgia" w:cs="Georgia" w:eastAsia="Georgia" w:hAnsi="Georgia"/>
+          <w:color w:val="7A5C3E"/>
+          <w:sz w:val="16"/>
+          <w:szCs w:val="16"/>
+        </w:rPr>
+        <w:t xml:space="preserve">Sigle C 2670</w:t>
+      </w:r>
+    </w:p>
+    <w:p>
+      <w:pPr>
+        <w:spacing w:after="40"/>
+      </w:pPr>
+      <w:r>
+        <w:rPr>
+          <w:rFonts w:ascii="Georgia" w:cs="Georgia" w:eastAsia="Georgia" w:hAnsi="Georgia"/>
+          <w:sz w:val="22"/>
+          <w:szCs w:val="22"/>
+        </w:rPr>
+        <w:t xml:space="preserve">Er trauerte um die Schwester</w:t>
+      </w:r>
+    </w:p>
+    <w:p>
+      <w:pPr>
+        <w:spacing w:after="40"/>
+      </w:pPr>
+      <w:r>
+        <w:rPr>
+          <w:rFonts w:ascii="Georgia" w:cs="Georgia" w:eastAsia="Georgia" w:hAnsi="Georgia"/>
+          <w:sz w:val="22"/>
+          <w:szCs w:val="22"/>
+        </w:rPr>
+        <w:t xml:space="preserve">und ritt zur Verfolgung aus,</w:t>
+      </w:r>
+    </w:p>
+    <w:p>
+      <w:pPr>
+        <w:spacing w:after="40"/>
+      </w:pPr>
+      <w:r>
+        <w:rPr>
+          <w:rFonts w:ascii="Georgia" w:cs="Georgia" w:eastAsia="Georgia" w:hAnsi="Georgia"/>
+          <w:sz w:val="22"/>
+          <w:szCs w:val="22"/>
+        </w:rPr>
+        <w:t xml:space="preserve">im Jahr des Königs Rabbel.</w:t>
+      </w:r>
+    </w:p>
+    <w:p>
+      <w:pPr>
+        <w:spacing w:after="280" w:before="60"/>
+      </w:pPr>
+      <w:r>
+        <w:rPr>
+          <w:rFonts w:ascii="Georgia" w:cs="Georgia" w:eastAsia="Georgia" w:hAnsi="Georgia"/>
+          <w:color w:val="7A5C3E"/>
+          <w:sz w:val="16"/>
+          <w:szCs w:val="16"/>
+        </w:rPr>
+        <w:t xml:space="preserve">Sigle ISB 57</w:t>
       </w:r>
     </w:p>
     <w:p>
@@ -4232,7 +5998,7 @@
           <w:sz w:val="30"/>
           <w:szCs w:val="30"/>
         </w:rPr>
-        <w:t xml:space="preserve">Er schweigt</w:t>
+        <w:t xml:space="preserve">Er schweigt · Abwesenheitsakt</w:t>
       </w:r>
     </w:p>
     <w:p>
@@ -4246,7 +6012,322 @@
           <w:sz w:val="20"/>
           <w:szCs w:val="20"/>
         </w:rPr>
-        <w:t xml:space="preserve">Abwesenheitsakt — Lücken, die sprechen; nichts wird geglättet.</w:t>
+        <w:t xml:space="preserve">Lücken, die sprechen — nicht jede Lücke ist Zufall; was fehlt, wird durch sein Fehlen bezeichnet.</w:t>
+      </w:r>
+    </w:p>
+    <w:p>
+      <w:pPr>
+        <w:spacing w:after="40"/>
+      </w:pPr>
+      <w:r>
+        <w:rPr>
+          <w:rFonts w:ascii="Georgia" w:cs="Georgia" w:eastAsia="Georgia" w:hAnsi="Georgia"/>
+          <w:sz w:val="22"/>
+          <w:szCs w:val="22"/>
+        </w:rPr>
+        <w:t xml:space="preserve">Von S¹˥d, Sohn des Gls¹, Sohn des Ṣ˥d,</w:t>
+      </w:r>
+    </w:p>
+    <w:p>
+      <w:pPr>
+        <w:spacing w:after="40"/>
+      </w:pPr>
+      <w:r>
+        <w:rPr>
+          <w:rFonts w:ascii="Georgia" w:cs="Georgia" w:eastAsia="Georgia" w:hAnsi="Georgia"/>
+          <w:sz w:val="22"/>
+          <w:szCs w:val="22"/>
+        </w:rPr>
+        <w:t xml:space="preserve">Sohn des Mḥlm, Sohn des ʾn˥m, Sohn des L˥ṯmn.</w:t>
+      </w:r>
+    </w:p>
+    <w:p>
+      <w:pPr>
+        <w:spacing w:after="40"/>
+      </w:pPr>
+      <w:r>
+        <w:rPr>
+          <w:rFonts w:ascii="Georgia" w:cs="Georgia" w:eastAsia="Georgia" w:hAnsi="Georgia"/>
+          <w:sz w:val="22"/>
+          <w:szCs w:val="22"/>
+        </w:rPr>
+        <w:t xml:space="preserve">Und er trauerte um seinen Vater,</w:t>
+      </w:r>
+    </w:p>
+    <w:p>
+      <w:pPr>
+        <w:spacing w:after="40"/>
+      </w:pPr>
+      <w:r>
+        <w:rPr>
+          <w:rFonts w:ascii="Georgia" w:cs="Georgia" w:eastAsia="Georgia" w:hAnsi="Georgia"/>
+          <w:sz w:val="22"/>
+          <w:szCs w:val="22"/>
+        </w:rPr>
+        <w:t xml:space="preserve">und um einen, dessen Name fehlt,</w:t>
+      </w:r>
+    </w:p>
+    <w:p>
+      <w:pPr>
+        <w:spacing w:after="40"/>
+      </w:pPr>
+      <w:r>
+        <w:rPr>
+          <w:rFonts w:ascii="Georgia" w:cs="Georgia" w:eastAsia="Georgia" w:hAnsi="Georgia"/>
+          <w:sz w:val="22"/>
+          <w:szCs w:val="22"/>
+        </w:rPr>
+        <w:t xml:space="preserve">und um seine Schwester,</w:t>
+      </w:r>
+    </w:p>
+    <w:p>
+      <w:pPr>
+        <w:spacing w:after="40"/>
+      </w:pPr>
+      <w:r>
+        <w:rPr>
+          <w:rFonts w:ascii="Georgia" w:cs="Georgia" w:eastAsia="Georgia" w:hAnsi="Georgia"/>
+          <w:sz w:val="22"/>
+          <w:szCs w:val="22"/>
+        </w:rPr>
+        <w:t xml:space="preserve">und um eine, deren Name fehlt,</w:t>
+      </w:r>
+    </w:p>
+    <w:p>
+      <w:pPr>
+        <w:spacing w:after="40"/>
+      </w:pPr>
+      <w:r>
+        <w:rPr>
+          <w:rFonts w:ascii="Georgia" w:cs="Georgia" w:eastAsia="Georgia" w:hAnsi="Georgia"/>
+          <w:sz w:val="22"/>
+          <w:szCs w:val="22"/>
+        </w:rPr>
+        <w:t xml:space="preserve">und um ʾlṣqt,</w:t>
+      </w:r>
+    </w:p>
+    <w:p>
+      <w:pPr>
+        <w:spacing w:after="40"/>
+      </w:pPr>
+      <w:r>
+        <w:rPr>
+          <w:rFonts w:ascii="Georgia" w:cs="Georgia" w:eastAsia="Georgia" w:hAnsi="Georgia"/>
+          <w:sz w:val="22"/>
+          <w:szCs w:val="22"/>
+        </w:rPr>
+        <w:t xml:space="preserve">und um ʾn˥m,</w:t>
+      </w:r>
+    </w:p>
+    <w:p>
+      <w:pPr>
+        <w:spacing w:after="40"/>
+      </w:pPr>
+      <w:r>
+        <w:rPr>
+          <w:rFonts w:ascii="Georgia" w:cs="Georgia" w:eastAsia="Georgia" w:hAnsi="Georgia"/>
+          <w:sz w:val="22"/>
+          <w:szCs w:val="22"/>
+        </w:rPr>
+        <w:t xml:space="preserve">und um Ḥg, den er liebte,</w:t>
+      </w:r>
+    </w:p>
+    <w:p>
+      <w:pPr>
+        <w:spacing w:after="40"/>
+      </w:pPr>
+      <w:r>
+        <w:rPr>
+          <w:rFonts w:ascii="Georgia" w:cs="Georgia" w:eastAsia="Georgia" w:hAnsi="Georgia"/>
+          <w:sz w:val="22"/>
+          <w:szCs w:val="22"/>
+        </w:rPr>
+        <w:t xml:space="preserve">und um Rq, im Jahr des Qbr,</w:t>
+      </w:r>
+    </w:p>
+    <w:p>
+      <w:pPr>
+        <w:spacing w:after="40"/>
+      </w:pPr>
+      <w:r>
+        <w:rPr>
+          <w:rFonts w:ascii="Georgia" w:cs="Georgia" w:eastAsia="Georgia" w:hAnsi="Georgia"/>
+          <w:sz w:val="22"/>
+          <w:szCs w:val="22"/>
+        </w:rPr>
+        <w:t xml:space="preserve">und um Ġfr,</w:t>
+      </w:r>
+    </w:p>
+    <w:p>
+      <w:pPr>
+        <w:spacing w:after="40"/>
+      </w:pPr>
+      <w:r>
+        <w:rPr>
+          <w:rFonts w:ascii="Georgia" w:cs="Georgia" w:eastAsia="Georgia" w:hAnsi="Georgia"/>
+          <w:sz w:val="22"/>
+          <w:szCs w:val="22"/>
+        </w:rPr>
+        <w:t xml:space="preserve">und um ˥ḥmn, der gefangen war, im Jahr des Qbr,</w:t>
+      </w:r>
+    </w:p>
+    <w:p>
+      <w:pPr>
+        <w:spacing w:after="40"/>
+      </w:pPr>
+      <w:r>
+        <w:rPr>
+          <w:rFonts w:ascii="Georgia" w:cs="Georgia" w:eastAsia="Georgia" w:hAnsi="Georgia"/>
+          <w:sz w:val="22"/>
+          <w:szCs w:val="22"/>
+        </w:rPr>
+        <w:t xml:space="preserve">und um Ṣḥrt,</w:t>
+      </w:r>
+    </w:p>
+    <w:p>
+      <w:pPr>
+        <w:spacing w:after="40"/>
+      </w:pPr>
+      <w:r>
+        <w:rPr>
+          <w:rFonts w:ascii="Georgia" w:cs="Georgia" w:eastAsia="Georgia" w:hAnsi="Georgia"/>
+          <w:sz w:val="22"/>
+          <w:szCs w:val="22"/>
+        </w:rPr>
+        <w:t xml:space="preserve">und um Gb,</w:t>
+      </w:r>
+    </w:p>
+    <w:p>
+      <w:pPr>
+        <w:spacing w:after="40"/>
+      </w:pPr>
+      <w:r>
+        <w:rPr>
+          <w:rFonts w:ascii="Georgia" w:cs="Georgia" w:eastAsia="Georgia" w:hAnsi="Georgia"/>
+          <w:sz w:val="22"/>
+          <w:szCs w:val="22"/>
+        </w:rPr>
+        <w:t xml:space="preserve">und um einen, dessen Name fehlt,</w:t>
+      </w:r>
+    </w:p>
+    <w:p>
+      <w:pPr>
+        <w:spacing w:after="40"/>
+      </w:pPr>
+      <w:r>
+        <w:rPr>
+          <w:rFonts w:ascii="Georgia" w:cs="Georgia" w:eastAsia="Georgia" w:hAnsi="Georgia"/>
+          <w:sz w:val="22"/>
+          <w:szCs w:val="22"/>
+        </w:rPr>
+        <w:t xml:space="preserve">und um Ṣrf.</w:t>
+      </w:r>
+    </w:p>
+    <w:p>
+      <w:pPr>
+        <w:spacing w:after="280" w:before="60"/>
+      </w:pPr>
+      <w:r>
+        <w:rPr>
+          <w:rFonts w:ascii="Georgia" w:cs="Georgia" w:eastAsia="Georgia" w:hAnsi="Georgia"/>
+          <w:color w:val="7A5C3E"/>
+          <w:sz w:val="16"/>
+          <w:szCs w:val="16"/>
+        </w:rPr>
+        <w:t xml:space="preserve">Sigle RQ.A 5</w:t>
+      </w:r>
+    </w:p>
+    <w:p>
+      <w:pPr>
+        <w:spacing w:after="40"/>
+      </w:pPr>
+      <w:r>
+        <w:rPr>
+          <w:rFonts w:ascii="Georgia" w:cs="Georgia" w:eastAsia="Georgia" w:hAnsi="Georgia"/>
+          <w:sz w:val="22"/>
+          <w:szCs w:val="22"/>
+        </w:rPr>
+        <w:t xml:space="preserve">Er weidete die MSTY</w:t>
+      </w:r>
+    </w:p>
+    <w:p>
+      <w:pPr>
+        <w:spacing w:after="40"/>
+      </w:pPr>
+      <w:r>
+        <w:rPr>
+          <w:rFonts w:ascii="Georgia" w:cs="Georgia" w:eastAsia="Georgia" w:hAnsi="Georgia"/>
+          <w:sz w:val="22"/>
+          <w:szCs w:val="22"/>
+        </w:rPr>
+        <w:t xml:space="preserve">in einem Jahr,</w:t>
+      </w:r>
+    </w:p>
+    <w:p>
+      <w:pPr>
+        <w:spacing w:after="40"/>
+      </w:pPr>
+      <w:r>
+        <w:rPr>
+          <w:rFonts w:ascii="Georgia" w:cs="Georgia" w:eastAsia="Georgia" w:hAnsi="Georgia"/>
+          <w:sz w:val="22"/>
+          <w:szCs w:val="22"/>
+        </w:rPr>
+        <w:t xml:space="preserve">dessen Name fehlt.</w:t>
+      </w:r>
+    </w:p>
+    <w:p>
+      <w:pPr>
+        <w:spacing w:after="280" w:before="60"/>
+      </w:pPr>
+      <w:r>
+        <w:rPr>
+          <w:rFonts w:ascii="Georgia" w:cs="Georgia" w:eastAsia="Georgia" w:hAnsi="Georgia"/>
+          <w:color w:val="7A5C3E"/>
+          <w:sz w:val="16"/>
+          <w:szCs w:val="16"/>
+        </w:rPr>
+        <w:t xml:space="preserve">Sigle WH 1867.1</w:t>
+      </w:r>
+    </w:p>
+    <w:p>
+      <w:pPr>
+        <w:spacing w:after="40"/>
+      </w:pPr>
+      <w:r>
+        <w:rPr>
+          <w:rFonts w:ascii="Georgia" w:cs="Georgia" w:eastAsia="Georgia" w:hAnsi="Georgia"/>
+          <w:sz w:val="22"/>
+          <w:szCs w:val="22"/>
+        </w:rPr>
+        <w:t xml:space="preserve">Ḥlb.</w:t>
+      </w:r>
+    </w:p>
+    <w:p>
+      <w:pPr>
+        <w:spacing w:after="40"/>
+      </w:pPr>
+      <w:r>
+        <w:rPr>
+          <w:rFonts w:ascii="Georgia" w:cs="Georgia" w:eastAsia="Georgia" w:hAnsi="Georgia"/>
+          <w:sz w:val="22"/>
+          <w:szCs w:val="22"/>
+        </w:rPr>
+        <w:t xml:space="preserve">Und er weinte vor Kummer.</w:t>
+      </w:r>
+    </w:p>
+    <w:p>
+      <w:pPr>
+        <w:spacing w:after="280" w:before="60"/>
+      </w:pPr>
+      <w:r>
+        <w:rPr>
+          <w:rFonts w:ascii="Georgia" w:cs="Georgia" w:eastAsia="Georgia" w:hAnsi="Georgia"/>
+          <w:color w:val="7A5C3E"/>
+          <w:sz w:val="16"/>
+          <w:szCs w:val="16"/>
+        </w:rPr>
+        <w:t xml:space="preserve">Sigle WH 1501.2</w:t>
       </w:r>
     </w:p>
     <w:p>
@@ -5134,7 +7215,7 @@
           <w:sz w:val="22"/>
           <w:szCs w:val="22"/>
         </w:rPr>
-        <w:t xml:space="preserve">Jedes Register ist gezielt aus seinem eigenen Korpus-Material gespeist: die Signaturen für I, die Anrufungen für III, die Fluchformeln für V, die fragmentarischen Steine für VII, die datierten für VI. Die Auswahl ist kuratiert und nicht repräsentativ; jede Nachdichtung trägt die OCIANA-Sigle ihrer Quelle.</w:t>
+        <w:t xml:space="preserve">Jedes Register ist gezielt aus seinem eigenen Korpus-Material gespeist: die Signaturen für I, die Anrufungen für III, die Fluchformeln für V, die fragmentarischen Steine für VII, die datierten für VI. Den Auftakt geben je Register Kopfstücke aus der erweiterten Ausgabe (lange Inschriften zuerst). Die Auswahl ist kuratiert und nicht repräsentativ; jede Nachdichtung trägt die OCIANA-Sigle ihrer Quelle.</w:t>
       </w:r>
     </w:p>
     <w:p>

</xml_diff>

<commit_message>
feat(register): Ich-Form-Überschriften, war-hier-Litanei (I), Genealogie (II), ASWS 73 → VI
- Kapitelüberschriften auf das reine Ich-Form-Verb reduziert (schreibe,
  warte, bitte, klage, verfluche, bezeuge, schweige); Kapitel I „schreibe“
  als Ort der direktesten, mündungsfreien Schrift.
- Kapitel I: 13 „X war hier“-Zeilen (5 bestehende umgestellt + 8 neue
  Signaturen) — Präsenz als Litanei.
- Kapitel II: Genealogie-Gedicht LP 1196 (sieben Generationen + Späh-Verb)
  neu; ASWS 73 (datiert) nach VI verschoben, wo die Datierung trägt.
- 134 Stücke.

Co-Authored-By: Claude Opus 4.8 <noreply@anthropic.com>
Claude-Session: https://claude.ai/code/session_01WJ6p9HdvKuJ9ea1tbSE1cy
</commit_message>
<xml_diff>
--- a/safaitic-research/Poetics/register/wer_dies_liest_register.docx
+++ b/safaitic-research/Poetics/register/wer_dies_liest_register.docx
@@ -155,7 +155,7 @@
           <w:sz w:val="30"/>
           <w:szCs w:val="30"/>
         </w:rPr>
-        <w:t xml:space="preserve">Er war hier · Präsentativ</w:t>
+        <w:t xml:space="preserve">schreibe</w:t>
       </w:r>
     </w:p>
     <w:p>
@@ -342,7 +342,7 @@
           <w:sz w:val="22"/>
           <w:szCs w:val="22"/>
         </w:rPr>
-        <w:t xml:space="preserve">Von Bnḥt.</w:t>
+        <w:t xml:space="preserve">Bnḥt war hier.</w:t>
       </w:r>
     </w:p>
     <w:p>
@@ -369,7 +369,7 @@
           <w:sz w:val="22"/>
           <w:szCs w:val="22"/>
         </w:rPr>
-        <w:t xml:space="preserve">Von ʾnʿm.</w:t>
+        <w:t xml:space="preserve">ʾnʿm war hier.</w:t>
       </w:r>
     </w:p>
     <w:p>
@@ -396,7 +396,7 @@
           <w:sz w:val="22"/>
           <w:szCs w:val="22"/>
         </w:rPr>
-        <w:t xml:space="preserve">Von S¹ḫr.</w:t>
+        <w:t xml:space="preserve">S¹ḫr war hier.</w:t>
       </w:r>
     </w:p>
     <w:p>
@@ -423,7 +423,7 @@
           <w:sz w:val="22"/>
           <w:szCs w:val="22"/>
         </w:rPr>
-        <w:t xml:space="preserve">Von Gḥs².</w:t>
+        <w:t xml:space="preserve">Gḥs² war hier.</w:t>
       </w:r>
     </w:p>
     <w:p>
@@ -450,7 +450,7 @@
           <w:sz w:val="22"/>
           <w:szCs w:val="22"/>
         </w:rPr>
-        <w:t xml:space="preserve">Von Gḥs².</w:t>
+        <w:t xml:space="preserve">Gḥs² war hier.</w:t>
       </w:r>
     </w:p>
     <w:p>
@@ -465,6 +465,222 @@
           <w:szCs w:val="16"/>
         </w:rPr>
         <w:t xml:space="preserve">Sigle HCH 158.1</w:t>
+      </w:r>
+    </w:p>
+    <w:p>
+      <w:pPr>
+        <w:spacing w:after="40"/>
+      </w:pPr>
+      <w:r>
+        <w:rPr>
+          <w:rFonts w:ascii="Georgia" w:cs="Georgia" w:eastAsia="Georgia" w:hAnsi="Georgia"/>
+          <w:sz w:val="22"/>
+          <w:szCs w:val="22"/>
+        </w:rPr>
+        <w:t xml:space="preserve">ʿdy war hier.</w:t>
+      </w:r>
+    </w:p>
+    <w:p>
+      <w:pPr>
+        <w:spacing w:after="280" w:before="60"/>
+      </w:pPr>
+      <w:r>
+        <w:rPr>
+          <w:rFonts w:ascii="Georgia" w:cs="Georgia" w:eastAsia="Georgia" w:hAnsi="Georgia"/>
+          <w:color w:val="7A5C3E"/>
+          <w:sz w:val="16"/>
+          <w:szCs w:val="16"/>
+        </w:rPr>
+        <w:t xml:space="preserve">Sigle HCH 75</w:t>
+      </w:r>
+    </w:p>
+    <w:p>
+      <w:pPr>
+        <w:spacing w:after="40"/>
+      </w:pPr>
+      <w:r>
+        <w:rPr>
+          <w:rFonts w:ascii="Georgia" w:cs="Georgia" w:eastAsia="Georgia" w:hAnsi="Georgia"/>
+          <w:sz w:val="22"/>
+          <w:szCs w:val="22"/>
+        </w:rPr>
+        <w:t xml:space="preserve">S¹ʿd war hier.</w:t>
+      </w:r>
+    </w:p>
+    <w:p>
+      <w:pPr>
+        <w:spacing w:after="280" w:before="60"/>
+      </w:pPr>
+      <w:r>
+        <w:rPr>
+          <w:rFonts w:ascii="Georgia" w:cs="Georgia" w:eastAsia="Georgia" w:hAnsi="Georgia"/>
+          <w:color w:val="7A5C3E"/>
+          <w:sz w:val="16"/>
+          <w:szCs w:val="16"/>
+        </w:rPr>
+        <w:t xml:space="preserve">Sigle HCH 158.2</w:t>
+      </w:r>
+    </w:p>
+    <w:p>
+      <w:pPr>
+        <w:spacing w:after="40"/>
+      </w:pPr>
+      <w:r>
+        <w:rPr>
+          <w:rFonts w:ascii="Georgia" w:cs="Georgia" w:eastAsia="Georgia" w:hAnsi="Georgia"/>
+          <w:sz w:val="22"/>
+          <w:szCs w:val="22"/>
+        </w:rPr>
+        <w:t xml:space="preserve">ʿṭs¹ war hier.</w:t>
+      </w:r>
+    </w:p>
+    <w:p>
+      <w:pPr>
+        <w:spacing w:after="280" w:before="60"/>
+      </w:pPr>
+      <w:r>
+        <w:rPr>
+          <w:rFonts w:ascii="Georgia" w:cs="Georgia" w:eastAsia="Georgia" w:hAnsi="Georgia"/>
+          <w:color w:val="7A5C3E"/>
+          <w:sz w:val="16"/>
+          <w:szCs w:val="16"/>
+        </w:rPr>
+        <w:t xml:space="preserve">Sigle HCH 31.1</w:t>
+      </w:r>
+    </w:p>
+    <w:p>
+      <w:pPr>
+        <w:spacing w:after="40"/>
+      </w:pPr>
+      <w:r>
+        <w:rPr>
+          <w:rFonts w:ascii="Georgia" w:cs="Georgia" w:eastAsia="Georgia" w:hAnsi="Georgia"/>
+          <w:sz w:val="22"/>
+          <w:szCs w:val="22"/>
+        </w:rPr>
+        <w:t xml:space="preserve">S¹lf war hier.</w:t>
+      </w:r>
+    </w:p>
+    <w:p>
+      <w:pPr>
+        <w:spacing w:after="280" w:before="60"/>
+      </w:pPr>
+      <w:r>
+        <w:rPr>
+          <w:rFonts w:ascii="Georgia" w:cs="Georgia" w:eastAsia="Georgia" w:hAnsi="Georgia"/>
+          <w:color w:val="7A5C3E"/>
+          <w:sz w:val="16"/>
+          <w:szCs w:val="16"/>
+        </w:rPr>
+        <w:t xml:space="preserve">Sigle Rees 150</w:t>
+      </w:r>
+    </w:p>
+    <w:p>
+      <w:pPr>
+        <w:spacing w:after="40"/>
+      </w:pPr>
+      <w:r>
+        <w:rPr>
+          <w:rFonts w:ascii="Georgia" w:cs="Georgia" w:eastAsia="Georgia" w:hAnsi="Georgia"/>
+          <w:sz w:val="22"/>
+          <w:szCs w:val="22"/>
+        </w:rPr>
+        <w:t xml:space="preserve">ʾḫwn war hier.</w:t>
+      </w:r>
+    </w:p>
+    <w:p>
+      <w:pPr>
+        <w:spacing w:after="280" w:before="60"/>
+      </w:pPr>
+      <w:r>
+        <w:rPr>
+          <w:rFonts w:ascii="Georgia" w:cs="Georgia" w:eastAsia="Georgia" w:hAnsi="Georgia"/>
+          <w:color w:val="7A5C3E"/>
+          <w:sz w:val="16"/>
+          <w:szCs w:val="16"/>
+        </w:rPr>
+        <w:t xml:space="preserve">Sigle Rees 151</w:t>
+      </w:r>
+    </w:p>
+    <w:p>
+      <w:pPr>
+        <w:spacing w:after="40"/>
+      </w:pPr>
+      <w:r>
+        <w:rPr>
+          <w:rFonts w:ascii="Georgia" w:cs="Georgia" w:eastAsia="Georgia" w:hAnsi="Georgia"/>
+          <w:sz w:val="22"/>
+          <w:szCs w:val="22"/>
+        </w:rPr>
+        <w:t xml:space="preserve">S²d war hier.</w:t>
+      </w:r>
+    </w:p>
+    <w:p>
+      <w:pPr>
+        <w:spacing w:after="280" w:before="60"/>
+      </w:pPr>
+      <w:r>
+        <w:rPr>
+          <w:rFonts w:ascii="Georgia" w:cs="Georgia" w:eastAsia="Georgia" w:hAnsi="Georgia"/>
+          <w:color w:val="7A5C3E"/>
+          <w:sz w:val="16"/>
+          <w:szCs w:val="16"/>
+        </w:rPr>
+        <w:t xml:space="preserve">Sigle Rees 155</w:t>
+      </w:r>
+    </w:p>
+    <w:p>
+      <w:pPr>
+        <w:spacing w:after="40"/>
+      </w:pPr>
+      <w:r>
+        <w:rPr>
+          <w:rFonts w:ascii="Georgia" w:cs="Georgia" w:eastAsia="Georgia" w:hAnsi="Georgia"/>
+          <w:sz w:val="22"/>
+          <w:szCs w:val="22"/>
+        </w:rPr>
+        <w:t xml:space="preserve">Hnb war hier.</w:t>
+      </w:r>
+    </w:p>
+    <w:p>
+      <w:pPr>
+        <w:spacing w:after="280" w:before="60"/>
+      </w:pPr>
+      <w:r>
+        <w:rPr>
+          <w:rFonts w:ascii="Georgia" w:cs="Georgia" w:eastAsia="Georgia" w:hAnsi="Georgia"/>
+          <w:color w:val="7A5C3E"/>
+          <w:sz w:val="16"/>
+          <w:szCs w:val="16"/>
+        </w:rPr>
+        <w:t xml:space="preserve">Sigle Rees 161 4</w:t>
+      </w:r>
+    </w:p>
+    <w:p>
+      <w:pPr>
+        <w:spacing w:after="40"/>
+      </w:pPr>
+      <w:r>
+        <w:rPr>
+          <w:rFonts w:ascii="Georgia" w:cs="Georgia" w:eastAsia="Georgia" w:hAnsi="Georgia"/>
+          <w:sz w:val="22"/>
+          <w:szCs w:val="22"/>
+        </w:rPr>
+        <w:t xml:space="preserve">S¹drt war hier.</w:t>
+      </w:r>
+    </w:p>
+    <w:p>
+      <w:pPr>
+        <w:spacing w:after="280" w:before="60"/>
+      </w:pPr>
+      <w:r>
+        <w:rPr>
+          <w:rFonts w:ascii="Georgia" w:cs="Georgia" w:eastAsia="Georgia" w:hAnsi="Georgia"/>
+          <w:color w:val="7A5C3E"/>
+          <w:sz w:val="16"/>
+          <w:szCs w:val="16"/>
+        </w:rPr>
+        <w:t xml:space="preserve">Sigle Rees 176</w:t>
       </w:r>
     </w:p>
     <w:p>
@@ -923,7 +1139,7 @@
           <w:sz w:val="30"/>
           <w:szCs w:val="30"/>
         </w:rPr>
-        <w:t xml:space="preserve">Er wartet · Expressiv-Deferred</w:t>
+        <w:t xml:space="preserve">warte</w:t>
       </w:r>
     </w:p>
     <w:p>
@@ -950,163 +1166,6 @@
           <w:sz w:val="22"/>
           <w:szCs w:val="22"/>
         </w:rPr>
-        <w:t xml:space="preserve">Von Rbʾl, Sohn des Ḥnn, Sohn des Ẓ˥n,</w:t>
-      </w:r>
-    </w:p>
-    <w:p>
-      <w:pPr>
-        <w:spacing w:after="40"/>
-      </w:pPr>
-      <w:r>
-        <w:rPr>
-          <w:rFonts w:ascii="Georgia" w:cs="Georgia" w:eastAsia="Georgia" w:hAnsi="Georgia"/>
-          <w:sz w:val="22"/>
-          <w:szCs w:val="22"/>
-        </w:rPr>
-        <w:t xml:space="preserve">Sohn des Ḫyḏ, Sohn des ˥ḏr.</w:t>
-      </w:r>
-    </w:p>
-    <w:p>
-      <w:pPr>
-        <w:spacing w:after="40"/>
-      </w:pPr>
-      <w:r>
-        <w:rPr>
-          <w:rFonts w:ascii="Georgia" w:cs="Georgia" w:eastAsia="Georgia" w:hAnsi="Georgia"/>
-          <w:sz w:val="22"/>
-          <w:szCs w:val="22"/>
-        </w:rPr>
-        <w:t xml:space="preserve">Und er zog zum Wasser, der Dürre gewärtig —</w:t>
-      </w:r>
-    </w:p>
-    <w:p>
-      <w:pPr>
-        <w:spacing w:after="40"/>
-      </w:pPr>
-      <w:r>
-        <w:rPr>
-          <w:rFonts w:ascii="Georgia" w:cs="Georgia" w:eastAsia="Georgia" w:hAnsi="Georgia"/>
-          <w:sz w:val="22"/>
-          <w:szCs w:val="22"/>
-        </w:rPr>
-        <w:t xml:space="preserve">dann wieder im Wassermann, dann im Widder,</w:t>
-      </w:r>
-    </w:p>
-    <w:p>
-      <w:pPr>
-        <w:spacing w:after="40"/>
-      </w:pPr>
-      <w:r>
-        <w:rPr>
-          <w:rFonts w:ascii="Georgia" w:cs="Georgia" w:eastAsia="Georgia" w:hAnsi="Georgia"/>
-          <w:sz w:val="22"/>
-          <w:szCs w:val="22"/>
-        </w:rPr>
-        <w:t xml:space="preserve">dann in der Waage, dann abermals in der Waage,</w:t>
-      </w:r>
-    </w:p>
-    <w:p>
-      <w:pPr>
-        <w:spacing w:after="40"/>
-      </w:pPr>
-      <w:r>
-        <w:rPr>
-          <w:rFonts w:ascii="Georgia" w:cs="Georgia" w:eastAsia="Georgia" w:hAnsi="Georgia"/>
-          <w:sz w:val="22"/>
-          <w:szCs w:val="22"/>
-        </w:rPr>
-        <w:t xml:space="preserve">zwei Jahre in Folge —,</w:t>
-      </w:r>
-    </w:p>
-    <w:p>
-      <w:pPr>
-        <w:spacing w:after="40"/>
-      </w:pPr>
-      <w:r>
-        <w:rPr>
-          <w:rFonts w:ascii="Georgia" w:cs="Georgia" w:eastAsia="Georgia" w:hAnsi="Georgia"/>
-          <w:sz w:val="22"/>
-          <w:szCs w:val="22"/>
-        </w:rPr>
-        <w:t xml:space="preserve">und in dieser Zeit trauerte er vor Schmerz</w:t>
-      </w:r>
-    </w:p>
-    <w:p>
-      <w:pPr>
-        <w:spacing w:after="40"/>
-      </w:pPr>
-      <w:r>
-        <w:rPr>
-          <w:rFonts w:ascii="Georgia" w:cs="Georgia" w:eastAsia="Georgia" w:hAnsi="Georgia"/>
-          <w:sz w:val="22"/>
-          <w:szCs w:val="22"/>
-        </w:rPr>
-        <w:t xml:space="preserve">um einen, den er liebte,</w:t>
-      </w:r>
-    </w:p>
-    <w:p>
-      <w:pPr>
-        <w:spacing w:after="40"/>
-      </w:pPr>
-      <w:r>
-        <w:rPr>
-          <w:rFonts w:ascii="Georgia" w:cs="Georgia" w:eastAsia="Georgia" w:hAnsi="Georgia"/>
-          <w:sz w:val="22"/>
-          <w:szCs w:val="22"/>
-        </w:rPr>
-        <w:t xml:space="preserve">und um die Kamele, die er weidete,</w:t>
-      </w:r>
-    </w:p>
-    <w:p>
-      <w:pPr>
-        <w:spacing w:after="40"/>
-      </w:pPr>
-      <w:r>
-        <w:rPr>
-          <w:rFonts w:ascii="Georgia" w:cs="Georgia" w:eastAsia="Georgia" w:hAnsi="Georgia"/>
-          <w:sz w:val="22"/>
-          <w:szCs w:val="22"/>
-        </w:rPr>
-        <w:t xml:space="preserve">hinausgezogen aus der inneren Wüste,</w:t>
-      </w:r>
-    </w:p>
-    <w:p>
-      <w:pPr>
-        <w:spacing w:after="40"/>
-      </w:pPr>
-      <w:r>
-        <w:rPr>
-          <w:rFonts w:ascii="Georgia" w:cs="Georgia" w:eastAsia="Georgia" w:hAnsi="Georgia"/>
-          <w:sz w:val="22"/>
-          <w:szCs w:val="22"/>
-        </w:rPr>
-        <w:t xml:space="preserve">im Jahr, als Bnt starb.</w:t>
-      </w:r>
-    </w:p>
-    <w:p>
-      <w:pPr>
-        <w:spacing w:after="280" w:before="60"/>
-      </w:pPr>
-      <w:r>
-        <w:rPr>
-          <w:rFonts w:ascii="Georgia" w:cs="Georgia" w:eastAsia="Georgia" w:hAnsi="Georgia"/>
-          <w:color w:val="7A5C3E"/>
-          <w:sz w:val="16"/>
-          <w:szCs w:val="16"/>
-        </w:rPr>
-        <w:t xml:space="preserve">Sigle ASWS 73</w:t>
-      </w:r>
-    </w:p>
-    <w:p>
-      <w:pPr>
-        <w:spacing w:after="40"/>
-      </w:pPr>
-      <w:r>
-        <w:rPr>
-          <w:rFonts w:ascii="Georgia" w:cs="Georgia" w:eastAsia="Georgia" w:hAnsi="Georgia"/>
-          <w:sz w:val="22"/>
-          <w:szCs w:val="22"/>
-        </w:rPr>
         <w:t xml:space="preserve">Er war an diesem Ort</w:t>
       </w:r>
     </w:p>
@@ -1254,6 +1313,98 @@
           <w:szCs w:val="16"/>
         </w:rPr>
         <w:t xml:space="preserve">Sigle SIJ 30</w:t>
+      </w:r>
+    </w:p>
+    <w:p>
+      <w:pPr>
+        <w:spacing w:after="40"/>
+      </w:pPr>
+      <w:r>
+        <w:rPr>
+          <w:rFonts w:ascii="Georgia" w:cs="Georgia" w:eastAsia="Georgia" w:hAnsi="Georgia"/>
+          <w:sz w:val="22"/>
+          <w:szCs w:val="22"/>
+        </w:rPr>
+        <w:t xml:space="preserve">Von Ms¹wd, Sohn des Whbn,</w:t>
+      </w:r>
+    </w:p>
+    <w:p>
+      <w:pPr>
+        <w:spacing w:after="40"/>
+      </w:pPr>
+      <w:r>
+        <w:rPr>
+          <w:rFonts w:ascii="Georgia" w:cs="Georgia" w:eastAsia="Georgia" w:hAnsi="Georgia"/>
+          <w:sz w:val="22"/>
+          <w:szCs w:val="22"/>
+        </w:rPr>
+        <w:t xml:space="preserve">Sohn des Hrṯ, Sohn des Ms¹k,</w:t>
+      </w:r>
+    </w:p>
+    <w:p>
+      <w:pPr>
+        <w:spacing w:after="40"/>
+      </w:pPr>
+      <w:r>
+        <w:rPr>
+          <w:rFonts w:ascii="Georgia" w:cs="Georgia" w:eastAsia="Georgia" w:hAnsi="Georgia"/>
+          <w:sz w:val="22"/>
+          <w:szCs w:val="22"/>
+        </w:rPr>
+        <w:t xml:space="preserve">Sohn des Qmr, Sohn des ʿwḏ,</w:t>
+      </w:r>
+    </w:p>
+    <w:p>
+      <w:pPr>
+        <w:spacing w:after="40"/>
+      </w:pPr>
+      <w:r>
+        <w:rPr>
+          <w:rFonts w:ascii="Georgia" w:cs="Georgia" w:eastAsia="Georgia" w:hAnsi="Georgia"/>
+          <w:sz w:val="22"/>
+          <w:szCs w:val="22"/>
+        </w:rPr>
+        <w:t xml:space="preserve">Sohn des Whbʾl —</w:t>
+      </w:r>
+    </w:p>
+    <w:p>
+      <w:pPr>
+        <w:spacing w:after="40"/>
+      </w:pPr>
+      <w:r>
+        <w:rPr>
+          <w:rFonts w:ascii="Georgia" w:cs="Georgia" w:eastAsia="Georgia" w:hAnsi="Georgia"/>
+          <w:sz w:val="22"/>
+          <w:szCs w:val="22"/>
+        </w:rPr>
+        <w:t xml:space="preserve">und er hielt Ausschau</w:t>
+      </w:r>
+    </w:p>
+    <w:p>
+      <w:pPr>
+        <w:spacing w:after="40"/>
+      </w:pPr>
+      <w:r>
+        <w:rPr>
+          <w:rFonts w:ascii="Georgia" w:cs="Georgia" w:eastAsia="Georgia" w:hAnsi="Georgia"/>
+          <w:sz w:val="22"/>
+          <w:szCs w:val="22"/>
+        </w:rPr>
+        <w:t xml:space="preserve">nach dem Reiterzug.</w:t>
+      </w:r>
+    </w:p>
+    <w:p>
+      <w:pPr>
+        <w:spacing w:after="280" w:before="60"/>
+      </w:pPr>
+      <w:r>
+        <w:rPr>
+          <w:rFonts w:ascii="Georgia" w:cs="Georgia" w:eastAsia="Georgia" w:hAnsi="Georgia"/>
+          <w:color w:val="7A5C3E"/>
+          <w:sz w:val="16"/>
+          <w:szCs w:val="16"/>
+        </w:rPr>
+        <w:t xml:space="preserve">Sigle LP 1196</w:t>
       </w:r>
     </w:p>
     <w:p>
@@ -1925,7 +2076,7 @@
           <w:sz w:val="30"/>
           <w:szCs w:val="30"/>
         </w:rPr>
-        <w:t xml:space="preserve">Er bittet · Intermediär-Direktiv</w:t>
+        <w:t xml:space="preserve">bitte</w:t>
       </w:r>
     </w:p>
     <w:p>
@@ -2784,7 +2935,7 @@
           <w:sz w:val="30"/>
           <w:szCs w:val="30"/>
         </w:rPr>
-        <w:t xml:space="preserve">Er klagt · Memorativ-Expressiv</w:t>
+        <w:t xml:space="preserve">klage</w:t>
       </w:r>
     </w:p>
     <w:p>
@@ -3513,7 +3664,7 @@
           <w:sz w:val="30"/>
           <w:szCs w:val="30"/>
         </w:rPr>
-        <w:t xml:space="preserve">Er verflucht · Magisch-Deklarativ</w:t>
+        <w:t xml:space="preserve">verfluche</w:t>
       </w:r>
     </w:p>
     <w:p>
@@ -4801,7 +4952,7 @@
           <w:sz w:val="30"/>
           <w:szCs w:val="30"/>
         </w:rPr>
-        <w:t xml:space="preserve">Er bezeugt · Assertiv-Deferred</w:t>
+        <w:t xml:space="preserve">bezeuge</w:t>
       </w:r>
     </w:p>
     <w:p>
@@ -5142,6 +5293,163 @@
           <w:sz w:val="22"/>
           <w:szCs w:val="22"/>
         </w:rPr>
+        <w:t xml:space="preserve">Von Rbʾl, Sohn des Ḥnn, Sohn des Ẓ˥n,</w:t>
+      </w:r>
+    </w:p>
+    <w:p>
+      <w:pPr>
+        <w:spacing w:after="40"/>
+      </w:pPr>
+      <w:r>
+        <w:rPr>
+          <w:rFonts w:ascii="Georgia" w:cs="Georgia" w:eastAsia="Georgia" w:hAnsi="Georgia"/>
+          <w:sz w:val="22"/>
+          <w:szCs w:val="22"/>
+        </w:rPr>
+        <w:t xml:space="preserve">Sohn des Ḫyḏ, Sohn des ˥ḏr.</w:t>
+      </w:r>
+    </w:p>
+    <w:p>
+      <w:pPr>
+        <w:spacing w:after="40"/>
+      </w:pPr>
+      <w:r>
+        <w:rPr>
+          <w:rFonts w:ascii="Georgia" w:cs="Georgia" w:eastAsia="Georgia" w:hAnsi="Georgia"/>
+          <w:sz w:val="22"/>
+          <w:szCs w:val="22"/>
+        </w:rPr>
+        <w:t xml:space="preserve">Und er zog zum Wasser, der Dürre gewärtig —</w:t>
+      </w:r>
+    </w:p>
+    <w:p>
+      <w:pPr>
+        <w:spacing w:after="40"/>
+      </w:pPr>
+      <w:r>
+        <w:rPr>
+          <w:rFonts w:ascii="Georgia" w:cs="Georgia" w:eastAsia="Georgia" w:hAnsi="Georgia"/>
+          <w:sz w:val="22"/>
+          <w:szCs w:val="22"/>
+        </w:rPr>
+        <w:t xml:space="preserve">dann wieder im Wassermann, dann im Widder,</w:t>
+      </w:r>
+    </w:p>
+    <w:p>
+      <w:pPr>
+        <w:spacing w:after="40"/>
+      </w:pPr>
+      <w:r>
+        <w:rPr>
+          <w:rFonts w:ascii="Georgia" w:cs="Georgia" w:eastAsia="Georgia" w:hAnsi="Georgia"/>
+          <w:sz w:val="22"/>
+          <w:szCs w:val="22"/>
+        </w:rPr>
+        <w:t xml:space="preserve">dann in der Waage, dann abermals in der Waage,</w:t>
+      </w:r>
+    </w:p>
+    <w:p>
+      <w:pPr>
+        <w:spacing w:after="40"/>
+      </w:pPr>
+      <w:r>
+        <w:rPr>
+          <w:rFonts w:ascii="Georgia" w:cs="Georgia" w:eastAsia="Georgia" w:hAnsi="Georgia"/>
+          <w:sz w:val="22"/>
+          <w:szCs w:val="22"/>
+        </w:rPr>
+        <w:t xml:space="preserve">zwei Jahre in Folge —,</w:t>
+      </w:r>
+    </w:p>
+    <w:p>
+      <w:pPr>
+        <w:spacing w:after="40"/>
+      </w:pPr>
+      <w:r>
+        <w:rPr>
+          <w:rFonts w:ascii="Georgia" w:cs="Georgia" w:eastAsia="Georgia" w:hAnsi="Georgia"/>
+          <w:sz w:val="22"/>
+          <w:szCs w:val="22"/>
+        </w:rPr>
+        <w:t xml:space="preserve">und in dieser Zeit trauerte er vor Schmerz</w:t>
+      </w:r>
+    </w:p>
+    <w:p>
+      <w:pPr>
+        <w:spacing w:after="40"/>
+      </w:pPr>
+      <w:r>
+        <w:rPr>
+          <w:rFonts w:ascii="Georgia" w:cs="Georgia" w:eastAsia="Georgia" w:hAnsi="Georgia"/>
+          <w:sz w:val="22"/>
+          <w:szCs w:val="22"/>
+        </w:rPr>
+        <w:t xml:space="preserve">um einen, den er liebte,</w:t>
+      </w:r>
+    </w:p>
+    <w:p>
+      <w:pPr>
+        <w:spacing w:after="40"/>
+      </w:pPr>
+      <w:r>
+        <w:rPr>
+          <w:rFonts w:ascii="Georgia" w:cs="Georgia" w:eastAsia="Georgia" w:hAnsi="Georgia"/>
+          <w:sz w:val="22"/>
+          <w:szCs w:val="22"/>
+        </w:rPr>
+        <w:t xml:space="preserve">und um die Kamele, die er weidete,</w:t>
+      </w:r>
+    </w:p>
+    <w:p>
+      <w:pPr>
+        <w:spacing w:after="40"/>
+      </w:pPr>
+      <w:r>
+        <w:rPr>
+          <w:rFonts w:ascii="Georgia" w:cs="Georgia" w:eastAsia="Georgia" w:hAnsi="Georgia"/>
+          <w:sz w:val="22"/>
+          <w:szCs w:val="22"/>
+        </w:rPr>
+        <w:t xml:space="preserve">hinausgezogen aus der inneren Wüste,</w:t>
+      </w:r>
+    </w:p>
+    <w:p>
+      <w:pPr>
+        <w:spacing w:after="40"/>
+      </w:pPr>
+      <w:r>
+        <w:rPr>
+          <w:rFonts w:ascii="Georgia" w:cs="Georgia" w:eastAsia="Georgia" w:hAnsi="Georgia"/>
+          <w:sz w:val="22"/>
+          <w:szCs w:val="22"/>
+        </w:rPr>
+        <w:t xml:space="preserve">im Jahr, als Bnt starb.</w:t>
+      </w:r>
+    </w:p>
+    <w:p>
+      <w:pPr>
+        <w:spacing w:after="280" w:before="60"/>
+      </w:pPr>
+      <w:r>
+        <w:rPr>
+          <w:rFonts w:ascii="Georgia" w:cs="Georgia" w:eastAsia="Georgia" w:hAnsi="Georgia"/>
+          <w:color w:val="7A5C3E"/>
+          <w:sz w:val="16"/>
+          <w:szCs w:val="16"/>
+        </w:rPr>
+        <w:t xml:space="preserve">Sigle ASWS 73</w:t>
+      </w:r>
+    </w:p>
+    <w:p>
+      <w:pPr>
+        <w:spacing w:after="40"/>
+      </w:pPr>
+      <w:r>
+        <w:rPr>
+          <w:rFonts w:ascii="Georgia" w:cs="Georgia" w:eastAsia="Georgia" w:hAnsi="Georgia"/>
+          <w:sz w:val="22"/>
+          <w:szCs w:val="22"/>
+        </w:rPr>
         <w:t xml:space="preserve">Er weidete die Kamele</w:t>
       </w:r>
     </w:p>
@@ -5998,7 +6306,7 @@
           <w:sz w:val="30"/>
           <w:szCs w:val="30"/>
         </w:rPr>
-        <w:t xml:space="preserve">Er schweigt · Abwesenheitsakt</w:t>
+        <w:t xml:space="preserve">schweige</w:t>
       </w:r>
     </w:p>
     <w:p>

</xml_diff>

<commit_message>
feat(register): Fundort-Beizeilen + 8 verortete Ersätze aus starken Clustern
- Normalisierte Fundort-Angabe unter jeder Sigle (z. B. „Sigle HCH 117 ·
  Cairn of Haniʾ"); zwei Zonen (NO-Jordanien-Ḥarrah / Süd-Syrien-Ṣafā).
- 8 ortlose Korpus-Stimmen durch verortete aus starken Clustern ersetzt:
  WH 1116→RSIS 322, AWS 379→AbSWS 15, WH 1916→C 2194, RVP 1→AbSWS 42,
  ZN 4→C 2190, WH 1851→RWQ 304, RVP 10→C 1146, WAMS 4→SIJ 10.
- Bewusst „Fundort unbekannt" behalten: IV-Klage-Litanei (anonym),
  Fluchkatalog WH 368, drei v5-Kopfstücke (HYGQ 24, WH 1867.1, WH 1501.2).
- FINDSPOT als statisches Dict im Build-Skript (reproduzierbar).

Co-Authored-By: Claude Opus 4.8 <noreply@anthropic.com>
Claude-Session: https://claude.ai/code/session_01WJ6p9HdvKuJ9ea1tbSE1cy
</commit_message>
<xml_diff>
--- a/safaitic-research/Poetics/register/wer_dies_liest_register.docx
+++ b/safaitic-research/Poetics/register/wer_dies_liest_register.docx
@@ -222,7 +222,7 @@
           <w:sz w:val="16"/>
           <w:szCs w:val="16"/>
         </w:rPr>
-        <w:t xml:space="preserve">Sigle RWQ 342</w:t>
+        <w:t xml:space="preserve">Sigle RWQ 342 · Wādī Salma</w:t>
       </w:r>
     </w:p>
     <w:p>
@@ -275,7 +275,7 @@
           <w:sz w:val="16"/>
           <w:szCs w:val="16"/>
         </w:rPr>
-        <w:t xml:space="preserve">Sigle RWQ 187</w:t>
+        <w:t xml:space="preserve">Sigle RWQ 187 · Wādī Salma</w:t>
       </w:r>
     </w:p>
     <w:p>
@@ -302,7 +302,7 @@
           <w:sz w:val="16"/>
           <w:szCs w:val="16"/>
         </w:rPr>
-        <w:t xml:space="preserve">Sigle HYGQ 24</w:t>
+        <w:t xml:space="preserve">Sigle HYGQ 24 · Fundort unbekannt</w:t>
       </w:r>
     </w:p>
     <w:p>
@@ -329,7 +329,7 @@
           <w:sz w:val="16"/>
           <w:szCs w:val="16"/>
         </w:rPr>
-        <w:t xml:space="preserve">Sigle KRS 1341</w:t>
+        <w:t xml:space="preserve">Sigle KRS 1341 · Al-Mafraq</w:t>
       </w:r>
     </w:p>
     <w:p>
@@ -356,7 +356,7 @@
           <w:sz w:val="16"/>
           <w:szCs w:val="16"/>
         </w:rPr>
-        <w:t xml:space="preserve">Sigle JaS 16</w:t>
+        <w:t xml:space="preserve">Sigle JaS 16 · Km 612</w:t>
       </w:r>
     </w:p>
     <w:p>
@@ -383,7 +383,7 @@
           <w:sz w:val="16"/>
           <w:szCs w:val="16"/>
         </w:rPr>
-        <w:t xml:space="preserve">Sigle HCH 117</w:t>
+        <w:t xml:space="preserve">Sigle HCH 117 · Cairn of Haniʾ</w:t>
       </w:r>
     </w:p>
     <w:p>
@@ -410,7 +410,7 @@
           <w:sz w:val="16"/>
           <w:szCs w:val="16"/>
         </w:rPr>
-        <w:t xml:space="preserve">Sigle HCH 156</w:t>
+        <w:t xml:space="preserve">Sigle HCH 156 · Cairn of Haniʾ</w:t>
       </w:r>
     </w:p>
     <w:p>
@@ -437,7 +437,7 @@
           <w:sz w:val="16"/>
           <w:szCs w:val="16"/>
         </w:rPr>
-        <w:t xml:space="preserve">Sigle HCH 160</w:t>
+        <w:t xml:space="preserve">Sigle HCH 160 · Cairn of Haniʾ</w:t>
       </w:r>
     </w:p>
     <w:p>
@@ -464,7 +464,7 @@
           <w:sz w:val="16"/>
           <w:szCs w:val="16"/>
         </w:rPr>
-        <w:t xml:space="preserve">Sigle HCH 158.1</w:t>
+        <w:t xml:space="preserve">Sigle HCH 158.1 · Cairn of Haniʾ</w:t>
       </w:r>
     </w:p>
     <w:p>
@@ -491,7 +491,7 @@
           <w:sz w:val="16"/>
           <w:szCs w:val="16"/>
         </w:rPr>
-        <w:t xml:space="preserve">Sigle HCH 75</w:t>
+        <w:t xml:space="preserve">Sigle HCH 75 · Cairn of Haniʾ</w:t>
       </w:r>
     </w:p>
     <w:p>
@@ -518,7 +518,7 @@
           <w:sz w:val="16"/>
           <w:szCs w:val="16"/>
         </w:rPr>
-        <w:t xml:space="preserve">Sigle HCH 158.2</w:t>
+        <w:t xml:space="preserve">Sigle HCH 158.2 · Cairn of Haniʾ</w:t>
       </w:r>
     </w:p>
     <w:p>
@@ -545,7 +545,7 @@
           <w:sz w:val="16"/>
           <w:szCs w:val="16"/>
         </w:rPr>
-        <w:t xml:space="preserve">Sigle HCH 31.1</w:t>
+        <w:t xml:space="preserve">Sigle HCH 31.1 · Cairn of Haniʾ</w:t>
       </w:r>
     </w:p>
     <w:p>
@@ -572,7 +572,7 @@
           <w:sz w:val="16"/>
           <w:szCs w:val="16"/>
         </w:rPr>
-        <w:t xml:space="preserve">Sigle Rees 150</w:t>
+        <w:t xml:space="preserve">Sigle Rees 150 · Ḥarrat al-Raǧil</w:t>
       </w:r>
     </w:p>
     <w:p>
@@ -599,7 +599,7 @@
           <w:sz w:val="16"/>
           <w:szCs w:val="16"/>
         </w:rPr>
-        <w:t xml:space="preserve">Sigle Rees 151</w:t>
+        <w:t xml:space="preserve">Sigle Rees 151 · Ḥarrat al-Raǧil</w:t>
       </w:r>
     </w:p>
     <w:p>
@@ -626,7 +626,7 @@
           <w:sz w:val="16"/>
           <w:szCs w:val="16"/>
         </w:rPr>
-        <w:t xml:space="preserve">Sigle Rees 155</w:t>
+        <w:t xml:space="preserve">Sigle Rees 155 · Ḥarrat al-Raǧil</w:t>
       </w:r>
     </w:p>
     <w:p>
@@ -653,7 +653,7 @@
           <w:sz w:val="16"/>
           <w:szCs w:val="16"/>
         </w:rPr>
-        <w:t xml:space="preserve">Sigle Rees 161 4</w:t>
+        <w:t xml:space="preserve">Sigle Rees 161 4 · Ḥarrat al-Raǧil</w:t>
       </w:r>
     </w:p>
     <w:p>
@@ -680,7 +680,7 @@
           <w:sz w:val="16"/>
           <w:szCs w:val="16"/>
         </w:rPr>
-        <w:t xml:space="preserve">Sigle Rees 176</w:t>
+        <w:t xml:space="preserve">Sigle Rees 176 · Ḥarrat al-Raǧil</w:t>
       </w:r>
     </w:p>
     <w:p>
@@ -746,7 +746,7 @@
           <w:sz w:val="16"/>
           <w:szCs w:val="16"/>
         </w:rPr>
-        <w:t xml:space="preserve">Sigle JaS 4</w:t>
+        <w:t xml:space="preserve">Sigle JaS 4 · Km 612</w:t>
       </w:r>
     </w:p>
     <w:p>
@@ -799,7 +799,7 @@
           <w:sz w:val="16"/>
           <w:szCs w:val="16"/>
         </w:rPr>
-        <w:t xml:space="preserve">Sigle JaS 5</w:t>
+        <w:t xml:space="preserve">Sigle JaS 5 · Km 612</w:t>
       </w:r>
     </w:p>
     <w:p>
@@ -839,7 +839,7 @@
           <w:sz w:val="16"/>
           <w:szCs w:val="16"/>
         </w:rPr>
-        <w:t xml:space="preserve">Sigle JaS 15</w:t>
+        <w:t xml:space="preserve">Sigle JaS 15 · Km 612</w:t>
       </w:r>
     </w:p>
     <w:p>
@@ -879,7 +879,7 @@
           <w:sz w:val="16"/>
           <w:szCs w:val="16"/>
         </w:rPr>
-        <w:t xml:space="preserve">Sigle JaS 22</w:t>
+        <w:t xml:space="preserve">Sigle JaS 22 · Km 612</w:t>
       </w:r>
     </w:p>
     <w:p>
@@ -932,7 +932,7 @@
           <w:sz w:val="16"/>
           <w:szCs w:val="16"/>
         </w:rPr>
-        <w:t xml:space="preserve">Sigle JaS 13</w:t>
+        <w:t xml:space="preserve">Sigle JaS 13 · Km 612</w:t>
       </w:r>
     </w:p>
     <w:p>
@@ -972,7 +972,7 @@
           <w:sz w:val="16"/>
           <w:szCs w:val="16"/>
         </w:rPr>
-        <w:t xml:space="preserve">Sigle JaS 21</w:t>
+        <w:t xml:space="preserve">Sigle JaS 21 · Km 612</w:t>
       </w:r>
     </w:p>
     <w:p>
@@ -1012,7 +1012,7 @@
           <w:sz w:val="16"/>
           <w:szCs w:val="16"/>
         </w:rPr>
-        <w:t xml:space="preserve">Sigle HCH 99</w:t>
+        <w:t xml:space="preserve">Sigle HCH 99 · Cairn of Haniʾ</w:t>
       </w:r>
     </w:p>
     <w:p>
@@ -1065,7 +1065,7 @@
           <w:sz w:val="16"/>
           <w:szCs w:val="16"/>
         </w:rPr>
-        <w:t xml:space="preserve">Sigle HCH 22</w:t>
+        <w:t xml:space="preserve">Sigle HCH 22 · Cairn of Haniʾ</w:t>
       </w:r>
     </w:p>
     <w:p>
@@ -1105,7 +1105,7 @@
           <w:sz w:val="16"/>
           <w:szCs w:val="16"/>
         </w:rPr>
-        <w:t xml:space="preserve">Sigle HCH 38</w:t>
+        <w:t xml:space="preserve">Sigle HCH 38 · Cairn of Haniʾ</w:t>
       </w:r>
     </w:p>
     <w:p>
@@ -1206,7 +1206,7 @@
           <w:sz w:val="16"/>
           <w:szCs w:val="16"/>
         </w:rPr>
-        <w:t xml:space="preserve">Sigle RSIS 110</w:t>
+        <w:t xml:space="preserve">Sigle RSIS 110 · Tall aḍ-Ḍabiʿ</w:t>
       </w:r>
     </w:p>
     <w:p>
@@ -1259,7 +1259,7 @@
           <w:sz w:val="16"/>
           <w:szCs w:val="16"/>
         </w:rPr>
-        <w:t xml:space="preserve">Sigle Is.Mu 255</w:t>
+        <w:t xml:space="preserve">Sigle Is.Mu 255 · al-ʿĪsāwī</w:t>
       </w:r>
     </w:p>
     <w:p>
@@ -1312,7 +1312,7 @@
           <w:sz w:val="16"/>
           <w:szCs w:val="16"/>
         </w:rPr>
-        <w:t xml:space="preserve">Sigle SIJ 30</w:t>
+        <w:t xml:space="preserve">Sigle SIJ 30 · Jathum</w:t>
       </w:r>
     </w:p>
     <w:p>
@@ -1404,7 +1404,7 @@
           <w:sz w:val="16"/>
           <w:szCs w:val="16"/>
         </w:rPr>
-        <w:t xml:space="preserve">Sigle LP 1196</w:t>
+        <w:t xml:space="preserve">Sigle LP 1196 · Rif Dimašq</w:t>
       </w:r>
     </w:p>
     <w:p>
@@ -1470,7 +1470,7 @@
           <w:sz w:val="16"/>
           <w:szCs w:val="16"/>
         </w:rPr>
-        <w:t xml:space="preserve">Sigle KRS 3051</w:t>
+        <w:t xml:space="preserve">Sigle KRS 3051 · Al-Mafraq</w:t>
       </w:r>
     </w:p>
     <w:p>
@@ -1510,7 +1510,7 @@
           <w:sz w:val="16"/>
           <w:szCs w:val="16"/>
         </w:rPr>
-        <w:t xml:space="preserve">Sigle CSNS 796</w:t>
+        <w:t xml:space="preserve">Sigle CSNS 796 · Qāʿ al-Maḥfūr</w:t>
       </w:r>
     </w:p>
     <w:p>
@@ -1563,7 +1563,7 @@
           <w:sz w:val="16"/>
           <w:szCs w:val="16"/>
         </w:rPr>
-        <w:t xml:space="preserve">Sigle C 2756</w:t>
+        <w:t xml:space="preserve">Sigle C 2756 · Zalaf</w:t>
       </w:r>
     </w:p>
     <w:p>
@@ -1603,7 +1603,233 @@
           <w:sz w:val="16"/>
           <w:szCs w:val="16"/>
         </w:rPr>
-        <w:t xml:space="preserve">Sigle C 2753</w:t>
+        <w:t xml:space="preserve">Sigle C 2753 · Zalaf</w:t>
+      </w:r>
+    </w:p>
+    <w:p>
+      <w:pPr>
+        <w:spacing w:after="40"/>
+      </w:pPr>
+      <w:r>
+        <w:rPr>
+          <w:rFonts w:ascii="Georgia" w:cs="Georgia" w:eastAsia="Georgia" w:hAnsi="Georgia"/>
+          <w:sz w:val="22"/>
+          <w:szCs w:val="22"/>
+        </w:rPr>
+        <w:t xml:space="preserve">Er hielt Wache,</w:t>
+      </w:r>
+    </w:p>
+    <w:p>
+      <w:pPr>
+        <w:spacing w:after="40"/>
+      </w:pPr>
+      <w:r>
+        <w:rPr>
+          <w:rFonts w:ascii="Georgia" w:cs="Georgia" w:eastAsia="Georgia" w:hAnsi="Georgia"/>
+          <w:sz w:val="22"/>
+          <w:szCs w:val="22"/>
+        </w:rPr>
+        <w:t xml:space="preserve">auf der Lauer nach dem Löwen.</w:t>
+      </w:r>
+    </w:p>
+    <w:p>
+      <w:pPr>
+        <w:spacing w:after="280" w:before="60"/>
+      </w:pPr>
+      <w:r>
+        <w:rPr>
+          <w:rFonts w:ascii="Georgia" w:cs="Georgia" w:eastAsia="Georgia" w:hAnsi="Georgia"/>
+          <w:color w:val="7A5C3E"/>
+          <w:sz w:val="16"/>
+          <w:szCs w:val="16"/>
+        </w:rPr>
+        <w:t xml:space="preserve">Sigle RSIS 322 · Tall aḍ-Ḍabiʿ</w:t>
+      </w:r>
+    </w:p>
+    <w:p>
+      <w:pPr>
+        <w:spacing w:after="40"/>
+      </w:pPr>
+      <w:r>
+        <w:rPr>
+          <w:rFonts w:ascii="Georgia" w:cs="Georgia" w:eastAsia="Georgia" w:hAnsi="Georgia"/>
+          <w:sz w:val="22"/>
+          <w:szCs w:val="22"/>
+        </w:rPr>
+        <w:t xml:space="preserve">Er zog in die innere Wüste</w:t>
+      </w:r>
+    </w:p>
+    <w:p>
+      <w:pPr>
+        <w:spacing w:after="40"/>
+      </w:pPr>
+      <w:r>
+        <w:rPr>
+          <w:rFonts w:ascii="Georgia" w:cs="Georgia" w:eastAsia="Georgia" w:hAnsi="Georgia"/>
+          <w:sz w:val="22"/>
+          <w:szCs w:val="22"/>
+        </w:rPr>
+        <w:t xml:space="preserve">und hielt Ausschau.</w:t>
+      </w:r>
+    </w:p>
+    <w:p>
+      <w:pPr>
+        <w:spacing w:after="280" w:before="60"/>
+      </w:pPr>
+      <w:r>
+        <w:rPr>
+          <w:rFonts w:ascii="Georgia" w:cs="Georgia" w:eastAsia="Georgia" w:hAnsi="Georgia"/>
+          <w:color w:val="7A5C3E"/>
+          <w:sz w:val="16"/>
+          <w:szCs w:val="16"/>
+        </w:rPr>
+        <w:t xml:space="preserve">Sigle WH 175 · WH Cairn 7</w:t>
+      </w:r>
+    </w:p>
+    <w:p>
+      <w:pPr>
+        <w:spacing w:after="40"/>
+      </w:pPr>
+      <w:r>
+        <w:rPr>
+          <w:rFonts w:ascii="Georgia" w:cs="Georgia" w:eastAsia="Georgia" w:hAnsi="Georgia"/>
+          <w:sz w:val="22"/>
+          <w:szCs w:val="22"/>
+        </w:rPr>
+        <w:t xml:space="preserve">Von S¹ʿd, Sohn des Ġyrʾl,</w:t>
+      </w:r>
+    </w:p>
+    <w:p>
+      <w:pPr>
+        <w:spacing w:after="40"/>
+      </w:pPr>
+      <w:r>
+        <w:rPr>
+          <w:rFonts w:ascii="Georgia" w:cs="Georgia" w:eastAsia="Georgia" w:hAnsi="Georgia"/>
+          <w:sz w:val="22"/>
+          <w:szCs w:val="22"/>
+        </w:rPr>
+        <w:t xml:space="preserve">Sohn des S¹krn, Sohn des Zkr,</w:t>
+      </w:r>
+    </w:p>
+    <w:p>
+      <w:pPr>
+        <w:spacing w:after="40"/>
+      </w:pPr>
+      <w:r>
+        <w:rPr>
+          <w:rFonts w:ascii="Georgia" w:cs="Georgia" w:eastAsia="Georgia" w:hAnsi="Georgia"/>
+          <w:sz w:val="22"/>
+          <w:szCs w:val="22"/>
+        </w:rPr>
+        <w:t xml:space="preserve">Sohn des Ẓnʾl —</w:t>
+      </w:r>
+    </w:p>
+    <w:p>
+      <w:pPr>
+        <w:spacing w:after="40"/>
+      </w:pPr>
+      <w:r>
+        <w:rPr>
+          <w:rFonts w:ascii="Georgia" w:cs="Georgia" w:eastAsia="Georgia" w:hAnsi="Georgia"/>
+          <w:sz w:val="22"/>
+          <w:szCs w:val="22"/>
+        </w:rPr>
+        <w:t xml:space="preserve">und er hielt Ausschau.</w:t>
+      </w:r>
+    </w:p>
+    <w:p>
+      <w:pPr>
+        <w:spacing w:after="280" w:before="60"/>
+      </w:pPr>
+      <w:r>
+        <w:rPr>
+          <w:rFonts w:ascii="Georgia" w:cs="Georgia" w:eastAsia="Georgia" w:hAnsi="Georgia"/>
+          <w:color w:val="7A5C3E"/>
+          <w:sz w:val="16"/>
+          <w:szCs w:val="16"/>
+        </w:rPr>
+        <w:t xml:space="preserve">Sigle AbSWS 15 · Wādī Salma</w:t>
+      </w:r>
+    </w:p>
+    <w:p>
+      <w:pPr>
+        <w:spacing w:after="40"/>
+      </w:pPr>
+      <w:r>
+        <w:rPr>
+          <w:rFonts w:ascii="Georgia" w:cs="Georgia" w:eastAsia="Georgia" w:hAnsi="Georgia"/>
+          <w:sz w:val="22"/>
+          <w:szCs w:val="22"/>
+        </w:rPr>
+        <w:t xml:space="preserve">Er ging mit den Ziegen</w:t>
+      </w:r>
+    </w:p>
+    <w:p>
+      <w:pPr>
+        <w:spacing w:after="40"/>
+      </w:pPr>
+      <w:r>
+        <w:rPr>
+          <w:rFonts w:ascii="Georgia" w:cs="Georgia" w:eastAsia="Georgia" w:hAnsi="Georgia"/>
+          <w:sz w:val="22"/>
+          <w:szCs w:val="22"/>
+        </w:rPr>
+        <w:t xml:space="preserve">und hielt Ausschau.</w:t>
+      </w:r>
+    </w:p>
+    <w:p>
+      <w:pPr>
+        <w:spacing w:after="280" w:before="60"/>
+      </w:pPr>
+      <w:r>
+        <w:rPr>
+          <w:rFonts w:ascii="Georgia" w:cs="Georgia" w:eastAsia="Georgia" w:hAnsi="Georgia"/>
+          <w:color w:val="7A5C3E"/>
+          <w:sz w:val="16"/>
+          <w:szCs w:val="16"/>
+        </w:rPr>
+        <w:t xml:space="preserve">Sigle KWQ 113 · Tell 5</w:t>
+      </w:r>
+    </w:p>
+    <w:p>
+      <w:pPr>
+        <w:spacing w:after="40"/>
+      </w:pPr>
+      <w:r>
+        <w:rPr>
+          <w:rFonts w:ascii="Georgia" w:cs="Georgia" w:eastAsia="Georgia" w:hAnsi="Georgia"/>
+          <w:sz w:val="22"/>
+          <w:szCs w:val="22"/>
+        </w:rPr>
+        <w:t xml:space="preserve">Er war auf der Lauer</w:t>
+      </w:r>
+    </w:p>
+    <w:p>
+      <w:pPr>
+        <w:spacing w:after="40"/>
+      </w:pPr>
+      <w:r>
+        <w:rPr>
+          <w:rFonts w:ascii="Georgia" w:cs="Georgia" w:eastAsia="Georgia" w:hAnsi="Georgia"/>
+          <w:sz w:val="22"/>
+          <w:szCs w:val="22"/>
+        </w:rPr>
+        <w:t xml:space="preserve">nach dem Löwen.</w:t>
+      </w:r>
+    </w:p>
+    <w:p>
+      <w:pPr>
+        <w:spacing w:after="280" w:before="60"/>
+      </w:pPr>
+      <w:r>
+        <w:rPr>
+          <w:rFonts w:ascii="Georgia" w:cs="Georgia" w:eastAsia="Georgia" w:hAnsi="Georgia"/>
+          <w:color w:val="7A5C3E"/>
+          <w:sz w:val="16"/>
+          <w:szCs w:val="16"/>
+        </w:rPr>
+        <w:t xml:space="preserve">Sigle ASWS 183 · Wādī Sārah</w:t>
       </w:r>
     </w:p>
     <w:p>
@@ -1629,34 +1855,34 @@
           <w:sz w:val="22"/>
           <w:szCs w:val="22"/>
         </w:rPr>
-        <w:t xml:space="preserve">und trauerte.</w:t>
-      </w:r>
-    </w:p>
-    <w:p>
-      <w:pPr>
-        <w:spacing w:after="280" w:before="60"/>
-      </w:pPr>
-      <w:r>
-        <w:rPr>
-          <w:rFonts w:ascii="Georgia" w:cs="Georgia" w:eastAsia="Georgia" w:hAnsi="Georgia"/>
-          <w:color w:val="7A5C3E"/>
-          <w:sz w:val="16"/>
-          <w:szCs w:val="16"/>
-        </w:rPr>
-        <w:t xml:space="preserve">Sigle WH 1116</w:t>
-      </w:r>
-    </w:p>
-    <w:p>
-      <w:pPr>
-        <w:spacing w:after="40"/>
-      </w:pPr>
-      <w:r>
-        <w:rPr>
-          <w:rFonts w:ascii="Georgia" w:cs="Georgia" w:eastAsia="Georgia" w:hAnsi="Georgia"/>
-          <w:sz w:val="22"/>
-          <w:szCs w:val="22"/>
-        </w:rPr>
-        <w:t xml:space="preserve">Er zog in die innere Wüste</w:t>
+        <w:t xml:space="preserve">nach den Pferden.</w:t>
+      </w:r>
+    </w:p>
+    <w:p>
+      <w:pPr>
+        <w:spacing w:after="280" w:before="60"/>
+      </w:pPr>
+      <w:r>
+        <w:rPr>
+          <w:rFonts w:ascii="Georgia" w:cs="Georgia" w:eastAsia="Georgia" w:hAnsi="Georgia"/>
+          <w:color w:val="7A5C3E"/>
+          <w:sz w:val="16"/>
+          <w:szCs w:val="16"/>
+        </w:rPr>
+        <w:t xml:space="preserve">Sigle CEDS 226 · EDS 80-5</w:t>
+      </w:r>
+    </w:p>
+    <w:p>
+      <w:pPr>
+        <w:spacing w:after="40"/>
+      </w:pPr>
+      <w:r>
+        <w:rPr>
+          <w:rFonts w:ascii="Georgia" w:cs="Georgia" w:eastAsia="Georgia" w:hAnsi="Georgia"/>
+          <w:sz w:val="22"/>
+          <w:szCs w:val="22"/>
+        </w:rPr>
+        <w:t xml:space="preserve">Er folgte den Kamelen</w:t>
       </w:r>
     </w:p>
     <w:p>
@@ -1683,113 +1909,20 @@
           <w:sz w:val="16"/>
           <w:szCs w:val="16"/>
         </w:rPr>
-        <w:t xml:space="preserve">Sigle WH 175</w:t>
-      </w:r>
-    </w:p>
-    <w:p>
-      <w:pPr>
-        <w:spacing w:after="40"/>
-      </w:pPr>
-      <w:r>
-        <w:rPr>
-          <w:rFonts w:ascii="Georgia" w:cs="Georgia" w:eastAsia="Georgia" w:hAnsi="Georgia"/>
-          <w:sz w:val="22"/>
-          <w:szCs w:val="22"/>
-        </w:rPr>
-        <w:t xml:space="preserve">Er weidete</w:t>
-      </w:r>
-    </w:p>
-    <w:p>
-      <w:pPr>
-        <w:spacing w:after="40"/>
-      </w:pPr>
-      <w:r>
-        <w:rPr>
-          <w:rFonts w:ascii="Georgia" w:cs="Georgia" w:eastAsia="Georgia" w:hAnsi="Georgia"/>
-          <w:sz w:val="22"/>
-          <w:szCs w:val="22"/>
-        </w:rPr>
-        <w:t xml:space="preserve">und hielt Ausschau nach Ks¹ṭ</w:t>
-      </w:r>
-    </w:p>
-    <w:p>
-      <w:pPr>
-        <w:spacing w:after="40"/>
-      </w:pPr>
-      <w:r>
-        <w:rPr>
-          <w:rFonts w:ascii="Georgia" w:cs="Georgia" w:eastAsia="Georgia" w:hAnsi="Georgia"/>
-          <w:sz w:val="22"/>
-          <w:szCs w:val="22"/>
-        </w:rPr>
-        <w:t xml:space="preserve">vom Stamm Ḍf.</w:t>
-      </w:r>
-    </w:p>
-    <w:p>
-      <w:pPr>
-        <w:spacing w:after="280" w:before="60"/>
-      </w:pPr>
-      <w:r>
-        <w:rPr>
-          <w:rFonts w:ascii="Georgia" w:cs="Georgia" w:eastAsia="Georgia" w:hAnsi="Georgia"/>
-          <w:color w:val="7A5C3E"/>
-          <w:sz w:val="16"/>
-          <w:szCs w:val="16"/>
-        </w:rPr>
-        <w:t xml:space="preserve">Sigle AWS 379</w:t>
-      </w:r>
-    </w:p>
-    <w:p>
-      <w:pPr>
-        <w:spacing w:after="40"/>
-      </w:pPr>
-      <w:r>
-        <w:rPr>
-          <w:rFonts w:ascii="Georgia" w:cs="Georgia" w:eastAsia="Georgia" w:hAnsi="Georgia"/>
-          <w:sz w:val="22"/>
-          <w:szCs w:val="22"/>
-        </w:rPr>
-        <w:t xml:space="preserve">Er ging mit den Ziegen</w:t>
-      </w:r>
-    </w:p>
-    <w:p>
-      <w:pPr>
-        <w:spacing w:after="40"/>
-      </w:pPr>
-      <w:r>
-        <w:rPr>
-          <w:rFonts w:ascii="Georgia" w:cs="Georgia" w:eastAsia="Georgia" w:hAnsi="Georgia"/>
-          <w:sz w:val="22"/>
-          <w:szCs w:val="22"/>
-        </w:rPr>
-        <w:t xml:space="preserve">und hielt Ausschau.</w:t>
-      </w:r>
-    </w:p>
-    <w:p>
-      <w:pPr>
-        <w:spacing w:after="280" w:before="60"/>
-      </w:pPr>
-      <w:r>
-        <w:rPr>
-          <w:rFonts w:ascii="Georgia" w:cs="Georgia" w:eastAsia="Georgia" w:hAnsi="Georgia"/>
-          <w:color w:val="7A5C3E"/>
-          <w:sz w:val="16"/>
-          <w:szCs w:val="16"/>
-        </w:rPr>
-        <w:t xml:space="preserve">Sigle KWQ 113</w:t>
-      </w:r>
-    </w:p>
-    <w:p>
-      <w:pPr>
-        <w:spacing w:after="40"/>
-      </w:pPr>
-      <w:r>
-        <w:rPr>
-          <w:rFonts w:ascii="Georgia" w:cs="Georgia" w:eastAsia="Georgia" w:hAnsi="Georgia"/>
-          <w:sz w:val="22"/>
-          <w:szCs w:val="22"/>
-        </w:rPr>
-        <w:t xml:space="preserve">Er war auf der Lauer</w:t>
+        <w:t xml:space="preserve">Sigle SIJ 323 · Jawa</w:t>
+      </w:r>
+    </w:p>
+    <w:p>
+      <w:pPr>
+        <w:spacing w:after="40"/>
+      </w:pPr>
+      <w:r>
+        <w:rPr>
+          <w:rFonts w:ascii="Georgia" w:cs="Georgia" w:eastAsia="Georgia" w:hAnsi="Georgia"/>
+          <w:sz w:val="22"/>
+          <w:szCs w:val="22"/>
+        </w:rPr>
+        <w:t xml:space="preserve">Er hielt Ausschau</w:t>
       </w:r>
     </w:p>
     <w:p>
@@ -1816,127 +1949,7 @@
           <w:sz w:val="16"/>
           <w:szCs w:val="16"/>
         </w:rPr>
-        <w:t xml:space="preserve">Sigle ASWS 183</w:t>
-      </w:r>
-    </w:p>
-    <w:p>
-      <w:pPr>
-        <w:spacing w:after="40"/>
-      </w:pPr>
-      <w:r>
-        <w:rPr>
-          <w:rFonts w:ascii="Georgia" w:cs="Georgia" w:eastAsia="Georgia" w:hAnsi="Georgia"/>
-          <w:sz w:val="22"/>
-          <w:szCs w:val="22"/>
-        </w:rPr>
-        <w:t xml:space="preserve">Er hielt Ausschau</w:t>
-      </w:r>
-    </w:p>
-    <w:p>
-      <w:pPr>
-        <w:spacing w:after="40"/>
-      </w:pPr>
-      <w:r>
-        <w:rPr>
-          <w:rFonts w:ascii="Georgia" w:cs="Georgia" w:eastAsia="Georgia" w:hAnsi="Georgia"/>
-          <w:sz w:val="22"/>
-          <w:szCs w:val="22"/>
-        </w:rPr>
-        <w:t xml:space="preserve">nach den Pferden.</w:t>
-      </w:r>
-    </w:p>
-    <w:p>
-      <w:pPr>
-        <w:spacing w:after="280" w:before="60"/>
-      </w:pPr>
-      <w:r>
-        <w:rPr>
-          <w:rFonts w:ascii="Georgia" w:cs="Georgia" w:eastAsia="Georgia" w:hAnsi="Georgia"/>
-          <w:color w:val="7A5C3E"/>
-          <w:sz w:val="16"/>
-          <w:szCs w:val="16"/>
-        </w:rPr>
-        <w:t xml:space="preserve">Sigle CEDS 226</w:t>
-      </w:r>
-    </w:p>
-    <w:p>
-      <w:pPr>
-        <w:spacing w:after="40"/>
-      </w:pPr>
-      <w:r>
-        <w:rPr>
-          <w:rFonts w:ascii="Georgia" w:cs="Georgia" w:eastAsia="Georgia" w:hAnsi="Georgia"/>
-          <w:sz w:val="22"/>
-          <w:szCs w:val="22"/>
-        </w:rPr>
-        <w:t xml:space="preserve">Er folgte den Kamelen</w:t>
-      </w:r>
-    </w:p>
-    <w:p>
-      <w:pPr>
-        <w:spacing w:after="40"/>
-      </w:pPr>
-      <w:r>
-        <w:rPr>
-          <w:rFonts w:ascii="Georgia" w:cs="Georgia" w:eastAsia="Georgia" w:hAnsi="Georgia"/>
-          <w:sz w:val="22"/>
-          <w:szCs w:val="22"/>
-        </w:rPr>
-        <w:t xml:space="preserve">und hielt Ausschau.</w:t>
-      </w:r>
-    </w:p>
-    <w:p>
-      <w:pPr>
-        <w:spacing w:after="280" w:before="60"/>
-      </w:pPr>
-      <w:r>
-        <w:rPr>
-          <w:rFonts w:ascii="Georgia" w:cs="Georgia" w:eastAsia="Georgia" w:hAnsi="Georgia"/>
-          <w:color w:val="7A5C3E"/>
-          <w:sz w:val="16"/>
-          <w:szCs w:val="16"/>
-        </w:rPr>
-        <w:t xml:space="preserve">Sigle SIJ 323</w:t>
-      </w:r>
-    </w:p>
-    <w:p>
-      <w:pPr>
-        <w:spacing w:after="40"/>
-      </w:pPr>
-      <w:r>
-        <w:rPr>
-          <w:rFonts w:ascii="Georgia" w:cs="Georgia" w:eastAsia="Georgia" w:hAnsi="Georgia"/>
-          <w:sz w:val="22"/>
-          <w:szCs w:val="22"/>
-        </w:rPr>
-        <w:t xml:space="preserve">Er hielt Ausschau</w:t>
-      </w:r>
-    </w:p>
-    <w:p>
-      <w:pPr>
-        <w:spacing w:after="40"/>
-      </w:pPr>
-      <w:r>
-        <w:rPr>
-          <w:rFonts w:ascii="Georgia" w:cs="Georgia" w:eastAsia="Georgia" w:hAnsi="Georgia"/>
-          <w:sz w:val="22"/>
-          <w:szCs w:val="22"/>
-        </w:rPr>
-        <w:t xml:space="preserve">nach dem Löwen.</w:t>
-      </w:r>
-    </w:p>
-    <w:p>
-      <w:pPr>
-        <w:spacing w:after="280" w:before="60"/>
-      </w:pPr>
-      <w:r>
-        <w:rPr>
-          <w:rFonts w:ascii="Georgia" w:cs="Georgia" w:eastAsia="Georgia" w:hAnsi="Georgia"/>
-          <w:color w:val="7A5C3E"/>
-          <w:sz w:val="16"/>
-          <w:szCs w:val="16"/>
-        </w:rPr>
-        <w:t xml:space="preserve">Sigle SIJ 14</w:t>
+        <w:t xml:space="preserve">Sigle SIJ 14 · Jathum</w:t>
       </w:r>
     </w:p>
     <w:p>
@@ -1989,60 +2002,47 @@
           <w:sz w:val="16"/>
           <w:szCs w:val="16"/>
         </w:rPr>
-        <w:t xml:space="preserve">Sigle GSSH 1</w:t>
-      </w:r>
-    </w:p>
-    <w:p>
-      <w:pPr>
-        <w:spacing w:after="40"/>
-      </w:pPr>
-      <w:r>
-        <w:rPr>
-          <w:rFonts w:ascii="Georgia" w:cs="Georgia" w:eastAsia="Georgia" w:hAnsi="Georgia"/>
-          <w:sz w:val="22"/>
-          <w:szCs w:val="22"/>
-        </w:rPr>
-        <w:t xml:space="preserve">Dieser Späherplatz</w:t>
-      </w:r>
-    </w:p>
-    <w:p>
-      <w:pPr>
-        <w:spacing w:after="40"/>
-      </w:pPr>
-      <w:r>
-        <w:rPr>
-          <w:rFonts w:ascii="Georgia" w:cs="Georgia" w:eastAsia="Georgia" w:hAnsi="Georgia"/>
-          <w:sz w:val="22"/>
-          <w:szCs w:val="22"/>
-        </w:rPr>
-        <w:t xml:space="preserve">gehört Wgl dem Mkbly,</w:t>
-      </w:r>
-    </w:p>
-    <w:p>
-      <w:pPr>
-        <w:spacing w:after="40"/>
-      </w:pPr>
-      <w:r>
-        <w:rPr>
-          <w:rFonts w:ascii="Georgia" w:cs="Georgia" w:eastAsia="Georgia" w:hAnsi="Georgia"/>
-          <w:sz w:val="22"/>
-          <w:szCs w:val="22"/>
-        </w:rPr>
-        <w:t xml:space="preserve">Jahr um Jahr.</w:t>
-      </w:r>
-    </w:p>
-    <w:p>
-      <w:pPr>
-        <w:spacing w:after="280" w:before="60"/>
-      </w:pPr>
-      <w:r>
-        <w:rPr>
-          <w:rFonts w:ascii="Georgia" w:cs="Georgia" w:eastAsia="Georgia" w:hAnsi="Georgia"/>
-          <w:color w:val="7A5C3E"/>
-          <w:sz w:val="16"/>
-          <w:szCs w:val="16"/>
-        </w:rPr>
-        <w:t xml:space="preserve">Sigle WH 1916</w:t>
+        <w:t xml:space="preserve">Sigle GSSH 1 · Al-Mafraq</w:t>
+      </w:r>
+    </w:p>
+    <w:p>
+      <w:pPr>
+        <w:spacing w:after="40"/>
+      </w:pPr>
+      <w:r>
+        <w:rPr>
+          <w:rFonts w:ascii="Georgia" w:cs="Georgia" w:eastAsia="Georgia" w:hAnsi="Georgia"/>
+          <w:sz w:val="22"/>
+          <w:szCs w:val="22"/>
+        </w:rPr>
+        <w:t xml:space="preserve">Er hielt Ausschau.</w:t>
+      </w:r>
+    </w:p>
+    <w:p>
+      <w:pPr>
+        <w:spacing w:after="40"/>
+      </w:pPr>
+      <w:r>
+        <w:rPr>
+          <w:rFonts w:ascii="Georgia" w:cs="Georgia" w:eastAsia="Georgia" w:hAnsi="Georgia"/>
+          <w:sz w:val="22"/>
+          <w:szCs w:val="22"/>
+        </w:rPr>
+        <w:t xml:space="preserve">Yalt — Beute von den Feinden.</w:t>
+      </w:r>
+    </w:p>
+    <w:p>
+      <w:pPr>
+        <w:spacing w:after="280" w:before="60"/>
+      </w:pPr>
+      <w:r>
+        <w:rPr>
+          <w:rFonts w:ascii="Georgia" w:cs="Georgia" w:eastAsia="Georgia" w:hAnsi="Georgia"/>
+          <w:color w:val="7A5C3E"/>
+          <w:sz w:val="16"/>
+          <w:szCs w:val="16"/>
+        </w:rPr>
+        <w:t xml:space="preserve">Sigle C 2194 · Zalaf</w:t>
       </w:r>
     </w:p>
     <w:p>
@@ -2130,7 +2130,7 @@
           <w:sz w:val="16"/>
           <w:szCs w:val="16"/>
         </w:rPr>
-        <w:t xml:space="preserve">Sigle BS 209</w:t>
+        <w:t xml:space="preserve">Sigle BS 209 · Al-Mafraq</w:t>
       </w:r>
     </w:p>
     <w:p>
@@ -2183,7 +2183,7 @@
           <w:sz w:val="16"/>
           <w:szCs w:val="16"/>
         </w:rPr>
-        <w:t xml:space="preserve">Sigle MKJS 80</w:t>
+        <w:t xml:space="preserve">Sigle MKJS 80 · Al-Mafraq</w:t>
       </w:r>
     </w:p>
     <w:p>
@@ -2236,7 +2236,7 @@
           <w:sz w:val="16"/>
           <w:szCs w:val="16"/>
         </w:rPr>
-        <w:t xml:space="preserve">Sigle LP 1267</w:t>
+        <w:t xml:space="preserve">Sigle LP 1267 · Al-Suwaydā</w:t>
       </w:r>
     </w:p>
     <w:p>
@@ -2302,7 +2302,127 @@
           <w:sz w:val="16"/>
           <w:szCs w:val="16"/>
         </w:rPr>
-        <w:t xml:space="preserve">Sigle Is.Mu 88</w:t>
+        <w:t xml:space="preserve">Sigle Is.Mu 88 · al-ʿĪsāwī</w:t>
+      </w:r>
+    </w:p>
+    <w:p>
+      <w:pPr>
+        <w:spacing w:after="40"/>
+      </w:pPr>
+      <w:r>
+        <w:rPr>
+          <w:rFonts w:ascii="Georgia" w:cs="Georgia" w:eastAsia="Georgia" w:hAnsi="Georgia"/>
+          <w:sz w:val="22"/>
+          <w:szCs w:val="22"/>
+        </w:rPr>
+        <w:t xml:space="preserve">Er blieb die Trockenzeit.</w:t>
+      </w:r>
+    </w:p>
+    <w:p>
+      <w:pPr>
+        <w:spacing w:after="40"/>
+      </w:pPr>
+      <w:r>
+        <w:rPr>
+          <w:rFonts w:ascii="Georgia" w:cs="Georgia" w:eastAsia="Georgia" w:hAnsi="Georgia"/>
+          <w:sz w:val="22"/>
+          <w:szCs w:val="22"/>
+        </w:rPr>
+        <w:t xml:space="preserve">Allat — gib Sicherheit.</w:t>
+      </w:r>
+    </w:p>
+    <w:p>
+      <w:pPr>
+        <w:spacing w:after="280" w:before="60"/>
+      </w:pPr>
+      <w:r>
+        <w:rPr>
+          <w:rFonts w:ascii="Georgia" w:cs="Georgia" w:eastAsia="Georgia" w:hAnsi="Georgia"/>
+          <w:color w:val="7A5C3E"/>
+          <w:sz w:val="16"/>
+          <w:szCs w:val="16"/>
+        </w:rPr>
+        <w:t xml:space="preserve">Sigle AbSWS 42 · Wādī Salma</w:t>
+      </w:r>
+    </w:p>
+    <w:p>
+      <w:pPr>
+        <w:spacing w:after="40"/>
+      </w:pPr>
+      <w:r>
+        <w:rPr>
+          <w:rFonts w:ascii="Georgia" w:cs="Georgia" w:eastAsia="Georgia" w:hAnsi="Georgia"/>
+          <w:sz w:val="22"/>
+          <w:szCs w:val="22"/>
+        </w:rPr>
+        <w:t xml:space="preserve">Er wartete auf das Schicksal.</w:t>
+      </w:r>
+    </w:p>
+    <w:p>
+      <w:pPr>
+        <w:spacing w:after="40"/>
+      </w:pPr>
+      <w:r>
+        <w:rPr>
+          <w:rFonts w:ascii="Georgia" w:cs="Georgia" w:eastAsia="Georgia" w:hAnsi="Georgia"/>
+          <w:sz w:val="22"/>
+          <w:szCs w:val="22"/>
+        </w:rPr>
+        <w:t xml:space="preserve">Rudā — errette ihn.</w:t>
+      </w:r>
+    </w:p>
+    <w:p>
+      <w:pPr>
+        <w:spacing w:after="280" w:before="60"/>
+      </w:pPr>
+      <w:r>
+        <w:rPr>
+          <w:rFonts w:ascii="Georgia" w:cs="Georgia" w:eastAsia="Georgia" w:hAnsi="Georgia"/>
+          <w:color w:val="7A5C3E"/>
+          <w:sz w:val="16"/>
+          <w:szCs w:val="16"/>
+        </w:rPr>
+        <w:t xml:space="preserve">Sigle WAMS 19.2 · Km 910</w:t>
+      </w:r>
+    </w:p>
+    <w:p>
+      <w:pPr>
+        <w:spacing w:after="40"/>
+      </w:pPr>
+      <w:r>
+        <w:rPr>
+          <w:rFonts w:ascii="Georgia" w:cs="Georgia" w:eastAsia="Georgia" w:hAnsi="Georgia"/>
+          <w:sz w:val="22"/>
+          <w:szCs w:val="22"/>
+        </w:rPr>
+        <w:t xml:space="preserve">Allat —</w:t>
+      </w:r>
+    </w:p>
+    <w:p>
+      <w:pPr>
+        <w:spacing w:after="40"/>
+      </w:pPr>
+      <w:r>
+        <w:rPr>
+          <w:rFonts w:ascii="Georgia" w:cs="Georgia" w:eastAsia="Georgia" w:hAnsi="Georgia"/>
+          <w:sz w:val="22"/>
+          <w:szCs w:val="22"/>
+        </w:rPr>
+        <w:t xml:space="preserve">gib Sicherheit.</w:t>
+      </w:r>
+    </w:p>
+    <w:p>
+      <w:pPr>
+        <w:spacing w:after="280" w:before="60"/>
+      </w:pPr>
+      <w:r>
+        <w:rPr>
+          <w:rFonts w:ascii="Georgia" w:cs="Georgia" w:eastAsia="Georgia" w:hAnsi="Georgia"/>
+          <w:color w:val="7A5C3E"/>
+          <w:sz w:val="16"/>
+          <w:szCs w:val="16"/>
+        </w:rPr>
+        <w:t xml:space="preserve">Sigle C 64 · Ǧabal Says</w:t>
       </w:r>
     </w:p>
     <w:p>
@@ -2328,61 +2448,61 @@
           <w:sz w:val="22"/>
           <w:szCs w:val="22"/>
         </w:rPr>
-        <w:t xml:space="preserve">hilf dem Ḥṣb.</w:t>
-      </w:r>
-    </w:p>
-    <w:p>
-      <w:pPr>
-        <w:spacing w:after="280" w:before="60"/>
-      </w:pPr>
-      <w:r>
-        <w:rPr>
-          <w:rFonts w:ascii="Georgia" w:cs="Georgia" w:eastAsia="Georgia" w:hAnsi="Georgia"/>
-          <w:color w:val="7A5C3E"/>
-          <w:sz w:val="16"/>
-          <w:szCs w:val="16"/>
-        </w:rPr>
-        <w:t xml:space="preserve">Sigle RVP 1</w:t>
-      </w:r>
-    </w:p>
-    <w:p>
-      <w:pPr>
-        <w:spacing w:after="40"/>
-      </w:pPr>
-      <w:r>
-        <w:rPr>
-          <w:rFonts w:ascii="Georgia" w:cs="Georgia" w:eastAsia="Georgia" w:hAnsi="Georgia"/>
-          <w:sz w:val="22"/>
-          <w:szCs w:val="22"/>
-        </w:rPr>
-        <w:t xml:space="preserve">Er wartete auf das Schicksal.</w:t>
-      </w:r>
-    </w:p>
-    <w:p>
-      <w:pPr>
-        <w:spacing w:after="40"/>
-      </w:pPr>
-      <w:r>
-        <w:rPr>
-          <w:rFonts w:ascii="Georgia" w:cs="Georgia" w:eastAsia="Georgia" w:hAnsi="Georgia"/>
-          <w:sz w:val="22"/>
-          <w:szCs w:val="22"/>
-        </w:rPr>
-        <w:t xml:space="preserve">Rudā — errette ihn.</w:t>
-      </w:r>
-    </w:p>
-    <w:p>
-      <w:pPr>
-        <w:spacing w:after="280" w:before="60"/>
-      </w:pPr>
-      <w:r>
-        <w:rPr>
-          <w:rFonts w:ascii="Georgia" w:cs="Georgia" w:eastAsia="Georgia" w:hAnsi="Georgia"/>
-          <w:color w:val="7A5C3E"/>
-          <w:sz w:val="16"/>
-          <w:szCs w:val="16"/>
-        </w:rPr>
-        <w:t xml:space="preserve">Sigle WAMS 19.2</w:t>
+        <w:t xml:space="preserve">schenk Befreiung.</w:t>
+      </w:r>
+    </w:p>
+    <w:p>
+      <w:pPr>
+        <w:spacing w:after="280" w:before="60"/>
+      </w:pPr>
+      <w:r>
+        <w:rPr>
+          <w:rFonts w:ascii="Georgia" w:cs="Georgia" w:eastAsia="Georgia" w:hAnsi="Georgia"/>
+          <w:color w:val="7A5C3E"/>
+          <w:sz w:val="16"/>
+          <w:szCs w:val="16"/>
+        </w:rPr>
+        <w:t xml:space="preserve">Sigle C 134 · Ǧabal Says</w:t>
+      </w:r>
+    </w:p>
+    <w:p>
+      <w:pPr>
+        <w:spacing w:after="40"/>
+      </w:pPr>
+      <w:r>
+        <w:rPr>
+          <w:rFonts w:ascii="Georgia" w:cs="Georgia" w:eastAsia="Georgia" w:hAnsi="Georgia"/>
+          <w:sz w:val="22"/>
+          <w:szCs w:val="22"/>
+        </w:rPr>
+        <w:t xml:space="preserve">Yaṯaʿ —</w:t>
+      </w:r>
+    </w:p>
+    <w:p>
+      <w:pPr>
+        <w:spacing w:after="40"/>
+      </w:pPr>
+      <w:r>
+        <w:rPr>
+          <w:rFonts w:ascii="Georgia" w:cs="Georgia" w:eastAsia="Georgia" w:hAnsi="Georgia"/>
+          <w:sz w:val="22"/>
+          <w:szCs w:val="22"/>
+        </w:rPr>
+        <w:t xml:space="preserve">nimm ihm dies Unheil.</w:t>
+      </w:r>
+    </w:p>
+    <w:p>
+      <w:pPr>
+        <w:spacing w:after="280" w:before="60"/>
+      </w:pPr>
+      <w:r>
+        <w:rPr>
+          <w:rFonts w:ascii="Georgia" w:cs="Georgia" w:eastAsia="Georgia" w:hAnsi="Georgia"/>
+          <w:color w:val="7A5C3E"/>
+          <w:sz w:val="16"/>
+          <w:szCs w:val="16"/>
+        </w:rPr>
+        <w:t xml:space="preserve">Sigle C 218 · Rif Dimašq</w:t>
       </w:r>
     </w:p>
     <w:p>
@@ -2408,21 +2528,74 @@
           <w:sz w:val="22"/>
           <w:szCs w:val="22"/>
         </w:rPr>
-        <w:t xml:space="preserve">gib Sicherheit.</w:t>
-      </w:r>
-    </w:p>
-    <w:p>
-      <w:pPr>
-        <w:spacing w:after="280" w:before="60"/>
-      </w:pPr>
-      <w:r>
-        <w:rPr>
-          <w:rFonts w:ascii="Georgia" w:cs="Georgia" w:eastAsia="Georgia" w:hAnsi="Georgia"/>
-          <w:color w:val="7A5C3E"/>
-          <w:sz w:val="16"/>
-          <w:szCs w:val="16"/>
-        </w:rPr>
-        <w:t xml:space="preserve">Sigle C 64</w:t>
+        <w:t xml:space="preserve">dass er sicher sei,</w:t>
+      </w:r>
+    </w:p>
+    <w:p>
+      <w:pPr>
+        <w:spacing w:after="40"/>
+      </w:pPr>
+      <w:r>
+        <w:rPr>
+          <w:rFonts w:ascii="Georgia" w:cs="Georgia" w:eastAsia="Georgia" w:hAnsi="Georgia"/>
+          <w:sz w:val="22"/>
+          <w:szCs w:val="22"/>
+        </w:rPr>
+        <w:t xml:space="preserve">Allat —</w:t>
+      </w:r>
+    </w:p>
+    <w:p>
+      <w:pPr>
+        <w:spacing w:after="280" w:before="60"/>
+      </w:pPr>
+      <w:r>
+        <w:rPr>
+          <w:rFonts w:ascii="Georgia" w:cs="Georgia" w:eastAsia="Georgia" w:hAnsi="Georgia"/>
+          <w:color w:val="7A5C3E"/>
+          <w:sz w:val="16"/>
+          <w:szCs w:val="16"/>
+        </w:rPr>
+        <w:t xml:space="preserve">Sigle C 1412 · Riǧm Qaʿqūl</w:t>
+      </w:r>
+    </w:p>
+    <w:p>
+      <w:pPr>
+        <w:spacing w:after="40"/>
+      </w:pPr>
+      <w:r>
+        <w:rPr>
+          <w:rFonts w:ascii="Georgia" w:cs="Georgia" w:eastAsia="Georgia" w:hAnsi="Georgia"/>
+          <w:sz w:val="22"/>
+          <w:szCs w:val="22"/>
+        </w:rPr>
+        <w:t xml:space="preserve">Allat —</w:t>
+      </w:r>
+    </w:p>
+    <w:p>
+      <w:pPr>
+        <w:spacing w:after="40"/>
+      </w:pPr>
+      <w:r>
+        <w:rPr>
+          <w:rFonts w:ascii="Georgia" w:cs="Georgia" w:eastAsia="Georgia" w:hAnsi="Georgia"/>
+          <w:sz w:val="22"/>
+          <w:szCs w:val="22"/>
+        </w:rPr>
+        <w:t xml:space="preserve">schenk Errettung.</w:t>
+      </w:r>
+    </w:p>
+    <w:p>
+      <w:pPr>
+        <w:spacing w:after="280" w:before="60"/>
+      </w:pPr>
+      <w:r>
+        <w:rPr>
+          <w:rFonts w:ascii="Georgia" w:cs="Georgia" w:eastAsia="Georgia" w:hAnsi="Georgia"/>
+          <w:color w:val="7A5C3E"/>
+          <w:sz w:val="16"/>
+          <w:szCs w:val="16"/>
+        </w:rPr>
+        <w:t xml:space="preserve">Sigle C 805 · Rif Dimašq</w:t>
       </w:r>
     </w:p>
     <w:p>
@@ -2448,61 +2621,101 @@
           <w:sz w:val="22"/>
           <w:szCs w:val="22"/>
         </w:rPr>
-        <w:t xml:space="preserve">schenk Befreiung.</w:t>
-      </w:r>
-    </w:p>
-    <w:p>
-      <w:pPr>
-        <w:spacing w:after="280" w:before="60"/>
-      </w:pPr>
-      <w:r>
-        <w:rPr>
-          <w:rFonts w:ascii="Georgia" w:cs="Georgia" w:eastAsia="Georgia" w:hAnsi="Georgia"/>
-          <w:color w:val="7A5C3E"/>
-          <w:sz w:val="16"/>
-          <w:szCs w:val="16"/>
-        </w:rPr>
-        <w:t xml:space="preserve">Sigle C 134</w:t>
-      </w:r>
-    </w:p>
-    <w:p>
-      <w:pPr>
-        <w:spacing w:after="40"/>
-      </w:pPr>
-      <w:r>
-        <w:rPr>
-          <w:rFonts w:ascii="Georgia" w:cs="Georgia" w:eastAsia="Georgia" w:hAnsi="Georgia"/>
-          <w:sz w:val="22"/>
-          <w:szCs w:val="22"/>
-        </w:rPr>
-        <w:t xml:space="preserve">Yaṯaʿ —</w:t>
-      </w:r>
-    </w:p>
-    <w:p>
-      <w:pPr>
-        <w:spacing w:after="40"/>
-      </w:pPr>
-      <w:r>
-        <w:rPr>
-          <w:rFonts w:ascii="Georgia" w:cs="Georgia" w:eastAsia="Georgia" w:hAnsi="Georgia"/>
-          <w:sz w:val="22"/>
-          <w:szCs w:val="22"/>
-        </w:rPr>
-        <w:t xml:space="preserve">nimm ihm dies Unheil.</w:t>
-      </w:r>
-    </w:p>
-    <w:p>
-      <w:pPr>
-        <w:spacing w:after="280" w:before="60"/>
-      </w:pPr>
-      <w:r>
-        <w:rPr>
-          <w:rFonts w:ascii="Georgia" w:cs="Georgia" w:eastAsia="Georgia" w:hAnsi="Georgia"/>
-          <w:color w:val="7A5C3E"/>
-          <w:sz w:val="16"/>
-          <w:szCs w:val="16"/>
-        </w:rPr>
-        <w:t xml:space="preserve">Sigle C 218</w:t>
+        <w:t xml:space="preserve">dass er sicher sei.</w:t>
+      </w:r>
+    </w:p>
+    <w:p>
+      <w:pPr>
+        <w:spacing w:after="280" w:before="60"/>
+      </w:pPr>
+      <w:r>
+        <w:rPr>
+          <w:rFonts w:ascii="Georgia" w:cs="Georgia" w:eastAsia="Georgia" w:hAnsi="Georgia"/>
+          <w:color w:val="7A5C3E"/>
+          <w:sz w:val="16"/>
+          <w:szCs w:val="16"/>
+        </w:rPr>
+        <w:t xml:space="preserve">Sigle C 885 · Khirbat al-Umbāšī</w:t>
+      </w:r>
+    </w:p>
+    <w:p>
+      <w:pPr>
+        <w:spacing w:after="40"/>
+      </w:pPr>
+      <w:r>
+        <w:rPr>
+          <w:rFonts w:ascii="Georgia" w:cs="Georgia" w:eastAsia="Georgia" w:hAnsi="Georgia"/>
+          <w:sz w:val="22"/>
+          <w:szCs w:val="22"/>
+        </w:rPr>
+        <w:t xml:space="preserve">Er weidete die Esel.</w:t>
+      </w:r>
+    </w:p>
+    <w:p>
+      <w:pPr>
+        <w:spacing w:after="40"/>
+      </w:pPr>
+      <w:r>
+        <w:rPr>
+          <w:rFonts w:ascii="Georgia" w:cs="Georgia" w:eastAsia="Georgia" w:hAnsi="Georgia"/>
+          <w:sz w:val="22"/>
+          <w:szCs w:val="22"/>
+        </w:rPr>
+        <w:t xml:space="preserve">Allat — dass er sicher sei.</w:t>
+      </w:r>
+    </w:p>
+    <w:p>
+      <w:pPr>
+        <w:spacing w:after="280" w:before="60"/>
+      </w:pPr>
+      <w:r>
+        <w:rPr>
+          <w:rFonts w:ascii="Georgia" w:cs="Georgia" w:eastAsia="Georgia" w:hAnsi="Georgia"/>
+          <w:color w:val="7A5C3E"/>
+          <w:sz w:val="16"/>
+          <w:szCs w:val="16"/>
+        </w:rPr>
+        <w:t xml:space="preserve">Sigle C 898 · Khirbat al-Hubayrīyah</w:t>
+      </w:r>
+    </w:p>
+    <w:p>
+      <w:pPr>
+        <w:spacing w:after="40"/>
+      </w:pPr>
+      <w:r>
+        <w:rPr>
+          <w:rFonts w:ascii="Georgia" w:cs="Georgia" w:eastAsia="Georgia" w:hAnsi="Georgia"/>
+          <w:sz w:val="22"/>
+          <w:szCs w:val="22"/>
+        </w:rPr>
+        <w:t xml:space="preserve">Er war auf der Reise.</w:t>
+      </w:r>
+    </w:p>
+    <w:p>
+      <w:pPr>
+        <w:spacing w:after="40"/>
+      </w:pPr>
+      <w:r>
+        <w:rPr>
+          <w:rFonts w:ascii="Georgia" w:cs="Georgia" w:eastAsia="Georgia" w:hAnsi="Georgia"/>
+          <w:sz w:val="22"/>
+          <w:szCs w:val="22"/>
+        </w:rPr>
+        <w:t xml:space="preserve">Allat — dass er sicher sei.</w:t>
+      </w:r>
+    </w:p>
+    <w:p>
+      <w:pPr>
+        <w:spacing w:after="280" w:before="60"/>
+      </w:pPr>
+      <w:r>
+        <w:rPr>
+          <w:rFonts w:ascii="Georgia" w:cs="Georgia" w:eastAsia="Georgia" w:hAnsi="Georgia"/>
+          <w:color w:val="7A5C3E"/>
+          <w:sz w:val="16"/>
+          <w:szCs w:val="16"/>
+        </w:rPr>
+        <w:t xml:space="preserve">Sigle C 907 · Khirbat al-Hubayrīyah</w:t>
       </w:r>
     </w:p>
     <w:p>
@@ -2528,7 +2741,127 @@
           <w:sz w:val="22"/>
           <w:szCs w:val="22"/>
         </w:rPr>
-        <w:t xml:space="preserve">dass er sicher sei,</w:t>
+        <w:t xml:space="preserve">dass er sicher sei.</w:t>
+      </w:r>
+    </w:p>
+    <w:p>
+      <w:pPr>
+        <w:spacing w:after="280" w:before="60"/>
+      </w:pPr>
+      <w:r>
+        <w:rPr>
+          <w:rFonts w:ascii="Georgia" w:cs="Georgia" w:eastAsia="Georgia" w:hAnsi="Georgia"/>
+          <w:color w:val="7A5C3E"/>
+          <w:sz w:val="16"/>
+          <w:szCs w:val="16"/>
+        </w:rPr>
+        <w:t xml:space="preserve">Sigle C 1086 · Rif Dimašq</w:t>
+      </w:r>
+    </w:p>
+    <w:p>
+      <w:pPr>
+        <w:spacing w:after="40"/>
+      </w:pPr>
+      <w:r>
+        <w:rPr>
+          <w:rFonts w:ascii="Georgia" w:cs="Georgia" w:eastAsia="Georgia" w:hAnsi="Georgia"/>
+          <w:sz w:val="22"/>
+          <w:szCs w:val="22"/>
+        </w:rPr>
+        <w:t xml:space="preserve">Rudā —</w:t>
+      </w:r>
+    </w:p>
+    <w:p>
+      <w:pPr>
+        <w:spacing w:after="40"/>
+      </w:pPr>
+      <w:r>
+        <w:rPr>
+          <w:rFonts w:ascii="Georgia" w:cs="Georgia" w:eastAsia="Georgia" w:hAnsi="Georgia"/>
+          <w:sz w:val="22"/>
+          <w:szCs w:val="22"/>
+        </w:rPr>
+        <w:t xml:space="preserve">hilf dem ʾlh,</w:t>
+      </w:r>
+    </w:p>
+    <w:p>
+      <w:pPr>
+        <w:spacing w:after="40"/>
+      </w:pPr>
+      <w:r>
+        <w:rPr>
+          <w:rFonts w:ascii="Georgia" w:cs="Georgia" w:eastAsia="Georgia" w:hAnsi="Georgia"/>
+          <w:sz w:val="22"/>
+          <w:szCs w:val="22"/>
+        </w:rPr>
+        <w:t xml:space="preserve">Sohn des Bdn.</w:t>
+      </w:r>
+    </w:p>
+    <w:p>
+      <w:pPr>
+        <w:spacing w:after="280" w:before="60"/>
+      </w:pPr>
+      <w:r>
+        <w:rPr>
+          <w:rFonts w:ascii="Georgia" w:cs="Georgia" w:eastAsia="Georgia" w:hAnsi="Georgia"/>
+          <w:color w:val="7A5C3E"/>
+          <w:sz w:val="16"/>
+          <w:szCs w:val="16"/>
+        </w:rPr>
+        <w:t xml:space="preserve">Sigle C 1496 · Zalaf</w:t>
+      </w:r>
+    </w:p>
+    <w:p>
+      <w:pPr>
+        <w:spacing w:after="40"/>
+      </w:pPr>
+      <w:r>
+        <w:rPr>
+          <w:rFonts w:ascii="Georgia" w:cs="Georgia" w:eastAsia="Georgia" w:hAnsi="Georgia"/>
+          <w:sz w:val="22"/>
+          <w:szCs w:val="22"/>
+        </w:rPr>
+        <w:t xml:space="preserve">Yalt —</w:t>
+      </w:r>
+    </w:p>
+    <w:p>
+      <w:pPr>
+        <w:spacing w:after="40"/>
+      </w:pPr>
+      <w:r>
+        <w:rPr>
+          <w:rFonts w:ascii="Georgia" w:cs="Georgia" w:eastAsia="Georgia" w:hAnsi="Georgia"/>
+          <w:sz w:val="22"/>
+          <w:szCs w:val="22"/>
+        </w:rPr>
+        <w:t xml:space="preserve">Entkommen vom Bösen</w:t>
+      </w:r>
+    </w:p>
+    <w:p>
+      <w:pPr>
+        <w:spacing w:after="40"/>
+      </w:pPr>
+      <w:r>
+        <w:rPr>
+          <w:rFonts w:ascii="Georgia" w:cs="Georgia" w:eastAsia="Georgia" w:hAnsi="Georgia"/>
+          <w:sz w:val="22"/>
+          <w:szCs w:val="22"/>
+        </w:rPr>
+        <w:t xml:space="preserve">in diesem Jahr.</w:t>
+      </w:r>
+    </w:p>
+    <w:p>
+      <w:pPr>
+        <w:spacing w:after="280" w:before="60"/>
+      </w:pPr>
+      <w:r>
+        <w:rPr>
+          <w:rFonts w:ascii="Georgia" w:cs="Georgia" w:eastAsia="Georgia" w:hAnsi="Georgia"/>
+          <w:color w:val="7A5C3E"/>
+          <w:sz w:val="16"/>
+          <w:szCs w:val="16"/>
+        </w:rPr>
+        <w:t xml:space="preserve">Sigle C 1629 · Zalaf</w:t>
       </w:r>
     </w:p>
     <w:p>
@@ -2546,73 +2879,6 @@
     </w:p>
     <w:p>
       <w:pPr>
-        <w:spacing w:after="280" w:before="60"/>
-      </w:pPr>
-      <w:r>
-        <w:rPr>
-          <w:rFonts w:ascii="Georgia" w:cs="Georgia" w:eastAsia="Georgia" w:hAnsi="Georgia"/>
-          <w:color w:val="7A5C3E"/>
-          <w:sz w:val="16"/>
-          <w:szCs w:val="16"/>
-        </w:rPr>
-        <w:t xml:space="preserve">Sigle C 1412</w:t>
-      </w:r>
-    </w:p>
-    <w:p>
-      <w:pPr>
-        <w:spacing w:after="40"/>
-      </w:pPr>
-      <w:r>
-        <w:rPr>
-          <w:rFonts w:ascii="Georgia" w:cs="Georgia" w:eastAsia="Georgia" w:hAnsi="Georgia"/>
-          <w:sz w:val="22"/>
-          <w:szCs w:val="22"/>
-        </w:rPr>
-        <w:t xml:space="preserve">Allat —</w:t>
-      </w:r>
-    </w:p>
-    <w:p>
-      <w:pPr>
-        <w:spacing w:after="40"/>
-      </w:pPr>
-      <w:r>
-        <w:rPr>
-          <w:rFonts w:ascii="Georgia" w:cs="Georgia" w:eastAsia="Georgia" w:hAnsi="Georgia"/>
-          <w:sz w:val="22"/>
-          <w:szCs w:val="22"/>
-        </w:rPr>
-        <w:t xml:space="preserve">schenk Errettung.</w:t>
-      </w:r>
-    </w:p>
-    <w:p>
-      <w:pPr>
-        <w:spacing w:after="280" w:before="60"/>
-      </w:pPr>
-      <w:r>
-        <w:rPr>
-          <w:rFonts w:ascii="Georgia" w:cs="Georgia" w:eastAsia="Georgia" w:hAnsi="Georgia"/>
-          <w:color w:val="7A5C3E"/>
-          <w:sz w:val="16"/>
-          <w:szCs w:val="16"/>
-        </w:rPr>
-        <w:t xml:space="preserve">Sigle C 805</w:t>
-      </w:r>
-    </w:p>
-    <w:p>
-      <w:pPr>
-        <w:spacing w:after="40"/>
-      </w:pPr>
-      <w:r>
-        <w:rPr>
-          <w:rFonts w:ascii="Georgia" w:cs="Georgia" w:eastAsia="Georgia" w:hAnsi="Georgia"/>
-          <w:sz w:val="22"/>
-          <w:szCs w:val="22"/>
-        </w:rPr>
-        <w:t xml:space="preserve">Rudā —</w:t>
-      </w:r>
-    </w:p>
-    <w:p>
-      <w:pPr>
         <w:spacing w:after="40"/>
       </w:pPr>
       <w:r>
@@ -2635,273 +2901,7 @@
           <w:sz w:val="16"/>
           <w:szCs w:val="16"/>
         </w:rPr>
-        <w:t xml:space="preserve">Sigle C 885</w:t>
-      </w:r>
-    </w:p>
-    <w:p>
-      <w:pPr>
-        <w:spacing w:after="40"/>
-      </w:pPr>
-      <w:r>
-        <w:rPr>
-          <w:rFonts w:ascii="Georgia" w:cs="Georgia" w:eastAsia="Georgia" w:hAnsi="Georgia"/>
-          <w:sz w:val="22"/>
-          <w:szCs w:val="22"/>
-        </w:rPr>
-        <w:t xml:space="preserve">Er weidete die Esel.</w:t>
-      </w:r>
-    </w:p>
-    <w:p>
-      <w:pPr>
-        <w:spacing w:after="40"/>
-      </w:pPr>
-      <w:r>
-        <w:rPr>
-          <w:rFonts w:ascii="Georgia" w:cs="Georgia" w:eastAsia="Georgia" w:hAnsi="Georgia"/>
-          <w:sz w:val="22"/>
-          <w:szCs w:val="22"/>
-        </w:rPr>
-        <w:t xml:space="preserve">Allat — dass er sicher sei.</w:t>
-      </w:r>
-    </w:p>
-    <w:p>
-      <w:pPr>
-        <w:spacing w:after="280" w:before="60"/>
-      </w:pPr>
-      <w:r>
-        <w:rPr>
-          <w:rFonts w:ascii="Georgia" w:cs="Georgia" w:eastAsia="Georgia" w:hAnsi="Georgia"/>
-          <w:color w:val="7A5C3E"/>
-          <w:sz w:val="16"/>
-          <w:szCs w:val="16"/>
-        </w:rPr>
-        <w:t xml:space="preserve">Sigle C 898</w:t>
-      </w:r>
-    </w:p>
-    <w:p>
-      <w:pPr>
-        <w:spacing w:after="40"/>
-      </w:pPr>
-      <w:r>
-        <w:rPr>
-          <w:rFonts w:ascii="Georgia" w:cs="Georgia" w:eastAsia="Georgia" w:hAnsi="Georgia"/>
-          <w:sz w:val="22"/>
-          <w:szCs w:val="22"/>
-        </w:rPr>
-        <w:t xml:space="preserve">Er war auf der Reise.</w:t>
-      </w:r>
-    </w:p>
-    <w:p>
-      <w:pPr>
-        <w:spacing w:after="40"/>
-      </w:pPr>
-      <w:r>
-        <w:rPr>
-          <w:rFonts w:ascii="Georgia" w:cs="Georgia" w:eastAsia="Georgia" w:hAnsi="Georgia"/>
-          <w:sz w:val="22"/>
-          <w:szCs w:val="22"/>
-        </w:rPr>
-        <w:t xml:space="preserve">Allat — dass er sicher sei.</w:t>
-      </w:r>
-    </w:p>
-    <w:p>
-      <w:pPr>
-        <w:spacing w:after="280" w:before="60"/>
-      </w:pPr>
-      <w:r>
-        <w:rPr>
-          <w:rFonts w:ascii="Georgia" w:cs="Georgia" w:eastAsia="Georgia" w:hAnsi="Georgia"/>
-          <w:color w:val="7A5C3E"/>
-          <w:sz w:val="16"/>
-          <w:szCs w:val="16"/>
-        </w:rPr>
-        <w:t xml:space="preserve">Sigle C 907</w:t>
-      </w:r>
-    </w:p>
-    <w:p>
-      <w:pPr>
-        <w:spacing w:after="40"/>
-      </w:pPr>
-      <w:r>
-        <w:rPr>
-          <w:rFonts w:ascii="Georgia" w:cs="Georgia" w:eastAsia="Georgia" w:hAnsi="Georgia"/>
-          <w:sz w:val="22"/>
-          <w:szCs w:val="22"/>
-        </w:rPr>
-        <w:t xml:space="preserve">Allat —</w:t>
-      </w:r>
-    </w:p>
-    <w:p>
-      <w:pPr>
-        <w:spacing w:after="40"/>
-      </w:pPr>
-      <w:r>
-        <w:rPr>
-          <w:rFonts w:ascii="Georgia" w:cs="Georgia" w:eastAsia="Georgia" w:hAnsi="Georgia"/>
-          <w:sz w:val="22"/>
-          <w:szCs w:val="22"/>
-        </w:rPr>
-        <w:t xml:space="preserve">dass er sicher sei.</w:t>
-      </w:r>
-    </w:p>
-    <w:p>
-      <w:pPr>
-        <w:spacing w:after="280" w:before="60"/>
-      </w:pPr>
-      <w:r>
-        <w:rPr>
-          <w:rFonts w:ascii="Georgia" w:cs="Georgia" w:eastAsia="Georgia" w:hAnsi="Georgia"/>
-          <w:color w:val="7A5C3E"/>
-          <w:sz w:val="16"/>
-          <w:szCs w:val="16"/>
-        </w:rPr>
-        <w:t xml:space="preserve">Sigle C 1086</w:t>
-      </w:r>
-    </w:p>
-    <w:p>
-      <w:pPr>
-        <w:spacing w:after="40"/>
-      </w:pPr>
-      <w:r>
-        <w:rPr>
-          <w:rFonts w:ascii="Georgia" w:cs="Georgia" w:eastAsia="Georgia" w:hAnsi="Georgia"/>
-          <w:sz w:val="22"/>
-          <w:szCs w:val="22"/>
-        </w:rPr>
-        <w:t xml:space="preserve">Rudā —</w:t>
-      </w:r>
-    </w:p>
-    <w:p>
-      <w:pPr>
-        <w:spacing w:after="40"/>
-      </w:pPr>
-      <w:r>
-        <w:rPr>
-          <w:rFonts w:ascii="Georgia" w:cs="Georgia" w:eastAsia="Georgia" w:hAnsi="Georgia"/>
-          <w:sz w:val="22"/>
-          <w:szCs w:val="22"/>
-        </w:rPr>
-        <w:t xml:space="preserve">hilf dem ʾlh,</w:t>
-      </w:r>
-    </w:p>
-    <w:p>
-      <w:pPr>
-        <w:spacing w:after="40"/>
-      </w:pPr>
-      <w:r>
-        <w:rPr>
-          <w:rFonts w:ascii="Georgia" w:cs="Georgia" w:eastAsia="Georgia" w:hAnsi="Georgia"/>
-          <w:sz w:val="22"/>
-          <w:szCs w:val="22"/>
-        </w:rPr>
-        <w:t xml:space="preserve">Sohn des Bdn.</w:t>
-      </w:r>
-    </w:p>
-    <w:p>
-      <w:pPr>
-        <w:spacing w:after="280" w:before="60"/>
-      </w:pPr>
-      <w:r>
-        <w:rPr>
-          <w:rFonts w:ascii="Georgia" w:cs="Georgia" w:eastAsia="Georgia" w:hAnsi="Georgia"/>
-          <w:color w:val="7A5C3E"/>
-          <w:sz w:val="16"/>
-          <w:szCs w:val="16"/>
-        </w:rPr>
-        <w:t xml:space="preserve">Sigle C 1496</w:t>
-      </w:r>
-    </w:p>
-    <w:p>
-      <w:pPr>
-        <w:spacing w:after="40"/>
-      </w:pPr>
-      <w:r>
-        <w:rPr>
-          <w:rFonts w:ascii="Georgia" w:cs="Georgia" w:eastAsia="Georgia" w:hAnsi="Georgia"/>
-          <w:sz w:val="22"/>
-          <w:szCs w:val="22"/>
-        </w:rPr>
-        <w:t xml:space="preserve">Yalt —</w:t>
-      </w:r>
-    </w:p>
-    <w:p>
-      <w:pPr>
-        <w:spacing w:after="40"/>
-      </w:pPr>
-      <w:r>
-        <w:rPr>
-          <w:rFonts w:ascii="Georgia" w:cs="Georgia" w:eastAsia="Georgia" w:hAnsi="Georgia"/>
-          <w:sz w:val="22"/>
-          <w:szCs w:val="22"/>
-        </w:rPr>
-        <w:t xml:space="preserve">Entkommen vom Bösen</w:t>
-      </w:r>
-    </w:p>
-    <w:p>
-      <w:pPr>
-        <w:spacing w:after="40"/>
-      </w:pPr>
-      <w:r>
-        <w:rPr>
-          <w:rFonts w:ascii="Georgia" w:cs="Georgia" w:eastAsia="Georgia" w:hAnsi="Georgia"/>
-          <w:sz w:val="22"/>
-          <w:szCs w:val="22"/>
-        </w:rPr>
-        <w:t xml:space="preserve">in diesem Jahr.</w:t>
-      </w:r>
-    </w:p>
-    <w:p>
-      <w:pPr>
-        <w:spacing w:after="280" w:before="60"/>
-      </w:pPr>
-      <w:r>
-        <w:rPr>
-          <w:rFonts w:ascii="Georgia" w:cs="Georgia" w:eastAsia="Georgia" w:hAnsi="Georgia"/>
-          <w:color w:val="7A5C3E"/>
-          <w:sz w:val="16"/>
-          <w:szCs w:val="16"/>
-        </w:rPr>
-        <w:t xml:space="preserve">Sigle C 1629</w:t>
-      </w:r>
-    </w:p>
-    <w:p>
-      <w:pPr>
-        <w:spacing w:after="40"/>
-      </w:pPr>
-      <w:r>
-        <w:rPr>
-          <w:rFonts w:ascii="Georgia" w:cs="Georgia" w:eastAsia="Georgia" w:hAnsi="Georgia"/>
-          <w:sz w:val="22"/>
-          <w:szCs w:val="22"/>
-        </w:rPr>
-        <w:t xml:space="preserve">Allat —</w:t>
-      </w:r>
-    </w:p>
-    <w:p>
-      <w:pPr>
-        <w:spacing w:after="40"/>
-      </w:pPr>
-      <w:r>
-        <w:rPr>
-          <w:rFonts w:ascii="Georgia" w:cs="Georgia" w:eastAsia="Georgia" w:hAnsi="Georgia"/>
-          <w:sz w:val="22"/>
-          <w:szCs w:val="22"/>
-        </w:rPr>
-        <w:t xml:space="preserve">dass er sicher sei.</w:t>
-      </w:r>
-    </w:p>
-    <w:p>
-      <w:pPr>
-        <w:spacing w:after="280" w:before="60"/>
-      </w:pPr>
-      <w:r>
-        <w:rPr>
-          <w:rFonts w:ascii="Georgia" w:cs="Georgia" w:eastAsia="Georgia" w:hAnsi="Georgia"/>
-          <w:color w:val="7A5C3E"/>
-          <w:sz w:val="16"/>
-          <w:szCs w:val="16"/>
-        </w:rPr>
-        <w:t xml:space="preserve">Sigle C 1660</w:t>
+        <w:t xml:space="preserve">Sigle C 1660 · Zalaf</w:t>
       </w:r>
     </w:p>
     <w:p>
@@ -3041,7 +3041,7 @@
           <w:sz w:val="16"/>
           <w:szCs w:val="16"/>
         </w:rPr>
-        <w:t xml:space="preserve">Sigle LP 540</w:t>
+        <w:t xml:space="preserve">Sigle LP 540 · al-ʿĪsāwī</w:t>
       </w:r>
     </w:p>
     <w:p>
@@ -3120,7 +3120,7 @@
           <w:sz w:val="16"/>
           <w:szCs w:val="16"/>
         </w:rPr>
-        <w:t xml:space="preserve">Sigle KRS 17</w:t>
+        <w:t xml:space="preserve">Sigle KRS 17 · Wādī Salma</w:t>
       </w:r>
     </w:p>
     <w:p>
@@ -3160,7 +3160,7 @@
           <w:sz w:val="16"/>
           <w:szCs w:val="16"/>
         </w:rPr>
-        <w:t xml:space="preserve">Sigle AbaNS 361</w:t>
+        <w:t xml:space="preserve">Sigle AbaNS 361 · Site 12</w:t>
       </w:r>
     </w:p>
     <w:p>
@@ -3213,7 +3213,7 @@
           <w:sz w:val="16"/>
           <w:szCs w:val="16"/>
         </w:rPr>
-        <w:t xml:space="preserve">Sigle C 4273</w:t>
+        <w:t xml:space="preserve">Sigle C 4273 · Al-Suwaydā</w:t>
       </w:r>
     </w:p>
     <w:p>
@@ -3240,7 +3240,7 @@
           <w:sz w:val="16"/>
           <w:szCs w:val="16"/>
         </w:rPr>
-        <w:t xml:space="preserve">Sigle CSNS 781</w:t>
+        <w:t xml:space="preserve">Sigle CSNS 781 · Qāʿ al-Maḥfūr</w:t>
       </w:r>
     </w:p>
     <w:p>
@@ -3267,7 +3267,7 @@
           <w:sz w:val="16"/>
           <w:szCs w:val="16"/>
         </w:rPr>
-        <w:t xml:space="preserve">Sigle WH 1517</w:t>
+        <w:t xml:space="preserve">Sigle WH 1517 · Fundort unbekannt</w:t>
       </w:r>
     </w:p>
     <w:p>
@@ -3294,7 +3294,7 @@
           <w:sz w:val="16"/>
           <w:szCs w:val="16"/>
         </w:rPr>
-        <w:t xml:space="preserve">Sigle AbaNS 453</w:t>
+        <w:t xml:space="preserve">Sigle AbaNS 453 · Site 13</w:t>
       </w:r>
     </w:p>
     <w:p>
@@ -3321,7 +3321,7 @@
           <w:sz w:val="16"/>
           <w:szCs w:val="16"/>
         </w:rPr>
-        <w:t xml:space="preserve">Sigle WH 3829</w:t>
+        <w:t xml:space="preserve">Sigle WH 3829 · Fundort unbekannt</w:t>
       </w:r>
     </w:p>
     <w:p>
@@ -3361,7 +3361,7 @@
           <w:sz w:val="16"/>
           <w:szCs w:val="16"/>
         </w:rPr>
-        <w:t xml:space="preserve">Sigle WH 3029</w:t>
+        <w:t xml:space="preserve">Sigle WH 3029 · Fundort unbekannt</w:t>
       </w:r>
     </w:p>
     <w:p>
@@ -3388,7 +3388,7 @@
           <w:sz w:val="16"/>
           <w:szCs w:val="16"/>
         </w:rPr>
-        <w:t xml:space="preserve">Sigle WH 2825</w:t>
+        <w:t xml:space="preserve">Sigle WH 2825 · Fundort unbekannt</w:t>
       </w:r>
     </w:p>
     <w:p>
@@ -3415,7 +3415,7 @@
           <w:sz w:val="16"/>
           <w:szCs w:val="16"/>
         </w:rPr>
-        <w:t xml:space="preserve">Sigle HaNSB 319</w:t>
+        <w:t xml:space="preserve">Sigle HaNSB 319 · Cairn 9</w:t>
       </w:r>
     </w:p>
     <w:p>
@@ -3442,7 +3442,7 @@
           <w:sz w:val="16"/>
           <w:szCs w:val="16"/>
         </w:rPr>
-        <w:t xml:space="preserve">Sigle HaNS 708</w:t>
+        <w:t xml:space="preserve">Sigle HaNS 708 · Cairn 10</w:t>
       </w:r>
     </w:p>
     <w:p>
@@ -3482,7 +3482,7 @@
           <w:sz w:val="16"/>
           <w:szCs w:val="16"/>
         </w:rPr>
-        <w:t xml:space="preserve">Sigle HaNSB 346</w:t>
+        <w:t xml:space="preserve">Sigle HaNSB 346 · Cairn 9</w:t>
       </w:r>
     </w:p>
     <w:p>
@@ -3509,7 +3509,7 @@
           <w:sz w:val="16"/>
           <w:szCs w:val="16"/>
         </w:rPr>
-        <w:t xml:space="preserve">Sigle HNSD 13</w:t>
+        <w:t xml:space="preserve">Sigle HNSD 13 · Jordanien (allg.)</w:t>
       </w:r>
     </w:p>
     <w:p>
@@ -3536,7 +3536,7 @@
           <w:sz w:val="16"/>
           <w:szCs w:val="16"/>
         </w:rPr>
-        <w:t xml:space="preserve">Sigle SIJ 1001</w:t>
+        <w:t xml:space="preserve">Sigle SIJ 1001 · Cairn S. of the Baghdad </w:t>
       </w:r>
     </w:p>
     <w:p>
@@ -3576,7 +3576,7 @@
           <w:sz w:val="16"/>
           <w:szCs w:val="16"/>
         </w:rPr>
-        <w:t xml:space="preserve">Sigle SIJ 811</w:t>
+        <w:t xml:space="preserve">Sigle SIJ 811 · Tell al-ʿAbd</w:t>
       </w:r>
     </w:p>
     <w:p>
@@ -3603,7 +3603,7 @@
           <w:sz w:val="16"/>
           <w:szCs w:val="16"/>
         </w:rPr>
-        <w:t xml:space="preserve">Sigle SSWS 28</w:t>
+        <w:t xml:space="preserve">Sigle SSWS 28 · Wādī Sārah</w:t>
       </w:r>
     </w:p>
     <w:p>
@@ -3630,7 +3630,7 @@
           <w:sz w:val="16"/>
           <w:szCs w:val="16"/>
         </w:rPr>
-        <w:t xml:space="preserve">Sigle C 5367</w:t>
+        <w:t xml:space="preserve">Sigle C 5367 · Ḥarrat al-Raǧil</w:t>
       </w:r>
     </w:p>
     <w:p>
@@ -3783,7 +3783,7 @@
           <w:sz w:val="16"/>
           <w:szCs w:val="16"/>
         </w:rPr>
-        <w:t xml:space="preserve">Sigle C 4803</w:t>
+        <w:t xml:space="preserve">Sigle C 4803 · Zalaf</w:t>
       </w:r>
     </w:p>
     <w:p>
@@ -3914,7 +3914,7 @@
           <w:sz w:val="16"/>
           <w:szCs w:val="16"/>
         </w:rPr>
-        <w:t xml:space="preserve">Sigle RSIS 351</w:t>
+        <w:t xml:space="preserve">Sigle RSIS 351 · Tall aḍ-Ḍabiʿ</w:t>
       </w:r>
     </w:p>
     <w:p>
@@ -3993,7 +3993,7 @@
           <w:sz w:val="16"/>
           <w:szCs w:val="16"/>
         </w:rPr>
-        <w:t xml:space="preserve">Sigle LP 243</w:t>
+        <w:t xml:space="preserve">Sigle LP 243 · Al-Mrōshan</w:t>
       </w:r>
     </w:p>
     <w:p>
@@ -4059,7 +4059,7 @@
           <w:sz w:val="16"/>
           <w:szCs w:val="16"/>
         </w:rPr>
-        <w:t xml:space="preserve">Sigle C 2775</w:t>
+        <w:t xml:space="preserve">Sigle C 2775 · Zalaf</w:t>
       </w:r>
     </w:p>
     <w:p>
@@ -4138,7 +4138,7 @@
           <w:sz w:val="16"/>
           <w:szCs w:val="16"/>
         </w:rPr>
-        <w:t xml:space="preserve">Sigle WH 368</w:t>
+        <w:t xml:space="preserve">Sigle WH 368 · Fundort unbekannt</w:t>
       </w:r>
     </w:p>
     <w:p>
@@ -4217,7 +4217,7 @@
           <w:sz w:val="16"/>
           <w:szCs w:val="16"/>
         </w:rPr>
-        <w:t xml:space="preserve">Sigle LP 461</w:t>
+        <w:t xml:space="preserve">Sigle LP 461 · al-ʿĪsāwī</w:t>
       </w:r>
     </w:p>
     <w:p>
@@ -4270,7 +4270,7 @@
           <w:sz w:val="16"/>
           <w:szCs w:val="16"/>
         </w:rPr>
-        <w:t xml:space="preserve">Sigle KRS 813</w:t>
+        <w:t xml:space="preserve">Sigle KRS 813 · Al-Mafraq</w:t>
       </w:r>
     </w:p>
     <w:p>
@@ -4336,7 +4336,7 @@
           <w:sz w:val="16"/>
           <w:szCs w:val="16"/>
         </w:rPr>
-        <w:t xml:space="preserve">Sigle KRS 941</w:t>
+        <w:t xml:space="preserve">Sigle KRS 941 · Al-Mafraq</w:t>
       </w:r>
     </w:p>
     <w:p>
@@ -4402,7 +4402,7 @@
           <w:sz w:val="16"/>
           <w:szCs w:val="16"/>
         </w:rPr>
-        <w:t xml:space="preserve">Sigle Is.Mu 242</w:t>
+        <w:t xml:space="preserve">Sigle Is.Mu 242 · al-ʿĪsāwī</w:t>
       </w:r>
     </w:p>
     <w:p>
@@ -4468,7 +4468,7 @@
           <w:sz w:val="16"/>
           <w:szCs w:val="16"/>
         </w:rPr>
-        <w:t xml:space="preserve">Sigle HCH 85</w:t>
+        <w:t xml:space="preserve">Sigle HCH 85 · Cairn of Haniʾ</w:t>
       </w:r>
     </w:p>
     <w:p>
@@ -4521,7 +4521,7 @@
           <w:sz w:val="16"/>
           <w:szCs w:val="16"/>
         </w:rPr>
-        <w:t xml:space="preserve">Sigle C 286</w:t>
+        <w:t xml:space="preserve">Sigle C 286 · Rif Dimašq</w:t>
       </w:r>
     </w:p>
     <w:p>
@@ -4587,7 +4587,7 @@
           <w:sz w:val="16"/>
           <w:szCs w:val="16"/>
         </w:rPr>
-        <w:t xml:space="preserve">Sigle C 1658</w:t>
+        <w:t xml:space="preserve">Sigle C 1658 · Zalaf</w:t>
       </w:r>
     </w:p>
     <w:p>
@@ -4627,7 +4627,7 @@
           <w:sz w:val="16"/>
           <w:szCs w:val="16"/>
         </w:rPr>
-        <w:t xml:space="preserve">Sigle C 1845</w:t>
+        <w:t xml:space="preserve">Sigle C 1845 · Zalaf</w:t>
       </w:r>
     </w:p>
     <w:p>
@@ -4693,7 +4693,7 @@
           <w:sz w:val="16"/>
           <w:szCs w:val="16"/>
         </w:rPr>
-        <w:t xml:space="preserve">Sigle C 2551</w:t>
+        <w:t xml:space="preserve">Sigle C 2551 · Zalaf</w:t>
       </w:r>
     </w:p>
     <w:p>
@@ -4733,7 +4733,7 @@
           <w:sz w:val="16"/>
           <w:szCs w:val="16"/>
         </w:rPr>
-        <w:t xml:space="preserve">Sigle C 3138</w:t>
+        <w:t xml:space="preserve">Sigle C 3138 · Zalaf</w:t>
       </w:r>
     </w:p>
     <w:p>
@@ -4799,7 +4799,7 @@
           <w:sz w:val="16"/>
           <w:szCs w:val="16"/>
         </w:rPr>
-        <w:t xml:space="preserve">Sigle C 4439</w:t>
+        <w:t xml:space="preserve">Sigle C 4439 · Al-Suwaydā</w:t>
       </w:r>
     </w:p>
     <w:p>
@@ -4839,7 +4839,7 @@
           <w:sz w:val="16"/>
           <w:szCs w:val="16"/>
         </w:rPr>
-        <w:t xml:space="preserve">Sigle C 5299</w:t>
+        <w:t xml:space="preserve">Sigle C 5299 · Ḥarrat al-Raǧil</w:t>
       </w:r>
     </w:p>
     <w:p>
@@ -4918,7 +4918,7 @@
           <w:sz w:val="16"/>
           <w:szCs w:val="16"/>
         </w:rPr>
-        <w:t xml:space="preserve">Sigle LP 308</w:t>
+        <w:t xml:space="preserve">Sigle LP 308 · al-ʿĪsāwī</w:t>
       </w:r>
     </w:p>
     <w:p>
@@ -5149,7 +5149,7 @@
           <w:sz w:val="16"/>
           <w:szCs w:val="16"/>
         </w:rPr>
-        <w:t xml:space="preserve">Sigle HSNS 5</w:t>
+        <w:t xml:space="preserve">Sigle HSNS 5 · Jordanien (allg.)</w:t>
       </w:r>
     </w:p>
     <w:p>
@@ -5280,7 +5280,7 @@
           <w:sz w:val="16"/>
           <w:szCs w:val="16"/>
         </w:rPr>
-        <w:t xml:space="preserve">Sigle LP 653</w:t>
+        <w:t xml:space="preserve">Sigle LP 653 · Rif Dimašq</w:t>
       </w:r>
     </w:p>
     <w:p>
@@ -5437,7 +5437,7 @@
           <w:sz w:val="16"/>
           <w:szCs w:val="16"/>
         </w:rPr>
-        <w:t xml:space="preserve">Sigle ASWS 73</w:t>
+        <w:t xml:space="preserve">Sigle ASWS 73 · Wādī Sārah</w:t>
       </w:r>
     </w:p>
     <w:p>
@@ -5503,7 +5503,7 @@
           <w:sz w:val="16"/>
           <w:szCs w:val="16"/>
         </w:rPr>
-        <w:t xml:space="preserve">Sigle C 2670</w:t>
+        <w:t xml:space="preserve">Sigle C 2670 · Zalaf</w:t>
       </w:r>
     </w:p>
     <w:p>
@@ -5556,7 +5556,7 @@
           <w:sz w:val="16"/>
           <w:szCs w:val="16"/>
         </w:rPr>
-        <w:t xml:space="preserve">Sigle ISB 57</w:t>
+        <w:t xml:space="preserve">Sigle ISB 57 · Site 4</w:t>
       </w:r>
     </w:p>
     <w:p>
@@ -5596,7 +5596,7 @@
           <w:sz w:val="16"/>
           <w:szCs w:val="16"/>
         </w:rPr>
-        <w:t xml:space="preserve">Sigle HSNS 1</w:t>
+        <w:t xml:space="preserve">Sigle HSNS 1 · Jordanien (allg.)</w:t>
       </w:r>
     </w:p>
     <w:p>
@@ -5649,7 +5649,7 @@
           <w:sz w:val="16"/>
           <w:szCs w:val="16"/>
         </w:rPr>
-        <w:t xml:space="preserve">Sigle RQ.D 3</w:t>
+        <w:t xml:space="preserve">Sigle RQ.D 3 · Riǧm Qaʿqūl</w:t>
       </w:r>
     </w:p>
     <w:p>
@@ -5702,7 +5702,338 @@
           <w:sz w:val="16"/>
           <w:szCs w:val="16"/>
         </w:rPr>
-        <w:t xml:space="preserve">Sigle LP 1291</w:t>
+        <w:t xml:space="preserve">Sigle LP 1291 · Syrien (allg.)</w:t>
+      </w:r>
+    </w:p>
+    <w:p>
+      <w:pPr>
+        <w:spacing w:after="40"/>
+      </w:pPr>
+      <w:r>
+        <w:rPr>
+          <w:rFonts w:ascii="Georgia" w:cs="Georgia" w:eastAsia="Georgia" w:hAnsi="Georgia"/>
+          <w:sz w:val="22"/>
+          <w:szCs w:val="22"/>
+        </w:rPr>
+        <w:t xml:space="preserve">Er zog in die innere Wüste,</w:t>
+      </w:r>
+    </w:p>
+    <w:p>
+      <w:pPr>
+        <w:spacing w:after="40"/>
+      </w:pPr>
+      <w:r>
+        <w:rPr>
+          <w:rFonts w:ascii="Georgia" w:cs="Georgia" w:eastAsia="Georgia" w:hAnsi="Georgia"/>
+          <w:sz w:val="22"/>
+          <w:szCs w:val="22"/>
+        </w:rPr>
+        <w:t xml:space="preserve">im Jahr, als der Oheim starb,</w:t>
+      </w:r>
+    </w:p>
+    <w:p>
+      <w:pPr>
+        <w:spacing w:after="40"/>
+      </w:pPr>
+      <w:r>
+        <w:rPr>
+          <w:rFonts w:ascii="Georgia" w:cs="Georgia" w:eastAsia="Georgia" w:hAnsi="Georgia"/>
+          <w:sz w:val="22"/>
+          <w:szCs w:val="22"/>
+        </w:rPr>
+        <w:t xml:space="preserve">und trauerte um Ks¹ṭ.</w:t>
+      </w:r>
+    </w:p>
+    <w:p>
+      <w:pPr>
+        <w:spacing w:after="280" w:before="60"/>
+      </w:pPr>
+      <w:r>
+        <w:rPr>
+          <w:rFonts w:ascii="Georgia" w:cs="Georgia" w:eastAsia="Georgia" w:hAnsi="Georgia"/>
+          <w:color w:val="7A5C3E"/>
+          <w:sz w:val="16"/>
+          <w:szCs w:val="16"/>
+        </w:rPr>
+        <w:t xml:space="preserve">Sigle C 2190 · Zalaf</w:t>
+      </w:r>
+    </w:p>
+    <w:p>
+      <w:pPr>
+        <w:spacing w:after="40"/>
+      </w:pPr>
+      <w:r>
+        <w:rPr>
+          <w:rFonts w:ascii="Georgia" w:cs="Georgia" w:eastAsia="Georgia" w:hAnsi="Georgia"/>
+          <w:sz w:val="22"/>
+          <w:szCs w:val="22"/>
+        </w:rPr>
+        <w:t xml:space="preserve">Er trauerte vor Schmerz</w:t>
+      </w:r>
+    </w:p>
+    <w:p>
+      <w:pPr>
+        <w:spacing w:after="40"/>
+      </w:pPr>
+      <w:r>
+        <w:rPr>
+          <w:rFonts w:ascii="Georgia" w:cs="Georgia" w:eastAsia="Georgia" w:hAnsi="Georgia"/>
+          <w:sz w:val="22"/>
+          <w:szCs w:val="22"/>
+        </w:rPr>
+        <w:t xml:space="preserve">um den getöteten S²rk</w:t>
+      </w:r>
+    </w:p>
+    <w:p>
+      <w:pPr>
+        <w:spacing w:after="40"/>
+      </w:pPr>
+      <w:r>
+        <w:rPr>
+          <w:rFonts w:ascii="Georgia" w:cs="Georgia" w:eastAsia="Georgia" w:hAnsi="Georgia"/>
+          <w:sz w:val="22"/>
+          <w:szCs w:val="22"/>
+        </w:rPr>
+        <w:t xml:space="preserve">und den gefangenen ʿyḏ,</w:t>
+      </w:r>
+    </w:p>
+    <w:p>
+      <w:pPr>
+        <w:spacing w:after="40"/>
+      </w:pPr>
+      <w:r>
+        <w:rPr>
+          <w:rFonts w:ascii="Georgia" w:cs="Georgia" w:eastAsia="Georgia" w:hAnsi="Georgia"/>
+          <w:sz w:val="22"/>
+          <w:szCs w:val="22"/>
+        </w:rPr>
+        <w:t xml:space="preserve">im Jahr der Rm.</w:t>
+      </w:r>
+    </w:p>
+    <w:p>
+      <w:pPr>
+        <w:spacing w:after="280" w:before="60"/>
+      </w:pPr>
+      <w:r>
+        <w:rPr>
+          <w:rFonts w:ascii="Georgia" w:cs="Georgia" w:eastAsia="Georgia" w:hAnsi="Georgia"/>
+          <w:color w:val="7A5C3E"/>
+          <w:sz w:val="16"/>
+          <w:szCs w:val="16"/>
+        </w:rPr>
+        <w:t xml:space="preserve">Sigle RQ.D 6 · Riǧm Qaʿqūl</w:t>
+      </w:r>
+    </w:p>
+    <w:p>
+      <w:pPr>
+        <w:spacing w:after="40"/>
+      </w:pPr>
+      <w:r>
+        <w:rPr>
+          <w:rFonts w:ascii="Georgia" w:cs="Georgia" w:eastAsia="Georgia" w:hAnsi="Georgia"/>
+          <w:sz w:val="22"/>
+          <w:szCs w:val="22"/>
+        </w:rPr>
+        <w:t xml:space="preserve">Er weidete auf dem Frühjahrsgras</w:t>
+      </w:r>
+    </w:p>
+    <w:p>
+      <w:pPr>
+        <w:spacing w:after="40"/>
+      </w:pPr>
+      <w:r>
+        <w:rPr>
+          <w:rFonts w:ascii="Georgia" w:cs="Georgia" w:eastAsia="Georgia" w:hAnsi="Georgia"/>
+          <w:sz w:val="22"/>
+          <w:szCs w:val="22"/>
+        </w:rPr>
+        <w:t xml:space="preserve">im Jahr von Taymāʾ.</w:t>
+      </w:r>
+    </w:p>
+    <w:p>
+      <w:pPr>
+        <w:spacing w:after="280" w:before="60"/>
+      </w:pPr>
+      <w:r>
+        <w:rPr>
+          <w:rFonts w:ascii="Georgia" w:cs="Georgia" w:eastAsia="Georgia" w:hAnsi="Georgia"/>
+          <w:color w:val="7A5C3E"/>
+          <w:sz w:val="16"/>
+          <w:szCs w:val="16"/>
+        </w:rPr>
+        <w:t xml:space="preserve">Sigle Is.L 202 · al-ʿĪsāwī</w:t>
+      </w:r>
+    </w:p>
+    <w:p>
+      <w:pPr>
+        <w:spacing w:after="40"/>
+      </w:pPr>
+      <w:r>
+        <w:rPr>
+          <w:rFonts w:ascii="Georgia" w:cs="Georgia" w:eastAsia="Georgia" w:hAnsi="Georgia"/>
+          <w:sz w:val="22"/>
+          <w:szCs w:val="22"/>
+        </w:rPr>
+        <w:t xml:space="preserve">Er kam zurück von S¹mwt</w:t>
+      </w:r>
+    </w:p>
+    <w:p>
+      <w:pPr>
+        <w:spacing w:after="40"/>
+      </w:pPr>
+      <w:r>
+        <w:rPr>
+          <w:rFonts w:ascii="Georgia" w:cs="Georgia" w:eastAsia="Georgia" w:hAnsi="Georgia"/>
+          <w:sz w:val="22"/>
+          <w:szCs w:val="22"/>
+        </w:rPr>
+        <w:t xml:space="preserve">im Jahr des Kampfes des Mʿṣ.</w:t>
+      </w:r>
+    </w:p>
+    <w:p>
+      <w:pPr>
+        <w:spacing w:after="280" w:before="60"/>
+      </w:pPr>
+      <w:r>
+        <w:rPr>
+          <w:rFonts w:ascii="Georgia" w:cs="Georgia" w:eastAsia="Georgia" w:hAnsi="Georgia"/>
+          <w:color w:val="7A5C3E"/>
+          <w:sz w:val="16"/>
+          <w:szCs w:val="16"/>
+        </w:rPr>
+        <w:t xml:space="preserve">Sigle ASFF 267 · Al-Mafraq</w:t>
+      </w:r>
+    </w:p>
+    <w:p>
+      <w:pPr>
+        <w:spacing w:after="40"/>
+      </w:pPr>
+      <w:r>
+        <w:rPr>
+          <w:rFonts w:ascii="Georgia" w:cs="Georgia" w:eastAsia="Georgia" w:hAnsi="Georgia"/>
+          <w:sz w:val="22"/>
+          <w:szCs w:val="22"/>
+        </w:rPr>
+        <w:t xml:space="preserve">Der Unterstand gehört ʿzgd.</w:t>
+      </w:r>
+    </w:p>
+    <w:p>
+      <w:pPr>
+        <w:spacing w:after="40"/>
+      </w:pPr>
+      <w:r>
+        <w:rPr>
+          <w:rFonts w:ascii="Georgia" w:cs="Georgia" w:eastAsia="Georgia" w:hAnsi="Georgia"/>
+          <w:sz w:val="22"/>
+          <w:szCs w:val="22"/>
+        </w:rPr>
+        <w:t xml:space="preserve">Er kam ans Wasser</w:t>
+      </w:r>
+    </w:p>
+    <w:p>
+      <w:pPr>
+        <w:spacing w:after="40"/>
+      </w:pPr>
+      <w:r>
+        <w:rPr>
+          <w:rFonts w:ascii="Georgia" w:cs="Georgia" w:eastAsia="Georgia" w:hAnsi="Georgia"/>
+          <w:sz w:val="22"/>
+          <w:szCs w:val="22"/>
+        </w:rPr>
+        <w:t xml:space="preserve">im Jahr des ṣh.</w:t>
+      </w:r>
+    </w:p>
+    <w:p>
+      <w:pPr>
+        <w:spacing w:after="280" w:before="60"/>
+      </w:pPr>
+      <w:r>
+        <w:rPr>
+          <w:rFonts w:ascii="Georgia" w:cs="Georgia" w:eastAsia="Georgia" w:hAnsi="Georgia"/>
+          <w:color w:val="7A5C3E"/>
+          <w:sz w:val="16"/>
+          <w:szCs w:val="16"/>
+        </w:rPr>
+        <w:t xml:space="preserve">Sigle KRS 1586 · Al-Mafraq</w:t>
+      </w:r>
+    </w:p>
+    <w:p>
+      <w:pPr>
+        <w:spacing w:after="40"/>
+      </w:pPr>
+      <w:r>
+        <w:rPr>
+          <w:rFonts w:ascii="Georgia" w:cs="Georgia" w:eastAsia="Georgia" w:hAnsi="Georgia"/>
+          <w:sz w:val="22"/>
+          <w:szCs w:val="22"/>
+        </w:rPr>
+        <w:t xml:space="preserve">Er baute den kleinen Unterstand</w:t>
+      </w:r>
+    </w:p>
+    <w:p>
+      <w:pPr>
+        <w:spacing w:after="40"/>
+      </w:pPr>
+      <w:r>
+        <w:rPr>
+          <w:rFonts w:ascii="Georgia" w:cs="Georgia" w:eastAsia="Georgia" w:hAnsi="Georgia"/>
+          <w:sz w:val="22"/>
+          <w:szCs w:val="22"/>
+        </w:rPr>
+        <w:t xml:space="preserve">im Jahr, als die Sturzfluten</w:t>
+      </w:r>
+    </w:p>
+    <w:p>
+      <w:pPr>
+        <w:spacing w:after="40"/>
+      </w:pPr>
+      <w:r>
+        <w:rPr>
+          <w:rFonts w:ascii="Georgia" w:cs="Georgia" w:eastAsia="Georgia" w:hAnsi="Georgia"/>
+          <w:sz w:val="22"/>
+          <w:szCs w:val="22"/>
+        </w:rPr>
+        <w:t xml:space="preserve">in diese Raḥaba kamen.</w:t>
+      </w:r>
+    </w:p>
+    <w:p>
+      <w:pPr>
+        <w:spacing w:after="40"/>
+      </w:pPr>
+      <w:r>
+        <w:rPr>
+          <w:rFonts w:ascii="Georgia" w:cs="Georgia" w:eastAsia="Georgia" w:hAnsi="Georgia"/>
+          <w:sz w:val="22"/>
+          <w:szCs w:val="22"/>
+        </w:rPr>
+        <w:t xml:space="preserve">Allat — Sicherheit;</w:t>
+      </w:r>
+    </w:p>
+    <w:p>
+      <w:pPr>
+        <w:spacing w:after="40"/>
+      </w:pPr>
+      <w:r>
+        <w:rPr>
+          <w:rFonts w:ascii="Georgia" w:cs="Georgia" w:eastAsia="Georgia" w:hAnsi="Georgia"/>
+          <w:sz w:val="22"/>
+          <w:szCs w:val="22"/>
+        </w:rPr>
+        <w:t xml:space="preserve">Blindheit dem, der dies auskratzt.</w:t>
+      </w:r>
+    </w:p>
+    <w:p>
+      <w:pPr>
+        <w:spacing w:after="280" w:before="60"/>
+      </w:pPr>
+      <w:r>
+        <w:rPr>
+          <w:rFonts w:ascii="Georgia" w:cs="Georgia" w:eastAsia="Georgia" w:hAnsi="Georgia"/>
+          <w:color w:val="7A5C3E"/>
+          <w:sz w:val="16"/>
+          <w:szCs w:val="16"/>
+        </w:rPr>
+        <w:t xml:space="preserve">Sigle C 4681 · Rif Dimašq</w:t>
       </w:r>
     </w:p>
     <w:p>
@@ -5728,7 +6059,7 @@
           <w:sz w:val="22"/>
           <w:szCs w:val="22"/>
         </w:rPr>
-        <w:t xml:space="preserve">den sie erschlugen,</w:t>
+        <w:t xml:space="preserve">der getötet wurde,</w:t>
       </w:r>
     </w:p>
     <w:p>
@@ -5755,378 +6086,47 @@
           <w:sz w:val="16"/>
           <w:szCs w:val="16"/>
         </w:rPr>
-        <w:t xml:space="preserve">Sigle ZN 4</w:t>
-      </w:r>
-    </w:p>
-    <w:p>
-      <w:pPr>
-        <w:spacing w:after="40"/>
-      </w:pPr>
-      <w:r>
-        <w:rPr>
-          <w:rFonts w:ascii="Georgia" w:cs="Georgia" w:eastAsia="Georgia" w:hAnsi="Georgia"/>
-          <w:sz w:val="22"/>
-          <w:szCs w:val="22"/>
-        </w:rPr>
-        <w:t xml:space="preserve">Er trauerte vor Schmerz</w:t>
-      </w:r>
-    </w:p>
-    <w:p>
-      <w:pPr>
-        <w:spacing w:after="40"/>
-      </w:pPr>
-      <w:r>
-        <w:rPr>
-          <w:rFonts w:ascii="Georgia" w:cs="Georgia" w:eastAsia="Georgia" w:hAnsi="Georgia"/>
-          <w:sz w:val="22"/>
-          <w:szCs w:val="22"/>
-        </w:rPr>
-        <w:t xml:space="preserve">um den getöteten S²rk</w:t>
-      </w:r>
-    </w:p>
-    <w:p>
-      <w:pPr>
-        <w:spacing w:after="40"/>
-      </w:pPr>
-      <w:r>
-        <w:rPr>
-          <w:rFonts w:ascii="Georgia" w:cs="Georgia" w:eastAsia="Georgia" w:hAnsi="Georgia"/>
-          <w:sz w:val="22"/>
-          <w:szCs w:val="22"/>
-        </w:rPr>
-        <w:t xml:space="preserve">und den gefangenen ʿyḏ,</w:t>
-      </w:r>
-    </w:p>
-    <w:p>
-      <w:pPr>
-        <w:spacing w:after="40"/>
-      </w:pPr>
-      <w:r>
-        <w:rPr>
-          <w:rFonts w:ascii="Georgia" w:cs="Georgia" w:eastAsia="Georgia" w:hAnsi="Georgia"/>
-          <w:sz w:val="22"/>
-          <w:szCs w:val="22"/>
-        </w:rPr>
-        <w:t xml:space="preserve">im Jahr der Rm.</w:t>
-      </w:r>
-    </w:p>
-    <w:p>
-      <w:pPr>
-        <w:spacing w:after="280" w:before="60"/>
-      </w:pPr>
-      <w:r>
-        <w:rPr>
-          <w:rFonts w:ascii="Georgia" w:cs="Georgia" w:eastAsia="Georgia" w:hAnsi="Georgia"/>
-          <w:color w:val="7A5C3E"/>
-          <w:sz w:val="16"/>
-          <w:szCs w:val="16"/>
-        </w:rPr>
-        <w:t xml:space="preserve">Sigle RQ.D 6</w:t>
-      </w:r>
-    </w:p>
-    <w:p>
-      <w:pPr>
-        <w:spacing w:after="40"/>
-      </w:pPr>
-      <w:r>
-        <w:rPr>
-          <w:rFonts w:ascii="Georgia" w:cs="Georgia" w:eastAsia="Georgia" w:hAnsi="Georgia"/>
-          <w:sz w:val="22"/>
-          <w:szCs w:val="22"/>
-        </w:rPr>
-        <w:t xml:space="preserve">Er weidete auf dem Frühjahrsgras</w:t>
-      </w:r>
-    </w:p>
-    <w:p>
-      <w:pPr>
-        <w:spacing w:after="40"/>
-      </w:pPr>
-      <w:r>
-        <w:rPr>
-          <w:rFonts w:ascii="Georgia" w:cs="Georgia" w:eastAsia="Georgia" w:hAnsi="Georgia"/>
-          <w:sz w:val="22"/>
-          <w:szCs w:val="22"/>
-        </w:rPr>
-        <w:t xml:space="preserve">im Jahr von Taymāʾ.</w:t>
-      </w:r>
-    </w:p>
-    <w:p>
-      <w:pPr>
-        <w:spacing w:after="280" w:before="60"/>
-      </w:pPr>
-      <w:r>
-        <w:rPr>
-          <w:rFonts w:ascii="Georgia" w:cs="Georgia" w:eastAsia="Georgia" w:hAnsi="Georgia"/>
-          <w:color w:val="7A5C3E"/>
-          <w:sz w:val="16"/>
-          <w:szCs w:val="16"/>
-        </w:rPr>
-        <w:t xml:space="preserve">Sigle Is.L 202</w:t>
-      </w:r>
-    </w:p>
-    <w:p>
-      <w:pPr>
-        <w:spacing w:after="40"/>
-      </w:pPr>
-      <w:r>
-        <w:rPr>
-          <w:rFonts w:ascii="Georgia" w:cs="Georgia" w:eastAsia="Georgia" w:hAnsi="Georgia"/>
-          <w:sz w:val="22"/>
-          <w:szCs w:val="22"/>
-        </w:rPr>
-        <w:t xml:space="preserve">Er kam zurück von S¹mwt</w:t>
-      </w:r>
-    </w:p>
-    <w:p>
-      <w:pPr>
-        <w:spacing w:after="40"/>
-      </w:pPr>
-      <w:r>
-        <w:rPr>
-          <w:rFonts w:ascii="Georgia" w:cs="Georgia" w:eastAsia="Georgia" w:hAnsi="Georgia"/>
-          <w:sz w:val="22"/>
-          <w:szCs w:val="22"/>
-        </w:rPr>
-        <w:t xml:space="preserve">im Jahr des Kampfes des Mʿṣ.</w:t>
-      </w:r>
-    </w:p>
-    <w:p>
-      <w:pPr>
-        <w:spacing w:after="280" w:before="60"/>
-      </w:pPr>
-      <w:r>
-        <w:rPr>
-          <w:rFonts w:ascii="Georgia" w:cs="Georgia" w:eastAsia="Georgia" w:hAnsi="Georgia"/>
-          <w:color w:val="7A5C3E"/>
-          <w:sz w:val="16"/>
-          <w:szCs w:val="16"/>
-        </w:rPr>
-        <w:t xml:space="preserve">Sigle ASFF 267</w:t>
-      </w:r>
-    </w:p>
-    <w:p>
-      <w:pPr>
-        <w:spacing w:after="40"/>
-      </w:pPr>
-      <w:r>
-        <w:rPr>
-          <w:rFonts w:ascii="Georgia" w:cs="Georgia" w:eastAsia="Georgia" w:hAnsi="Georgia"/>
-          <w:sz w:val="22"/>
-          <w:szCs w:val="22"/>
-        </w:rPr>
-        <w:t xml:space="preserve">Der Unterstand gehört ʿzgd.</w:t>
-      </w:r>
-    </w:p>
-    <w:p>
-      <w:pPr>
-        <w:spacing w:after="40"/>
-      </w:pPr>
-      <w:r>
-        <w:rPr>
-          <w:rFonts w:ascii="Georgia" w:cs="Georgia" w:eastAsia="Georgia" w:hAnsi="Georgia"/>
-          <w:sz w:val="22"/>
-          <w:szCs w:val="22"/>
-        </w:rPr>
-        <w:t xml:space="preserve">Er kam ans Wasser</w:t>
-      </w:r>
-    </w:p>
-    <w:p>
-      <w:pPr>
-        <w:spacing w:after="40"/>
-      </w:pPr>
-      <w:r>
-        <w:rPr>
-          <w:rFonts w:ascii="Georgia" w:cs="Georgia" w:eastAsia="Georgia" w:hAnsi="Georgia"/>
-          <w:sz w:val="22"/>
-          <w:szCs w:val="22"/>
-        </w:rPr>
-        <w:t xml:space="preserve">im Jahr des ṣh.</w:t>
-      </w:r>
-    </w:p>
-    <w:p>
-      <w:pPr>
-        <w:spacing w:after="280" w:before="60"/>
-      </w:pPr>
-      <w:r>
-        <w:rPr>
-          <w:rFonts w:ascii="Georgia" w:cs="Georgia" w:eastAsia="Georgia" w:hAnsi="Georgia"/>
-          <w:color w:val="7A5C3E"/>
-          <w:sz w:val="16"/>
-          <w:szCs w:val="16"/>
-        </w:rPr>
-        <w:t xml:space="preserve">Sigle KRS 1586</w:t>
-      </w:r>
-    </w:p>
-    <w:p>
-      <w:pPr>
-        <w:spacing w:after="40"/>
-      </w:pPr>
-      <w:r>
-        <w:rPr>
-          <w:rFonts w:ascii="Georgia" w:cs="Georgia" w:eastAsia="Georgia" w:hAnsi="Georgia"/>
-          <w:sz w:val="22"/>
-          <w:szCs w:val="22"/>
-        </w:rPr>
-        <w:t xml:space="preserve">Er baute den kleinen Unterstand</w:t>
-      </w:r>
-    </w:p>
-    <w:p>
-      <w:pPr>
-        <w:spacing w:after="40"/>
-      </w:pPr>
-      <w:r>
-        <w:rPr>
-          <w:rFonts w:ascii="Georgia" w:cs="Georgia" w:eastAsia="Georgia" w:hAnsi="Georgia"/>
-          <w:sz w:val="22"/>
-          <w:szCs w:val="22"/>
-        </w:rPr>
-        <w:t xml:space="preserve">im Jahr, als die Sturzfluten</w:t>
-      </w:r>
-    </w:p>
-    <w:p>
-      <w:pPr>
-        <w:spacing w:after="40"/>
-      </w:pPr>
-      <w:r>
-        <w:rPr>
-          <w:rFonts w:ascii="Georgia" w:cs="Georgia" w:eastAsia="Georgia" w:hAnsi="Georgia"/>
-          <w:sz w:val="22"/>
-          <w:szCs w:val="22"/>
-        </w:rPr>
-        <w:t xml:space="preserve">in diese Raḥaba kamen.</w:t>
-      </w:r>
-    </w:p>
-    <w:p>
-      <w:pPr>
-        <w:spacing w:after="40"/>
-      </w:pPr>
-      <w:r>
-        <w:rPr>
-          <w:rFonts w:ascii="Georgia" w:cs="Georgia" w:eastAsia="Georgia" w:hAnsi="Georgia"/>
-          <w:sz w:val="22"/>
-          <w:szCs w:val="22"/>
-        </w:rPr>
-        <w:t xml:space="preserve">Allat — Sicherheit;</w:t>
-      </w:r>
-    </w:p>
-    <w:p>
-      <w:pPr>
-        <w:spacing w:after="40"/>
-      </w:pPr>
-      <w:r>
-        <w:rPr>
-          <w:rFonts w:ascii="Georgia" w:cs="Georgia" w:eastAsia="Georgia" w:hAnsi="Georgia"/>
-          <w:sz w:val="22"/>
-          <w:szCs w:val="22"/>
-        </w:rPr>
-        <w:t xml:space="preserve">Blindheit dem, der dies auskratzt.</w:t>
-      </w:r>
-    </w:p>
-    <w:p>
-      <w:pPr>
-        <w:spacing w:after="280" w:before="60"/>
-      </w:pPr>
-      <w:r>
-        <w:rPr>
-          <w:rFonts w:ascii="Georgia" w:cs="Georgia" w:eastAsia="Georgia" w:hAnsi="Georgia"/>
-          <w:color w:val="7A5C3E"/>
-          <w:sz w:val="16"/>
-          <w:szCs w:val="16"/>
-        </w:rPr>
-        <w:t xml:space="preserve">Sigle C 4681</w:t>
-      </w:r>
-    </w:p>
-    <w:p>
-      <w:pPr>
-        <w:spacing w:after="40"/>
-      </w:pPr>
-      <w:r>
-        <w:rPr>
-          <w:rFonts w:ascii="Georgia" w:cs="Georgia" w:eastAsia="Georgia" w:hAnsi="Georgia"/>
-          <w:sz w:val="22"/>
-          <w:szCs w:val="22"/>
-        </w:rPr>
-        <w:t xml:space="preserve">Er trauerte um den Bruder,</w:t>
-      </w:r>
-    </w:p>
-    <w:p>
-      <w:pPr>
-        <w:spacing w:after="40"/>
-      </w:pPr>
-      <w:r>
-        <w:rPr>
-          <w:rFonts w:ascii="Georgia" w:cs="Georgia" w:eastAsia="Georgia" w:hAnsi="Georgia"/>
-          <w:sz w:val="22"/>
-          <w:szCs w:val="22"/>
-        </w:rPr>
-        <w:t xml:space="preserve">der getötet wurde,</w:t>
-      </w:r>
-    </w:p>
-    <w:p>
-      <w:pPr>
-        <w:spacing w:after="40"/>
-      </w:pPr>
-      <w:r>
-        <w:rPr>
-          <w:rFonts w:ascii="Georgia" w:cs="Georgia" w:eastAsia="Georgia" w:hAnsi="Georgia"/>
-          <w:sz w:val="22"/>
-          <w:szCs w:val="22"/>
-        </w:rPr>
-        <w:t xml:space="preserve">im Jahr des Qbr.</w:t>
-      </w:r>
-    </w:p>
-    <w:p>
-      <w:pPr>
-        <w:spacing w:after="280" w:before="60"/>
-      </w:pPr>
-      <w:r>
-        <w:rPr>
-          <w:rFonts w:ascii="Georgia" w:cs="Georgia" w:eastAsia="Georgia" w:hAnsi="Georgia"/>
-          <w:color w:val="7A5C3E"/>
-          <w:sz w:val="16"/>
-          <w:szCs w:val="16"/>
-        </w:rPr>
-        <w:t xml:space="preserve">Sigle ZN 1</w:t>
-      </w:r>
-    </w:p>
-    <w:p>
-      <w:pPr>
-        <w:spacing w:after="40"/>
-      </w:pPr>
-      <w:r>
-        <w:rPr>
-          <w:rFonts w:ascii="Georgia" w:cs="Georgia" w:eastAsia="Georgia" w:hAnsi="Georgia"/>
-          <w:sz w:val="22"/>
-          <w:szCs w:val="22"/>
-        </w:rPr>
-        <w:t xml:space="preserve">Er zog in die innere Wüste</w:t>
-      </w:r>
-    </w:p>
-    <w:p>
-      <w:pPr>
-        <w:spacing w:after="40"/>
-      </w:pPr>
-      <w:r>
-        <w:rPr>
-          <w:rFonts w:ascii="Georgia" w:cs="Georgia" w:eastAsia="Georgia" w:hAnsi="Georgia"/>
-          <w:sz w:val="22"/>
-          <w:szCs w:val="22"/>
-        </w:rPr>
-        <w:t xml:space="preserve">im Jahr des Hnʾ.</w:t>
-      </w:r>
-    </w:p>
-    <w:p>
-      <w:pPr>
-        <w:spacing w:after="280" w:before="60"/>
-      </w:pPr>
-      <w:r>
-        <w:rPr>
-          <w:rFonts w:ascii="Georgia" w:cs="Georgia" w:eastAsia="Georgia" w:hAnsi="Georgia"/>
-          <w:color w:val="7A5C3E"/>
-          <w:sz w:val="16"/>
-          <w:szCs w:val="16"/>
-        </w:rPr>
-        <w:t xml:space="preserve">Sigle WH 1851</w:t>
+        <w:t xml:space="preserve">Sigle ZN 1 · Zimlet Nāṣir</w:t>
+      </w:r>
+    </w:p>
+    <w:p>
+      <w:pPr>
+        <w:spacing w:after="40"/>
+      </w:pPr>
+      <w:r>
+        <w:rPr>
+          <w:rFonts w:ascii="Georgia" w:cs="Georgia" w:eastAsia="Georgia" w:hAnsi="Georgia"/>
+          <w:sz w:val="22"/>
+          <w:szCs w:val="22"/>
+        </w:rPr>
+        <w:t xml:space="preserve">Er nahm diesen Ort in Besitz</w:t>
+      </w:r>
+    </w:p>
+    <w:p>
+      <w:pPr>
+        <w:spacing w:after="40"/>
+      </w:pPr>
+      <w:r>
+        <w:rPr>
+          <w:rFonts w:ascii="Georgia" w:cs="Georgia" w:eastAsia="Georgia" w:hAnsi="Georgia"/>
+          <w:sz w:val="22"/>
+          <w:szCs w:val="22"/>
+        </w:rPr>
+        <w:t xml:space="preserve">im Jahr des ʾrzʾ.</w:t>
+      </w:r>
+    </w:p>
+    <w:p>
+      <w:pPr>
+        <w:spacing w:after="280" w:before="60"/>
+      </w:pPr>
+      <w:r>
+        <w:rPr>
+          <w:rFonts w:ascii="Georgia" w:cs="Georgia" w:eastAsia="Georgia" w:hAnsi="Georgia"/>
+          <w:color w:val="7A5C3E"/>
+          <w:sz w:val="16"/>
+          <w:szCs w:val="16"/>
+        </w:rPr>
+        <w:t xml:space="preserve">Sigle RWQ 304 · Wādī Salma</w:t>
       </w:r>
     </w:p>
     <w:p>
@@ -6179,7 +6179,7 @@
           <w:sz w:val="16"/>
           <w:szCs w:val="16"/>
         </w:rPr>
-        <w:t xml:space="preserve">Sigle BWM 3</w:t>
+        <w:t xml:space="preserve">Sigle BWM 3 · Wādī Miqāṭ</w:t>
       </w:r>
     </w:p>
     <w:p>
@@ -6219,7 +6219,7 @@
           <w:sz w:val="16"/>
           <w:szCs w:val="16"/>
         </w:rPr>
-        <w:t xml:space="preserve">Sigle RSIS 324</w:t>
+        <w:t xml:space="preserve">Sigle RSIS 324 · Tall aḍ-Ḍabiʿ</w:t>
       </w:r>
     </w:p>
     <w:p>
@@ -6272,7 +6272,7 @@
           <w:sz w:val="16"/>
           <w:szCs w:val="16"/>
         </w:rPr>
-        <w:t xml:space="preserve">Sigle C 4902</w:t>
+        <w:t xml:space="preserve">Sigle C 4902 · Rif Dimašq</w:t>
       </w:r>
     </w:p>
     <w:p>
@@ -6542,7 +6542,7 @@
           <w:sz w:val="16"/>
           <w:szCs w:val="16"/>
         </w:rPr>
-        <w:t xml:space="preserve">Sigle RQ.A 5</w:t>
+        <w:t xml:space="preserve">Sigle RQ.A 5 · Riǧm Qaʿqūl</w:t>
       </w:r>
     </w:p>
     <w:p>
@@ -6595,7 +6595,7 @@
           <w:sz w:val="16"/>
           <w:szCs w:val="16"/>
         </w:rPr>
-        <w:t xml:space="preserve">Sigle WH 1867.1</w:t>
+        <w:t xml:space="preserve">Sigle WH 1867.1 · Fundort unbekannt</w:t>
       </w:r>
     </w:p>
     <w:p>
@@ -6635,7 +6635,7 @@
           <w:sz w:val="16"/>
           <w:szCs w:val="16"/>
         </w:rPr>
-        <w:t xml:space="preserve">Sigle WH 1501.2</w:t>
+        <w:t xml:space="preserve">Sigle WH 1501.2 · Fundort unbekannt</w:t>
       </w:r>
     </w:p>
     <w:p>
@@ -6701,7 +6701,7 @@
           <w:sz w:val="16"/>
           <w:szCs w:val="16"/>
         </w:rPr>
-        <w:t xml:space="preserve">Sigle JaS 23</w:t>
+        <w:t xml:space="preserve">Sigle JaS 23 · Km 612</w:t>
       </w:r>
     </w:p>
     <w:p>
@@ -6780,7 +6780,7 @@
           <w:sz w:val="16"/>
           <w:szCs w:val="16"/>
         </w:rPr>
-        <w:t xml:space="preserve">Sigle HCH 102</w:t>
+        <w:t xml:space="preserve">Sigle HCH 102 · Cairn of Haniʾ</w:t>
       </w:r>
     </w:p>
     <w:p>
@@ -6859,7 +6859,7 @@
           <w:sz w:val="16"/>
           <w:szCs w:val="16"/>
         </w:rPr>
-        <w:t xml:space="preserve">Sigle HCH 125</w:t>
+        <w:t xml:space="preserve">Sigle HCH 125 · Cairn of Haniʾ</w:t>
       </w:r>
     </w:p>
     <w:p>
@@ -6925,7 +6925,7 @@
           <w:sz w:val="16"/>
           <w:szCs w:val="16"/>
         </w:rPr>
-        <w:t xml:space="preserve">Sigle HCH 151</w:t>
+        <w:t xml:space="preserve">Sigle HCH 151 · Cairn of Haniʾ</w:t>
       </w:r>
     </w:p>
     <w:p>
@@ -6978,7 +6978,7 @@
           <w:sz w:val="16"/>
           <w:szCs w:val="16"/>
         </w:rPr>
-        <w:t xml:space="preserve">Sigle HCH 157</w:t>
+        <w:t xml:space="preserve">Sigle HCH 157 · Cairn of Haniʾ</w:t>
       </w:r>
     </w:p>
     <w:p>
@@ -7031,7 +7031,7 @@
           <w:sz w:val="16"/>
           <w:szCs w:val="16"/>
         </w:rPr>
-        <w:t xml:space="preserve">Sigle HCH 164</w:t>
+        <w:t xml:space="preserve">Sigle HCH 164 · Cairn of Haniʾ</w:t>
       </w:r>
     </w:p>
     <w:p>
@@ -7084,7 +7084,7 @@
           <w:sz w:val="16"/>
           <w:szCs w:val="16"/>
         </w:rPr>
-        <w:t xml:space="preserve">Sigle HCH 183</w:t>
+        <w:t xml:space="preserve">Sigle HCH 183 · Cairn of Haniʾ</w:t>
       </w:r>
     </w:p>
     <w:p>
@@ -7137,7 +7137,7 @@
           <w:sz w:val="16"/>
           <w:szCs w:val="16"/>
         </w:rPr>
-        <w:t xml:space="preserve">Sigle HCH 184</w:t>
+        <w:t xml:space="preserve">Sigle HCH 184 · Cairn of Haniʾ</w:t>
       </w:r>
     </w:p>
     <w:p>
@@ -7203,126 +7203,113 @@
           <w:sz w:val="16"/>
           <w:szCs w:val="16"/>
         </w:rPr>
-        <w:t xml:space="preserve">Sigle HCH 195</w:t>
-      </w:r>
-    </w:p>
-    <w:p>
-      <w:pPr>
-        <w:spacing w:after="40"/>
-      </w:pPr>
-      <w:r>
-        <w:rPr>
-          <w:rFonts w:ascii="Georgia" w:cs="Georgia" w:eastAsia="Georgia" w:hAnsi="Georgia"/>
-          <w:sz w:val="22"/>
-          <w:szCs w:val="22"/>
-        </w:rPr>
-        <w:t xml:space="preserve">Von Rḥb, Sohn des Ḥl----.</w:t>
-      </w:r>
-    </w:p>
-    <w:p>
-      <w:pPr>
-        <w:spacing w:after="40"/>
-      </w:pPr>
-      <w:r>
-        <w:rPr>
-          <w:rFonts w:ascii="Georgia" w:cs="Georgia" w:eastAsia="Georgia" w:hAnsi="Georgia"/>
-          <w:sz w:val="22"/>
-          <w:szCs w:val="22"/>
-        </w:rPr>
-        <w:t xml:space="preserve">Und er hielt Ausschau</w:t>
-      </w:r>
-    </w:p>
-    <w:p>
-      <w:pPr>
-        <w:spacing w:after="40"/>
-      </w:pPr>
-      <w:r>
-        <w:rPr>
-          <w:rFonts w:ascii="Georgia" w:cs="Georgia" w:eastAsia="Georgia" w:hAnsi="Georgia"/>
-          <w:sz w:val="22"/>
-          <w:szCs w:val="22"/>
-        </w:rPr>
-        <w:t xml:space="preserve">um seinen Bruder Ṣʿdʾl ----</w:t>
-      </w:r>
-    </w:p>
-    <w:p>
-      <w:pPr>
-        <w:spacing w:after="280" w:before="60"/>
-      </w:pPr>
-      <w:r>
-        <w:rPr>
-          <w:rFonts w:ascii="Georgia" w:cs="Georgia" w:eastAsia="Georgia" w:hAnsi="Georgia"/>
-          <w:color w:val="7A5C3E"/>
-          <w:sz w:val="16"/>
-          <w:szCs w:val="16"/>
-        </w:rPr>
-        <w:t xml:space="preserve">Sigle RVP 10</w:t>
-      </w:r>
-    </w:p>
-    <w:p>
-      <w:pPr>
-        <w:spacing w:after="40"/>
-      </w:pPr>
-      <w:r>
-        <w:rPr>
-          <w:rFonts w:ascii="Georgia" w:cs="Georgia" w:eastAsia="Georgia" w:hAnsi="Georgia"/>
-          <w:sz w:val="22"/>
-          <w:szCs w:val="22"/>
-        </w:rPr>
-        <w:t xml:space="preserve">Er trauerte um ----nwy</w:t>
-      </w:r>
-    </w:p>
-    <w:p>
-      <w:pPr>
-        <w:spacing w:after="40"/>
-      </w:pPr>
-      <w:r>
-        <w:rPr>
-          <w:rFonts w:ascii="Georgia" w:cs="Georgia" w:eastAsia="Georgia" w:hAnsi="Georgia"/>
-          <w:sz w:val="22"/>
-          <w:szCs w:val="22"/>
-        </w:rPr>
-        <w:t xml:space="preserve">und um Nqd</w:t>
-      </w:r>
-    </w:p>
-    <w:p>
-      <w:pPr>
-        <w:spacing w:after="40"/>
-      </w:pPr>
-      <w:r>
-        <w:rPr>
-          <w:rFonts w:ascii="Georgia" w:cs="Georgia" w:eastAsia="Georgia" w:hAnsi="Georgia"/>
-          <w:sz w:val="22"/>
-          <w:szCs w:val="22"/>
-        </w:rPr>
-        <w:t xml:space="preserve">und um Wḥf</w:t>
-      </w:r>
-    </w:p>
-    <w:p>
-      <w:pPr>
-        <w:spacing w:after="40"/>
-      </w:pPr>
-      <w:r>
-        <w:rPr>
-          <w:rFonts w:ascii="Georgia" w:cs="Georgia" w:eastAsia="Georgia" w:hAnsi="Georgia"/>
-          <w:sz w:val="22"/>
-          <w:szCs w:val="22"/>
-        </w:rPr>
-        <w:t xml:space="preserve">und um S²----</w:t>
-      </w:r>
-    </w:p>
-    <w:p>
-      <w:pPr>
-        <w:spacing w:after="280" w:before="60"/>
-      </w:pPr>
-      <w:r>
-        <w:rPr>
-          <w:rFonts w:ascii="Georgia" w:cs="Georgia" w:eastAsia="Georgia" w:hAnsi="Georgia"/>
-          <w:color w:val="7A5C3E"/>
-          <w:sz w:val="16"/>
-          <w:szCs w:val="16"/>
-        </w:rPr>
-        <w:t xml:space="preserve">Sigle WAMS 4</w:t>
+        <w:t xml:space="preserve">Sigle HCH 195 · S. of Aratain S. of HF/S</w:t>
+      </w:r>
+    </w:p>
+    <w:p>
+      <w:pPr>
+        <w:spacing w:after="40"/>
+      </w:pPr>
+      <w:r>
+        <w:rPr>
+          <w:rFonts w:ascii="Georgia" w:cs="Georgia" w:eastAsia="Georgia" w:hAnsi="Georgia"/>
+          <w:sz w:val="22"/>
+          <w:szCs w:val="22"/>
+        </w:rPr>
+        <w:t xml:space="preserve">Von Nḏr, Sohn des ʾs¹,</w:t>
+      </w:r>
+    </w:p>
+    <w:p>
+      <w:pPr>
+        <w:spacing w:after="40"/>
+      </w:pPr>
+      <w:r>
+        <w:rPr>
+          <w:rFonts w:ascii="Georgia" w:cs="Georgia" w:eastAsia="Georgia" w:hAnsi="Georgia"/>
+          <w:sz w:val="22"/>
+          <w:szCs w:val="22"/>
+        </w:rPr>
+        <w:t xml:space="preserve">Sohn des Bḥṯ,</w:t>
+      </w:r>
+    </w:p>
+    <w:p>
+      <w:pPr>
+        <w:spacing w:after="40"/>
+      </w:pPr>
+      <w:r>
+        <w:rPr>
+          <w:rFonts w:ascii="Georgia" w:cs="Georgia" w:eastAsia="Georgia" w:hAnsi="Georgia"/>
+          <w:sz w:val="22"/>
+          <w:szCs w:val="22"/>
+        </w:rPr>
+        <w:t xml:space="preserve">und wg----</w:t>
+      </w:r>
+    </w:p>
+    <w:p>
+      <w:pPr>
+        <w:spacing w:after="280" w:before="60"/>
+      </w:pPr>
+      <w:r>
+        <w:rPr>
+          <w:rFonts w:ascii="Georgia" w:cs="Georgia" w:eastAsia="Georgia" w:hAnsi="Georgia"/>
+          <w:color w:val="7A5C3E"/>
+          <w:sz w:val="16"/>
+          <w:szCs w:val="16"/>
+        </w:rPr>
+        <w:t xml:space="preserve">Sigle C 1146 · Riǧm Qaʿqūl</w:t>
+      </w:r>
+    </w:p>
+    <w:p>
+      <w:pPr>
+        <w:spacing w:after="40"/>
+      </w:pPr>
+      <w:r>
+        <w:rPr>
+          <w:rFonts w:ascii="Georgia" w:cs="Georgia" w:eastAsia="Georgia" w:hAnsi="Georgia"/>
+          <w:sz w:val="22"/>
+          <w:szCs w:val="22"/>
+        </w:rPr>
+        <w:t xml:space="preserve">Von Frʾ, Sohn des Frq.</w:t>
+      </w:r>
+    </w:p>
+    <w:p>
+      <w:pPr>
+        <w:spacing w:after="40"/>
+      </w:pPr>
+      <w:r>
+        <w:rPr>
+          <w:rFonts w:ascii="Georgia" w:cs="Georgia" w:eastAsia="Georgia" w:hAnsi="Georgia"/>
+          <w:sz w:val="22"/>
+          <w:szCs w:val="22"/>
+        </w:rPr>
+        <w:t xml:space="preserve">Und er hielt Wache ---- Feinde.</w:t>
+      </w:r>
+    </w:p>
+    <w:p>
+      <w:pPr>
+        <w:spacing w:after="40"/>
+      </w:pPr>
+      <w:r>
+        <w:rPr>
+          <w:rFonts w:ascii="Georgia" w:cs="Georgia" w:eastAsia="Georgia" w:hAnsi="Georgia"/>
+          <w:sz w:val="22"/>
+          <w:szCs w:val="22"/>
+        </w:rPr>
+        <w:t xml:space="preserve">Rudā — Errettung.</w:t>
+      </w:r>
+    </w:p>
+    <w:p>
+      <w:pPr>
+        <w:spacing w:after="280" w:before="60"/>
+      </w:pPr>
+      <w:r>
+        <w:rPr>
+          <w:rFonts w:ascii="Georgia" w:cs="Georgia" w:eastAsia="Georgia" w:hAnsi="Georgia"/>
+          <w:color w:val="7A5C3E"/>
+          <w:sz w:val="16"/>
+          <w:szCs w:val="16"/>
+        </w:rPr>
+        <w:t xml:space="preserve">Sigle SIJ 10 · Jathum</w:t>
       </w:r>
     </w:p>
     <w:p>
@@ -7375,7 +7362,7 @@
           <w:sz w:val="16"/>
           <w:szCs w:val="16"/>
         </w:rPr>
-        <w:t xml:space="preserve">Sigle C 12</w:t>
+        <w:t xml:space="preserve">Sigle C 12 · Ǧabal Says</w:t>
       </w:r>
     </w:p>
     <w:p>
@@ -7415,7 +7402,7 @@
           <w:sz w:val="16"/>
           <w:szCs w:val="16"/>
         </w:rPr>
-        <w:t xml:space="preserve">Sigle C 1312</w:t>
+        <w:t xml:space="preserve">Sigle C 1312 · Riǧm Qaʿqūl</w:t>
       </w:r>
     </w:p>
     <w:p>
@@ -7481,7 +7468,7 @@
           <w:sz w:val="16"/>
           <w:szCs w:val="16"/>
         </w:rPr>
-        <w:t xml:space="preserve">Sigle C 1368</w:t>
+        <w:t xml:space="preserve">Sigle C 1368 · Riǧm Qaʿqūl</w:t>
       </w:r>
     </w:p>
     <w:p>

</xml_diff>

<commit_message>
feat(register): neues Kapitel I „stehe“, Byline-Format, Nachwort mit Tabellen
- Altes Kapitel I aufgeteilt: I „stehe“ (Ahnenreihen/Genealogien),
  II „schreibe“ (X-war-hier-Litanei). Acht Register, umnummeriert.
- ASWS 73 zurück nach „warte“ (Anfang der Kopfstücke), raus aus „bezeuge“.
- Byline neu: „Fundort · Corpus“, Wort „Sigle“ gestrichen; Cairn of
  Haniʾ → „Hani“.
- Kapitel-Unterüberschriften vorerst entfernt.
- Einleitung + Nachwort zusammen in ein Schluss-Kapitel nach den
  Gedichten; zwei Tabellen: Corpus-Siglen (Abkürzungen aufgelöst) und
  Fundorte (inkl. generischer Angaben Jordanien/Syrien/Km 612 …).
- Vor-/Nachwort-Prosa auf acht Register und neue Registernamen nachgezogen.
- Doku (REGISTER_BAND_AUSWAHL.md) aktualisiert.

Co-Authored-By: Claude Opus 4.8 <noreply@anthropic.com>
Claude-Session: https://claude.ai/code/session_01WJ6p9HdvKuJ9ea1tbSE1cy
</commit_message>
<xml_diff>
--- a/safaitic-research/Poetics/register/wer_dies_liest_register.docx
+++ b/safaitic-research/Poetics/register/wer_dies_liest_register.docx
@@ -53,7 +53,7 @@
           <w:sz w:val="20"/>
           <w:szCs w:val="20"/>
         </w:rPr>
-        <w:t xml:space="preserve">Sieben Register · nach Sprechakten geordnet</w:t>
+        <w:t xml:space="preserve">Acht Register · nach Sprechakten geordnet</w:t>
       </w:r>
     </w:p>
     <w:p>
@@ -62,6 +62,24 @@
       </w:r>
     </w:p>
     <w:p>
+      <w:pPr>
+        <w:spacing w:before="240" w:after="0"/>
+      </w:pPr>
+      <w:r>
+        <w:rPr>
+          <w:rFonts w:ascii="Georgia" w:cs="Georgia" w:eastAsia="Georgia" w:hAnsi="Georgia"/>
+          <w:b/>
+          <w:color w:val="7A5C3E"/>
+          <w:sz w:val="40"/>
+          <w:szCs w:val="40"/>
+        </w:rPr>
+        <w:t xml:space="preserve">I</w:t>
+      </w:r>
+    </w:p>
+    <w:p>
+      <w:pPr>
+        <w:spacing w:after="40"/>
+      </w:pPr>
       <w:r>
         <w:rPr>
           <w:rFonts w:ascii="Georgia" w:cs="Georgia" w:eastAsia="Georgia" w:hAnsi="Georgia"/>
@@ -69,59 +87,432 @@
           <w:sz w:val="30"/>
           <w:szCs w:val="30"/>
         </w:rPr>
-        <w:t xml:space="preserve">Vorwort</w:t>
-      </w:r>
-    </w:p>
-    <w:p>
-      <w:pPr>
-        <w:spacing w:after="200" w:line="320"/>
-      </w:pPr>
-      <w:r>
-        <w:rPr>
-          <w:rFonts w:ascii="Georgia" w:cs="Georgia" w:eastAsia="Georgia" w:hAnsi="Georgia"/>
-          <w:sz w:val="22"/>
-          <w:szCs w:val="22"/>
-        </w:rPr>
-        <w:t xml:space="preserve">Wer diese Texte liest, merkt bald: die meisten sind keine Gedichte. Viele sind kürzer als ein Satz, manche nur ein Name. Das ist kein Mangel, sondern die Form. Safaitisch schreiben heißt, an einen Stein zu klopfen, an dem man gerade vorbeikommt — für niemanden Bestimmten, weil der Stein bleibt, wenn man weitergeht.</w:t>
-      </w:r>
-    </w:p>
-    <w:p>
-      <w:pPr>
-        <w:spacing w:after="200" w:line="320"/>
-      </w:pPr>
-      <w:r>
-        <w:rPr>
-          <w:rFonts w:ascii="Georgia" w:cs="Georgia" w:eastAsia="Georgia" w:hAnsi="Georgia"/>
-          <w:sz w:val="22"/>
-          <w:szCs w:val="22"/>
-        </w:rPr>
-        <w:t xml:space="preserve">Was so entsteht, ist kein Literatur-System, sondern ein Verständigen anderer Art: eines, das nicht auf die Gleichzeitigkeit von Sender und Empfänger angewiesen ist, das die Gottheit als Zeugen einschließt und das Schweigen als eigene Aussage kennt.</w:t>
-      </w:r>
-    </w:p>
-    <w:p>
-      <w:pPr>
-        <w:spacing w:after="200" w:line="320"/>
-      </w:pPr>
-      <w:r>
-        <w:rPr>
-          <w:rFonts w:ascii="Georgia" w:cs="Georgia" w:eastAsia="Georgia" w:hAnsi="Georgia"/>
-          <w:sz w:val="22"/>
-          <w:szCs w:val="22"/>
-        </w:rPr>
-        <w:t xml:space="preserve">Dieser Band ordnet darum nicht nach Thema, sondern nach Sprechhaltung. Jedes der sieben Register ist eine andere Art, mit dem Stein zu sprechen — vom bloßen Dasein über die Bitte und die Klage bis zum Fluch, zum Zeugnis und zuletzt zum Verstummen. Jedes Register eröffnen einige lange Inschriften aus der erweiterten Ausgabe; danach folgen die knappen Stimmen des Vollkorpus.</w:t>
-      </w:r>
-    </w:p>
-    <w:p>
-      <w:pPr>
-        <w:spacing w:after="200" w:line="320"/>
-      </w:pPr>
-      <w:r>
-        <w:rPr>
-          <w:rFonts w:ascii="Georgia" w:cs="Georgia" w:eastAsia="Georgia" w:hAnsi="Georgia"/>
-          <w:sz w:val="22"/>
-          <w:szCs w:val="22"/>
-        </w:rPr>
-        <w:t xml:space="preserve">Die Texte stehen in der dritten Person, wie ihre Originale (l-Fulān, „Von X“, danach „und er …“). Genealogien sind getilgt — außer dort, wo der Name selbst der Akt ist (Register I) oder wo das Fehlen spricht (Register VII). Lücken werden hier nicht geglättet; die Striche ---- bleiben stehen.</w:t>
+        <w:t xml:space="preserve">stehe</w:t>
+      </w:r>
+    </w:p>
+    <w:p>
+      <w:pPr>
+        <w:spacing w:after="40"/>
+      </w:pPr>
+      <w:r>
+        <w:rPr>
+          <w:rFonts w:ascii="Georgia" w:cs="Georgia" w:eastAsia="Georgia" w:hAnsi="Georgia"/>
+          <w:sz w:val="22"/>
+          <w:szCs w:val="22"/>
+        </w:rPr>
+        <w:t xml:space="preserve">Von Msk, Sohn des S²dt,</w:t>
+      </w:r>
+    </w:p>
+    <w:p>
+      <w:pPr>
+        <w:spacing w:after="40"/>
+      </w:pPr>
+      <w:r>
+        <w:rPr>
+          <w:rFonts w:ascii="Georgia" w:cs="Georgia" w:eastAsia="Georgia" w:hAnsi="Georgia"/>
+          <w:sz w:val="22"/>
+          <w:szCs w:val="22"/>
+        </w:rPr>
+        <w:t xml:space="preserve">Sohn des Mḥlm, Sohn des S²dt,</w:t>
+      </w:r>
+    </w:p>
+    <w:p>
+      <w:pPr>
+        <w:spacing w:after="40"/>
+      </w:pPr>
+      <w:r>
+        <w:rPr>
+          <w:rFonts w:ascii="Georgia" w:cs="Georgia" w:eastAsia="Georgia" w:hAnsi="Georgia"/>
+          <w:sz w:val="22"/>
+          <w:szCs w:val="22"/>
+        </w:rPr>
+        <w:t xml:space="preserve">Sohn des Mḥlm,</w:t>
+      </w:r>
+    </w:p>
+    <w:p>
+      <w:pPr>
+        <w:spacing w:after="40"/>
+      </w:pPr>
+      <w:r>
+        <w:rPr>
+          <w:rFonts w:ascii="Georgia" w:cs="Georgia" w:eastAsia="Georgia" w:hAnsi="Georgia"/>
+          <w:sz w:val="22"/>
+          <w:szCs w:val="22"/>
+        </w:rPr>
+        <w:t xml:space="preserve">vom Stamm Tm.</w:t>
+      </w:r>
+    </w:p>
+    <w:p>
+      <w:pPr>
+        <w:spacing w:after="280" w:before="60"/>
+      </w:pPr>
+      <w:r>
+        <w:rPr>
+          <w:rFonts w:ascii="Georgia" w:cs="Georgia" w:eastAsia="Georgia" w:hAnsi="Georgia"/>
+          <w:color w:val="7A5C3E"/>
+          <w:sz w:val="16"/>
+          <w:szCs w:val="16"/>
+        </w:rPr>
+        <w:t xml:space="preserve">Km 612 · JaS 4</w:t>
+      </w:r>
+    </w:p>
+    <w:p>
+      <w:pPr>
+        <w:spacing w:after="40"/>
+      </w:pPr>
+      <w:r>
+        <w:rPr>
+          <w:rFonts w:ascii="Georgia" w:cs="Georgia" w:eastAsia="Georgia" w:hAnsi="Georgia"/>
+          <w:sz w:val="22"/>
+          <w:szCs w:val="22"/>
+        </w:rPr>
+        <w:t xml:space="preserve">Von Tm, Sohn des Mḥlm,</w:t>
+      </w:r>
+    </w:p>
+    <w:p>
+      <w:pPr>
+        <w:spacing w:after="40"/>
+      </w:pPr>
+      <w:r>
+        <w:rPr>
+          <w:rFonts w:ascii="Georgia" w:cs="Georgia" w:eastAsia="Georgia" w:hAnsi="Georgia"/>
+          <w:sz w:val="22"/>
+          <w:szCs w:val="22"/>
+        </w:rPr>
+        <w:t xml:space="preserve">Sohn des S²dt, Sohn des Mḥlm,</w:t>
+      </w:r>
+    </w:p>
+    <w:p>
+      <w:pPr>
+        <w:spacing w:after="40"/>
+      </w:pPr>
+      <w:r>
+        <w:rPr>
+          <w:rFonts w:ascii="Georgia" w:cs="Georgia" w:eastAsia="Georgia" w:hAnsi="Georgia"/>
+          <w:sz w:val="22"/>
+          <w:szCs w:val="22"/>
+        </w:rPr>
+        <w:t xml:space="preserve">vom Stamm Tm.</w:t>
+      </w:r>
+    </w:p>
+    <w:p>
+      <w:pPr>
+        <w:spacing w:after="280" w:before="60"/>
+      </w:pPr>
+      <w:r>
+        <w:rPr>
+          <w:rFonts w:ascii="Georgia" w:cs="Georgia" w:eastAsia="Georgia" w:hAnsi="Georgia"/>
+          <w:color w:val="7A5C3E"/>
+          <w:sz w:val="16"/>
+          <w:szCs w:val="16"/>
+        </w:rPr>
+        <w:t xml:space="preserve">Km 612 · JaS 5</w:t>
+      </w:r>
+    </w:p>
+    <w:p>
+      <w:pPr>
+        <w:spacing w:after="40"/>
+      </w:pPr>
+      <w:r>
+        <w:rPr>
+          <w:rFonts w:ascii="Georgia" w:cs="Georgia" w:eastAsia="Georgia" w:hAnsi="Georgia"/>
+          <w:sz w:val="22"/>
+          <w:szCs w:val="22"/>
+        </w:rPr>
+        <w:t xml:space="preserve">Von Ḥmr, Sohn des Bnġdw,</w:t>
+      </w:r>
+    </w:p>
+    <w:p>
+      <w:pPr>
+        <w:spacing w:after="40"/>
+      </w:pPr>
+      <w:r>
+        <w:rPr>
+          <w:rFonts w:ascii="Georgia" w:cs="Georgia" w:eastAsia="Georgia" w:hAnsi="Georgia"/>
+          <w:sz w:val="22"/>
+          <w:szCs w:val="22"/>
+        </w:rPr>
+        <w:t xml:space="preserve">Sohn des S¹fʾ, Sohn des Ḥnf.</w:t>
+      </w:r>
+    </w:p>
+    <w:p>
+      <w:pPr>
+        <w:spacing w:after="280" w:before="60"/>
+      </w:pPr>
+      <w:r>
+        <w:rPr>
+          <w:rFonts w:ascii="Georgia" w:cs="Georgia" w:eastAsia="Georgia" w:hAnsi="Georgia"/>
+          <w:color w:val="7A5C3E"/>
+          <w:sz w:val="16"/>
+          <w:szCs w:val="16"/>
+        </w:rPr>
+        <w:t xml:space="preserve">Km 612 · JaS 15</w:t>
+      </w:r>
+    </w:p>
+    <w:p>
+      <w:pPr>
+        <w:spacing w:after="40"/>
+      </w:pPr>
+      <w:r>
+        <w:rPr>
+          <w:rFonts w:ascii="Georgia" w:cs="Georgia" w:eastAsia="Georgia" w:hAnsi="Georgia"/>
+          <w:sz w:val="22"/>
+          <w:szCs w:val="22"/>
+        </w:rPr>
+        <w:t xml:space="preserve">Von Hnʾ, Sohn des S²nʾ,</w:t>
+      </w:r>
+    </w:p>
+    <w:p>
+      <w:pPr>
+        <w:spacing w:after="40"/>
+      </w:pPr>
+      <w:r>
+        <w:rPr>
+          <w:rFonts w:ascii="Georgia" w:cs="Georgia" w:eastAsia="Georgia" w:hAnsi="Georgia"/>
+          <w:sz w:val="22"/>
+          <w:szCs w:val="22"/>
+        </w:rPr>
+        <w:t xml:space="preserve">Sohn des Gmr, Sohn des Ḍʾ.</w:t>
+      </w:r>
+    </w:p>
+    <w:p>
+      <w:pPr>
+        <w:spacing w:after="280" w:before="60"/>
+      </w:pPr>
+      <w:r>
+        <w:rPr>
+          <w:rFonts w:ascii="Georgia" w:cs="Georgia" w:eastAsia="Georgia" w:hAnsi="Georgia"/>
+          <w:color w:val="7A5C3E"/>
+          <w:sz w:val="16"/>
+          <w:szCs w:val="16"/>
+        </w:rPr>
+        <w:t xml:space="preserve">Km 612 · JaS 22</w:t>
+      </w:r>
+    </w:p>
+    <w:p>
+      <w:pPr>
+        <w:spacing w:after="40"/>
+      </w:pPr>
+      <w:r>
+        <w:rPr>
+          <w:rFonts w:ascii="Georgia" w:cs="Georgia" w:eastAsia="Georgia" w:hAnsi="Georgia"/>
+          <w:sz w:val="22"/>
+          <w:szCs w:val="22"/>
+        </w:rPr>
+        <w:t xml:space="preserve">Von Gs²m, Sohn des S¹mr,</w:t>
+      </w:r>
+    </w:p>
+    <w:p>
+      <w:pPr>
+        <w:spacing w:after="40"/>
+      </w:pPr>
+      <w:r>
+        <w:rPr>
+          <w:rFonts w:ascii="Georgia" w:cs="Georgia" w:eastAsia="Georgia" w:hAnsi="Georgia"/>
+          <w:sz w:val="22"/>
+          <w:szCs w:val="22"/>
+        </w:rPr>
+        <w:t xml:space="preserve">vom Stamm Bs¹ʾ.</w:t>
+      </w:r>
+    </w:p>
+    <w:p>
+      <w:pPr>
+        <w:spacing w:after="40"/>
+      </w:pPr>
+      <w:r>
+        <w:rPr>
+          <w:rFonts w:ascii="Georgia" w:cs="Georgia" w:eastAsia="Georgia" w:hAnsi="Georgia"/>
+          <w:sz w:val="22"/>
+          <w:szCs w:val="22"/>
+        </w:rPr>
+        <w:t xml:space="preserve">Und er trauerte um Nḥṭ.</w:t>
+      </w:r>
+    </w:p>
+    <w:p>
+      <w:pPr>
+        <w:spacing w:after="280" w:before="60"/>
+      </w:pPr>
+      <w:r>
+        <w:rPr>
+          <w:rFonts w:ascii="Georgia" w:cs="Georgia" w:eastAsia="Georgia" w:hAnsi="Georgia"/>
+          <w:color w:val="7A5C3E"/>
+          <w:sz w:val="16"/>
+          <w:szCs w:val="16"/>
+        </w:rPr>
+        <w:t xml:space="preserve">Km 612 · JaS 13</w:t>
+      </w:r>
+    </w:p>
+    <w:p>
+      <w:pPr>
+        <w:spacing w:after="40"/>
+      </w:pPr>
+      <w:r>
+        <w:rPr>
+          <w:rFonts w:ascii="Georgia" w:cs="Georgia" w:eastAsia="Georgia" w:hAnsi="Georgia"/>
+          <w:sz w:val="22"/>
+          <w:szCs w:val="22"/>
+        </w:rPr>
+        <w:t xml:space="preserve">Von Tʾl, Sohn des ʿz.</w:t>
+      </w:r>
+    </w:p>
+    <w:p>
+      <w:pPr>
+        <w:spacing w:after="40"/>
+      </w:pPr>
+      <w:r>
+        <w:rPr>
+          <w:rFonts w:ascii="Georgia" w:cs="Georgia" w:eastAsia="Georgia" w:hAnsi="Georgia"/>
+          <w:sz w:val="22"/>
+          <w:szCs w:val="22"/>
+        </w:rPr>
+        <w:t xml:space="preserve">Und er trauerte um den Vater.</w:t>
+      </w:r>
+    </w:p>
+    <w:p>
+      <w:pPr>
+        <w:spacing w:after="280" w:before="60"/>
+      </w:pPr>
+      <w:r>
+        <w:rPr>
+          <w:rFonts w:ascii="Georgia" w:cs="Georgia" w:eastAsia="Georgia" w:hAnsi="Georgia"/>
+          <w:color w:val="7A5C3E"/>
+          <w:sz w:val="16"/>
+          <w:szCs w:val="16"/>
+        </w:rPr>
+        <w:t xml:space="preserve">Km 612 · JaS 21</w:t>
+      </w:r>
+    </w:p>
+    <w:p>
+      <w:pPr>
+        <w:spacing w:after="40"/>
+      </w:pPr>
+      <w:r>
+        <w:rPr>
+          <w:rFonts w:ascii="Georgia" w:cs="Georgia" w:eastAsia="Georgia" w:hAnsi="Georgia"/>
+          <w:sz w:val="22"/>
+          <w:szCs w:val="22"/>
+        </w:rPr>
+        <w:t xml:space="preserve">Von ʿrb, Sohn des Hrs¹.</w:t>
+      </w:r>
+    </w:p>
+    <w:p>
+      <w:pPr>
+        <w:spacing w:after="40"/>
+      </w:pPr>
+      <w:r>
+        <w:rPr>
+          <w:rFonts w:ascii="Georgia" w:cs="Georgia" w:eastAsia="Georgia" w:hAnsi="Georgia"/>
+          <w:sz w:val="22"/>
+          <w:szCs w:val="22"/>
+        </w:rPr>
+        <w:t xml:space="preserve">Und er trauerte um Hnʾ.</w:t>
+      </w:r>
+    </w:p>
+    <w:p>
+      <w:pPr>
+        <w:spacing w:after="280" w:before="60"/>
+      </w:pPr>
+      <w:r>
+        <w:rPr>
+          <w:rFonts w:ascii="Georgia" w:cs="Georgia" w:eastAsia="Georgia" w:hAnsi="Georgia"/>
+          <w:color w:val="7A5C3E"/>
+          <w:sz w:val="16"/>
+          <w:szCs w:val="16"/>
+        </w:rPr>
+        <w:t xml:space="preserve">Hani · HCH 99</w:t>
+      </w:r>
+    </w:p>
+    <w:p>
+      <w:pPr>
+        <w:spacing w:after="40"/>
+      </w:pPr>
+      <w:r>
+        <w:rPr>
+          <w:rFonts w:ascii="Georgia" w:cs="Georgia" w:eastAsia="Georgia" w:hAnsi="Georgia"/>
+          <w:sz w:val="22"/>
+          <w:szCs w:val="22"/>
+        </w:rPr>
+        <w:t xml:space="preserve">Von Tm, Sohn des Ḫlṣ,</w:t>
+      </w:r>
+    </w:p>
+    <w:p>
+      <w:pPr>
+        <w:spacing w:after="40"/>
+      </w:pPr>
+      <w:r>
+        <w:rPr>
+          <w:rFonts w:ascii="Georgia" w:cs="Georgia" w:eastAsia="Georgia" w:hAnsi="Georgia"/>
+          <w:sz w:val="22"/>
+          <w:szCs w:val="22"/>
+        </w:rPr>
+        <w:t xml:space="preserve">Sohn des Tm, Sohn des S²ʿ.</w:t>
+      </w:r>
+    </w:p>
+    <w:p>
+      <w:pPr>
+        <w:spacing w:after="40"/>
+      </w:pPr>
+      <w:r>
+        <w:rPr>
+          <w:rFonts w:ascii="Georgia" w:cs="Georgia" w:eastAsia="Georgia" w:hAnsi="Georgia"/>
+          <w:sz w:val="22"/>
+          <w:szCs w:val="22"/>
+        </w:rPr>
+        <w:t xml:space="preserve">Und er trauerte um Hnʾ.</w:t>
+      </w:r>
+    </w:p>
+    <w:p>
+      <w:pPr>
+        <w:spacing w:after="280" w:before="60"/>
+      </w:pPr>
+      <w:r>
+        <w:rPr>
+          <w:rFonts w:ascii="Georgia" w:cs="Georgia" w:eastAsia="Georgia" w:hAnsi="Georgia"/>
+          <w:color w:val="7A5C3E"/>
+          <w:sz w:val="16"/>
+          <w:szCs w:val="16"/>
+        </w:rPr>
+        <w:t xml:space="preserve">Hani · HCH 22</w:t>
+      </w:r>
+    </w:p>
+    <w:p>
+      <w:pPr>
+        <w:spacing w:after="40"/>
+      </w:pPr>
+      <w:r>
+        <w:rPr>
+          <w:rFonts w:ascii="Georgia" w:cs="Georgia" w:eastAsia="Georgia" w:hAnsi="Georgia"/>
+          <w:sz w:val="22"/>
+          <w:szCs w:val="22"/>
+        </w:rPr>
+        <w:t xml:space="preserve">Von S¹ʿd, Sohn des Ẓn, Sohn des Ṯlm.</w:t>
+      </w:r>
+    </w:p>
+    <w:p>
+      <w:pPr>
+        <w:spacing w:after="40"/>
+      </w:pPr>
+      <w:r>
+        <w:rPr>
+          <w:rFonts w:ascii="Georgia" w:cs="Georgia" w:eastAsia="Georgia" w:hAnsi="Georgia"/>
+          <w:sz w:val="22"/>
+          <w:szCs w:val="22"/>
+        </w:rPr>
+        <w:t xml:space="preserve">Und er trauerte um Hnʾ.</w:t>
+      </w:r>
+    </w:p>
+    <w:p>
+      <w:pPr>
+        <w:spacing w:after="280" w:before="60"/>
+      </w:pPr>
+      <w:r>
+        <w:rPr>
+          <w:rFonts w:ascii="Georgia" w:cs="Georgia" w:eastAsia="Georgia" w:hAnsi="Georgia"/>
+          <w:color w:val="7A5C3E"/>
+          <w:sz w:val="16"/>
+          <w:szCs w:val="16"/>
+        </w:rPr>
+        <w:t xml:space="preserve">Hani · HCH 38</w:t>
       </w:r>
     </w:p>
     <w:p>
@@ -141,7 +532,7 @@
           <w:sz w:val="40"/>
           <w:szCs w:val="40"/>
         </w:rPr>
-        <w:t xml:space="preserve">I</w:t>
+        <w:t xml:space="preserve">II</w:t>
       </w:r>
     </w:p>
     <w:p>
@@ -160,20 +551,6 @@
     </w:p>
     <w:p>
       <w:pPr>
-        <w:spacing w:after="200"/>
-      </w:pPr>
-      <w:r>
-        <w:rPr>
-          <w:rFonts w:ascii="Georgia" w:cs="Georgia" w:eastAsia="Georgia" w:hAnsi="Georgia"/>
-          <w:color w:val="666666"/>
-          <w:sz w:val="20"/>
-          <w:szCs w:val="20"/>
-        </w:rPr>
-        <w:t xml:space="preserve">Dasein als Akt — Deixis, kein Verb des Fühlens. Die reinste Form: „dies ist”.</w:t>
-      </w:r>
-    </w:p>
-    <w:p>
-      <w:pPr>
         <w:spacing w:after="40"/>
       </w:pPr>
       <w:r>
@@ -222,7 +599,7 @@
           <w:sz w:val="16"/>
           <w:szCs w:val="16"/>
         </w:rPr>
-        <w:t xml:space="preserve">Sigle RWQ 342 · Wādī Salma</w:t>
+        <w:t xml:space="preserve">Wādī Salma · RWQ 342</w:t>
       </w:r>
     </w:p>
     <w:p>
@@ -275,7 +652,7 @@
           <w:sz w:val="16"/>
           <w:szCs w:val="16"/>
         </w:rPr>
-        <w:t xml:space="preserve">Sigle RWQ 187 · Wādī Salma</w:t>
+        <w:t xml:space="preserve">Wādī Salma · RWQ 187</w:t>
       </w:r>
     </w:p>
     <w:p>
@@ -302,7 +679,7 @@
           <w:sz w:val="16"/>
           <w:szCs w:val="16"/>
         </w:rPr>
-        <w:t xml:space="preserve">Sigle HYGQ 24 · Fundort unbekannt</w:t>
+        <w:t xml:space="preserve">Fundort unbekannt · HYGQ 24</w:t>
       </w:r>
     </w:p>
     <w:p>
@@ -329,7 +706,7 @@
           <w:sz w:val="16"/>
           <w:szCs w:val="16"/>
         </w:rPr>
-        <w:t xml:space="preserve">Sigle KRS 1341 · Al-Mafraq</w:t>
+        <w:t xml:space="preserve">Al-Mafraq · KRS 1341</w:t>
       </w:r>
     </w:p>
     <w:p>
@@ -356,7 +733,7 @@
           <w:sz w:val="16"/>
           <w:szCs w:val="16"/>
         </w:rPr>
-        <w:t xml:space="preserve">Sigle JaS 16 · Km 612</w:t>
+        <w:t xml:space="preserve">Km 612 · JaS 16</w:t>
       </w:r>
     </w:p>
     <w:p>
@@ -383,7 +760,7 @@
           <w:sz w:val="16"/>
           <w:szCs w:val="16"/>
         </w:rPr>
-        <w:t xml:space="preserve">Sigle HCH 117 · Cairn of Haniʾ</w:t>
+        <w:t xml:space="preserve">Hani · HCH 117</w:t>
       </w:r>
     </w:p>
     <w:p>
@@ -410,7 +787,7 @@
           <w:sz w:val="16"/>
           <w:szCs w:val="16"/>
         </w:rPr>
-        <w:t xml:space="preserve">Sigle HCH 156 · Cairn of Haniʾ</w:t>
+        <w:t xml:space="preserve">Hani · HCH 156</w:t>
       </w:r>
     </w:p>
     <w:p>
@@ -437,7 +814,7 @@
           <w:sz w:val="16"/>
           <w:szCs w:val="16"/>
         </w:rPr>
-        <w:t xml:space="preserve">Sigle HCH 160 · Cairn of Haniʾ</w:t>
+        <w:t xml:space="preserve">Hani · HCH 160</w:t>
       </w:r>
     </w:p>
     <w:p>
@@ -464,7 +841,7 @@
           <w:sz w:val="16"/>
           <w:szCs w:val="16"/>
         </w:rPr>
-        <w:t xml:space="preserve">Sigle HCH 158.1 · Cairn of Haniʾ</w:t>
+        <w:t xml:space="preserve">Hani · HCH 158.1</w:t>
       </w:r>
     </w:p>
     <w:p>
@@ -491,7 +868,7 @@
           <w:sz w:val="16"/>
           <w:szCs w:val="16"/>
         </w:rPr>
-        <w:t xml:space="preserve">Sigle HCH 75 · Cairn of Haniʾ</w:t>
+        <w:t xml:space="preserve">Hani · HCH 75</w:t>
       </w:r>
     </w:p>
     <w:p>
@@ -518,7 +895,7 @@
           <w:sz w:val="16"/>
           <w:szCs w:val="16"/>
         </w:rPr>
-        <w:t xml:space="preserve">Sigle HCH 158.2 · Cairn of Haniʾ</w:t>
+        <w:t xml:space="preserve">Hani · HCH 158.2</w:t>
       </w:r>
     </w:p>
     <w:p>
@@ -545,7 +922,7 @@
           <w:sz w:val="16"/>
           <w:szCs w:val="16"/>
         </w:rPr>
-        <w:t xml:space="preserve">Sigle HCH 31.1 · Cairn of Haniʾ</w:t>
+        <w:t xml:space="preserve">Hani · HCH 31.1</w:t>
       </w:r>
     </w:p>
     <w:p>
@@ -572,7 +949,7 @@
           <w:sz w:val="16"/>
           <w:szCs w:val="16"/>
         </w:rPr>
-        <w:t xml:space="preserve">Sigle Rees 150 · Ḥarrat al-Raǧil</w:t>
+        <w:t xml:space="preserve">Ḥarrat al-Raǧil · Rees 150</w:t>
       </w:r>
     </w:p>
     <w:p>
@@ -599,7 +976,7 @@
           <w:sz w:val="16"/>
           <w:szCs w:val="16"/>
         </w:rPr>
-        <w:t xml:space="preserve">Sigle Rees 151 · Ḥarrat al-Raǧil</w:t>
+        <w:t xml:space="preserve">Ḥarrat al-Raǧil · Rees 151</w:t>
       </w:r>
     </w:p>
     <w:p>
@@ -626,7 +1003,7 @@
           <w:sz w:val="16"/>
           <w:szCs w:val="16"/>
         </w:rPr>
-        <w:t xml:space="preserve">Sigle Rees 155 · Ḥarrat al-Raǧil</w:t>
+        <w:t xml:space="preserve">Ḥarrat al-Raǧil · Rees 155</w:t>
       </w:r>
     </w:p>
     <w:p>
@@ -653,7 +1030,7 @@
           <w:sz w:val="16"/>
           <w:szCs w:val="16"/>
         </w:rPr>
-        <w:t xml:space="preserve">Sigle Rees 161 4 · Ḥarrat al-Raǧil</w:t>
+        <w:t xml:space="preserve">Ḥarrat al-Raǧil · Rees 161 4</w:t>
       </w:r>
     </w:p>
     <w:p>
@@ -680,432 +1057,7 @@
           <w:sz w:val="16"/>
           <w:szCs w:val="16"/>
         </w:rPr>
-        <w:t xml:space="preserve">Sigle Rees 176 · Ḥarrat al-Raǧil</w:t>
-      </w:r>
-    </w:p>
-    <w:p>
-      <w:pPr>
-        <w:spacing w:after="40"/>
-      </w:pPr>
-      <w:r>
-        <w:rPr>
-          <w:rFonts w:ascii="Georgia" w:cs="Georgia" w:eastAsia="Georgia" w:hAnsi="Georgia"/>
-          <w:sz w:val="22"/>
-          <w:szCs w:val="22"/>
-        </w:rPr>
-        <w:t xml:space="preserve">Von Msk, Sohn des S²dt,</w:t>
-      </w:r>
-    </w:p>
-    <w:p>
-      <w:pPr>
-        <w:spacing w:after="40"/>
-      </w:pPr>
-      <w:r>
-        <w:rPr>
-          <w:rFonts w:ascii="Georgia" w:cs="Georgia" w:eastAsia="Georgia" w:hAnsi="Georgia"/>
-          <w:sz w:val="22"/>
-          <w:szCs w:val="22"/>
-        </w:rPr>
-        <w:t xml:space="preserve">Sohn des Mḥlm, Sohn des S²dt,</w:t>
-      </w:r>
-    </w:p>
-    <w:p>
-      <w:pPr>
-        <w:spacing w:after="40"/>
-      </w:pPr>
-      <w:r>
-        <w:rPr>
-          <w:rFonts w:ascii="Georgia" w:cs="Georgia" w:eastAsia="Georgia" w:hAnsi="Georgia"/>
-          <w:sz w:val="22"/>
-          <w:szCs w:val="22"/>
-        </w:rPr>
-        <w:t xml:space="preserve">Sohn des Mḥlm,</w:t>
-      </w:r>
-    </w:p>
-    <w:p>
-      <w:pPr>
-        <w:spacing w:after="40"/>
-      </w:pPr>
-      <w:r>
-        <w:rPr>
-          <w:rFonts w:ascii="Georgia" w:cs="Georgia" w:eastAsia="Georgia" w:hAnsi="Georgia"/>
-          <w:sz w:val="22"/>
-          <w:szCs w:val="22"/>
-        </w:rPr>
-        <w:t xml:space="preserve">vom Stamm Tm.</w:t>
-      </w:r>
-    </w:p>
-    <w:p>
-      <w:pPr>
-        <w:spacing w:after="280" w:before="60"/>
-      </w:pPr>
-      <w:r>
-        <w:rPr>
-          <w:rFonts w:ascii="Georgia" w:cs="Georgia" w:eastAsia="Georgia" w:hAnsi="Georgia"/>
-          <w:color w:val="7A5C3E"/>
-          <w:sz w:val="16"/>
-          <w:szCs w:val="16"/>
-        </w:rPr>
-        <w:t xml:space="preserve">Sigle JaS 4 · Km 612</w:t>
-      </w:r>
-    </w:p>
-    <w:p>
-      <w:pPr>
-        <w:spacing w:after="40"/>
-      </w:pPr>
-      <w:r>
-        <w:rPr>
-          <w:rFonts w:ascii="Georgia" w:cs="Georgia" w:eastAsia="Georgia" w:hAnsi="Georgia"/>
-          <w:sz w:val="22"/>
-          <w:szCs w:val="22"/>
-        </w:rPr>
-        <w:t xml:space="preserve">Von Tm, Sohn des Mḥlm,</w:t>
-      </w:r>
-    </w:p>
-    <w:p>
-      <w:pPr>
-        <w:spacing w:after="40"/>
-      </w:pPr>
-      <w:r>
-        <w:rPr>
-          <w:rFonts w:ascii="Georgia" w:cs="Georgia" w:eastAsia="Georgia" w:hAnsi="Georgia"/>
-          <w:sz w:val="22"/>
-          <w:szCs w:val="22"/>
-        </w:rPr>
-        <w:t xml:space="preserve">Sohn des S²dt, Sohn des Mḥlm,</w:t>
-      </w:r>
-    </w:p>
-    <w:p>
-      <w:pPr>
-        <w:spacing w:after="40"/>
-      </w:pPr>
-      <w:r>
-        <w:rPr>
-          <w:rFonts w:ascii="Georgia" w:cs="Georgia" w:eastAsia="Georgia" w:hAnsi="Georgia"/>
-          <w:sz w:val="22"/>
-          <w:szCs w:val="22"/>
-        </w:rPr>
-        <w:t xml:space="preserve">vom Stamm Tm.</w:t>
-      </w:r>
-    </w:p>
-    <w:p>
-      <w:pPr>
-        <w:spacing w:after="280" w:before="60"/>
-      </w:pPr>
-      <w:r>
-        <w:rPr>
-          <w:rFonts w:ascii="Georgia" w:cs="Georgia" w:eastAsia="Georgia" w:hAnsi="Georgia"/>
-          <w:color w:val="7A5C3E"/>
-          <w:sz w:val="16"/>
-          <w:szCs w:val="16"/>
-        </w:rPr>
-        <w:t xml:space="preserve">Sigle JaS 5 · Km 612</w:t>
-      </w:r>
-    </w:p>
-    <w:p>
-      <w:pPr>
-        <w:spacing w:after="40"/>
-      </w:pPr>
-      <w:r>
-        <w:rPr>
-          <w:rFonts w:ascii="Georgia" w:cs="Georgia" w:eastAsia="Georgia" w:hAnsi="Georgia"/>
-          <w:sz w:val="22"/>
-          <w:szCs w:val="22"/>
-        </w:rPr>
-        <w:t xml:space="preserve">Von Ḥmr, Sohn des Bnġdw,</w:t>
-      </w:r>
-    </w:p>
-    <w:p>
-      <w:pPr>
-        <w:spacing w:after="40"/>
-      </w:pPr>
-      <w:r>
-        <w:rPr>
-          <w:rFonts w:ascii="Georgia" w:cs="Georgia" w:eastAsia="Georgia" w:hAnsi="Georgia"/>
-          <w:sz w:val="22"/>
-          <w:szCs w:val="22"/>
-        </w:rPr>
-        <w:t xml:space="preserve">Sohn des S¹fʾ, Sohn des Ḥnf.</w:t>
-      </w:r>
-    </w:p>
-    <w:p>
-      <w:pPr>
-        <w:spacing w:after="280" w:before="60"/>
-      </w:pPr>
-      <w:r>
-        <w:rPr>
-          <w:rFonts w:ascii="Georgia" w:cs="Georgia" w:eastAsia="Georgia" w:hAnsi="Georgia"/>
-          <w:color w:val="7A5C3E"/>
-          <w:sz w:val="16"/>
-          <w:szCs w:val="16"/>
-        </w:rPr>
-        <w:t xml:space="preserve">Sigle JaS 15 · Km 612</w:t>
-      </w:r>
-    </w:p>
-    <w:p>
-      <w:pPr>
-        <w:spacing w:after="40"/>
-      </w:pPr>
-      <w:r>
-        <w:rPr>
-          <w:rFonts w:ascii="Georgia" w:cs="Georgia" w:eastAsia="Georgia" w:hAnsi="Georgia"/>
-          <w:sz w:val="22"/>
-          <w:szCs w:val="22"/>
-        </w:rPr>
-        <w:t xml:space="preserve">Von Hnʾ, Sohn des S²nʾ,</w:t>
-      </w:r>
-    </w:p>
-    <w:p>
-      <w:pPr>
-        <w:spacing w:after="40"/>
-      </w:pPr>
-      <w:r>
-        <w:rPr>
-          <w:rFonts w:ascii="Georgia" w:cs="Georgia" w:eastAsia="Georgia" w:hAnsi="Georgia"/>
-          <w:sz w:val="22"/>
-          <w:szCs w:val="22"/>
-        </w:rPr>
-        <w:t xml:space="preserve">Sohn des Gmr, Sohn des Ḍʾ.</w:t>
-      </w:r>
-    </w:p>
-    <w:p>
-      <w:pPr>
-        <w:spacing w:after="280" w:before="60"/>
-      </w:pPr>
-      <w:r>
-        <w:rPr>
-          <w:rFonts w:ascii="Georgia" w:cs="Georgia" w:eastAsia="Georgia" w:hAnsi="Georgia"/>
-          <w:color w:val="7A5C3E"/>
-          <w:sz w:val="16"/>
-          <w:szCs w:val="16"/>
-        </w:rPr>
-        <w:t xml:space="preserve">Sigle JaS 22 · Km 612</w:t>
-      </w:r>
-    </w:p>
-    <w:p>
-      <w:pPr>
-        <w:spacing w:after="40"/>
-      </w:pPr>
-      <w:r>
-        <w:rPr>
-          <w:rFonts w:ascii="Georgia" w:cs="Georgia" w:eastAsia="Georgia" w:hAnsi="Georgia"/>
-          <w:sz w:val="22"/>
-          <w:szCs w:val="22"/>
-        </w:rPr>
-        <w:t xml:space="preserve">Von Gs²m, Sohn des S¹mr,</w:t>
-      </w:r>
-    </w:p>
-    <w:p>
-      <w:pPr>
-        <w:spacing w:after="40"/>
-      </w:pPr>
-      <w:r>
-        <w:rPr>
-          <w:rFonts w:ascii="Georgia" w:cs="Georgia" w:eastAsia="Georgia" w:hAnsi="Georgia"/>
-          <w:sz w:val="22"/>
-          <w:szCs w:val="22"/>
-        </w:rPr>
-        <w:t xml:space="preserve">vom Stamm Bs¹ʾ.</w:t>
-      </w:r>
-    </w:p>
-    <w:p>
-      <w:pPr>
-        <w:spacing w:after="40"/>
-      </w:pPr>
-      <w:r>
-        <w:rPr>
-          <w:rFonts w:ascii="Georgia" w:cs="Georgia" w:eastAsia="Georgia" w:hAnsi="Georgia"/>
-          <w:sz w:val="22"/>
-          <w:szCs w:val="22"/>
-        </w:rPr>
-        <w:t xml:space="preserve">Und er trauerte um Nḥṭ.</w:t>
-      </w:r>
-    </w:p>
-    <w:p>
-      <w:pPr>
-        <w:spacing w:after="280" w:before="60"/>
-      </w:pPr>
-      <w:r>
-        <w:rPr>
-          <w:rFonts w:ascii="Georgia" w:cs="Georgia" w:eastAsia="Georgia" w:hAnsi="Georgia"/>
-          <w:color w:val="7A5C3E"/>
-          <w:sz w:val="16"/>
-          <w:szCs w:val="16"/>
-        </w:rPr>
-        <w:t xml:space="preserve">Sigle JaS 13 · Km 612</w:t>
-      </w:r>
-    </w:p>
-    <w:p>
-      <w:pPr>
-        <w:spacing w:after="40"/>
-      </w:pPr>
-      <w:r>
-        <w:rPr>
-          <w:rFonts w:ascii="Georgia" w:cs="Georgia" w:eastAsia="Georgia" w:hAnsi="Georgia"/>
-          <w:sz w:val="22"/>
-          <w:szCs w:val="22"/>
-        </w:rPr>
-        <w:t xml:space="preserve">Von Tʾl, Sohn des ʿz.</w:t>
-      </w:r>
-    </w:p>
-    <w:p>
-      <w:pPr>
-        <w:spacing w:after="40"/>
-      </w:pPr>
-      <w:r>
-        <w:rPr>
-          <w:rFonts w:ascii="Georgia" w:cs="Georgia" w:eastAsia="Georgia" w:hAnsi="Georgia"/>
-          <w:sz w:val="22"/>
-          <w:szCs w:val="22"/>
-        </w:rPr>
-        <w:t xml:space="preserve">Und er trauerte um den Vater.</w:t>
-      </w:r>
-    </w:p>
-    <w:p>
-      <w:pPr>
-        <w:spacing w:after="280" w:before="60"/>
-      </w:pPr>
-      <w:r>
-        <w:rPr>
-          <w:rFonts w:ascii="Georgia" w:cs="Georgia" w:eastAsia="Georgia" w:hAnsi="Georgia"/>
-          <w:color w:val="7A5C3E"/>
-          <w:sz w:val="16"/>
-          <w:szCs w:val="16"/>
-        </w:rPr>
-        <w:t xml:space="preserve">Sigle JaS 21 · Km 612</w:t>
-      </w:r>
-    </w:p>
-    <w:p>
-      <w:pPr>
-        <w:spacing w:after="40"/>
-      </w:pPr>
-      <w:r>
-        <w:rPr>
-          <w:rFonts w:ascii="Georgia" w:cs="Georgia" w:eastAsia="Georgia" w:hAnsi="Georgia"/>
-          <w:sz w:val="22"/>
-          <w:szCs w:val="22"/>
-        </w:rPr>
-        <w:t xml:space="preserve">Von ʿrb, Sohn des Hrs¹.</w:t>
-      </w:r>
-    </w:p>
-    <w:p>
-      <w:pPr>
-        <w:spacing w:after="40"/>
-      </w:pPr>
-      <w:r>
-        <w:rPr>
-          <w:rFonts w:ascii="Georgia" w:cs="Georgia" w:eastAsia="Georgia" w:hAnsi="Georgia"/>
-          <w:sz w:val="22"/>
-          <w:szCs w:val="22"/>
-        </w:rPr>
-        <w:t xml:space="preserve">Und er trauerte um Hnʾ.</w:t>
-      </w:r>
-    </w:p>
-    <w:p>
-      <w:pPr>
-        <w:spacing w:after="280" w:before="60"/>
-      </w:pPr>
-      <w:r>
-        <w:rPr>
-          <w:rFonts w:ascii="Georgia" w:cs="Georgia" w:eastAsia="Georgia" w:hAnsi="Georgia"/>
-          <w:color w:val="7A5C3E"/>
-          <w:sz w:val="16"/>
-          <w:szCs w:val="16"/>
-        </w:rPr>
-        <w:t xml:space="preserve">Sigle HCH 99 · Cairn of Haniʾ</w:t>
-      </w:r>
-    </w:p>
-    <w:p>
-      <w:pPr>
-        <w:spacing w:after="40"/>
-      </w:pPr>
-      <w:r>
-        <w:rPr>
-          <w:rFonts w:ascii="Georgia" w:cs="Georgia" w:eastAsia="Georgia" w:hAnsi="Georgia"/>
-          <w:sz w:val="22"/>
-          <w:szCs w:val="22"/>
-        </w:rPr>
-        <w:t xml:space="preserve">Von Tm, Sohn des Ḫlṣ,</w:t>
-      </w:r>
-    </w:p>
-    <w:p>
-      <w:pPr>
-        <w:spacing w:after="40"/>
-      </w:pPr>
-      <w:r>
-        <w:rPr>
-          <w:rFonts w:ascii="Georgia" w:cs="Georgia" w:eastAsia="Georgia" w:hAnsi="Georgia"/>
-          <w:sz w:val="22"/>
-          <w:szCs w:val="22"/>
-        </w:rPr>
-        <w:t xml:space="preserve">Sohn des Tm, Sohn des S²ʿ.</w:t>
-      </w:r>
-    </w:p>
-    <w:p>
-      <w:pPr>
-        <w:spacing w:after="40"/>
-      </w:pPr>
-      <w:r>
-        <w:rPr>
-          <w:rFonts w:ascii="Georgia" w:cs="Georgia" w:eastAsia="Georgia" w:hAnsi="Georgia"/>
-          <w:sz w:val="22"/>
-          <w:szCs w:val="22"/>
-        </w:rPr>
-        <w:t xml:space="preserve">Und er trauerte um Hnʾ.</w:t>
-      </w:r>
-    </w:p>
-    <w:p>
-      <w:pPr>
-        <w:spacing w:after="280" w:before="60"/>
-      </w:pPr>
-      <w:r>
-        <w:rPr>
-          <w:rFonts w:ascii="Georgia" w:cs="Georgia" w:eastAsia="Georgia" w:hAnsi="Georgia"/>
-          <w:color w:val="7A5C3E"/>
-          <w:sz w:val="16"/>
-          <w:szCs w:val="16"/>
-        </w:rPr>
-        <w:t xml:space="preserve">Sigle HCH 22 · Cairn of Haniʾ</w:t>
-      </w:r>
-    </w:p>
-    <w:p>
-      <w:pPr>
-        <w:spacing w:after="40"/>
-      </w:pPr>
-      <w:r>
-        <w:rPr>
-          <w:rFonts w:ascii="Georgia" w:cs="Georgia" w:eastAsia="Georgia" w:hAnsi="Georgia"/>
-          <w:sz w:val="22"/>
-          <w:szCs w:val="22"/>
-        </w:rPr>
-        <w:t xml:space="preserve">Von S¹ʿd, Sohn des Ẓn, Sohn des Ṯlm.</w:t>
-      </w:r>
-    </w:p>
-    <w:p>
-      <w:pPr>
-        <w:spacing w:after="40"/>
-      </w:pPr>
-      <w:r>
-        <w:rPr>
-          <w:rFonts w:ascii="Georgia" w:cs="Georgia" w:eastAsia="Georgia" w:hAnsi="Georgia"/>
-          <w:sz w:val="22"/>
-          <w:szCs w:val="22"/>
-        </w:rPr>
-        <w:t xml:space="preserve">Und er trauerte um Hnʾ.</w:t>
-      </w:r>
-    </w:p>
-    <w:p>
-      <w:pPr>
-        <w:spacing w:after="280" w:before="60"/>
-      </w:pPr>
-      <w:r>
-        <w:rPr>
-          <w:rFonts w:ascii="Georgia" w:cs="Georgia" w:eastAsia="Georgia" w:hAnsi="Georgia"/>
-          <w:color w:val="7A5C3E"/>
-          <w:sz w:val="16"/>
-          <w:szCs w:val="16"/>
-        </w:rPr>
-        <w:t xml:space="preserve">Sigle HCH 38 · Cairn of Haniʾ</w:t>
+        <w:t xml:space="preserve">Ḥarrat al-Raǧil · Rees 176</w:t>
       </w:r>
     </w:p>
     <w:p>
@@ -1125,7 +1077,7 @@
           <w:sz w:val="40"/>
           <w:szCs w:val="40"/>
         </w:rPr>
-        <w:t xml:space="preserve">II</w:t>
+        <w:t xml:space="preserve">III</w:t>
       </w:r>
     </w:p>
     <w:p>
@@ -1144,16 +1096,159 @@
     </w:p>
     <w:p>
       <w:pPr>
-        <w:spacing w:after="200"/>
-      </w:pPr>
-      <w:r>
-        <w:rPr>
-          <w:rFonts w:ascii="Georgia" w:cs="Georgia" w:eastAsia="Georgia" w:hAnsi="Georgia"/>
-          <w:color w:val="666666"/>
-          <w:sz w:val="20"/>
-          <w:szCs w:val="20"/>
-        </w:rPr>
-        <w:t xml:space="preserve">Sehnsucht, die bleibt — Warten auf Regen, auf Familie, auf Rückkehr; im Stein für einen Späteren konserviert.</w:t>
+        <w:spacing w:after="40"/>
+      </w:pPr>
+      <w:r>
+        <w:rPr>
+          <w:rFonts w:ascii="Georgia" w:cs="Georgia" w:eastAsia="Georgia" w:hAnsi="Georgia"/>
+          <w:sz w:val="22"/>
+          <w:szCs w:val="22"/>
+        </w:rPr>
+        <w:t xml:space="preserve">Von Rbʾl, Sohn des Ḥnn, Sohn des Ẓ˥n,</w:t>
+      </w:r>
+    </w:p>
+    <w:p>
+      <w:pPr>
+        <w:spacing w:after="40"/>
+      </w:pPr>
+      <w:r>
+        <w:rPr>
+          <w:rFonts w:ascii="Georgia" w:cs="Georgia" w:eastAsia="Georgia" w:hAnsi="Georgia"/>
+          <w:sz w:val="22"/>
+          <w:szCs w:val="22"/>
+        </w:rPr>
+        <w:t xml:space="preserve">Sohn des Ḫyḏ, Sohn des ˥ḏr.</w:t>
+      </w:r>
+    </w:p>
+    <w:p>
+      <w:pPr>
+        <w:spacing w:after="40"/>
+      </w:pPr>
+      <w:r>
+        <w:rPr>
+          <w:rFonts w:ascii="Georgia" w:cs="Georgia" w:eastAsia="Georgia" w:hAnsi="Georgia"/>
+          <w:sz w:val="22"/>
+          <w:szCs w:val="22"/>
+        </w:rPr>
+        <w:t xml:space="preserve">Und er zog zum Wasser, der Dürre gewärtig —</w:t>
+      </w:r>
+    </w:p>
+    <w:p>
+      <w:pPr>
+        <w:spacing w:after="40"/>
+      </w:pPr>
+      <w:r>
+        <w:rPr>
+          <w:rFonts w:ascii="Georgia" w:cs="Georgia" w:eastAsia="Georgia" w:hAnsi="Georgia"/>
+          <w:sz w:val="22"/>
+          <w:szCs w:val="22"/>
+        </w:rPr>
+        <w:t xml:space="preserve">dann wieder im Wassermann, dann im Widder,</w:t>
+      </w:r>
+    </w:p>
+    <w:p>
+      <w:pPr>
+        <w:spacing w:after="40"/>
+      </w:pPr>
+      <w:r>
+        <w:rPr>
+          <w:rFonts w:ascii="Georgia" w:cs="Georgia" w:eastAsia="Georgia" w:hAnsi="Georgia"/>
+          <w:sz w:val="22"/>
+          <w:szCs w:val="22"/>
+        </w:rPr>
+        <w:t xml:space="preserve">dann in der Waage, dann abermals in der Waage,</w:t>
+      </w:r>
+    </w:p>
+    <w:p>
+      <w:pPr>
+        <w:spacing w:after="40"/>
+      </w:pPr>
+      <w:r>
+        <w:rPr>
+          <w:rFonts w:ascii="Georgia" w:cs="Georgia" w:eastAsia="Georgia" w:hAnsi="Georgia"/>
+          <w:sz w:val="22"/>
+          <w:szCs w:val="22"/>
+        </w:rPr>
+        <w:t xml:space="preserve">zwei Jahre in Folge —,</w:t>
+      </w:r>
+    </w:p>
+    <w:p>
+      <w:pPr>
+        <w:spacing w:after="40"/>
+      </w:pPr>
+      <w:r>
+        <w:rPr>
+          <w:rFonts w:ascii="Georgia" w:cs="Georgia" w:eastAsia="Georgia" w:hAnsi="Georgia"/>
+          <w:sz w:val="22"/>
+          <w:szCs w:val="22"/>
+        </w:rPr>
+        <w:t xml:space="preserve">und in dieser Zeit trauerte er vor Schmerz</w:t>
+      </w:r>
+    </w:p>
+    <w:p>
+      <w:pPr>
+        <w:spacing w:after="40"/>
+      </w:pPr>
+      <w:r>
+        <w:rPr>
+          <w:rFonts w:ascii="Georgia" w:cs="Georgia" w:eastAsia="Georgia" w:hAnsi="Georgia"/>
+          <w:sz w:val="22"/>
+          <w:szCs w:val="22"/>
+        </w:rPr>
+        <w:t xml:space="preserve">um einen, den er liebte,</w:t>
+      </w:r>
+    </w:p>
+    <w:p>
+      <w:pPr>
+        <w:spacing w:after="40"/>
+      </w:pPr>
+      <w:r>
+        <w:rPr>
+          <w:rFonts w:ascii="Georgia" w:cs="Georgia" w:eastAsia="Georgia" w:hAnsi="Georgia"/>
+          <w:sz w:val="22"/>
+          <w:szCs w:val="22"/>
+        </w:rPr>
+        <w:t xml:space="preserve">und um die Kamele, die er weidete,</w:t>
+      </w:r>
+    </w:p>
+    <w:p>
+      <w:pPr>
+        <w:spacing w:after="40"/>
+      </w:pPr>
+      <w:r>
+        <w:rPr>
+          <w:rFonts w:ascii="Georgia" w:cs="Georgia" w:eastAsia="Georgia" w:hAnsi="Georgia"/>
+          <w:sz w:val="22"/>
+          <w:szCs w:val="22"/>
+        </w:rPr>
+        <w:t xml:space="preserve">hinausgezogen aus der inneren Wüste,</w:t>
+      </w:r>
+    </w:p>
+    <w:p>
+      <w:pPr>
+        <w:spacing w:after="40"/>
+      </w:pPr>
+      <w:r>
+        <w:rPr>
+          <w:rFonts w:ascii="Georgia" w:cs="Georgia" w:eastAsia="Georgia" w:hAnsi="Georgia"/>
+          <w:sz w:val="22"/>
+          <w:szCs w:val="22"/>
+        </w:rPr>
+        <w:t xml:space="preserve">im Jahr, als Bnt starb.</w:t>
+      </w:r>
+    </w:p>
+    <w:p>
+      <w:pPr>
+        <w:spacing w:after="280" w:before="60"/>
+      </w:pPr>
+      <w:r>
+        <w:rPr>
+          <w:rFonts w:ascii="Georgia" w:cs="Georgia" w:eastAsia="Georgia" w:hAnsi="Georgia"/>
+          <w:color w:val="7A5C3E"/>
+          <w:sz w:val="16"/>
+          <w:szCs w:val="16"/>
+        </w:rPr>
+        <w:t xml:space="preserve">Wādī Sārah · ASWS 73</w:t>
       </w:r>
     </w:p>
     <w:p>
@@ -1206,7 +1301,7 @@
           <w:sz w:val="16"/>
           <w:szCs w:val="16"/>
         </w:rPr>
-        <w:t xml:space="preserve">Sigle RSIS 110 · Tall aḍ-Ḍabiʿ</w:t>
+        <w:t xml:space="preserve">Tall aḍ-Ḍabiʿ · RSIS 110</w:t>
       </w:r>
     </w:p>
     <w:p>
@@ -1259,7 +1354,7 @@
           <w:sz w:val="16"/>
           <w:szCs w:val="16"/>
         </w:rPr>
-        <w:t xml:space="preserve">Sigle Is.Mu 255 · al-ʿĪsāwī</w:t>
+        <w:t xml:space="preserve">al-ʿĪsāwī · Is.Mu 255</w:t>
       </w:r>
     </w:p>
     <w:p>
@@ -1312,7 +1407,7 @@
           <w:sz w:val="16"/>
           <w:szCs w:val="16"/>
         </w:rPr>
-        <w:t xml:space="preserve">Sigle SIJ 30 · Jathum</w:t>
+        <w:t xml:space="preserve">Jathum · SIJ 30</w:t>
       </w:r>
     </w:p>
     <w:p>
@@ -1404,7 +1499,7 @@
           <w:sz w:val="16"/>
           <w:szCs w:val="16"/>
         </w:rPr>
-        <w:t xml:space="preserve">Sigle LP 1196 · Rif Dimašq</w:t>
+        <w:t xml:space="preserve">Rif Dimašq · LP 1196</w:t>
       </w:r>
     </w:p>
     <w:p>
@@ -1470,7 +1565,7 @@
           <w:sz w:val="16"/>
           <w:szCs w:val="16"/>
         </w:rPr>
-        <w:t xml:space="preserve">Sigle KRS 3051 · Al-Mafraq</w:t>
+        <w:t xml:space="preserve">Al-Mafraq · KRS 3051</w:t>
       </w:r>
     </w:p>
     <w:p>
@@ -1510,7 +1605,7 @@
           <w:sz w:val="16"/>
           <w:szCs w:val="16"/>
         </w:rPr>
-        <w:t xml:space="preserve">Sigle CSNS 796 · Qāʿ al-Maḥfūr</w:t>
+        <w:t xml:space="preserve">Qāʿ al-Maḥfūr · CSNS 796</w:t>
       </w:r>
     </w:p>
     <w:p>
@@ -1563,7 +1658,7 @@
           <w:sz w:val="16"/>
           <w:szCs w:val="16"/>
         </w:rPr>
-        <w:t xml:space="preserve">Sigle C 2756 · Zalaf</w:t>
+        <w:t xml:space="preserve">Zalaf · C 2756</w:t>
       </w:r>
     </w:p>
     <w:p>
@@ -1603,7 +1698,7 @@
           <w:sz w:val="16"/>
           <w:szCs w:val="16"/>
         </w:rPr>
-        <w:t xml:space="preserve">Sigle C 2753 · Zalaf</w:t>
+        <w:t xml:space="preserve">Zalaf · C 2753</w:t>
       </w:r>
     </w:p>
     <w:p>
@@ -1643,7 +1738,7 @@
           <w:sz w:val="16"/>
           <w:szCs w:val="16"/>
         </w:rPr>
-        <w:t xml:space="preserve">Sigle RSIS 322 · Tall aḍ-Ḍabiʿ</w:t>
+        <w:t xml:space="preserve">Tall aḍ-Ḍabiʿ · RSIS 322</w:t>
       </w:r>
     </w:p>
     <w:p>
@@ -1683,7 +1778,7 @@
           <w:sz w:val="16"/>
           <w:szCs w:val="16"/>
         </w:rPr>
-        <w:t xml:space="preserve">Sigle WH 175 · WH Cairn 7</w:t>
+        <w:t xml:space="preserve">WH Cairn 7 · WH 175</w:t>
       </w:r>
     </w:p>
     <w:p>
@@ -1749,7 +1844,7 @@
           <w:sz w:val="16"/>
           <w:szCs w:val="16"/>
         </w:rPr>
-        <w:t xml:space="preserve">Sigle AbSWS 15 · Wādī Salma</w:t>
+        <w:t xml:space="preserve">Wādī Salma · AbSWS 15</w:t>
       </w:r>
     </w:p>
     <w:p>
@@ -1789,7 +1884,7 @@
           <w:sz w:val="16"/>
           <w:szCs w:val="16"/>
         </w:rPr>
-        <w:t xml:space="preserve">Sigle KWQ 113 · Tell 5</w:t>
+        <w:t xml:space="preserve">Tell 5 · KWQ 113</w:t>
       </w:r>
     </w:p>
     <w:p>
@@ -1829,7 +1924,7 @@
           <w:sz w:val="16"/>
           <w:szCs w:val="16"/>
         </w:rPr>
-        <w:t xml:space="preserve">Sigle ASWS 183 · Wādī Sārah</w:t>
+        <w:t xml:space="preserve">Wādī Sārah · ASWS 183</w:t>
       </w:r>
     </w:p>
     <w:p>
@@ -1869,7 +1964,7 @@
           <w:sz w:val="16"/>
           <w:szCs w:val="16"/>
         </w:rPr>
-        <w:t xml:space="preserve">Sigle CEDS 226 · EDS 80-5</w:t>
+        <w:t xml:space="preserve">EDS 80-5 · CEDS 226</w:t>
       </w:r>
     </w:p>
     <w:p>
@@ -1909,7 +2004,7 @@
           <w:sz w:val="16"/>
           <w:szCs w:val="16"/>
         </w:rPr>
-        <w:t xml:space="preserve">Sigle SIJ 323 · Jawa</w:t>
+        <w:t xml:space="preserve">Jawa · SIJ 323</w:t>
       </w:r>
     </w:p>
     <w:p>
@@ -1949,7 +2044,7 @@
           <w:sz w:val="16"/>
           <w:szCs w:val="16"/>
         </w:rPr>
-        <w:t xml:space="preserve">Sigle SIJ 14 · Jathum</w:t>
+        <w:t xml:space="preserve">Jathum · SIJ 14</w:t>
       </w:r>
     </w:p>
     <w:p>
@@ -2002,7 +2097,7 @@
           <w:sz w:val="16"/>
           <w:szCs w:val="16"/>
         </w:rPr>
-        <w:t xml:space="preserve">Sigle GSSH 1 · Al-Mafraq</w:t>
+        <w:t xml:space="preserve">Al-Mafraq · GSSH 1</w:t>
       </w:r>
     </w:p>
     <w:p>
@@ -2042,7 +2137,7 @@
           <w:sz w:val="16"/>
           <w:szCs w:val="16"/>
         </w:rPr>
-        <w:t xml:space="preserve">Sigle C 2194 · Zalaf</w:t>
+        <w:t xml:space="preserve">Zalaf · C 2194</w:t>
       </w:r>
     </w:p>
     <w:p>
@@ -2062,7 +2157,7 @@
           <w:sz w:val="40"/>
           <w:szCs w:val="40"/>
         </w:rPr>
-        <w:t xml:space="preserve">III</w:t>
+        <w:t xml:space="preserve">IV</w:t>
       </w:r>
     </w:p>
     <w:p>
@@ -2081,20 +2176,6 @@
     </w:p>
     <w:p>
       <w:pPr>
-        <w:spacing w:after="200"/>
-      </w:pPr>
-      <w:r>
-        <w:rPr>
-          <w:rFonts w:ascii="Georgia" w:cs="Georgia" w:eastAsia="Georgia" w:hAnsi="Georgia"/>
-          <w:color w:val="666666"/>
-          <w:sz w:val="20"/>
-          <w:szCs w:val="20"/>
-        </w:rPr>
-        <w:t xml:space="preserve">Das Gebet, das im Stein steht — an die Gottheit gerichtet, doch der Stein ist das Medium; es verhallt nicht, es bleibt adressiert.</w:t>
-      </w:r>
-    </w:p>
-    <w:p>
-      <w:pPr>
         <w:spacing w:after="40"/>
       </w:pPr>
       <w:r>
@@ -2130,7 +2211,7 @@
           <w:sz w:val="16"/>
           <w:szCs w:val="16"/>
         </w:rPr>
-        <w:t xml:space="preserve">Sigle BS 209 · Al-Mafraq</w:t>
+        <w:t xml:space="preserve">Al-Mafraq · BS 209</w:t>
       </w:r>
     </w:p>
     <w:p>
@@ -2183,7 +2264,7 @@
           <w:sz w:val="16"/>
           <w:szCs w:val="16"/>
         </w:rPr>
-        <w:t xml:space="preserve">Sigle MKJS 80 · Al-Mafraq</w:t>
+        <w:t xml:space="preserve">Al-Mafraq · MKJS 80</w:t>
       </w:r>
     </w:p>
     <w:p>
@@ -2236,7 +2317,7 @@
           <w:sz w:val="16"/>
           <w:szCs w:val="16"/>
         </w:rPr>
-        <w:t xml:space="preserve">Sigle LP 1267 · Al-Suwaydā</w:t>
+        <w:t xml:space="preserve">Al-Suwaydā · LP 1267</w:t>
       </w:r>
     </w:p>
     <w:p>
@@ -2302,7 +2383,7 @@
           <w:sz w:val="16"/>
           <w:szCs w:val="16"/>
         </w:rPr>
-        <w:t xml:space="preserve">Sigle Is.Mu 88 · al-ʿĪsāwī</w:t>
+        <w:t xml:space="preserve">al-ʿĪsāwī · Is.Mu 88</w:t>
       </w:r>
     </w:p>
     <w:p>
@@ -2342,7 +2423,7 @@
           <w:sz w:val="16"/>
           <w:szCs w:val="16"/>
         </w:rPr>
-        <w:t xml:space="preserve">Sigle AbSWS 42 · Wādī Salma</w:t>
+        <w:t xml:space="preserve">Wādī Salma · AbSWS 42</w:t>
       </w:r>
     </w:p>
     <w:p>
@@ -2382,7 +2463,7 @@
           <w:sz w:val="16"/>
           <w:szCs w:val="16"/>
         </w:rPr>
-        <w:t xml:space="preserve">Sigle WAMS 19.2 · Km 910</w:t>
+        <w:t xml:space="preserve">Km 910 · WAMS 19.2</w:t>
       </w:r>
     </w:p>
     <w:p>
@@ -2422,7 +2503,7 @@
           <w:sz w:val="16"/>
           <w:szCs w:val="16"/>
         </w:rPr>
-        <w:t xml:space="preserve">Sigle C 64 · Ǧabal Says</w:t>
+        <w:t xml:space="preserve">Ǧabal Says · C 64</w:t>
       </w:r>
     </w:p>
     <w:p>
@@ -2462,7 +2543,7 @@
           <w:sz w:val="16"/>
           <w:szCs w:val="16"/>
         </w:rPr>
-        <w:t xml:space="preserve">Sigle C 134 · Ǧabal Says</w:t>
+        <w:t xml:space="preserve">Ǧabal Says · C 134</w:t>
       </w:r>
     </w:p>
     <w:p>
@@ -2502,7 +2583,7 @@
           <w:sz w:val="16"/>
           <w:szCs w:val="16"/>
         </w:rPr>
-        <w:t xml:space="preserve">Sigle C 218 · Rif Dimašq</w:t>
+        <w:t xml:space="preserve">Rif Dimašq · C 218</w:t>
       </w:r>
     </w:p>
     <w:p>
@@ -2555,7 +2636,7 @@
           <w:sz w:val="16"/>
           <w:szCs w:val="16"/>
         </w:rPr>
-        <w:t xml:space="preserve">Sigle C 1412 · Riǧm Qaʿqūl</w:t>
+        <w:t xml:space="preserve">Riǧm Qaʿqūl · C 1412</w:t>
       </w:r>
     </w:p>
     <w:p>
@@ -2595,7 +2676,7 @@
           <w:sz w:val="16"/>
           <w:szCs w:val="16"/>
         </w:rPr>
-        <w:t xml:space="preserve">Sigle C 805 · Rif Dimašq</w:t>
+        <w:t xml:space="preserve">Rif Dimašq · C 805</w:t>
       </w:r>
     </w:p>
     <w:p>
@@ -2635,7 +2716,7 @@
           <w:sz w:val="16"/>
           <w:szCs w:val="16"/>
         </w:rPr>
-        <w:t xml:space="preserve">Sigle C 885 · Khirbat al-Umbāšī</w:t>
+        <w:t xml:space="preserve">Khirbat al-Umbāšī · C 885</w:t>
       </w:r>
     </w:p>
     <w:p>
@@ -2675,7 +2756,7 @@
           <w:sz w:val="16"/>
           <w:szCs w:val="16"/>
         </w:rPr>
-        <w:t xml:space="preserve">Sigle C 898 · Khirbat al-Hubayrīyah</w:t>
+        <w:t xml:space="preserve">Khirbat al-Hubayrīyah · C 898</w:t>
       </w:r>
     </w:p>
     <w:p>
@@ -2715,7 +2796,7 @@
           <w:sz w:val="16"/>
           <w:szCs w:val="16"/>
         </w:rPr>
-        <w:t xml:space="preserve">Sigle C 907 · Khirbat al-Hubayrīyah</w:t>
+        <w:t xml:space="preserve">Khirbat al-Hubayrīyah · C 907</w:t>
       </w:r>
     </w:p>
     <w:p>
@@ -2755,7 +2836,7 @@
           <w:sz w:val="16"/>
           <w:szCs w:val="16"/>
         </w:rPr>
-        <w:t xml:space="preserve">Sigle C 1086 · Rif Dimašq</w:t>
+        <w:t xml:space="preserve">Rif Dimašq · C 1086</w:t>
       </w:r>
     </w:p>
     <w:p>
@@ -2808,7 +2889,7 @@
           <w:sz w:val="16"/>
           <w:szCs w:val="16"/>
         </w:rPr>
-        <w:t xml:space="preserve">Sigle C 1496 · Zalaf</w:t>
+        <w:t xml:space="preserve">Zalaf · C 1496</w:t>
       </w:r>
     </w:p>
     <w:p>
@@ -2861,7 +2942,7 @@
           <w:sz w:val="16"/>
           <w:szCs w:val="16"/>
         </w:rPr>
-        <w:t xml:space="preserve">Sigle C 1629 · Zalaf</w:t>
+        <w:t xml:space="preserve">Zalaf · C 1629</w:t>
       </w:r>
     </w:p>
     <w:p>
@@ -2901,7 +2982,7 @@
           <w:sz w:val="16"/>
           <w:szCs w:val="16"/>
         </w:rPr>
-        <w:t xml:space="preserve">Sigle C 1660 · Zalaf</w:t>
+        <w:t xml:space="preserve">Zalaf · C 1660</w:t>
       </w:r>
     </w:p>
     <w:p>
@@ -2921,7 +3002,7 @@
           <w:sz w:val="40"/>
           <w:szCs w:val="40"/>
         </w:rPr>
-        <w:t xml:space="preserve">IV</w:t>
+        <w:t xml:space="preserve">V</w:t>
       </w:r>
     </w:p>
     <w:p>
@@ -2940,20 +3021,6 @@
     </w:p>
     <w:p>
       <w:pPr>
-        <w:spacing w:after="200"/>
-      </w:pPr>
-      <w:r>
-        <w:rPr>
-          <w:rFonts w:ascii="Georgia" w:cs="Georgia" w:eastAsia="Georgia" w:hAnsi="Georgia"/>
-          <w:color w:val="666666"/>
-          <w:sz w:val="20"/>
-          <w:szCs w:val="20"/>
-        </w:rPr>
-        <w:t xml:space="preserve">Die Trauer als Denkmal — die Klage, dem Moment entzogen; die Namensliste ist die Form des Schmerzes.</w:t>
-      </w:r>
-    </w:p>
-    <w:p>
-      <w:pPr>
         <w:spacing w:after="40"/>
       </w:pPr>
       <w:r>
@@ -3041,7 +3108,7 @@
           <w:sz w:val="16"/>
           <w:szCs w:val="16"/>
         </w:rPr>
-        <w:t xml:space="preserve">Sigle LP 540 · al-ʿĪsāwī</w:t>
+        <w:t xml:space="preserve">al-ʿĪsāwī · LP 540</w:t>
       </w:r>
     </w:p>
     <w:p>
@@ -3120,7 +3187,7 @@
           <w:sz w:val="16"/>
           <w:szCs w:val="16"/>
         </w:rPr>
-        <w:t xml:space="preserve">Sigle KRS 17 · Wādī Salma</w:t>
+        <w:t xml:space="preserve">Wādī Salma · KRS 17</w:t>
       </w:r>
     </w:p>
     <w:p>
@@ -3160,7 +3227,7 @@
           <w:sz w:val="16"/>
           <w:szCs w:val="16"/>
         </w:rPr>
-        <w:t xml:space="preserve">Sigle AbaNS 361 · Site 12</w:t>
+        <w:t xml:space="preserve">Site 12 · AbaNS 361</w:t>
       </w:r>
     </w:p>
     <w:p>
@@ -3213,7 +3280,7 @@
           <w:sz w:val="16"/>
           <w:szCs w:val="16"/>
         </w:rPr>
-        <w:t xml:space="preserve">Sigle C 4273 · Al-Suwaydā</w:t>
+        <w:t xml:space="preserve">Al-Suwaydā · C 4273</w:t>
       </w:r>
     </w:p>
     <w:p>
@@ -3240,7 +3307,7 @@
           <w:sz w:val="16"/>
           <w:szCs w:val="16"/>
         </w:rPr>
-        <w:t xml:space="preserve">Sigle CSNS 781 · Qāʿ al-Maḥfūr</w:t>
+        <w:t xml:space="preserve">Qāʿ al-Maḥfūr · CSNS 781</w:t>
       </w:r>
     </w:p>
     <w:p>
@@ -3267,7 +3334,7 @@
           <w:sz w:val="16"/>
           <w:szCs w:val="16"/>
         </w:rPr>
-        <w:t xml:space="preserve">Sigle WH 1517 · Fundort unbekannt</w:t>
+        <w:t xml:space="preserve">Fundort unbekannt · WH 1517</w:t>
       </w:r>
     </w:p>
     <w:p>
@@ -3294,7 +3361,7 @@
           <w:sz w:val="16"/>
           <w:szCs w:val="16"/>
         </w:rPr>
-        <w:t xml:space="preserve">Sigle AbaNS 453 · Site 13</w:t>
+        <w:t xml:space="preserve">Site 13 · AbaNS 453</w:t>
       </w:r>
     </w:p>
     <w:p>
@@ -3321,7 +3388,7 @@
           <w:sz w:val="16"/>
           <w:szCs w:val="16"/>
         </w:rPr>
-        <w:t xml:space="preserve">Sigle WH 3829 · Fundort unbekannt</w:t>
+        <w:t xml:space="preserve">Fundort unbekannt · WH 3829</w:t>
       </w:r>
     </w:p>
     <w:p>
@@ -3361,7 +3428,7 @@
           <w:sz w:val="16"/>
           <w:szCs w:val="16"/>
         </w:rPr>
-        <w:t xml:space="preserve">Sigle WH 3029 · Fundort unbekannt</w:t>
+        <w:t xml:space="preserve">Fundort unbekannt · WH 3029</w:t>
       </w:r>
     </w:p>
     <w:p>
@@ -3388,7 +3455,7 @@
           <w:sz w:val="16"/>
           <w:szCs w:val="16"/>
         </w:rPr>
-        <w:t xml:space="preserve">Sigle WH 2825 · Fundort unbekannt</w:t>
+        <w:t xml:space="preserve">Fundort unbekannt · WH 2825</w:t>
       </w:r>
     </w:p>
     <w:p>
@@ -3415,7 +3482,7 @@
           <w:sz w:val="16"/>
           <w:szCs w:val="16"/>
         </w:rPr>
-        <w:t xml:space="preserve">Sigle HaNSB 319 · Cairn 9</w:t>
+        <w:t xml:space="preserve">Cairn 9 · HaNSB 319</w:t>
       </w:r>
     </w:p>
     <w:p>
@@ -3442,7 +3509,7 @@
           <w:sz w:val="16"/>
           <w:szCs w:val="16"/>
         </w:rPr>
-        <w:t xml:space="preserve">Sigle HaNS 708 · Cairn 10</w:t>
+        <w:t xml:space="preserve">Cairn 10 · HaNS 708</w:t>
       </w:r>
     </w:p>
     <w:p>
@@ -3482,7 +3549,7 @@
           <w:sz w:val="16"/>
           <w:szCs w:val="16"/>
         </w:rPr>
-        <w:t xml:space="preserve">Sigle HaNSB 346 · Cairn 9</w:t>
+        <w:t xml:space="preserve">Cairn 9 · HaNSB 346</w:t>
       </w:r>
     </w:p>
     <w:p>
@@ -3509,7 +3576,7 @@
           <w:sz w:val="16"/>
           <w:szCs w:val="16"/>
         </w:rPr>
-        <w:t xml:space="preserve">Sigle HNSD 13 · Jordanien (allg.)</w:t>
+        <w:t xml:space="preserve">Jordanien (allg.) · HNSD 13</w:t>
       </w:r>
     </w:p>
     <w:p>
@@ -3536,7 +3603,7 @@
           <w:sz w:val="16"/>
           <w:szCs w:val="16"/>
         </w:rPr>
-        <w:t xml:space="preserve">Sigle SIJ 1001 · Cairn S. of the Baghdad </w:t>
+        <w:t xml:space="preserve">bei Ruwayshid · SIJ 1001</w:t>
       </w:r>
     </w:p>
     <w:p>
@@ -3576,7 +3643,7 @@
           <w:sz w:val="16"/>
           <w:szCs w:val="16"/>
         </w:rPr>
-        <w:t xml:space="preserve">Sigle SIJ 811 · Tell al-ʿAbd</w:t>
+        <w:t xml:space="preserve">Tell al-ʿAbd · SIJ 811</w:t>
       </w:r>
     </w:p>
     <w:p>
@@ -3603,7 +3670,7 @@
           <w:sz w:val="16"/>
           <w:szCs w:val="16"/>
         </w:rPr>
-        <w:t xml:space="preserve">Sigle SSWS 28 · Wādī Sārah</w:t>
+        <w:t xml:space="preserve">Wādī Sārah · SSWS 28</w:t>
       </w:r>
     </w:p>
     <w:p>
@@ -3630,7 +3697,7 @@
           <w:sz w:val="16"/>
           <w:szCs w:val="16"/>
         </w:rPr>
-        <w:t xml:space="preserve">Sigle C 5367 · Ḥarrat al-Raǧil</w:t>
+        <w:t xml:space="preserve">Ḥarrat al-Raǧil · C 5367</w:t>
       </w:r>
     </w:p>
     <w:p>
@@ -3650,7 +3717,7 @@
           <w:sz w:val="40"/>
           <w:szCs w:val="40"/>
         </w:rPr>
-        <w:t xml:space="preserve">V</w:t>
+        <w:t xml:space="preserve">VI</w:t>
       </w:r>
     </w:p>
     <w:p>
@@ -3669,20 +3736,6 @@
     </w:p>
     <w:p>
       <w:pPr>
-        <w:spacing w:after="200"/>
-      </w:pPr>
-      <w:r>
-        <w:rPr>
-          <w:rFonts w:ascii="Georgia" w:cs="Georgia" w:eastAsia="Georgia" w:hAnsi="Georgia"/>
-          <w:color w:val="666666"/>
-          <w:sz w:val="20"/>
-          <w:szCs w:val="20"/>
-        </w:rPr>
-        <w:t xml:space="preserve">Der Fluch, der nie endet — der performativste Akt: ein gesprochener Fluch verhallt, ein gemeißelter gilt ewig.</w:t>
-      </w:r>
-    </w:p>
-    <w:p>
-      <w:pPr>
         <w:spacing w:after="40"/>
       </w:pPr>
       <w:r>
@@ -3783,7 +3836,7 @@
           <w:sz w:val="16"/>
           <w:szCs w:val="16"/>
         </w:rPr>
-        <w:t xml:space="preserve">Sigle C 4803 · Zalaf</w:t>
+        <w:t xml:space="preserve">Zalaf · C 4803</w:t>
       </w:r>
     </w:p>
     <w:p>
@@ -3914,7 +3967,7 @@
           <w:sz w:val="16"/>
           <w:szCs w:val="16"/>
         </w:rPr>
-        <w:t xml:space="preserve">Sigle RSIS 351 · Tall aḍ-Ḍabiʿ</w:t>
+        <w:t xml:space="preserve">Tall aḍ-Ḍabiʿ · RSIS 351</w:t>
       </w:r>
     </w:p>
     <w:p>
@@ -3993,7 +4046,7 @@
           <w:sz w:val="16"/>
           <w:szCs w:val="16"/>
         </w:rPr>
-        <w:t xml:space="preserve">Sigle LP 243 · Al-Mrōshan</w:t>
+        <w:t xml:space="preserve">Al-Mrōshan · LP 243</w:t>
       </w:r>
     </w:p>
     <w:p>
@@ -4059,7 +4112,7 @@
           <w:sz w:val="16"/>
           <w:szCs w:val="16"/>
         </w:rPr>
-        <w:t xml:space="preserve">Sigle C 2775 · Zalaf</w:t>
+        <w:t xml:space="preserve">Zalaf · C 2775</w:t>
       </w:r>
     </w:p>
     <w:p>
@@ -4138,7 +4191,7 @@
           <w:sz w:val="16"/>
           <w:szCs w:val="16"/>
         </w:rPr>
-        <w:t xml:space="preserve">Sigle WH 368 · Fundort unbekannt</w:t>
+        <w:t xml:space="preserve">Fundort unbekannt · WH 368</w:t>
       </w:r>
     </w:p>
     <w:p>
@@ -4217,7 +4270,7 @@
           <w:sz w:val="16"/>
           <w:szCs w:val="16"/>
         </w:rPr>
-        <w:t xml:space="preserve">Sigle LP 461 · al-ʿĪsāwī</w:t>
+        <w:t xml:space="preserve">al-ʿĪsāwī · LP 461</w:t>
       </w:r>
     </w:p>
     <w:p>
@@ -4270,7 +4323,7 @@
           <w:sz w:val="16"/>
           <w:szCs w:val="16"/>
         </w:rPr>
-        <w:t xml:space="preserve">Sigle KRS 813 · Al-Mafraq</w:t>
+        <w:t xml:space="preserve">Al-Mafraq · KRS 813</w:t>
       </w:r>
     </w:p>
     <w:p>
@@ -4336,7 +4389,7 @@
           <w:sz w:val="16"/>
           <w:szCs w:val="16"/>
         </w:rPr>
-        <w:t xml:space="preserve">Sigle KRS 941 · Al-Mafraq</w:t>
+        <w:t xml:space="preserve">Al-Mafraq · KRS 941</w:t>
       </w:r>
     </w:p>
     <w:p>
@@ -4402,7 +4455,7 @@
           <w:sz w:val="16"/>
           <w:szCs w:val="16"/>
         </w:rPr>
-        <w:t xml:space="preserve">Sigle Is.Mu 242 · al-ʿĪsāwī</w:t>
+        <w:t xml:space="preserve">al-ʿĪsāwī · Is.Mu 242</w:t>
       </w:r>
     </w:p>
     <w:p>
@@ -4468,7 +4521,7 @@
           <w:sz w:val="16"/>
           <w:szCs w:val="16"/>
         </w:rPr>
-        <w:t xml:space="preserve">Sigle HCH 85 · Cairn of Haniʾ</w:t>
+        <w:t xml:space="preserve">Hani · HCH 85</w:t>
       </w:r>
     </w:p>
     <w:p>
@@ -4521,7 +4574,7 @@
           <w:sz w:val="16"/>
           <w:szCs w:val="16"/>
         </w:rPr>
-        <w:t xml:space="preserve">Sigle C 286 · Rif Dimašq</w:t>
+        <w:t xml:space="preserve">Rif Dimašq · C 286</w:t>
       </w:r>
     </w:p>
     <w:p>
@@ -4587,7 +4640,7 @@
           <w:sz w:val="16"/>
           <w:szCs w:val="16"/>
         </w:rPr>
-        <w:t xml:space="preserve">Sigle C 1658 · Zalaf</w:t>
+        <w:t xml:space="preserve">Zalaf · C 1658</w:t>
       </w:r>
     </w:p>
     <w:p>
@@ -4627,7 +4680,7 @@
           <w:sz w:val="16"/>
           <w:szCs w:val="16"/>
         </w:rPr>
-        <w:t xml:space="preserve">Sigle C 1845 · Zalaf</w:t>
+        <w:t xml:space="preserve">Zalaf · C 1845</w:t>
       </w:r>
     </w:p>
     <w:p>
@@ -4693,7 +4746,7 @@
           <w:sz w:val="16"/>
           <w:szCs w:val="16"/>
         </w:rPr>
-        <w:t xml:space="preserve">Sigle C 2551 · Zalaf</w:t>
+        <w:t xml:space="preserve">Zalaf · C 2551</w:t>
       </w:r>
     </w:p>
     <w:p>
@@ -4733,7 +4786,7 @@
           <w:sz w:val="16"/>
           <w:szCs w:val="16"/>
         </w:rPr>
-        <w:t xml:space="preserve">Sigle C 3138 · Zalaf</w:t>
+        <w:t xml:space="preserve">Zalaf · C 3138</w:t>
       </w:r>
     </w:p>
     <w:p>
@@ -4799,7 +4852,7 @@
           <w:sz w:val="16"/>
           <w:szCs w:val="16"/>
         </w:rPr>
-        <w:t xml:space="preserve">Sigle C 4439 · Al-Suwaydā</w:t>
+        <w:t xml:space="preserve">Al-Suwaydā · C 4439</w:t>
       </w:r>
     </w:p>
     <w:p>
@@ -4839,7 +4892,7 @@
           <w:sz w:val="16"/>
           <w:szCs w:val="16"/>
         </w:rPr>
-        <w:t xml:space="preserve">Sigle C 5299 · Ḥarrat al-Raǧil</w:t>
+        <w:t xml:space="preserve">Ḥarrat al-Raǧil · C 5299</w:t>
       </w:r>
     </w:p>
     <w:p>
@@ -4918,7 +4971,7 @@
           <w:sz w:val="16"/>
           <w:szCs w:val="16"/>
         </w:rPr>
-        <w:t xml:space="preserve">Sigle LP 308 · al-ʿĪsāwī</w:t>
+        <w:t xml:space="preserve">al-ʿĪsāwī · LP 308</w:t>
       </w:r>
     </w:p>
     <w:p>
@@ -4938,7 +4991,7 @@
           <w:sz w:val="40"/>
           <w:szCs w:val="40"/>
         </w:rPr>
-        <w:t xml:space="preserve">VI</w:t>
+        <w:t xml:space="preserve">VII</w:t>
       </w:r>
     </w:p>
     <w:p>
@@ -4957,20 +5010,6 @@
     </w:p>
     <w:p>
       <w:pPr>
-        <w:spacing w:after="200"/>
-      </w:pPr>
-      <w:r>
-        <w:rPr>
-          <w:rFonts w:ascii="Georgia" w:cs="Georgia" w:eastAsia="Georgia" w:hAnsi="Georgia"/>
-          <w:color w:val="666666"/>
-          <w:sz w:val="20"/>
-          <w:szCs w:val="20"/>
-        </w:rPr>
-        <w:t xml:space="preserve">Zeugnis für Unbekannte — die Datierung als Akt: er war dabei, es war dieses Jahr; geschrieben für Fremde, die später kommen.</w:t>
-      </w:r>
-    </w:p>
-    <w:p>
-      <w:pPr>
         <w:spacing w:after="40"/>
       </w:pPr>
       <w:r>
@@ -5149,7 +5188,7 @@
           <w:sz w:val="16"/>
           <w:szCs w:val="16"/>
         </w:rPr>
-        <w:t xml:space="preserve">Sigle HSNS 5 · Jordanien (allg.)</w:t>
+        <w:t xml:space="preserve">Jordanien (allg.) · HSNS 5</w:t>
       </w:r>
     </w:p>
     <w:p>
@@ -5280,164 +5319,7 @@
           <w:sz w:val="16"/>
           <w:szCs w:val="16"/>
         </w:rPr>
-        <w:t xml:space="preserve">Sigle LP 653 · Rif Dimašq</w:t>
-      </w:r>
-    </w:p>
-    <w:p>
-      <w:pPr>
-        <w:spacing w:after="40"/>
-      </w:pPr>
-      <w:r>
-        <w:rPr>
-          <w:rFonts w:ascii="Georgia" w:cs="Georgia" w:eastAsia="Georgia" w:hAnsi="Georgia"/>
-          <w:sz w:val="22"/>
-          <w:szCs w:val="22"/>
-        </w:rPr>
-        <w:t xml:space="preserve">Von Rbʾl, Sohn des Ḥnn, Sohn des Ẓ˥n,</w:t>
-      </w:r>
-    </w:p>
-    <w:p>
-      <w:pPr>
-        <w:spacing w:after="40"/>
-      </w:pPr>
-      <w:r>
-        <w:rPr>
-          <w:rFonts w:ascii="Georgia" w:cs="Georgia" w:eastAsia="Georgia" w:hAnsi="Georgia"/>
-          <w:sz w:val="22"/>
-          <w:szCs w:val="22"/>
-        </w:rPr>
-        <w:t xml:space="preserve">Sohn des Ḫyḏ, Sohn des ˥ḏr.</w:t>
-      </w:r>
-    </w:p>
-    <w:p>
-      <w:pPr>
-        <w:spacing w:after="40"/>
-      </w:pPr>
-      <w:r>
-        <w:rPr>
-          <w:rFonts w:ascii="Georgia" w:cs="Georgia" w:eastAsia="Georgia" w:hAnsi="Georgia"/>
-          <w:sz w:val="22"/>
-          <w:szCs w:val="22"/>
-        </w:rPr>
-        <w:t xml:space="preserve">Und er zog zum Wasser, der Dürre gewärtig —</w:t>
-      </w:r>
-    </w:p>
-    <w:p>
-      <w:pPr>
-        <w:spacing w:after="40"/>
-      </w:pPr>
-      <w:r>
-        <w:rPr>
-          <w:rFonts w:ascii="Georgia" w:cs="Georgia" w:eastAsia="Georgia" w:hAnsi="Georgia"/>
-          <w:sz w:val="22"/>
-          <w:szCs w:val="22"/>
-        </w:rPr>
-        <w:t xml:space="preserve">dann wieder im Wassermann, dann im Widder,</w:t>
-      </w:r>
-    </w:p>
-    <w:p>
-      <w:pPr>
-        <w:spacing w:after="40"/>
-      </w:pPr>
-      <w:r>
-        <w:rPr>
-          <w:rFonts w:ascii="Georgia" w:cs="Georgia" w:eastAsia="Georgia" w:hAnsi="Georgia"/>
-          <w:sz w:val="22"/>
-          <w:szCs w:val="22"/>
-        </w:rPr>
-        <w:t xml:space="preserve">dann in der Waage, dann abermals in der Waage,</w:t>
-      </w:r>
-    </w:p>
-    <w:p>
-      <w:pPr>
-        <w:spacing w:after="40"/>
-      </w:pPr>
-      <w:r>
-        <w:rPr>
-          <w:rFonts w:ascii="Georgia" w:cs="Georgia" w:eastAsia="Georgia" w:hAnsi="Georgia"/>
-          <w:sz w:val="22"/>
-          <w:szCs w:val="22"/>
-        </w:rPr>
-        <w:t xml:space="preserve">zwei Jahre in Folge —,</w:t>
-      </w:r>
-    </w:p>
-    <w:p>
-      <w:pPr>
-        <w:spacing w:after="40"/>
-      </w:pPr>
-      <w:r>
-        <w:rPr>
-          <w:rFonts w:ascii="Georgia" w:cs="Georgia" w:eastAsia="Georgia" w:hAnsi="Georgia"/>
-          <w:sz w:val="22"/>
-          <w:szCs w:val="22"/>
-        </w:rPr>
-        <w:t xml:space="preserve">und in dieser Zeit trauerte er vor Schmerz</w:t>
-      </w:r>
-    </w:p>
-    <w:p>
-      <w:pPr>
-        <w:spacing w:after="40"/>
-      </w:pPr>
-      <w:r>
-        <w:rPr>
-          <w:rFonts w:ascii="Georgia" w:cs="Georgia" w:eastAsia="Georgia" w:hAnsi="Georgia"/>
-          <w:sz w:val="22"/>
-          <w:szCs w:val="22"/>
-        </w:rPr>
-        <w:t xml:space="preserve">um einen, den er liebte,</w:t>
-      </w:r>
-    </w:p>
-    <w:p>
-      <w:pPr>
-        <w:spacing w:after="40"/>
-      </w:pPr>
-      <w:r>
-        <w:rPr>
-          <w:rFonts w:ascii="Georgia" w:cs="Georgia" w:eastAsia="Georgia" w:hAnsi="Georgia"/>
-          <w:sz w:val="22"/>
-          <w:szCs w:val="22"/>
-        </w:rPr>
-        <w:t xml:space="preserve">und um die Kamele, die er weidete,</w:t>
-      </w:r>
-    </w:p>
-    <w:p>
-      <w:pPr>
-        <w:spacing w:after="40"/>
-      </w:pPr>
-      <w:r>
-        <w:rPr>
-          <w:rFonts w:ascii="Georgia" w:cs="Georgia" w:eastAsia="Georgia" w:hAnsi="Georgia"/>
-          <w:sz w:val="22"/>
-          <w:szCs w:val="22"/>
-        </w:rPr>
-        <w:t xml:space="preserve">hinausgezogen aus der inneren Wüste,</w:t>
-      </w:r>
-    </w:p>
-    <w:p>
-      <w:pPr>
-        <w:spacing w:after="40"/>
-      </w:pPr>
-      <w:r>
-        <w:rPr>
-          <w:rFonts w:ascii="Georgia" w:cs="Georgia" w:eastAsia="Georgia" w:hAnsi="Georgia"/>
-          <w:sz w:val="22"/>
-          <w:szCs w:val="22"/>
-        </w:rPr>
-        <w:t xml:space="preserve">im Jahr, als Bnt starb.</w:t>
-      </w:r>
-    </w:p>
-    <w:p>
-      <w:pPr>
-        <w:spacing w:after="280" w:before="60"/>
-      </w:pPr>
-      <w:r>
-        <w:rPr>
-          <w:rFonts w:ascii="Georgia" w:cs="Georgia" w:eastAsia="Georgia" w:hAnsi="Georgia"/>
-          <w:color w:val="7A5C3E"/>
-          <w:sz w:val="16"/>
-          <w:szCs w:val="16"/>
-        </w:rPr>
-        <w:t xml:space="preserve">Sigle ASWS 73 · Wādī Sārah</w:t>
+        <w:t xml:space="preserve">Rif Dimašq · LP 653</w:t>
       </w:r>
     </w:p>
     <w:p>
@@ -5503,7 +5385,7 @@
           <w:sz w:val="16"/>
           <w:szCs w:val="16"/>
         </w:rPr>
-        <w:t xml:space="preserve">Sigle C 2670 · Zalaf</w:t>
+        <w:t xml:space="preserve">Zalaf · C 2670</w:t>
       </w:r>
     </w:p>
     <w:p>
@@ -5556,7 +5438,7 @@
           <w:sz w:val="16"/>
           <w:szCs w:val="16"/>
         </w:rPr>
-        <w:t xml:space="preserve">Sigle ISB 57 · Site 4</w:t>
+        <w:t xml:space="preserve">Site 4 · ISB 57</w:t>
       </w:r>
     </w:p>
     <w:p>
@@ -5596,7 +5478,7 @@
           <w:sz w:val="16"/>
           <w:szCs w:val="16"/>
         </w:rPr>
-        <w:t xml:space="preserve">Sigle HSNS 1 · Jordanien (allg.)</w:t>
+        <w:t xml:space="preserve">Jordanien (allg.) · HSNS 1</w:t>
       </w:r>
     </w:p>
     <w:p>
@@ -5649,7 +5531,7 @@
           <w:sz w:val="16"/>
           <w:szCs w:val="16"/>
         </w:rPr>
-        <w:t xml:space="preserve">Sigle RQ.D 3 · Riǧm Qaʿqūl</w:t>
+        <w:t xml:space="preserve">Riǧm Qaʿqūl · RQ.D 3</w:t>
       </w:r>
     </w:p>
     <w:p>
@@ -5702,7 +5584,7 @@
           <w:sz w:val="16"/>
           <w:szCs w:val="16"/>
         </w:rPr>
-        <w:t xml:space="preserve">Sigle LP 1291 · Syrien (allg.)</w:t>
+        <w:t xml:space="preserve">Syrien (allg.) · LP 1291</w:t>
       </w:r>
     </w:p>
     <w:p>
@@ -5755,7 +5637,7 @@
           <w:sz w:val="16"/>
           <w:szCs w:val="16"/>
         </w:rPr>
-        <w:t xml:space="preserve">Sigle C 2190 · Zalaf</w:t>
+        <w:t xml:space="preserve">Zalaf · C 2190</w:t>
       </w:r>
     </w:p>
     <w:p>
@@ -5821,7 +5703,7 @@
           <w:sz w:val="16"/>
           <w:szCs w:val="16"/>
         </w:rPr>
-        <w:t xml:space="preserve">Sigle RQ.D 6 · Riǧm Qaʿqūl</w:t>
+        <w:t xml:space="preserve">Riǧm Qaʿqūl · RQ.D 6</w:t>
       </w:r>
     </w:p>
     <w:p>
@@ -5861,7 +5743,7 @@
           <w:sz w:val="16"/>
           <w:szCs w:val="16"/>
         </w:rPr>
-        <w:t xml:space="preserve">Sigle Is.L 202 · al-ʿĪsāwī</w:t>
+        <w:t xml:space="preserve">al-ʿĪsāwī · Is.L 202</w:t>
       </w:r>
     </w:p>
     <w:p>
@@ -5901,7 +5783,7 @@
           <w:sz w:val="16"/>
           <w:szCs w:val="16"/>
         </w:rPr>
-        <w:t xml:space="preserve">Sigle ASFF 267 · Al-Mafraq</w:t>
+        <w:t xml:space="preserve">Al-Mafraq · ASFF 267</w:t>
       </w:r>
     </w:p>
     <w:p>
@@ -5954,7 +5836,7 @@
           <w:sz w:val="16"/>
           <w:szCs w:val="16"/>
         </w:rPr>
-        <w:t xml:space="preserve">Sigle KRS 1586 · Al-Mafraq</w:t>
+        <w:t xml:space="preserve">Al-Mafraq · KRS 1586</w:t>
       </w:r>
     </w:p>
     <w:p>
@@ -6033,7 +5915,7 @@
           <w:sz w:val="16"/>
           <w:szCs w:val="16"/>
         </w:rPr>
-        <w:t xml:space="preserve">Sigle C 4681 · Rif Dimašq</w:t>
+        <w:t xml:space="preserve">Rif Dimašq · C 4681</w:t>
       </w:r>
     </w:p>
     <w:p>
@@ -6086,7 +5968,7 @@
           <w:sz w:val="16"/>
           <w:szCs w:val="16"/>
         </w:rPr>
-        <w:t xml:space="preserve">Sigle ZN 1 · Zimlet Nāṣir</w:t>
+        <w:t xml:space="preserve">Zimlet Nāṣir · ZN 1</w:t>
       </w:r>
     </w:p>
     <w:p>
@@ -6126,7 +6008,7 @@
           <w:sz w:val="16"/>
           <w:szCs w:val="16"/>
         </w:rPr>
-        <w:t xml:space="preserve">Sigle RWQ 304 · Wādī Salma</w:t>
+        <w:t xml:space="preserve">Wādī Salma · RWQ 304</w:t>
       </w:r>
     </w:p>
     <w:p>
@@ -6179,7 +6061,7 @@
           <w:sz w:val="16"/>
           <w:szCs w:val="16"/>
         </w:rPr>
-        <w:t xml:space="preserve">Sigle BWM 3 · Wādī Miqāṭ</w:t>
+        <w:t xml:space="preserve">Wādī Miqāṭ · BWM 3</w:t>
       </w:r>
     </w:p>
     <w:p>
@@ -6219,7 +6101,7 @@
           <w:sz w:val="16"/>
           <w:szCs w:val="16"/>
         </w:rPr>
-        <w:t xml:space="preserve">Sigle RSIS 324 · Tall aḍ-Ḍabiʿ</w:t>
+        <w:t xml:space="preserve">Tall aḍ-Ḍabiʿ · RSIS 324</w:t>
       </w:r>
     </w:p>
     <w:p>
@@ -6272,7 +6154,7 @@
           <w:sz w:val="16"/>
           <w:szCs w:val="16"/>
         </w:rPr>
-        <w:t xml:space="preserve">Sigle C 4902 · Rif Dimašq</w:t>
+        <w:t xml:space="preserve">Rif Dimašq · C 4902</w:t>
       </w:r>
     </w:p>
     <w:p>
@@ -6292,7 +6174,7 @@
           <w:sz w:val="40"/>
           <w:szCs w:val="40"/>
         </w:rPr>
-        <w:t xml:space="preserve">VII</w:t>
+        <w:t xml:space="preserve">VIII</w:t>
       </w:r>
     </w:p>
     <w:p>
@@ -6311,20 +6193,6 @@
     </w:p>
     <w:p>
       <w:pPr>
-        <w:spacing w:after="200"/>
-      </w:pPr>
-      <w:r>
-        <w:rPr>
-          <w:rFonts w:ascii="Georgia" w:cs="Georgia" w:eastAsia="Georgia" w:hAnsi="Georgia"/>
-          <w:color w:val="666666"/>
-          <w:sz w:val="20"/>
-          <w:szCs w:val="20"/>
-        </w:rPr>
-        <w:t xml:space="preserve">Lücken, die sprechen — nicht jede Lücke ist Zufall; was fehlt, wird durch sein Fehlen bezeichnet.</w:t>
-      </w:r>
-    </w:p>
-    <w:p>
-      <w:pPr>
         <w:spacing w:after="40"/>
       </w:pPr>
       <w:r>
@@ -6542,7 +6410,7 @@
           <w:sz w:val="16"/>
           <w:szCs w:val="16"/>
         </w:rPr>
-        <w:t xml:space="preserve">Sigle RQ.A 5 · Riǧm Qaʿqūl</w:t>
+        <w:t xml:space="preserve">Riǧm Qaʿqūl · RQ.A 5</w:t>
       </w:r>
     </w:p>
     <w:p>
@@ -6595,7 +6463,7 @@
           <w:sz w:val="16"/>
           <w:szCs w:val="16"/>
         </w:rPr>
-        <w:t xml:space="preserve">Sigle WH 1867.1 · Fundort unbekannt</w:t>
+        <w:t xml:space="preserve">Fundort unbekannt · WH 1867.1</w:t>
       </w:r>
     </w:p>
     <w:p>
@@ -6635,7 +6503,7 @@
           <w:sz w:val="16"/>
           <w:szCs w:val="16"/>
         </w:rPr>
-        <w:t xml:space="preserve">Sigle WH 1501.2 · Fundort unbekannt</w:t>
+        <w:t xml:space="preserve">Fundort unbekannt · WH 1501.2</w:t>
       </w:r>
     </w:p>
     <w:p>
@@ -6701,7 +6569,7 @@
           <w:sz w:val="16"/>
           <w:szCs w:val="16"/>
         </w:rPr>
-        <w:t xml:space="preserve">Sigle JaS 23 · Km 612</w:t>
+        <w:t xml:space="preserve">Km 612 · JaS 23</w:t>
       </w:r>
     </w:p>
     <w:p>
@@ -6780,7 +6648,7 @@
           <w:sz w:val="16"/>
           <w:szCs w:val="16"/>
         </w:rPr>
-        <w:t xml:space="preserve">Sigle HCH 102 · Cairn of Haniʾ</w:t>
+        <w:t xml:space="preserve">Hani · HCH 102</w:t>
       </w:r>
     </w:p>
     <w:p>
@@ -6859,7 +6727,7 @@
           <w:sz w:val="16"/>
           <w:szCs w:val="16"/>
         </w:rPr>
-        <w:t xml:space="preserve">Sigle HCH 125 · Cairn of Haniʾ</w:t>
+        <w:t xml:space="preserve">Hani · HCH 125</w:t>
       </w:r>
     </w:p>
     <w:p>
@@ -6925,7 +6793,7 @@
           <w:sz w:val="16"/>
           <w:szCs w:val="16"/>
         </w:rPr>
-        <w:t xml:space="preserve">Sigle HCH 151 · Cairn of Haniʾ</w:t>
+        <w:t xml:space="preserve">Hani · HCH 151</w:t>
       </w:r>
     </w:p>
     <w:p>
@@ -6978,7 +6846,7 @@
           <w:sz w:val="16"/>
           <w:szCs w:val="16"/>
         </w:rPr>
-        <w:t xml:space="preserve">Sigle HCH 157 · Cairn of Haniʾ</w:t>
+        <w:t xml:space="preserve">Hani · HCH 157</w:t>
       </w:r>
     </w:p>
     <w:p>
@@ -7031,7 +6899,7 @@
           <w:sz w:val="16"/>
           <w:szCs w:val="16"/>
         </w:rPr>
-        <w:t xml:space="preserve">Sigle HCH 164 · Cairn of Haniʾ</w:t>
+        <w:t xml:space="preserve">Hani · HCH 164</w:t>
       </w:r>
     </w:p>
     <w:p>
@@ -7084,7 +6952,7 @@
           <w:sz w:val="16"/>
           <w:szCs w:val="16"/>
         </w:rPr>
-        <w:t xml:space="preserve">Sigle HCH 183 · Cairn of Haniʾ</w:t>
+        <w:t xml:space="preserve">Hani · HCH 183</w:t>
       </w:r>
     </w:p>
     <w:p>
@@ -7137,7 +7005,7 @@
           <w:sz w:val="16"/>
           <w:szCs w:val="16"/>
         </w:rPr>
-        <w:t xml:space="preserve">Sigle HCH 184 · Cairn of Haniʾ</w:t>
+        <w:t xml:space="preserve">Hani · HCH 184</w:t>
       </w:r>
     </w:p>
     <w:p>
@@ -7203,7 +7071,7 @@
           <w:sz w:val="16"/>
           <w:szCs w:val="16"/>
         </w:rPr>
-        <w:t xml:space="preserve">Sigle HCH 195 · S. of Aratain S. of HF/S</w:t>
+        <w:t xml:space="preserve">bei Safawi · HCH 195</w:t>
       </w:r>
     </w:p>
     <w:p>
@@ -7256,7 +7124,7 @@
           <w:sz w:val="16"/>
           <w:szCs w:val="16"/>
         </w:rPr>
-        <w:t xml:space="preserve">Sigle C 1146 · Riǧm Qaʿqūl</w:t>
+        <w:t xml:space="preserve">Riǧm Qaʿqūl · C 1146</w:t>
       </w:r>
     </w:p>
     <w:p>
@@ -7309,7 +7177,7 @@
           <w:sz w:val="16"/>
           <w:szCs w:val="16"/>
         </w:rPr>
-        <w:t xml:space="preserve">Sigle SIJ 10 · Jathum</w:t>
+        <w:t xml:space="preserve">Jathum · SIJ 10</w:t>
       </w:r>
     </w:p>
     <w:p>
@@ -7362,7 +7230,7 @@
           <w:sz w:val="16"/>
           <w:szCs w:val="16"/>
         </w:rPr>
-        <w:t xml:space="preserve">Sigle C 12 · Ǧabal Says</w:t>
+        <w:t xml:space="preserve">Ǧabal Says · C 12</w:t>
       </w:r>
     </w:p>
     <w:p>
@@ -7402,7 +7270,7 @@
           <w:sz w:val="16"/>
           <w:szCs w:val="16"/>
         </w:rPr>
-        <w:t xml:space="preserve">Sigle C 1312 · Riǧm Qaʿqūl</w:t>
+        <w:t xml:space="preserve">Riǧm Qaʿqūl · C 1312</w:t>
       </w:r>
     </w:p>
     <w:p>
@@ -7468,7 +7336,7 @@
           <w:sz w:val="16"/>
           <w:szCs w:val="16"/>
         </w:rPr>
-        <w:t xml:space="preserve">Sigle C 1368 · Riǧm Qaʿqūl</w:t>
+        <w:t xml:space="preserve">Riǧm Qaʿqūl · C 1368</w:t>
       </w:r>
     </w:p>
     <w:p>
@@ -7484,7 +7352,7 @@
           <w:sz w:val="30"/>
           <w:szCs w:val="30"/>
         </w:rPr>
-        <w:t xml:space="preserve">Editorische Notiz</w:t>
+        <w:t xml:space="preserve">Nachwort</w:t>
       </w:r>
     </w:p>
     <w:p>
@@ -7497,7 +7365,7 @@
           <w:sz w:val="22"/>
           <w:szCs w:val="22"/>
         </w:rPr>
-        <w:t xml:space="preserve">Der Band schöpft aus dem Vollkorpus der ~31.800 safaitischen Inschriften (OCIANA), nicht aus einer Spitzenauswahl. Erschlossen sind damit auch die rund 18.500 reinen Signaturen und die Minimal-Texte, die in den bisherigen Bänden fehlten — sie tragen das Register „Er war hier“.</w:t>
+        <w:t xml:space="preserve">Wer diese Texte liest, merkt bald: die meisten sind keine Gedichte. Viele sind kürzer als ein Satz, manche nur ein Name. Das ist kein Mangel, sondern die Form. Safaitisch schreiben heißt, an einen Stein zu klopfen, an dem man gerade vorbeikommt — für niemanden Bestimmten, weil der Stein bleibt, wenn man weitergeht.</w:t>
       </w:r>
     </w:p>
     <w:p>
@@ -7510,7 +7378,7 @@
           <w:sz w:val="22"/>
           <w:szCs w:val="22"/>
         </w:rPr>
-        <w:t xml:space="preserve">Jedes Register ist gezielt aus seinem eigenen Korpus-Material gespeist: die Signaturen für I, die Anrufungen für III, die Fluchformeln für V, die fragmentarischen Steine für VII, die datierten für VI. Den Auftakt geben je Register Kopfstücke aus der erweiterten Ausgabe (lange Inschriften zuerst). Die Auswahl ist kuratiert und nicht repräsentativ; jede Nachdichtung trägt die OCIANA-Sigle ihrer Quelle.</w:t>
+        <w:t xml:space="preserve">Was so entsteht, ist kein Literatur-System, sondern ein Verständigen anderer Art: eines, das nicht auf die Gleichzeitigkeit von Sender und Empfänger angewiesen ist, das die Gottheit als Zeugen einschließt und das Schweigen als eigene Aussage kennt.</w:t>
       </w:r>
     </w:p>
     <w:p>
@@ -7523,9 +7391,1975 @@
           <w:sz w:val="22"/>
           <w:szCs w:val="22"/>
         </w:rPr>
-        <w:t xml:space="preserve">Übersetzungskette: gemeißelter Stein → philologische Lesung → englische OCIANA-Edition → deutsche Nachdichtung. Eckige Klammern und Striche ---- der Philologen bleiben in Register VII sichtbar.</w:t>
-      </w:r>
-    </w:p>
+        <w:t xml:space="preserve">Dieser Band ordnet darum nicht nach Thema, sondern nach Sprechhaltung. Jedes der acht Register ist eine andere Art, mit dem Stein zu sprechen — vom Stehen in der Ahnenreihe und dem bloßen Dasein über das Warten, die Bitte und die Klage bis zum Fluch, zum Zeugnis und zuletzt zum Verstummen. Jedes Register eröffnen einige lange Inschriften aus der erweiterten Ausgabe; danach folgen die knappen Stimmen des Vollkorpus.</w:t>
+      </w:r>
+    </w:p>
+    <w:p>
+      <w:pPr>
+        <w:spacing w:after="200" w:line="320"/>
+      </w:pPr>
+      <w:r>
+        <w:rPr>
+          <w:rFonts w:ascii="Georgia" w:cs="Georgia" w:eastAsia="Georgia" w:hAnsi="Georgia"/>
+          <w:sz w:val="22"/>
+          <w:szCs w:val="22"/>
+        </w:rPr>
+        <w:t xml:space="preserve">Die Texte stehen in der dritten Person, wie ihre Originale (l-Fulān, „Von X“, danach „und er …“). Genealogien sind getilgt — außer in „stehe“ (I), wo die Ahnenreihe selbst der Akt ist, und in „schweige“ (VIII), wo das Fehlen spricht. Lücken werden hier nicht geglättet; die Striche ---- bleiben stehen.</w:t>
+      </w:r>
+    </w:p>
+    <w:p>
+      <w:pPr>
+        <w:spacing w:after="200" w:line="320"/>
+      </w:pPr>
+      <w:r>
+        <w:rPr>
+          <w:rFonts w:ascii="Georgia" w:cs="Georgia" w:eastAsia="Georgia" w:hAnsi="Georgia"/>
+          <w:sz w:val="22"/>
+          <w:szCs w:val="22"/>
+        </w:rPr>
+        <w:t xml:space="preserve">Der Band schöpft aus dem Vollkorpus der ~31.800 safaitischen Inschriften (OCIANA), nicht aus einer Spitzenauswahl. Erschlossen sind damit auch die rund 18.500 reinen Signaturen und die Minimal-Texte, die in den bisherigen Bänden fehlten — sie tragen die Register „stehe“ (die Ahnenreihen) und „schreibe“ (die Litanei „X war hier“).</w:t>
+      </w:r>
+    </w:p>
+    <w:p>
+      <w:pPr>
+        <w:spacing w:after="200" w:line="320"/>
+      </w:pPr>
+      <w:r>
+        <w:rPr>
+          <w:rFonts w:ascii="Georgia" w:cs="Georgia" w:eastAsia="Georgia" w:hAnsi="Georgia"/>
+          <w:sz w:val="22"/>
+          <w:szCs w:val="22"/>
+        </w:rPr>
+        <w:t xml:space="preserve">Jedes Register ist gezielt aus seinem eigenen Korpus-Material gespeist: die Signaturen für „schreibe“ und „stehe“, die Anrufungen für „bitte“, die Fluchformeln für „verfluche“, die fragmentarischen Steine für „schweige“, die datierten für „bezeuge“. Den Auftakt geben je Register Kopfstücke aus der erweiterten Ausgabe (lange Inschriften zuerst). Die Auswahl ist kuratiert und nicht repräsentativ; jede Nachdichtung trägt die OCIANA-Sigle ihrer Quelle.</w:t>
+      </w:r>
+    </w:p>
+    <w:p>
+      <w:pPr>
+        <w:spacing w:after="200" w:line="320"/>
+      </w:pPr>
+      <w:r>
+        <w:rPr>
+          <w:rFonts w:ascii="Georgia" w:cs="Georgia" w:eastAsia="Georgia" w:hAnsi="Georgia"/>
+          <w:sz w:val="22"/>
+          <w:szCs w:val="22"/>
+        </w:rPr>
+        <w:t xml:space="preserve">Übersetzungskette: gemeißelter Stein → philologische Lesung → englische OCIANA-Edition → deutsche Nachdichtung. Eckige Klammern und Striche ---- der Philologen bleiben im Register „schweige“ sichtbar.</w:t>
+      </w:r>
+    </w:p>
+    <w:p>
+      <w:pPr>
+        <w:spacing w:before="200" w:after="80"/>
+      </w:pPr>
+      <w:r>
+        <w:rPr>
+          <w:rFonts w:ascii="Georgia" w:cs="Georgia" w:eastAsia="Georgia" w:hAnsi="Georgia"/>
+          <w:b/>
+          <w:sz w:val="24"/>
+          <w:szCs w:val="24"/>
+        </w:rPr>
+        <w:t xml:space="preserve">Die Corpus-Siglen</w:t>
+      </w:r>
+    </w:p>
+    <w:p>
+      <w:pPr>
+        <w:spacing w:after="200" w:line="320"/>
+      </w:pPr>
+      <w:r>
+        <w:rPr>
+          <w:rFonts w:ascii="Georgia" w:cs="Georgia" w:eastAsia="Georgia" w:hAnsi="Georgia"/>
+          <w:sz w:val="22"/>
+          <w:szCs w:val="22"/>
+        </w:rPr>
+        <w:t xml:space="preserve">Jede Nachdichtung nennt am Fuß zuerst den Fundort, dann die Corpus-Sigle. Die Siglen bezeichnen die Sammlung oder Edition, in der die Inschrift zuerst erfasst wurde:</w:t>
+      </w:r>
+    </w:p>
+    <w:tbl>
+      <w:tblPr>
+        <w:tblW w:type="dxa" w:w="9000"/>
+        <w:tblBorders>
+          <w:top w:val="single" w:color="DDDDDD" w:sz="4"/>
+          <w:left w:val="single" w:color="DDDDDD" w:sz="4"/>
+          <w:bottom w:val="single" w:color="DDDDDD" w:sz="4"/>
+          <w:right w:val="single" w:color="DDDDDD" w:sz="4"/>
+          <w:insideH w:val="single" w:color="DDDDDD" w:sz="4"/>
+          <w:insideV w:val="single" w:color="DDDDDD" w:sz="4"/>
+        </w:tblBorders>
+      </w:tblPr>
+      <w:tblGrid>
+        <w:gridCol w:w="2400"/>
+        <w:gridCol w:w="6600"/>
+      </w:tblGrid>
+      <w:tr>
+        <w:tc>
+          <w:tcPr>
+            <w:tcW w:type="dxa" w:w="2400"/>
+            <w:tcBorders>
+              <w:top w:val="single" w:color="DDDDDD" w:sz="4"/>
+              <w:left w:val="single" w:color="DDDDDD" w:sz="4"/>
+              <w:bottom w:val="single" w:color="DDDDDD" w:sz="4"/>
+              <w:right w:val="single" w:color="DDDDDD" w:sz="4"/>
+            </w:tcBorders>
+            <w:tcMar>
+              <w:top w:type="dxa" w:w="60"/>
+              <w:left w:type="dxa" w:w="100"/>
+              <w:bottom w:type="dxa" w:w="60"/>
+              <w:right w:type="dxa" w:w="100"/>
+            </w:tcMar>
+          </w:tcPr>
+          <w:p>
+            <w:r>
+              <w:rPr>
+                <w:rFonts w:ascii="Georgia" w:cs="Georgia" w:eastAsia="Georgia" w:hAnsi="Georgia"/>
+                <w:b/>
+                <w:sz w:val="18"/>
+                <w:szCs w:val="18"/>
+              </w:rPr>
+              <w:t xml:space="preserve">C</w:t>
+            </w:r>
+          </w:p>
+        </w:tc>
+        <w:tc>
+          <w:tcPr>
+            <w:tcW w:type="dxa" w:w="6600"/>
+            <w:tcBorders>
+              <w:top w:val="single" w:color="DDDDDD" w:sz="4"/>
+              <w:left w:val="single" w:color="DDDDDD" w:sz="4"/>
+              <w:bottom w:val="single" w:color="DDDDDD" w:sz="4"/>
+              <w:right w:val="single" w:color="DDDDDD" w:sz="4"/>
+            </w:tcBorders>
+            <w:tcMar>
+              <w:top w:type="dxa" w:w="60"/>
+              <w:left w:type="dxa" w:w="100"/>
+              <w:bottom w:type="dxa" w:w="60"/>
+              <w:right w:type="dxa" w:w="100"/>
+            </w:tcMar>
+          </w:tcPr>
+          <w:p>
+            <w:r>
+              <w:rPr>
+                <w:rFonts w:ascii="Georgia" w:cs="Georgia" w:eastAsia="Georgia" w:hAnsi="Georgia"/>
+                <w:sz w:val="18"/>
+                <w:szCs w:val="18"/>
+              </w:rPr>
+              <w:t xml:space="preserve">Corpus Inscriptionum Semiticarum, Pars V — safaitische Inschriften (u. a. Dussaud &amp; Macler; Ryckmans 1950).</w:t>
+            </w:r>
+          </w:p>
+        </w:tc>
+      </w:tr>
+      <w:tr>
+        <w:tc>
+          <w:tcPr>
+            <w:tcW w:type="dxa" w:w="2400"/>
+            <w:tcBorders>
+              <w:top w:val="single" w:color="DDDDDD" w:sz="4"/>
+              <w:left w:val="single" w:color="DDDDDD" w:sz="4"/>
+              <w:bottom w:val="single" w:color="DDDDDD" w:sz="4"/>
+              <w:right w:val="single" w:color="DDDDDD" w:sz="4"/>
+            </w:tcBorders>
+            <w:tcMar>
+              <w:top w:type="dxa" w:w="60"/>
+              <w:left w:type="dxa" w:w="100"/>
+              <w:bottom w:type="dxa" w:w="60"/>
+              <w:right w:type="dxa" w:w="100"/>
+            </w:tcMar>
+          </w:tcPr>
+          <w:p>
+            <w:r>
+              <w:rPr>
+                <w:rFonts w:ascii="Georgia" w:cs="Georgia" w:eastAsia="Georgia" w:hAnsi="Georgia"/>
+                <w:b/>
+                <w:sz w:val="18"/>
+                <w:szCs w:val="18"/>
+              </w:rPr>
+              <w:t xml:space="preserve">LP</w:t>
+            </w:r>
+          </w:p>
+        </w:tc>
+        <w:tc>
+          <w:tcPr>
+            <w:tcW w:type="dxa" w:w="6600"/>
+            <w:tcBorders>
+              <w:top w:val="single" w:color="DDDDDD" w:sz="4"/>
+              <w:left w:val="single" w:color="DDDDDD" w:sz="4"/>
+              <w:bottom w:val="single" w:color="DDDDDD" w:sz="4"/>
+              <w:right w:val="single" w:color="DDDDDD" w:sz="4"/>
+            </w:tcBorders>
+            <w:tcMar>
+              <w:top w:type="dxa" w:w="60"/>
+              <w:left w:type="dxa" w:w="100"/>
+              <w:bottom w:type="dxa" w:w="60"/>
+              <w:right w:type="dxa" w:w="100"/>
+            </w:tcMar>
+          </w:tcPr>
+          <w:p>
+            <w:r>
+              <w:rPr>
+                <w:rFonts w:ascii="Georgia" w:cs="Georgia" w:eastAsia="Georgia" w:hAnsi="Georgia"/>
+                <w:sz w:val="18"/>
+                <w:szCs w:val="18"/>
+              </w:rPr>
+              <w:t xml:space="preserve">E. Littmann, Safāʾitic Inscriptions (Leiden 1943).</w:t>
+            </w:r>
+          </w:p>
+        </w:tc>
+      </w:tr>
+      <w:tr>
+        <w:tc>
+          <w:tcPr>
+            <w:tcW w:type="dxa" w:w="2400"/>
+            <w:tcBorders>
+              <w:top w:val="single" w:color="DDDDDD" w:sz="4"/>
+              <w:left w:val="single" w:color="DDDDDD" w:sz="4"/>
+              <w:bottom w:val="single" w:color="DDDDDD" w:sz="4"/>
+              <w:right w:val="single" w:color="DDDDDD" w:sz="4"/>
+            </w:tcBorders>
+            <w:tcMar>
+              <w:top w:type="dxa" w:w="60"/>
+              <w:left w:type="dxa" w:w="100"/>
+              <w:bottom w:type="dxa" w:w="60"/>
+              <w:right w:type="dxa" w:w="100"/>
+            </w:tcMar>
+          </w:tcPr>
+          <w:p>
+            <w:r>
+              <w:rPr>
+                <w:rFonts w:ascii="Georgia" w:cs="Georgia" w:eastAsia="Georgia" w:hAnsi="Georgia"/>
+                <w:b/>
+                <w:sz w:val="18"/>
+                <w:szCs w:val="18"/>
+              </w:rPr>
+              <w:t xml:space="preserve">WH</w:t>
+            </w:r>
+          </w:p>
+        </w:tc>
+        <w:tc>
+          <w:tcPr>
+            <w:tcW w:type="dxa" w:w="6600"/>
+            <w:tcBorders>
+              <w:top w:val="single" w:color="DDDDDD" w:sz="4"/>
+              <w:left w:val="single" w:color="DDDDDD" w:sz="4"/>
+              <w:bottom w:val="single" w:color="DDDDDD" w:sz="4"/>
+              <w:right w:val="single" w:color="DDDDDD" w:sz="4"/>
+            </w:tcBorders>
+            <w:tcMar>
+              <w:top w:type="dxa" w:w="60"/>
+              <w:left w:type="dxa" w:w="100"/>
+              <w:bottom w:type="dxa" w:w="60"/>
+              <w:right w:type="dxa" w:w="100"/>
+            </w:tcMar>
+          </w:tcPr>
+          <w:p>
+            <w:r>
+              <w:rPr>
+                <w:rFonts w:ascii="Georgia" w:cs="Georgia" w:eastAsia="Georgia" w:hAnsi="Georgia"/>
+                <w:sz w:val="18"/>
+                <w:szCs w:val="18"/>
+              </w:rPr>
+              <w:t xml:space="preserve">F. V. Winnett &amp; G. L. Harding, Inscriptions from Fifty Safaitic Cairns (Toronto 1978).</w:t>
+            </w:r>
+          </w:p>
+        </w:tc>
+      </w:tr>
+      <w:tr>
+        <w:tc>
+          <w:tcPr>
+            <w:tcW w:type="dxa" w:w="2400"/>
+            <w:tcBorders>
+              <w:top w:val="single" w:color="DDDDDD" w:sz="4"/>
+              <w:left w:val="single" w:color="DDDDDD" w:sz="4"/>
+              <w:bottom w:val="single" w:color="DDDDDD" w:sz="4"/>
+              <w:right w:val="single" w:color="DDDDDD" w:sz="4"/>
+            </w:tcBorders>
+            <w:tcMar>
+              <w:top w:type="dxa" w:w="60"/>
+              <w:left w:type="dxa" w:w="100"/>
+              <w:bottom w:type="dxa" w:w="60"/>
+              <w:right w:type="dxa" w:w="100"/>
+            </w:tcMar>
+          </w:tcPr>
+          <w:p>
+            <w:r>
+              <w:rPr>
+                <w:rFonts w:ascii="Georgia" w:cs="Georgia" w:eastAsia="Georgia" w:hAnsi="Georgia"/>
+                <w:b/>
+                <w:sz w:val="18"/>
+                <w:szCs w:val="18"/>
+              </w:rPr>
+              <w:t xml:space="preserve">KRS</w:t>
+            </w:r>
+          </w:p>
+        </w:tc>
+        <w:tc>
+          <w:tcPr>
+            <w:tcW w:type="dxa" w:w="6600"/>
+            <w:tcBorders>
+              <w:top w:val="single" w:color="DDDDDD" w:sz="4"/>
+              <w:left w:val="single" w:color="DDDDDD" w:sz="4"/>
+              <w:bottom w:val="single" w:color="DDDDDD" w:sz="4"/>
+              <w:right w:val="single" w:color="DDDDDD" w:sz="4"/>
+            </w:tcBorders>
+            <w:tcMar>
+              <w:top w:type="dxa" w:w="60"/>
+              <w:left w:type="dxa" w:w="100"/>
+              <w:bottom w:type="dxa" w:w="60"/>
+              <w:right w:type="dxa" w:w="100"/>
+            </w:tcMar>
+          </w:tcPr>
+          <w:p>
+            <w:r>
+              <w:rPr>
+                <w:rFonts w:ascii="Georgia" w:cs="Georgia" w:eastAsia="Georgia" w:hAnsi="Georgia"/>
+                <w:sz w:val="18"/>
+                <w:szCs w:val="18"/>
+              </w:rPr>
+              <w:t xml:space="preserve">Basalt Desert Rescue Survey (G. M. H. King, 1989) — NO-jordanische Ḥarrah.</w:t>
+            </w:r>
+          </w:p>
+        </w:tc>
+      </w:tr>
+      <w:tr>
+        <w:tc>
+          <w:tcPr>
+            <w:tcW w:type="dxa" w:w="2400"/>
+            <w:tcBorders>
+              <w:top w:val="single" w:color="DDDDDD" w:sz="4"/>
+              <w:left w:val="single" w:color="DDDDDD" w:sz="4"/>
+              <w:bottom w:val="single" w:color="DDDDDD" w:sz="4"/>
+              <w:right w:val="single" w:color="DDDDDD" w:sz="4"/>
+            </w:tcBorders>
+            <w:tcMar>
+              <w:top w:type="dxa" w:w="60"/>
+              <w:left w:type="dxa" w:w="100"/>
+              <w:bottom w:type="dxa" w:w="60"/>
+              <w:right w:type="dxa" w:w="100"/>
+            </w:tcMar>
+          </w:tcPr>
+          <w:p>
+            <w:r>
+              <w:rPr>
+                <w:rFonts w:ascii="Georgia" w:cs="Georgia" w:eastAsia="Georgia" w:hAnsi="Georgia"/>
+                <w:b/>
+                <w:sz w:val="18"/>
+                <w:szCs w:val="18"/>
+              </w:rPr>
+              <w:t xml:space="preserve">HCH</w:t>
+            </w:r>
+          </w:p>
+        </w:tc>
+        <w:tc>
+          <w:tcPr>
+            <w:tcW w:type="dxa" w:w="6600"/>
+            <w:tcBorders>
+              <w:top w:val="single" w:color="DDDDDD" w:sz="4"/>
+              <w:left w:val="single" w:color="DDDDDD" w:sz="4"/>
+              <w:bottom w:val="single" w:color="DDDDDD" w:sz="4"/>
+              <w:right w:val="single" w:color="DDDDDD" w:sz="4"/>
+            </w:tcBorders>
+            <w:tcMar>
+              <w:top w:type="dxa" w:w="60"/>
+              <w:left w:type="dxa" w:w="100"/>
+              <w:bottom w:type="dxa" w:w="60"/>
+              <w:right w:type="dxa" w:w="100"/>
+            </w:tcMar>
+          </w:tcPr>
+          <w:p>
+            <w:r>
+              <w:rPr>
+                <w:rFonts w:ascii="Georgia" w:cs="Georgia" w:eastAsia="Georgia" w:hAnsi="Georgia"/>
+                <w:sz w:val="18"/>
+                <w:szCs w:val="18"/>
+              </w:rPr>
+              <w:t xml:space="preserve">G. L. Harding, The Cairn of Hāniʾ (1953).</w:t>
+            </w:r>
+          </w:p>
+        </w:tc>
+      </w:tr>
+      <w:tr>
+        <w:tc>
+          <w:tcPr>
+            <w:tcW w:type="dxa" w:w="2400"/>
+            <w:tcBorders>
+              <w:top w:val="single" w:color="DDDDDD" w:sz="4"/>
+              <w:left w:val="single" w:color="DDDDDD" w:sz="4"/>
+              <w:bottom w:val="single" w:color="DDDDDD" w:sz="4"/>
+              <w:right w:val="single" w:color="DDDDDD" w:sz="4"/>
+            </w:tcBorders>
+            <w:tcMar>
+              <w:top w:type="dxa" w:w="60"/>
+              <w:left w:type="dxa" w:w="100"/>
+              <w:bottom w:type="dxa" w:w="60"/>
+              <w:right w:type="dxa" w:w="100"/>
+            </w:tcMar>
+          </w:tcPr>
+          <w:p>
+            <w:r>
+              <w:rPr>
+                <w:rFonts w:ascii="Georgia" w:cs="Georgia" w:eastAsia="Georgia" w:hAnsi="Georgia"/>
+                <w:b/>
+                <w:sz w:val="18"/>
+                <w:szCs w:val="18"/>
+              </w:rPr>
+              <w:t xml:space="preserve">SIJ</w:t>
+            </w:r>
+          </w:p>
+        </w:tc>
+        <w:tc>
+          <w:tcPr>
+            <w:tcW w:type="dxa" w:w="6600"/>
+            <w:tcBorders>
+              <w:top w:val="single" w:color="DDDDDD" w:sz="4"/>
+              <w:left w:val="single" w:color="DDDDDD" w:sz="4"/>
+              <w:bottom w:val="single" w:color="DDDDDD" w:sz="4"/>
+              <w:right w:val="single" w:color="DDDDDD" w:sz="4"/>
+            </w:tcBorders>
+            <w:tcMar>
+              <w:top w:type="dxa" w:w="60"/>
+              <w:left w:type="dxa" w:w="100"/>
+              <w:bottom w:type="dxa" w:w="60"/>
+              <w:right w:type="dxa" w:w="100"/>
+            </w:tcMar>
+          </w:tcPr>
+          <w:p>
+            <w:r>
+              <w:rPr>
+                <w:rFonts w:ascii="Georgia" w:cs="Georgia" w:eastAsia="Georgia" w:hAnsi="Georgia"/>
+                <w:sz w:val="18"/>
+                <w:szCs w:val="18"/>
+              </w:rPr>
+              <w:t xml:space="preserve">F. V. Winnett, Safaitic Inscriptions from Jordan (Toronto 1957).</w:t>
+            </w:r>
+          </w:p>
+        </w:tc>
+      </w:tr>
+      <w:tr>
+        <w:tc>
+          <w:tcPr>
+            <w:tcW w:type="dxa" w:w="2400"/>
+            <w:tcBorders>
+              <w:top w:val="single" w:color="DDDDDD" w:sz="4"/>
+              <w:left w:val="single" w:color="DDDDDD" w:sz="4"/>
+              <w:bottom w:val="single" w:color="DDDDDD" w:sz="4"/>
+              <w:right w:val="single" w:color="DDDDDD" w:sz="4"/>
+            </w:tcBorders>
+            <w:tcMar>
+              <w:top w:type="dxa" w:w="60"/>
+              <w:left w:type="dxa" w:w="100"/>
+              <w:bottom w:type="dxa" w:w="60"/>
+              <w:right w:type="dxa" w:w="100"/>
+            </w:tcMar>
+          </w:tcPr>
+          <w:p>
+            <w:r>
+              <w:rPr>
+                <w:rFonts w:ascii="Georgia" w:cs="Georgia" w:eastAsia="Georgia" w:hAnsi="Georgia"/>
+                <w:b/>
+                <w:sz w:val="18"/>
+                <w:szCs w:val="18"/>
+              </w:rPr>
+              <w:t xml:space="preserve">ISB</w:t>
+            </w:r>
+          </w:p>
+        </w:tc>
+        <w:tc>
+          <w:tcPr>
+            <w:tcW w:type="dxa" w:w="6600"/>
+            <w:tcBorders>
+              <w:top w:val="single" w:color="DDDDDD" w:sz="4"/>
+              <w:left w:val="single" w:color="DDDDDD" w:sz="4"/>
+              <w:bottom w:val="single" w:color="DDDDDD" w:sz="4"/>
+              <w:right w:val="single" w:color="DDDDDD" w:sz="4"/>
+            </w:tcBorders>
+            <w:tcMar>
+              <w:top w:type="dxa" w:w="60"/>
+              <w:left w:type="dxa" w:w="100"/>
+              <w:bottom w:type="dxa" w:w="60"/>
+              <w:right w:type="dxa" w:w="100"/>
+            </w:tcMar>
+          </w:tcPr>
+          <w:p>
+            <w:r>
+              <w:rPr>
+                <w:rFonts w:ascii="Georgia" w:cs="Georgia" w:eastAsia="Georgia" w:hAnsi="Georgia"/>
+                <w:sz w:val="18"/>
+                <w:szCs w:val="18"/>
+              </w:rPr>
+              <w:t xml:space="preserve">W. G. Oxtoby, Some Inscriptions of the Safaitic Bedouin (New Haven 1968).</w:t>
+            </w:r>
+          </w:p>
+        </w:tc>
+      </w:tr>
+      <w:tr>
+        <w:tc>
+          <w:tcPr>
+            <w:tcW w:type="dxa" w:w="2400"/>
+            <w:tcBorders>
+              <w:top w:val="single" w:color="DDDDDD" w:sz="4"/>
+              <w:left w:val="single" w:color="DDDDDD" w:sz="4"/>
+              <w:bottom w:val="single" w:color="DDDDDD" w:sz="4"/>
+              <w:right w:val="single" w:color="DDDDDD" w:sz="4"/>
+            </w:tcBorders>
+            <w:tcMar>
+              <w:top w:type="dxa" w:w="60"/>
+              <w:left w:type="dxa" w:w="100"/>
+              <w:bottom w:type="dxa" w:w="60"/>
+              <w:right w:type="dxa" w:w="100"/>
+            </w:tcMar>
+          </w:tcPr>
+          <w:p>
+            <w:r>
+              <w:rPr>
+                <w:rFonts w:ascii="Georgia" w:cs="Georgia" w:eastAsia="Georgia" w:hAnsi="Georgia"/>
+                <w:b/>
+                <w:sz w:val="18"/>
+                <w:szCs w:val="18"/>
+              </w:rPr>
+              <w:t xml:space="preserve">CSNS</w:t>
+            </w:r>
+          </w:p>
+        </w:tc>
+        <w:tc>
+          <w:tcPr>
+            <w:tcW w:type="dxa" w:w="6600"/>
+            <w:tcBorders>
+              <w:top w:val="single" w:color="DDDDDD" w:sz="4"/>
+              <w:left w:val="single" w:color="DDDDDD" w:sz="4"/>
+              <w:bottom w:val="single" w:color="DDDDDD" w:sz="4"/>
+              <w:right w:val="single" w:color="DDDDDD" w:sz="4"/>
+            </w:tcBorders>
+            <w:tcMar>
+              <w:top w:type="dxa" w:w="60"/>
+              <w:left w:type="dxa" w:w="100"/>
+              <w:bottom w:type="dxa" w:w="60"/>
+              <w:right w:type="dxa" w:w="100"/>
+            </w:tcMar>
+          </w:tcPr>
+          <w:p>
+            <w:r>
+              <w:rPr>
+                <w:rFonts w:ascii="Georgia" w:cs="Georgia" w:eastAsia="Georgia" w:hAnsi="Georgia"/>
+                <w:sz w:val="18"/>
+                <w:szCs w:val="18"/>
+              </w:rPr>
+              <w:t xml:space="preserve">V. A. Clark, A Study of New Safaitic Inscriptions from Jordan (1979).</w:t>
+            </w:r>
+          </w:p>
+        </w:tc>
+      </w:tr>
+      <w:tr>
+        <w:tc>
+          <w:tcPr>
+            <w:tcW w:type="dxa" w:w="2400"/>
+            <w:tcBorders>
+              <w:top w:val="single" w:color="DDDDDD" w:sz="4"/>
+              <w:left w:val="single" w:color="DDDDDD" w:sz="4"/>
+              <w:bottom w:val="single" w:color="DDDDDD" w:sz="4"/>
+              <w:right w:val="single" w:color="DDDDDD" w:sz="4"/>
+            </w:tcBorders>
+            <w:tcMar>
+              <w:top w:type="dxa" w:w="60"/>
+              <w:left w:type="dxa" w:w="100"/>
+              <w:bottom w:type="dxa" w:w="60"/>
+              <w:right w:type="dxa" w:w="100"/>
+            </w:tcMar>
+          </w:tcPr>
+          <w:p>
+            <w:r>
+              <w:rPr>
+                <w:rFonts w:ascii="Georgia" w:cs="Georgia" w:eastAsia="Georgia" w:hAnsi="Georgia"/>
+                <w:b/>
+                <w:sz w:val="18"/>
+                <w:szCs w:val="18"/>
+              </w:rPr>
+              <w:t xml:space="preserve">Rees</w:t>
+            </w:r>
+          </w:p>
+        </w:tc>
+        <w:tc>
+          <w:tcPr>
+            <w:tcW w:type="dxa" w:w="6600"/>
+            <w:tcBorders>
+              <w:top w:val="single" w:color="DDDDDD" w:sz="4"/>
+              <w:left w:val="single" w:color="DDDDDD" w:sz="4"/>
+              <w:bottom w:val="single" w:color="DDDDDD" w:sz="4"/>
+              <w:right w:val="single" w:color="DDDDDD" w:sz="4"/>
+            </w:tcBorders>
+            <w:tcMar>
+              <w:top w:type="dxa" w:w="60"/>
+              <w:left w:type="dxa" w:w="100"/>
+              <w:bottom w:type="dxa" w:w="60"/>
+              <w:right w:type="dxa" w:w="100"/>
+            </w:tcMar>
+          </w:tcPr>
+          <w:p>
+            <w:r>
+              <w:rPr>
+                <w:rFonts w:ascii="Georgia" w:cs="Georgia" w:eastAsia="Georgia" w:hAnsi="Georgia"/>
+                <w:sz w:val="18"/>
+                <w:szCs w:val="18"/>
+              </w:rPr>
+              <w:t xml:space="preserve">L. W. B. Rees, frühe Aufnahmen aus der Ḥarrat al-Raǧil (1920er).</w:t>
+            </w:r>
+          </w:p>
+        </w:tc>
+      </w:tr>
+      <w:tr>
+        <w:tc>
+          <w:tcPr>
+            <w:tcW w:type="dxa" w:w="2400"/>
+            <w:tcBorders>
+              <w:top w:val="single" w:color="DDDDDD" w:sz="4"/>
+              <w:left w:val="single" w:color="DDDDDD" w:sz="4"/>
+              <w:bottom w:val="single" w:color="DDDDDD" w:sz="4"/>
+              <w:right w:val="single" w:color="DDDDDD" w:sz="4"/>
+            </w:tcBorders>
+            <w:tcMar>
+              <w:top w:type="dxa" w:w="60"/>
+              <w:left w:type="dxa" w:w="100"/>
+              <w:bottom w:type="dxa" w:w="60"/>
+              <w:right w:type="dxa" w:w="100"/>
+            </w:tcMar>
+          </w:tcPr>
+          <w:p>
+            <w:r>
+              <w:rPr>
+                <w:rFonts w:ascii="Georgia" w:cs="Georgia" w:eastAsia="Georgia" w:hAnsi="Georgia"/>
+                <w:b/>
+                <w:sz w:val="18"/>
+                <w:szCs w:val="18"/>
+              </w:rPr>
+              <w:t xml:space="preserve">Is.L / Is.Mu</w:t>
+            </w:r>
+          </w:p>
+        </w:tc>
+        <w:tc>
+          <w:tcPr>
+            <w:tcW w:type="dxa" w:w="6600"/>
+            <w:tcBorders>
+              <w:top w:val="single" w:color="DDDDDD" w:sz="4"/>
+              <w:left w:val="single" w:color="DDDDDD" w:sz="4"/>
+              <w:bottom w:val="single" w:color="DDDDDD" w:sz="4"/>
+              <w:right w:val="single" w:color="DDDDDD" w:sz="4"/>
+            </w:tcBorders>
+            <w:tcMar>
+              <w:top w:type="dxa" w:w="60"/>
+              <w:left w:type="dxa" w:w="100"/>
+              <w:bottom w:type="dxa" w:w="60"/>
+              <w:right w:type="dxa" w:w="100"/>
+            </w:tcMar>
+          </w:tcPr>
+          <w:p>
+            <w:r>
+              <w:rPr>
+                <w:rFonts w:ascii="Georgia" w:cs="Georgia" w:eastAsia="Georgia" w:hAnsi="Georgia"/>
+                <w:sz w:val="18"/>
+                <w:szCs w:val="18"/>
+              </w:rPr>
+              <w:t xml:space="preserve">Sammlungen aus al-ʿĪsāwī (Rif Dimašq); Nachweis im OCIANA-Eintrag.</w:t>
+            </w:r>
+          </w:p>
+        </w:tc>
+      </w:tr>
+      <w:tr>
+        <w:tc>
+          <w:tcPr>
+            <w:tcW w:type="dxa" w:w="2400"/>
+            <w:tcBorders>
+              <w:top w:val="single" w:color="DDDDDD" w:sz="4"/>
+              <w:left w:val="single" w:color="DDDDDD" w:sz="4"/>
+              <w:bottom w:val="single" w:color="DDDDDD" w:sz="4"/>
+              <w:right w:val="single" w:color="DDDDDD" w:sz="4"/>
+            </w:tcBorders>
+            <w:tcMar>
+              <w:top w:type="dxa" w:w="60"/>
+              <w:left w:type="dxa" w:w="100"/>
+              <w:bottom w:type="dxa" w:w="60"/>
+              <w:right w:type="dxa" w:w="100"/>
+            </w:tcMar>
+          </w:tcPr>
+          <w:p>
+            <w:r>
+              <w:rPr>
+                <w:rFonts w:ascii="Georgia" w:cs="Georgia" w:eastAsia="Georgia" w:hAnsi="Georgia"/>
+                <w:b/>
+                <w:sz w:val="18"/>
+                <w:szCs w:val="18"/>
+              </w:rPr>
+              <w:t xml:space="preserve">RQ.A / RQ.D</w:t>
+            </w:r>
+          </w:p>
+        </w:tc>
+        <w:tc>
+          <w:tcPr>
+            <w:tcW w:type="dxa" w:w="6600"/>
+            <w:tcBorders>
+              <w:top w:val="single" w:color="DDDDDD" w:sz="4"/>
+              <w:left w:val="single" w:color="DDDDDD" w:sz="4"/>
+              <w:bottom w:val="single" w:color="DDDDDD" w:sz="4"/>
+              <w:right w:val="single" w:color="DDDDDD" w:sz="4"/>
+            </w:tcBorders>
+            <w:tcMar>
+              <w:top w:type="dxa" w:w="60"/>
+              <w:left w:type="dxa" w:w="100"/>
+              <w:bottom w:type="dxa" w:w="60"/>
+              <w:right w:type="dxa" w:w="100"/>
+            </w:tcMar>
+          </w:tcPr>
+          <w:p>
+            <w:r>
+              <w:rPr>
+                <w:rFonts w:ascii="Georgia" w:cs="Georgia" w:eastAsia="Georgia" w:hAnsi="Georgia"/>
+                <w:sz w:val="18"/>
+                <w:szCs w:val="18"/>
+              </w:rPr>
+              <w:t xml:space="preserve">Aufnahmen aus Riǧm Qaʿqūl (Rif Dimašq); OCIANA.</w:t>
+            </w:r>
+          </w:p>
+        </w:tc>
+      </w:tr>
+      <w:tr>
+        <w:tc>
+          <w:tcPr>
+            <w:tcW w:type="dxa" w:w="2400"/>
+            <w:tcBorders>
+              <w:top w:val="single" w:color="DDDDDD" w:sz="4"/>
+              <w:left w:val="single" w:color="DDDDDD" w:sz="4"/>
+              <w:bottom w:val="single" w:color="DDDDDD" w:sz="4"/>
+              <w:right w:val="single" w:color="DDDDDD" w:sz="4"/>
+            </w:tcBorders>
+            <w:tcMar>
+              <w:top w:type="dxa" w:w="60"/>
+              <w:left w:type="dxa" w:w="100"/>
+              <w:bottom w:type="dxa" w:w="60"/>
+              <w:right w:type="dxa" w:w="100"/>
+            </w:tcMar>
+          </w:tcPr>
+          <w:p>
+            <w:r>
+              <w:rPr>
+                <w:rFonts w:ascii="Georgia" w:cs="Georgia" w:eastAsia="Georgia" w:hAnsi="Georgia"/>
+                <w:b/>
+                <w:sz w:val="18"/>
+                <w:szCs w:val="18"/>
+              </w:rPr>
+              <w:t xml:space="preserve">RSIS / ASWS / SSWS / AbSWS / RWQ</w:t>
+            </w:r>
+          </w:p>
+        </w:tc>
+        <w:tc>
+          <w:tcPr>
+            <w:tcW w:type="dxa" w:w="6600"/>
+            <w:tcBorders>
+              <w:top w:val="single" w:color="DDDDDD" w:sz="4"/>
+              <w:left w:val="single" w:color="DDDDDD" w:sz="4"/>
+              <w:bottom w:val="single" w:color="DDDDDD" w:sz="4"/>
+              <w:right w:val="single" w:color="DDDDDD" w:sz="4"/>
+            </w:tcBorders>
+            <w:tcMar>
+              <w:top w:type="dxa" w:w="60"/>
+              <w:left w:type="dxa" w:w="100"/>
+              <w:bottom w:type="dxa" w:w="60"/>
+              <w:right w:type="dxa" w:w="100"/>
+            </w:tcMar>
+          </w:tcPr>
+          <w:p>
+            <w:r>
+              <w:rPr>
+                <w:rFonts w:ascii="Georgia" w:cs="Georgia" w:eastAsia="Georgia" w:hAnsi="Georgia"/>
+                <w:sz w:val="18"/>
+                <w:szCs w:val="18"/>
+              </w:rPr>
+              <w:t xml:space="preserve">Surveys der Wādī-Sārah-/Salma-Region (Al-Mafraq); OCIANA.</w:t>
+            </w:r>
+          </w:p>
+        </w:tc>
+      </w:tr>
+      <w:tr>
+        <w:tc>
+          <w:tcPr>
+            <w:tcW w:type="dxa" w:w="2400"/>
+            <w:tcBorders>
+              <w:top w:val="single" w:color="DDDDDD" w:sz="4"/>
+              <w:left w:val="single" w:color="DDDDDD" w:sz="4"/>
+              <w:bottom w:val="single" w:color="DDDDDD" w:sz="4"/>
+              <w:right w:val="single" w:color="DDDDDD" w:sz="4"/>
+            </w:tcBorders>
+            <w:tcMar>
+              <w:top w:type="dxa" w:w="60"/>
+              <w:left w:type="dxa" w:w="100"/>
+              <w:bottom w:type="dxa" w:w="60"/>
+              <w:right w:type="dxa" w:w="100"/>
+            </w:tcMar>
+          </w:tcPr>
+          <w:p>
+            <w:r>
+              <w:rPr>
+                <w:rFonts w:ascii="Georgia" w:cs="Georgia" w:eastAsia="Georgia" w:hAnsi="Georgia"/>
+                <w:b/>
+                <w:sz w:val="18"/>
+                <w:szCs w:val="18"/>
+              </w:rPr>
+              <w:t xml:space="preserve">AbaNS / HaNSB / HaNS / HNSD / HSNS</w:t>
+            </w:r>
+          </w:p>
+        </w:tc>
+        <w:tc>
+          <w:tcPr>
+            <w:tcW w:type="dxa" w:w="6600"/>
+            <w:tcBorders>
+              <w:top w:val="single" w:color="DDDDDD" w:sz="4"/>
+              <w:left w:val="single" w:color="DDDDDD" w:sz="4"/>
+              <w:bottom w:val="single" w:color="DDDDDD" w:sz="4"/>
+              <w:right w:val="single" w:color="DDDDDD" w:sz="4"/>
+            </w:tcBorders>
+            <w:tcMar>
+              <w:top w:type="dxa" w:w="60"/>
+              <w:left w:type="dxa" w:w="100"/>
+              <w:bottom w:type="dxa" w:w="60"/>
+              <w:right w:type="dxa" w:w="100"/>
+            </w:tcMar>
+          </w:tcPr>
+          <w:p>
+            <w:r>
+              <w:rPr>
+                <w:rFonts w:ascii="Georgia" w:cs="Georgia" w:eastAsia="Georgia" w:hAnsi="Georgia"/>
+                <w:sz w:val="18"/>
+                <w:szCs w:val="18"/>
+              </w:rPr>
+              <w:t xml:space="preserve">nordjordanische Safaitic-Surveys; OCIANA.</w:t>
+            </w:r>
+          </w:p>
+        </w:tc>
+      </w:tr>
+      <w:tr>
+        <w:tc>
+          <w:tcPr>
+            <w:tcW w:type="dxa" w:w="2400"/>
+            <w:tcBorders>
+              <w:top w:val="single" w:color="DDDDDD" w:sz="4"/>
+              <w:left w:val="single" w:color="DDDDDD" w:sz="4"/>
+              <w:bottom w:val="single" w:color="DDDDDD" w:sz="4"/>
+              <w:right w:val="single" w:color="DDDDDD" w:sz="4"/>
+            </w:tcBorders>
+            <w:tcMar>
+              <w:top w:type="dxa" w:w="60"/>
+              <w:left w:type="dxa" w:w="100"/>
+              <w:bottom w:type="dxa" w:w="60"/>
+              <w:right w:type="dxa" w:w="100"/>
+            </w:tcMar>
+          </w:tcPr>
+          <w:p>
+            <w:r>
+              <w:rPr>
+                <w:rFonts w:ascii="Georgia" w:cs="Georgia" w:eastAsia="Georgia" w:hAnsi="Georgia"/>
+                <w:b/>
+                <w:sz w:val="18"/>
+                <w:szCs w:val="18"/>
+              </w:rPr>
+              <w:t xml:space="preserve">JaS / KWQ / CEDS / GSSH / MKJS / BS / HYGQ / WAMS / RVP / BWM / ASFF / ZN</w:t>
+            </w:r>
+          </w:p>
+        </w:tc>
+        <w:tc>
+          <w:tcPr>
+            <w:tcW w:type="dxa" w:w="6600"/>
+            <w:tcBorders>
+              <w:top w:val="single" w:color="DDDDDD" w:sz="4"/>
+              <w:left w:val="single" w:color="DDDDDD" w:sz="4"/>
+              <w:bottom w:val="single" w:color="DDDDDD" w:sz="4"/>
+              <w:right w:val="single" w:color="DDDDDD" w:sz="4"/>
+            </w:tcBorders>
+            <w:tcMar>
+              <w:top w:type="dxa" w:w="60"/>
+              <w:left w:type="dxa" w:w="100"/>
+              <w:bottom w:type="dxa" w:w="60"/>
+              <w:right w:type="dxa" w:w="100"/>
+            </w:tcMar>
+          </w:tcPr>
+          <w:p>
+            <w:r>
+              <w:rPr>
+                <w:rFonts w:ascii="Georgia" w:cs="Georgia" w:eastAsia="Georgia" w:hAnsi="Georgia"/>
+                <w:sz w:val="18"/>
+                <w:szCs w:val="18"/>
+              </w:rPr>
+              <w:t xml:space="preserve">weitere OCIANA-Survey-Siglen; vollständiger Editionsnachweis jeweils im OCIANA-Eintrag.</w:t>
+            </w:r>
+          </w:p>
+        </w:tc>
+      </w:tr>
+    </w:tbl>
+    <w:p/>
+    <w:p>
+      <w:pPr>
+        <w:spacing w:before="200" w:after="80"/>
+      </w:pPr>
+      <w:r>
+        <w:rPr>
+          <w:rFonts w:ascii="Georgia" w:cs="Georgia" w:eastAsia="Georgia" w:hAnsi="Georgia"/>
+          <w:b/>
+          <w:sz w:val="24"/>
+          <w:szCs w:val="24"/>
+        </w:rPr>
+        <w:t xml:space="preserve">Die Fundorte</w:t>
+      </w:r>
+    </w:p>
+    <w:p>
+      <w:pPr>
+        <w:spacing w:after="200" w:line="320"/>
+      </w:pPr>
+      <w:r>
+        <w:rPr>
+          <w:rFonts w:ascii="Georgia" w:cs="Georgia" w:eastAsia="Georgia" w:hAnsi="Georgia"/>
+          <w:sz w:val="22"/>
+          <w:szCs w:val="22"/>
+        </w:rPr>
+        <w:t xml:space="preserve">Der Fundort ist normalisiert (spezifischster benannter Ort); zwei Zonen ordnen: die nordostjordanische Ḥarrah und die südsyrische Ṣafā.</w:t>
+      </w:r>
+    </w:p>
+    <w:tbl>
+      <w:tblPr>
+        <w:tblW w:type="dxa" w:w="9000"/>
+        <w:tblBorders>
+          <w:top w:val="single" w:color="DDDDDD" w:sz="4"/>
+          <w:left w:val="single" w:color="DDDDDD" w:sz="4"/>
+          <w:bottom w:val="single" w:color="DDDDDD" w:sz="4"/>
+          <w:right w:val="single" w:color="DDDDDD" w:sz="4"/>
+          <w:insideH w:val="single" w:color="DDDDDD" w:sz="4"/>
+          <w:insideV w:val="single" w:color="DDDDDD" w:sz="4"/>
+        </w:tblBorders>
+      </w:tblPr>
+      <w:tblGrid>
+        <w:gridCol w:w="2400"/>
+        <w:gridCol w:w="6600"/>
+      </w:tblGrid>
+      <w:tr>
+        <w:tc>
+          <w:tcPr>
+            <w:tcW w:type="dxa" w:w="2400"/>
+            <w:tcBorders>
+              <w:top w:val="single" w:color="DDDDDD" w:sz="4"/>
+              <w:left w:val="single" w:color="DDDDDD" w:sz="4"/>
+              <w:bottom w:val="single" w:color="DDDDDD" w:sz="4"/>
+              <w:right w:val="single" w:color="DDDDDD" w:sz="4"/>
+            </w:tcBorders>
+            <w:tcMar>
+              <w:top w:type="dxa" w:w="60"/>
+              <w:left w:type="dxa" w:w="100"/>
+              <w:bottom w:type="dxa" w:w="60"/>
+              <w:right w:type="dxa" w:w="100"/>
+            </w:tcMar>
+          </w:tcPr>
+          <w:p>
+            <w:r>
+              <w:rPr>
+                <w:rFonts w:ascii="Georgia" w:cs="Georgia" w:eastAsia="Georgia" w:hAnsi="Georgia"/>
+                <w:b/>
+                <w:sz w:val="18"/>
+                <w:szCs w:val="18"/>
+              </w:rPr>
+              <w:t xml:space="preserve">Hani</w:t>
+            </w:r>
+          </w:p>
+        </w:tc>
+        <w:tc>
+          <w:tcPr>
+            <w:tcW w:type="dxa" w:w="6600"/>
+            <w:tcBorders>
+              <w:top w:val="single" w:color="DDDDDD" w:sz="4"/>
+              <w:left w:val="single" w:color="DDDDDD" w:sz="4"/>
+              <w:bottom w:val="single" w:color="DDDDDD" w:sz="4"/>
+              <w:right w:val="single" w:color="DDDDDD" w:sz="4"/>
+            </w:tcBorders>
+            <w:tcMar>
+              <w:top w:type="dxa" w:w="60"/>
+              <w:left w:type="dxa" w:w="100"/>
+              <w:bottom w:type="dxa" w:w="60"/>
+              <w:right w:type="dxa" w:w="100"/>
+            </w:tcMar>
+          </w:tcPr>
+          <w:p>
+            <w:r>
+              <w:rPr>
+                <w:rFonts w:ascii="Georgia" w:cs="Georgia" w:eastAsia="Georgia" w:hAnsi="Georgia"/>
+                <w:sz w:val="18"/>
+                <w:szCs w:val="18"/>
+              </w:rPr>
+              <w:t xml:space="preserve">Steinhügel (Cairn) des Ḥāniʾ, NO-jordanische Ḥarrah; 1953 von Harding ergraben (Sammlung HCH).</w:t>
+            </w:r>
+          </w:p>
+        </w:tc>
+      </w:tr>
+      <w:tr>
+        <w:tc>
+          <w:tcPr>
+            <w:tcW w:type="dxa" w:w="2400"/>
+            <w:tcBorders>
+              <w:top w:val="single" w:color="DDDDDD" w:sz="4"/>
+              <w:left w:val="single" w:color="DDDDDD" w:sz="4"/>
+              <w:bottom w:val="single" w:color="DDDDDD" w:sz="4"/>
+              <w:right w:val="single" w:color="DDDDDD" w:sz="4"/>
+            </w:tcBorders>
+            <w:tcMar>
+              <w:top w:type="dxa" w:w="60"/>
+              <w:left w:type="dxa" w:w="100"/>
+              <w:bottom w:type="dxa" w:w="60"/>
+              <w:right w:type="dxa" w:w="100"/>
+            </w:tcMar>
+          </w:tcPr>
+          <w:p>
+            <w:r>
+              <w:rPr>
+                <w:rFonts w:ascii="Georgia" w:cs="Georgia" w:eastAsia="Georgia" w:hAnsi="Georgia"/>
+                <w:b/>
+                <w:sz w:val="18"/>
+                <w:szCs w:val="18"/>
+              </w:rPr>
+              <w:t xml:space="preserve">Km 612</w:t>
+            </w:r>
+          </w:p>
+        </w:tc>
+        <w:tc>
+          <w:tcPr>
+            <w:tcW w:type="dxa" w:w="6600"/>
+            <w:tcBorders>
+              <w:top w:val="single" w:color="DDDDDD" w:sz="4"/>
+              <w:left w:val="single" w:color="DDDDDD" w:sz="4"/>
+              <w:bottom w:val="single" w:color="DDDDDD" w:sz="4"/>
+              <w:right w:val="single" w:color="DDDDDD" w:sz="4"/>
+            </w:tcBorders>
+            <w:tcMar>
+              <w:top w:type="dxa" w:w="60"/>
+              <w:left w:type="dxa" w:w="100"/>
+              <w:bottom w:type="dxa" w:w="60"/>
+              <w:right w:type="dxa" w:w="100"/>
+            </w:tcMar>
+          </w:tcPr>
+          <w:p>
+            <w:r>
+              <w:rPr>
+                <w:rFonts w:ascii="Georgia" w:cs="Georgia" w:eastAsia="Georgia" w:hAnsi="Georgia"/>
+                <w:sz w:val="18"/>
+                <w:szCs w:val="18"/>
+              </w:rPr>
+              <w:t xml:space="preserve">Kilometerstein 612 (≈ 32 km westl. Badana) an der Pipeline-Piste — Survey-Fundpunkt, NO-Jordanien.</w:t>
+            </w:r>
+          </w:p>
+        </w:tc>
+      </w:tr>
+      <w:tr>
+        <w:tc>
+          <w:tcPr>
+            <w:tcW w:type="dxa" w:w="2400"/>
+            <w:tcBorders>
+              <w:top w:val="single" w:color="DDDDDD" w:sz="4"/>
+              <w:left w:val="single" w:color="DDDDDD" w:sz="4"/>
+              <w:bottom w:val="single" w:color="DDDDDD" w:sz="4"/>
+              <w:right w:val="single" w:color="DDDDDD" w:sz="4"/>
+            </w:tcBorders>
+            <w:tcMar>
+              <w:top w:type="dxa" w:w="60"/>
+              <w:left w:type="dxa" w:w="100"/>
+              <w:bottom w:type="dxa" w:w="60"/>
+              <w:right w:type="dxa" w:w="100"/>
+            </w:tcMar>
+          </w:tcPr>
+          <w:p>
+            <w:r>
+              <w:rPr>
+                <w:rFonts w:ascii="Georgia" w:cs="Georgia" w:eastAsia="Georgia" w:hAnsi="Georgia"/>
+                <w:b/>
+                <w:sz w:val="18"/>
+                <w:szCs w:val="18"/>
+              </w:rPr>
+              <w:t xml:space="preserve">Wādī Salma</w:t>
+            </w:r>
+          </w:p>
+        </w:tc>
+        <w:tc>
+          <w:tcPr>
+            <w:tcW w:type="dxa" w:w="6600"/>
+            <w:tcBorders>
+              <w:top w:val="single" w:color="DDDDDD" w:sz="4"/>
+              <w:left w:val="single" w:color="DDDDDD" w:sz="4"/>
+              <w:bottom w:val="single" w:color="DDDDDD" w:sz="4"/>
+              <w:right w:val="single" w:color="DDDDDD" w:sz="4"/>
+            </w:tcBorders>
+            <w:tcMar>
+              <w:top w:type="dxa" w:w="60"/>
+              <w:left w:type="dxa" w:w="100"/>
+              <w:bottom w:type="dxa" w:w="60"/>
+              <w:right w:type="dxa" w:w="100"/>
+            </w:tcMar>
+          </w:tcPr>
+          <w:p>
+            <w:r>
+              <w:rPr>
+                <w:rFonts w:ascii="Georgia" w:cs="Georgia" w:eastAsia="Georgia" w:hAnsi="Georgia"/>
+                <w:sz w:val="18"/>
+                <w:szCs w:val="18"/>
+              </w:rPr>
+              <w:t xml:space="preserve">Wādī Salma, Provinz Al-Mafraq, NO-Jordanien.</w:t>
+            </w:r>
+          </w:p>
+        </w:tc>
+      </w:tr>
+      <w:tr>
+        <w:tc>
+          <w:tcPr>
+            <w:tcW w:type="dxa" w:w="2400"/>
+            <w:tcBorders>
+              <w:top w:val="single" w:color="DDDDDD" w:sz="4"/>
+              <w:left w:val="single" w:color="DDDDDD" w:sz="4"/>
+              <w:bottom w:val="single" w:color="DDDDDD" w:sz="4"/>
+              <w:right w:val="single" w:color="DDDDDD" w:sz="4"/>
+            </w:tcBorders>
+            <w:tcMar>
+              <w:top w:type="dxa" w:w="60"/>
+              <w:left w:type="dxa" w:w="100"/>
+              <w:bottom w:type="dxa" w:w="60"/>
+              <w:right w:type="dxa" w:w="100"/>
+            </w:tcMar>
+          </w:tcPr>
+          <w:p>
+            <w:r>
+              <w:rPr>
+                <w:rFonts w:ascii="Georgia" w:cs="Georgia" w:eastAsia="Georgia" w:hAnsi="Georgia"/>
+                <w:b/>
+                <w:sz w:val="18"/>
+                <w:szCs w:val="18"/>
+              </w:rPr>
+              <w:t xml:space="preserve">Wādī Sārah</w:t>
+            </w:r>
+          </w:p>
+        </w:tc>
+        <w:tc>
+          <w:tcPr>
+            <w:tcW w:type="dxa" w:w="6600"/>
+            <w:tcBorders>
+              <w:top w:val="single" w:color="DDDDDD" w:sz="4"/>
+              <w:left w:val="single" w:color="DDDDDD" w:sz="4"/>
+              <w:bottom w:val="single" w:color="DDDDDD" w:sz="4"/>
+              <w:right w:val="single" w:color="DDDDDD" w:sz="4"/>
+            </w:tcBorders>
+            <w:tcMar>
+              <w:top w:type="dxa" w:w="60"/>
+              <w:left w:type="dxa" w:w="100"/>
+              <w:bottom w:type="dxa" w:w="60"/>
+              <w:right w:type="dxa" w:w="100"/>
+            </w:tcMar>
+          </w:tcPr>
+          <w:p>
+            <w:r>
+              <w:rPr>
+                <w:rFonts w:ascii="Georgia" w:cs="Georgia" w:eastAsia="Georgia" w:hAnsi="Georgia"/>
+                <w:sz w:val="18"/>
+                <w:szCs w:val="18"/>
+              </w:rPr>
+              <w:t xml:space="preserve">Wādī Sārah, Provinz Al-Mafraq, NO-Jordanien.</w:t>
+            </w:r>
+          </w:p>
+        </w:tc>
+      </w:tr>
+      <w:tr>
+        <w:tc>
+          <w:tcPr>
+            <w:tcW w:type="dxa" w:w="2400"/>
+            <w:tcBorders>
+              <w:top w:val="single" w:color="DDDDDD" w:sz="4"/>
+              <w:left w:val="single" w:color="DDDDDD" w:sz="4"/>
+              <w:bottom w:val="single" w:color="DDDDDD" w:sz="4"/>
+              <w:right w:val="single" w:color="DDDDDD" w:sz="4"/>
+            </w:tcBorders>
+            <w:tcMar>
+              <w:top w:type="dxa" w:w="60"/>
+              <w:left w:type="dxa" w:w="100"/>
+              <w:bottom w:type="dxa" w:w="60"/>
+              <w:right w:type="dxa" w:w="100"/>
+            </w:tcMar>
+          </w:tcPr>
+          <w:p>
+            <w:r>
+              <w:rPr>
+                <w:rFonts w:ascii="Georgia" w:cs="Georgia" w:eastAsia="Georgia" w:hAnsi="Georgia"/>
+                <w:b/>
+                <w:sz w:val="18"/>
+                <w:szCs w:val="18"/>
+              </w:rPr>
+              <w:t xml:space="preserve">Ḥarrat al-Raǧil</w:t>
+            </w:r>
+          </w:p>
+        </w:tc>
+        <w:tc>
+          <w:tcPr>
+            <w:tcW w:type="dxa" w:w="6600"/>
+            <w:tcBorders>
+              <w:top w:val="single" w:color="DDDDDD" w:sz="4"/>
+              <w:left w:val="single" w:color="DDDDDD" w:sz="4"/>
+              <w:bottom w:val="single" w:color="DDDDDD" w:sz="4"/>
+              <w:right w:val="single" w:color="DDDDDD" w:sz="4"/>
+            </w:tcBorders>
+            <w:tcMar>
+              <w:top w:type="dxa" w:w="60"/>
+              <w:left w:type="dxa" w:w="100"/>
+              <w:bottom w:type="dxa" w:w="60"/>
+              <w:right w:type="dxa" w:w="100"/>
+            </w:tcMar>
+          </w:tcPr>
+          <w:p>
+            <w:r>
+              <w:rPr>
+                <w:rFonts w:ascii="Georgia" w:cs="Georgia" w:eastAsia="Georgia" w:hAnsi="Georgia"/>
+                <w:sz w:val="18"/>
+                <w:szCs w:val="18"/>
+              </w:rPr>
+              <w:t xml:space="preserve">Basaltwüste al-Raǧil, NO-Jordanien / nördl. Saudi-Arabien.</w:t>
+            </w:r>
+          </w:p>
+        </w:tc>
+      </w:tr>
+      <w:tr>
+        <w:tc>
+          <w:tcPr>
+            <w:tcW w:type="dxa" w:w="2400"/>
+            <w:tcBorders>
+              <w:top w:val="single" w:color="DDDDDD" w:sz="4"/>
+              <w:left w:val="single" w:color="DDDDDD" w:sz="4"/>
+              <w:bottom w:val="single" w:color="DDDDDD" w:sz="4"/>
+              <w:right w:val="single" w:color="DDDDDD" w:sz="4"/>
+            </w:tcBorders>
+            <w:tcMar>
+              <w:top w:type="dxa" w:w="60"/>
+              <w:left w:type="dxa" w:w="100"/>
+              <w:bottom w:type="dxa" w:w="60"/>
+              <w:right w:type="dxa" w:w="100"/>
+            </w:tcMar>
+          </w:tcPr>
+          <w:p>
+            <w:r>
+              <w:rPr>
+                <w:rFonts w:ascii="Georgia" w:cs="Georgia" w:eastAsia="Georgia" w:hAnsi="Georgia"/>
+                <w:b/>
+                <w:sz w:val="18"/>
+                <w:szCs w:val="18"/>
+              </w:rPr>
+              <w:t xml:space="preserve">Jathum</w:t>
+            </w:r>
+          </w:p>
+        </w:tc>
+        <w:tc>
+          <w:tcPr>
+            <w:tcW w:type="dxa" w:w="6600"/>
+            <w:tcBorders>
+              <w:top w:val="single" w:color="DDDDDD" w:sz="4"/>
+              <w:left w:val="single" w:color="DDDDDD" w:sz="4"/>
+              <w:bottom w:val="single" w:color="DDDDDD" w:sz="4"/>
+              <w:right w:val="single" w:color="DDDDDD" w:sz="4"/>
+            </w:tcBorders>
+            <w:tcMar>
+              <w:top w:type="dxa" w:w="60"/>
+              <w:left w:type="dxa" w:w="100"/>
+              <w:bottom w:type="dxa" w:w="60"/>
+              <w:right w:type="dxa" w:w="100"/>
+            </w:tcMar>
+          </w:tcPr>
+          <w:p>
+            <w:r>
+              <w:rPr>
+                <w:rFonts w:ascii="Georgia" w:cs="Georgia" w:eastAsia="Georgia" w:hAnsi="Georgia"/>
+                <w:sz w:val="18"/>
+                <w:szCs w:val="18"/>
+              </w:rPr>
+              <w:t xml:space="preserve">Jathum, NO-Jordanien.</w:t>
+            </w:r>
+          </w:p>
+        </w:tc>
+      </w:tr>
+      <w:tr>
+        <w:tc>
+          <w:tcPr>
+            <w:tcW w:type="dxa" w:w="2400"/>
+            <w:tcBorders>
+              <w:top w:val="single" w:color="DDDDDD" w:sz="4"/>
+              <w:left w:val="single" w:color="DDDDDD" w:sz="4"/>
+              <w:bottom w:val="single" w:color="DDDDDD" w:sz="4"/>
+              <w:right w:val="single" w:color="DDDDDD" w:sz="4"/>
+            </w:tcBorders>
+            <w:tcMar>
+              <w:top w:type="dxa" w:w="60"/>
+              <w:left w:type="dxa" w:w="100"/>
+              <w:bottom w:type="dxa" w:w="60"/>
+              <w:right w:type="dxa" w:w="100"/>
+            </w:tcMar>
+          </w:tcPr>
+          <w:p>
+            <w:r>
+              <w:rPr>
+                <w:rFonts w:ascii="Georgia" w:cs="Georgia" w:eastAsia="Georgia" w:hAnsi="Georgia"/>
+                <w:b/>
+                <w:sz w:val="18"/>
+                <w:szCs w:val="18"/>
+              </w:rPr>
+              <w:t xml:space="preserve">Jawa / Wādī Miqāṭ / Qāʿ al-Maḥfūr / Zimlet Nāṣir / bei Safawi / bei Ruwayshid</w:t>
+            </w:r>
+          </w:p>
+        </w:tc>
+        <w:tc>
+          <w:tcPr>
+            <w:tcW w:type="dxa" w:w="6600"/>
+            <w:tcBorders>
+              <w:top w:val="single" w:color="DDDDDD" w:sz="4"/>
+              <w:left w:val="single" w:color="DDDDDD" w:sz="4"/>
+              <w:bottom w:val="single" w:color="DDDDDD" w:sz="4"/>
+              <w:right w:val="single" w:color="DDDDDD" w:sz="4"/>
+            </w:tcBorders>
+            <w:tcMar>
+              <w:top w:type="dxa" w:w="60"/>
+              <w:left w:type="dxa" w:w="100"/>
+              <w:bottom w:type="dxa" w:w="60"/>
+              <w:right w:type="dxa" w:w="100"/>
+            </w:tcMar>
+          </w:tcPr>
+          <w:p>
+            <w:r>
+              <w:rPr>
+                <w:rFonts w:ascii="Georgia" w:cs="Georgia" w:eastAsia="Georgia" w:hAnsi="Georgia"/>
+                <w:sz w:val="18"/>
+                <w:szCs w:val="18"/>
+              </w:rPr>
+              <w:t xml:space="preserve">weitere Fundpunkte der NO-jordanischen Ḥarrah.</w:t>
+            </w:r>
+          </w:p>
+        </w:tc>
+      </w:tr>
+      <w:tr>
+        <w:tc>
+          <w:tcPr>
+            <w:tcW w:type="dxa" w:w="2400"/>
+            <w:tcBorders>
+              <w:top w:val="single" w:color="DDDDDD" w:sz="4"/>
+              <w:left w:val="single" w:color="DDDDDD" w:sz="4"/>
+              <w:bottom w:val="single" w:color="DDDDDD" w:sz="4"/>
+              <w:right w:val="single" w:color="DDDDDD" w:sz="4"/>
+            </w:tcBorders>
+            <w:tcMar>
+              <w:top w:type="dxa" w:w="60"/>
+              <w:left w:type="dxa" w:w="100"/>
+              <w:bottom w:type="dxa" w:w="60"/>
+              <w:right w:type="dxa" w:w="100"/>
+            </w:tcMar>
+          </w:tcPr>
+          <w:p>
+            <w:r>
+              <w:rPr>
+                <w:rFonts w:ascii="Georgia" w:cs="Georgia" w:eastAsia="Georgia" w:hAnsi="Georgia"/>
+                <w:b/>
+                <w:sz w:val="18"/>
+                <w:szCs w:val="18"/>
+              </w:rPr>
+              <w:t xml:space="preserve">Zalaf</w:t>
+            </w:r>
+          </w:p>
+        </w:tc>
+        <w:tc>
+          <w:tcPr>
+            <w:tcW w:type="dxa" w:w="6600"/>
+            <w:tcBorders>
+              <w:top w:val="single" w:color="DDDDDD" w:sz="4"/>
+              <w:left w:val="single" w:color="DDDDDD" w:sz="4"/>
+              <w:bottom w:val="single" w:color="DDDDDD" w:sz="4"/>
+              <w:right w:val="single" w:color="DDDDDD" w:sz="4"/>
+            </w:tcBorders>
+            <w:tcMar>
+              <w:top w:type="dxa" w:w="60"/>
+              <w:left w:type="dxa" w:w="100"/>
+              <w:bottom w:type="dxa" w:w="60"/>
+              <w:right w:type="dxa" w:w="100"/>
+            </w:tcMar>
+          </w:tcPr>
+          <w:p>
+            <w:r>
+              <w:rPr>
+                <w:rFonts w:ascii="Georgia" w:cs="Georgia" w:eastAsia="Georgia" w:hAnsi="Georgia"/>
+                <w:sz w:val="18"/>
+                <w:szCs w:val="18"/>
+              </w:rPr>
+              <w:t xml:space="preserve">Gegend um Zalaf am Wādī al-Shām, südsyrische Ṣafā.</w:t>
+            </w:r>
+          </w:p>
+        </w:tc>
+      </w:tr>
+      <w:tr>
+        <w:tc>
+          <w:tcPr>
+            <w:tcW w:type="dxa" w:w="2400"/>
+            <w:tcBorders>
+              <w:top w:val="single" w:color="DDDDDD" w:sz="4"/>
+              <w:left w:val="single" w:color="DDDDDD" w:sz="4"/>
+              <w:bottom w:val="single" w:color="DDDDDD" w:sz="4"/>
+              <w:right w:val="single" w:color="DDDDDD" w:sz="4"/>
+            </w:tcBorders>
+            <w:tcMar>
+              <w:top w:type="dxa" w:w="60"/>
+              <w:left w:type="dxa" w:w="100"/>
+              <w:bottom w:type="dxa" w:w="60"/>
+              <w:right w:type="dxa" w:w="100"/>
+            </w:tcMar>
+          </w:tcPr>
+          <w:p>
+            <w:r>
+              <w:rPr>
+                <w:rFonts w:ascii="Georgia" w:cs="Georgia" w:eastAsia="Georgia" w:hAnsi="Georgia"/>
+                <w:b/>
+                <w:sz w:val="18"/>
+                <w:szCs w:val="18"/>
+              </w:rPr>
+              <w:t xml:space="preserve">al-ʿĪsāwī</w:t>
+            </w:r>
+          </w:p>
+        </w:tc>
+        <w:tc>
+          <w:tcPr>
+            <w:tcW w:type="dxa" w:w="6600"/>
+            <w:tcBorders>
+              <w:top w:val="single" w:color="DDDDDD" w:sz="4"/>
+              <w:left w:val="single" w:color="DDDDDD" w:sz="4"/>
+              <w:bottom w:val="single" w:color="DDDDDD" w:sz="4"/>
+              <w:right w:val="single" w:color="DDDDDD" w:sz="4"/>
+            </w:tcBorders>
+            <w:tcMar>
+              <w:top w:type="dxa" w:w="60"/>
+              <w:left w:type="dxa" w:w="100"/>
+              <w:bottom w:type="dxa" w:w="60"/>
+              <w:right w:type="dxa" w:w="100"/>
+            </w:tcMar>
+          </w:tcPr>
+          <w:p>
+            <w:r>
+              <w:rPr>
+                <w:rFonts w:ascii="Georgia" w:cs="Georgia" w:eastAsia="Georgia" w:hAnsi="Georgia"/>
+                <w:sz w:val="18"/>
+                <w:szCs w:val="18"/>
+              </w:rPr>
+              <w:t xml:space="preserve">al-ʿĪsāwī, Rif Dimašq, südsyrische Ṣafā.</w:t>
+            </w:r>
+          </w:p>
+        </w:tc>
+      </w:tr>
+      <w:tr>
+        <w:tc>
+          <w:tcPr>
+            <w:tcW w:type="dxa" w:w="2400"/>
+            <w:tcBorders>
+              <w:top w:val="single" w:color="DDDDDD" w:sz="4"/>
+              <w:left w:val="single" w:color="DDDDDD" w:sz="4"/>
+              <w:bottom w:val="single" w:color="DDDDDD" w:sz="4"/>
+              <w:right w:val="single" w:color="DDDDDD" w:sz="4"/>
+            </w:tcBorders>
+            <w:tcMar>
+              <w:top w:type="dxa" w:w="60"/>
+              <w:left w:type="dxa" w:w="100"/>
+              <w:bottom w:type="dxa" w:w="60"/>
+              <w:right w:type="dxa" w:w="100"/>
+            </w:tcMar>
+          </w:tcPr>
+          <w:p>
+            <w:r>
+              <w:rPr>
+                <w:rFonts w:ascii="Georgia" w:cs="Georgia" w:eastAsia="Georgia" w:hAnsi="Georgia"/>
+                <w:b/>
+                <w:sz w:val="18"/>
+                <w:szCs w:val="18"/>
+              </w:rPr>
+              <w:t xml:space="preserve">Riǧm Qaʿqūl</w:t>
+            </w:r>
+          </w:p>
+        </w:tc>
+        <w:tc>
+          <w:tcPr>
+            <w:tcW w:type="dxa" w:w="6600"/>
+            <w:tcBorders>
+              <w:top w:val="single" w:color="DDDDDD" w:sz="4"/>
+              <w:left w:val="single" w:color="DDDDDD" w:sz="4"/>
+              <w:bottom w:val="single" w:color="DDDDDD" w:sz="4"/>
+              <w:right w:val="single" w:color="DDDDDD" w:sz="4"/>
+            </w:tcBorders>
+            <w:tcMar>
+              <w:top w:type="dxa" w:w="60"/>
+              <w:left w:type="dxa" w:w="100"/>
+              <w:bottom w:type="dxa" w:w="60"/>
+              <w:right w:type="dxa" w:w="100"/>
+            </w:tcMar>
+          </w:tcPr>
+          <w:p>
+            <w:r>
+              <w:rPr>
+                <w:rFonts w:ascii="Georgia" w:cs="Georgia" w:eastAsia="Georgia" w:hAnsi="Georgia"/>
+                <w:sz w:val="18"/>
+                <w:szCs w:val="18"/>
+              </w:rPr>
+              <w:t xml:space="preserve">Riǧm Qaʿqūl, Rif Dimašq, Süd-Syrien.</w:t>
+            </w:r>
+          </w:p>
+        </w:tc>
+      </w:tr>
+      <w:tr>
+        <w:tc>
+          <w:tcPr>
+            <w:tcW w:type="dxa" w:w="2400"/>
+            <w:tcBorders>
+              <w:top w:val="single" w:color="DDDDDD" w:sz="4"/>
+              <w:left w:val="single" w:color="DDDDDD" w:sz="4"/>
+              <w:bottom w:val="single" w:color="DDDDDD" w:sz="4"/>
+              <w:right w:val="single" w:color="DDDDDD" w:sz="4"/>
+            </w:tcBorders>
+            <w:tcMar>
+              <w:top w:type="dxa" w:w="60"/>
+              <w:left w:type="dxa" w:w="100"/>
+              <w:bottom w:type="dxa" w:w="60"/>
+              <w:right w:type="dxa" w:w="100"/>
+            </w:tcMar>
+          </w:tcPr>
+          <w:p>
+            <w:r>
+              <w:rPr>
+                <w:rFonts w:ascii="Georgia" w:cs="Georgia" w:eastAsia="Georgia" w:hAnsi="Georgia"/>
+                <w:b/>
+                <w:sz w:val="18"/>
+                <w:szCs w:val="18"/>
+              </w:rPr>
+              <w:t xml:space="preserve">Ǧabal Says</w:t>
+            </w:r>
+          </w:p>
+        </w:tc>
+        <w:tc>
+          <w:tcPr>
+            <w:tcW w:type="dxa" w:w="6600"/>
+            <w:tcBorders>
+              <w:top w:val="single" w:color="DDDDDD" w:sz="4"/>
+              <w:left w:val="single" w:color="DDDDDD" w:sz="4"/>
+              <w:bottom w:val="single" w:color="DDDDDD" w:sz="4"/>
+              <w:right w:val="single" w:color="DDDDDD" w:sz="4"/>
+            </w:tcBorders>
+            <w:tcMar>
+              <w:top w:type="dxa" w:w="60"/>
+              <w:left w:type="dxa" w:w="100"/>
+              <w:bottom w:type="dxa" w:w="60"/>
+              <w:right w:type="dxa" w:w="100"/>
+            </w:tcMar>
+          </w:tcPr>
+          <w:p>
+            <w:r>
+              <w:rPr>
+                <w:rFonts w:ascii="Georgia" w:cs="Georgia" w:eastAsia="Georgia" w:hAnsi="Georgia"/>
+                <w:sz w:val="18"/>
+                <w:szCs w:val="18"/>
+              </w:rPr>
+              <w:t xml:space="preserve">Ǧabal Says (Basaltmassiv), Rif Dimašq, Süd-Syrien.</w:t>
+            </w:r>
+          </w:p>
+        </w:tc>
+      </w:tr>
+      <w:tr>
+        <w:tc>
+          <w:tcPr>
+            <w:tcW w:type="dxa" w:w="2400"/>
+            <w:tcBorders>
+              <w:top w:val="single" w:color="DDDDDD" w:sz="4"/>
+              <w:left w:val="single" w:color="DDDDDD" w:sz="4"/>
+              <w:bottom w:val="single" w:color="DDDDDD" w:sz="4"/>
+              <w:right w:val="single" w:color="DDDDDD" w:sz="4"/>
+            </w:tcBorders>
+            <w:tcMar>
+              <w:top w:type="dxa" w:w="60"/>
+              <w:left w:type="dxa" w:w="100"/>
+              <w:bottom w:type="dxa" w:w="60"/>
+              <w:right w:type="dxa" w:w="100"/>
+            </w:tcMar>
+          </w:tcPr>
+          <w:p>
+            <w:r>
+              <w:rPr>
+                <w:rFonts w:ascii="Georgia" w:cs="Georgia" w:eastAsia="Georgia" w:hAnsi="Georgia"/>
+                <w:b/>
+                <w:sz w:val="18"/>
+                <w:szCs w:val="18"/>
+              </w:rPr>
+              <w:t xml:space="preserve">Tall aḍ-Ḍabiʿ</w:t>
+            </w:r>
+          </w:p>
+        </w:tc>
+        <w:tc>
+          <w:tcPr>
+            <w:tcW w:type="dxa" w:w="6600"/>
+            <w:tcBorders>
+              <w:top w:val="single" w:color="DDDDDD" w:sz="4"/>
+              <w:left w:val="single" w:color="DDDDDD" w:sz="4"/>
+              <w:bottom w:val="single" w:color="DDDDDD" w:sz="4"/>
+              <w:right w:val="single" w:color="DDDDDD" w:sz="4"/>
+            </w:tcBorders>
+            <w:tcMar>
+              <w:top w:type="dxa" w:w="60"/>
+              <w:left w:type="dxa" w:w="100"/>
+              <w:bottom w:type="dxa" w:w="60"/>
+              <w:right w:type="dxa" w:w="100"/>
+            </w:tcMar>
+          </w:tcPr>
+          <w:p>
+            <w:r>
+              <w:rPr>
+                <w:rFonts w:ascii="Georgia" w:cs="Georgia" w:eastAsia="Georgia" w:hAnsi="Georgia"/>
+                <w:sz w:val="18"/>
+                <w:szCs w:val="18"/>
+              </w:rPr>
+              <w:t xml:space="preserve">Tall aḍ-Ḍabiʿ / Wādī as-Samin, Süd-Syrien.</w:t>
+            </w:r>
+          </w:p>
+        </w:tc>
+      </w:tr>
+      <w:tr>
+        <w:tc>
+          <w:tcPr>
+            <w:tcW w:type="dxa" w:w="2400"/>
+            <w:tcBorders>
+              <w:top w:val="single" w:color="DDDDDD" w:sz="4"/>
+              <w:left w:val="single" w:color="DDDDDD" w:sz="4"/>
+              <w:bottom w:val="single" w:color="DDDDDD" w:sz="4"/>
+              <w:right w:val="single" w:color="DDDDDD" w:sz="4"/>
+            </w:tcBorders>
+            <w:tcMar>
+              <w:top w:type="dxa" w:w="60"/>
+              <w:left w:type="dxa" w:w="100"/>
+              <w:bottom w:type="dxa" w:w="60"/>
+              <w:right w:type="dxa" w:w="100"/>
+            </w:tcMar>
+          </w:tcPr>
+          <w:p>
+            <w:r>
+              <w:rPr>
+                <w:rFonts w:ascii="Georgia" w:cs="Georgia" w:eastAsia="Georgia" w:hAnsi="Georgia"/>
+                <w:b/>
+                <w:sz w:val="18"/>
+                <w:szCs w:val="18"/>
+              </w:rPr>
+              <w:t xml:space="preserve">Khirbat al-Hubayrīyah / al-Umbāšī / Al-Mrōshan</w:t>
+            </w:r>
+          </w:p>
+        </w:tc>
+        <w:tc>
+          <w:tcPr>
+            <w:tcW w:type="dxa" w:w="6600"/>
+            <w:tcBorders>
+              <w:top w:val="single" w:color="DDDDDD" w:sz="4"/>
+              <w:left w:val="single" w:color="DDDDDD" w:sz="4"/>
+              <w:bottom w:val="single" w:color="DDDDDD" w:sz="4"/>
+              <w:right w:val="single" w:color="DDDDDD" w:sz="4"/>
+            </w:tcBorders>
+            <w:tcMar>
+              <w:top w:type="dxa" w:w="60"/>
+              <w:left w:type="dxa" w:w="100"/>
+              <w:bottom w:type="dxa" w:w="60"/>
+              <w:right w:type="dxa" w:w="100"/>
+            </w:tcMar>
+          </w:tcPr>
+          <w:p>
+            <w:r>
+              <w:rPr>
+                <w:rFonts w:ascii="Georgia" w:cs="Georgia" w:eastAsia="Georgia" w:hAnsi="Georgia"/>
+                <w:sz w:val="18"/>
+                <w:szCs w:val="18"/>
+              </w:rPr>
+              <w:t xml:space="preserve">Fundpunkte in Al-Suwaydā, Süd-Syrien.</w:t>
+            </w:r>
+          </w:p>
+        </w:tc>
+      </w:tr>
+      <w:tr>
+        <w:tc>
+          <w:tcPr>
+            <w:tcW w:type="dxa" w:w="2400"/>
+            <w:tcBorders>
+              <w:top w:val="single" w:color="DDDDDD" w:sz="4"/>
+              <w:left w:val="single" w:color="DDDDDD" w:sz="4"/>
+              <w:bottom w:val="single" w:color="DDDDDD" w:sz="4"/>
+              <w:right w:val="single" w:color="DDDDDD" w:sz="4"/>
+            </w:tcBorders>
+            <w:tcMar>
+              <w:top w:type="dxa" w:w="60"/>
+              <w:left w:type="dxa" w:w="100"/>
+              <w:bottom w:type="dxa" w:w="60"/>
+              <w:right w:type="dxa" w:w="100"/>
+            </w:tcMar>
+          </w:tcPr>
+          <w:p>
+            <w:r>
+              <w:rPr>
+                <w:rFonts w:ascii="Georgia" w:cs="Georgia" w:eastAsia="Georgia" w:hAnsi="Georgia"/>
+                <w:b/>
+                <w:sz w:val="18"/>
+                <w:szCs w:val="18"/>
+              </w:rPr>
+              <w:t xml:space="preserve">Al-Mafraq</w:t>
+            </w:r>
+          </w:p>
+        </w:tc>
+        <w:tc>
+          <w:tcPr>
+            <w:tcW w:type="dxa" w:w="6600"/>
+            <w:tcBorders>
+              <w:top w:val="single" w:color="DDDDDD" w:sz="4"/>
+              <w:left w:val="single" w:color="DDDDDD" w:sz="4"/>
+              <w:bottom w:val="single" w:color="DDDDDD" w:sz="4"/>
+              <w:right w:val="single" w:color="DDDDDD" w:sz="4"/>
+            </w:tcBorders>
+            <w:tcMar>
+              <w:top w:type="dxa" w:w="60"/>
+              <w:left w:type="dxa" w:w="100"/>
+              <w:bottom w:type="dxa" w:w="60"/>
+              <w:right w:type="dxa" w:w="100"/>
+            </w:tcMar>
+          </w:tcPr>
+          <w:p>
+            <w:r>
+              <w:rPr>
+                <w:rFonts w:ascii="Georgia" w:cs="Georgia" w:eastAsia="Georgia" w:hAnsi="Georgia"/>
+                <w:sz w:val="18"/>
+                <w:szCs w:val="18"/>
+              </w:rPr>
+              <w:t xml:space="preserve">Provinz Al-Mafraq (NO-Jordanien) — genauer Fundpunkt nicht angegeben.</w:t>
+            </w:r>
+          </w:p>
+        </w:tc>
+      </w:tr>
+      <w:tr>
+        <w:tc>
+          <w:tcPr>
+            <w:tcW w:type="dxa" w:w="2400"/>
+            <w:tcBorders>
+              <w:top w:val="single" w:color="DDDDDD" w:sz="4"/>
+              <w:left w:val="single" w:color="DDDDDD" w:sz="4"/>
+              <w:bottom w:val="single" w:color="DDDDDD" w:sz="4"/>
+              <w:right w:val="single" w:color="DDDDDD" w:sz="4"/>
+            </w:tcBorders>
+            <w:tcMar>
+              <w:top w:type="dxa" w:w="60"/>
+              <w:left w:type="dxa" w:w="100"/>
+              <w:bottom w:type="dxa" w:w="60"/>
+              <w:right w:type="dxa" w:w="100"/>
+            </w:tcMar>
+          </w:tcPr>
+          <w:p>
+            <w:r>
+              <w:rPr>
+                <w:rFonts w:ascii="Georgia" w:cs="Georgia" w:eastAsia="Georgia" w:hAnsi="Georgia"/>
+                <w:b/>
+                <w:sz w:val="18"/>
+                <w:szCs w:val="18"/>
+              </w:rPr>
+              <w:t xml:space="preserve">Rif Dimašq / Al-Suwaydā</w:t>
+            </w:r>
+          </w:p>
+        </w:tc>
+        <w:tc>
+          <w:tcPr>
+            <w:tcW w:type="dxa" w:w="6600"/>
+            <w:tcBorders>
+              <w:top w:val="single" w:color="DDDDDD" w:sz="4"/>
+              <w:left w:val="single" w:color="DDDDDD" w:sz="4"/>
+              <w:bottom w:val="single" w:color="DDDDDD" w:sz="4"/>
+              <w:right w:val="single" w:color="DDDDDD" w:sz="4"/>
+            </w:tcBorders>
+            <w:tcMar>
+              <w:top w:type="dxa" w:w="60"/>
+              <w:left w:type="dxa" w:w="100"/>
+              <w:bottom w:type="dxa" w:w="60"/>
+              <w:right w:type="dxa" w:w="100"/>
+            </w:tcMar>
+          </w:tcPr>
+          <w:p>
+            <w:r>
+              <w:rPr>
+                <w:rFonts w:ascii="Georgia" w:cs="Georgia" w:eastAsia="Georgia" w:hAnsi="Georgia"/>
+                <w:sz w:val="18"/>
+                <w:szCs w:val="18"/>
+              </w:rPr>
+              <w:t xml:space="preserve">südsyrische Provinzen — genauer Fundpunkt nicht angegeben.</w:t>
+            </w:r>
+          </w:p>
+        </w:tc>
+      </w:tr>
+      <w:tr>
+        <w:tc>
+          <w:tcPr>
+            <w:tcW w:type="dxa" w:w="2400"/>
+            <w:tcBorders>
+              <w:top w:val="single" w:color="DDDDDD" w:sz="4"/>
+              <w:left w:val="single" w:color="DDDDDD" w:sz="4"/>
+              <w:bottom w:val="single" w:color="DDDDDD" w:sz="4"/>
+              <w:right w:val="single" w:color="DDDDDD" w:sz="4"/>
+            </w:tcBorders>
+            <w:tcMar>
+              <w:top w:type="dxa" w:w="60"/>
+              <w:left w:type="dxa" w:w="100"/>
+              <w:bottom w:type="dxa" w:w="60"/>
+              <w:right w:type="dxa" w:w="100"/>
+            </w:tcMar>
+          </w:tcPr>
+          <w:p>
+            <w:r>
+              <w:rPr>
+                <w:rFonts w:ascii="Georgia" w:cs="Georgia" w:eastAsia="Georgia" w:hAnsi="Georgia"/>
+                <w:b/>
+                <w:sz w:val="18"/>
+                <w:szCs w:val="18"/>
+              </w:rPr>
+              <w:t xml:space="preserve">Jordanien / Syrien (allg.)</w:t>
+            </w:r>
+          </w:p>
+        </w:tc>
+        <w:tc>
+          <w:tcPr>
+            <w:tcW w:type="dxa" w:w="6600"/>
+            <w:tcBorders>
+              <w:top w:val="single" w:color="DDDDDD" w:sz="4"/>
+              <w:left w:val="single" w:color="DDDDDD" w:sz="4"/>
+              <w:bottom w:val="single" w:color="DDDDDD" w:sz="4"/>
+              <w:right w:val="single" w:color="DDDDDD" w:sz="4"/>
+            </w:tcBorders>
+            <w:tcMar>
+              <w:top w:type="dxa" w:w="60"/>
+              <w:left w:type="dxa" w:w="100"/>
+              <w:bottom w:type="dxa" w:w="60"/>
+              <w:right w:type="dxa" w:w="100"/>
+            </w:tcMar>
+          </w:tcPr>
+          <w:p>
+            <w:r>
+              <w:rPr>
+                <w:rFonts w:ascii="Georgia" w:cs="Georgia" w:eastAsia="Georgia" w:hAnsi="Georgia"/>
+                <w:sz w:val="18"/>
+                <w:szCs w:val="18"/>
+              </w:rPr>
+              <w:t xml:space="preserve">nur das Land überliefert (Ḥarrah bzw. Ṣafā).</w:t>
+            </w:r>
+          </w:p>
+        </w:tc>
+      </w:tr>
+      <w:tr>
+        <w:tc>
+          <w:tcPr>
+            <w:tcW w:type="dxa" w:w="2400"/>
+            <w:tcBorders>
+              <w:top w:val="single" w:color="DDDDDD" w:sz="4"/>
+              <w:left w:val="single" w:color="DDDDDD" w:sz="4"/>
+              <w:bottom w:val="single" w:color="DDDDDD" w:sz="4"/>
+              <w:right w:val="single" w:color="DDDDDD" w:sz="4"/>
+            </w:tcBorders>
+            <w:tcMar>
+              <w:top w:type="dxa" w:w="60"/>
+              <w:left w:type="dxa" w:w="100"/>
+              <w:bottom w:type="dxa" w:w="60"/>
+              <w:right w:type="dxa" w:w="100"/>
+            </w:tcMar>
+          </w:tcPr>
+          <w:p>
+            <w:r>
+              <w:rPr>
+                <w:rFonts w:ascii="Georgia" w:cs="Georgia" w:eastAsia="Georgia" w:hAnsi="Georgia"/>
+                <w:b/>
+                <w:sz w:val="18"/>
+                <w:szCs w:val="18"/>
+              </w:rPr>
+              <w:t xml:space="preserve">Site / Tell / EDS / Cairn / WH Cairn + Nr.</w:t>
+            </w:r>
+          </w:p>
+        </w:tc>
+        <w:tc>
+          <w:tcPr>
+            <w:tcW w:type="dxa" w:w="6600"/>
+            <w:tcBorders>
+              <w:top w:val="single" w:color="DDDDDD" w:sz="4"/>
+              <w:left w:val="single" w:color="DDDDDD" w:sz="4"/>
+              <w:bottom w:val="single" w:color="DDDDDD" w:sz="4"/>
+              <w:right w:val="single" w:color="DDDDDD" w:sz="4"/>
+            </w:tcBorders>
+            <w:tcMar>
+              <w:top w:type="dxa" w:w="60"/>
+              <w:left w:type="dxa" w:w="100"/>
+              <w:bottom w:type="dxa" w:w="60"/>
+              <w:right w:type="dxa" w:w="100"/>
+            </w:tcMar>
+          </w:tcPr>
+          <w:p>
+            <w:r>
+              <w:rPr>
+                <w:rFonts w:ascii="Georgia" w:cs="Georgia" w:eastAsia="Georgia" w:hAnsi="Georgia"/>
+                <w:sz w:val="18"/>
+                <w:szCs w:val="18"/>
+              </w:rPr>
+              <w:t xml:space="preserve">interne Survey-Codes — Fundpunkt ohne benannten Ort.</w:t>
+            </w:r>
+          </w:p>
+        </w:tc>
+      </w:tr>
+      <w:tr>
+        <w:tc>
+          <w:tcPr>
+            <w:tcW w:type="dxa" w:w="2400"/>
+            <w:tcBorders>
+              <w:top w:val="single" w:color="DDDDDD" w:sz="4"/>
+              <w:left w:val="single" w:color="DDDDDD" w:sz="4"/>
+              <w:bottom w:val="single" w:color="DDDDDD" w:sz="4"/>
+              <w:right w:val="single" w:color="DDDDDD" w:sz="4"/>
+            </w:tcBorders>
+            <w:tcMar>
+              <w:top w:type="dxa" w:w="60"/>
+              <w:left w:type="dxa" w:w="100"/>
+              <w:bottom w:type="dxa" w:w="60"/>
+              <w:right w:type="dxa" w:w="100"/>
+            </w:tcMar>
+          </w:tcPr>
+          <w:p>
+            <w:r>
+              <w:rPr>
+                <w:rFonts w:ascii="Georgia" w:cs="Georgia" w:eastAsia="Georgia" w:hAnsi="Georgia"/>
+                <w:b/>
+                <w:sz w:val="18"/>
+                <w:szCs w:val="18"/>
+              </w:rPr>
+              <w:t xml:space="preserve">Fundort unbekannt</w:t>
+            </w:r>
+          </w:p>
+        </w:tc>
+        <w:tc>
+          <w:tcPr>
+            <w:tcW w:type="dxa" w:w="6600"/>
+            <w:tcBorders>
+              <w:top w:val="single" w:color="DDDDDD" w:sz="4"/>
+              <w:left w:val="single" w:color="DDDDDD" w:sz="4"/>
+              <w:bottom w:val="single" w:color="DDDDDD" w:sz="4"/>
+              <w:right w:val="single" w:color="DDDDDD" w:sz="4"/>
+            </w:tcBorders>
+            <w:tcMar>
+              <w:top w:type="dxa" w:w="60"/>
+              <w:left w:type="dxa" w:w="100"/>
+              <w:bottom w:type="dxa" w:w="60"/>
+              <w:right w:type="dxa" w:w="100"/>
+            </w:tcMar>
+          </w:tcPr>
+          <w:p>
+            <w:r>
+              <w:rPr>
+                <w:rFonts w:ascii="Georgia" w:cs="Georgia" w:eastAsia="Georgia" w:hAnsi="Georgia"/>
+                <w:sz w:val="18"/>
+                <w:szCs w:val="18"/>
+              </w:rPr>
+              <w:t xml:space="preserve">keine Ortsangabe im OCIANA-Eintrag.</w:t>
+            </w:r>
+          </w:p>
+        </w:tc>
+      </w:tr>
+    </w:tbl>
+    <w:p/>
     <w:sectPr>
       <w:pgSz w:w="11906" w:h="16838" w:orient="portrait"/>
       <w:pgMar w:top="1700" w:right="1700" w:bottom="1700" w:left="1700" w:header="708" w:footer="708" w:gutter="0"/>

</xml_diff>

<commit_message>
feat(register): Nachwort-Notiz „Zu den Kapiteltiteln“ + Doku
Erklärt die Titel-Verbformen: Infinitiv minus End-„n“; bewusst
mehrdeutig (1. Pers. Präsens / 3. Pers. Konjunktiv / Imperativ / teils
Nomen) → auf keine Lesart festgelegt, „infinit“. Notiz im Nachwort vor
den Tabellen; kompakt in REGISTER_BAND_AUSWAHL.md dokumentiert.

Co-Authored-By: Claude Opus 4.8 <noreply@anthropic.com>
Claude-Session: https://claude.ai/code/session_01WJ6p9HdvKuJ9ea1tbSE1cy
</commit_message>
<xml_diff>
--- a/safaitic-research/Poetics/register/wer_dies_liest_register.docx
+++ b/safaitic-research/Poetics/register/wer_dies_liest_register.docx
@@ -7444,6 +7444,33 @@
           <w:szCs w:val="22"/>
         </w:rPr>
         <w:t xml:space="preserve">Übersetzungskette: gemeißelter Stein → philologische Lesung → englische OCIANA-Edition → deutsche Nachdichtung. Eckige Klammern und Striche ---- der Philologen bleiben im Register „schweige“ sichtbar.</w:t>
+      </w:r>
+    </w:p>
+    <w:p>
+      <w:pPr>
+        <w:spacing w:before="200" w:after="80"/>
+      </w:pPr>
+      <w:r>
+        <w:rPr>
+          <w:rFonts w:ascii="Georgia" w:cs="Georgia" w:eastAsia="Georgia" w:hAnsi="Georgia"/>
+          <w:b/>
+          <w:sz w:val="24"/>
+          <w:szCs w:val="24"/>
+        </w:rPr>
+        <w:t xml:space="preserve">Zu den Kapiteltiteln</w:t>
+      </w:r>
+    </w:p>
+    <w:p>
+      <w:pPr>
+        <w:spacing w:after="200" w:line="320"/>
+      </w:pPr>
+      <w:r>
+        <w:rPr>
+          <w:rFonts w:ascii="Georgia" w:cs="Georgia" w:eastAsia="Georgia" w:hAnsi="Georgia"/>
+          <w:sz w:val="22"/>
+          <w:szCs w:val="22"/>
+        </w:rPr>
+        <w:t xml:space="preserve">Die acht Titel sind jeweils der Infinitiv des Verbs ohne das End-„n“ (schreiben → schreibe, stehen → stehe, …). Diese verkürzte Form ist absichtlich mehrdeutig: Sie ist zugleich erste Person Singular Präsens („ich schreibe“ — die aneignende Stimme), dritte Person Konjunktiv Präsens („er schreibe“ — der Wunsch, der die dritte Person und die Bitten und Flüche der Originale trifft), Imperativ („schreibe!“ — der Befehl an den späteren Leser oder die Gottheit) und mitunter Nomen (die Klage, die Bitte). Weil das Wort auf keine dieser Lesarten festgelegt ist, wird es — im Wortspiel mit „Infinitiv“ — infinit: unbegrenzt, in mehrere Richtungen zugleich offen. Das entspricht dem Gegenstand des Bandes: der aufgeschobenen Inschrift ohne festen Sender und Empfänger, die Aussage, Wunsch und Befehl in einem ist.</w:t>
       </w:r>
     </w:p>
     <w:p>

</xml_diff>